<commit_message>
ajustes nos preenchimentos dos laudos com os inputs
</commit_message>
<xml_diff>
--- a/laudo/templates/laudo_completo.docx
+++ b/laudo/templates/laudo_completo.docx
@@ -5284,6 +5284,34 @@
     </w:p>
     <w:p>
       <w:pPr>
+        <w:ind w:firstLine="0"/>
+        <w:rPr>
+          <w:color w:val="EE0000"/>
+        </w:rPr>
+      </w:pPr>
+      <w:r>
+        <w:rPr>
+          <w:color w:val="EE0000"/>
+        </w:rPr>
+        <w:t xml:space="preserve">[[BLOCK </w:t>
+      </w:r>
+      <w:proofErr w:type="spellStart"/>
+      <w:r>
+        <w:rPr>
+          <w:color w:val="EE0000"/>
+        </w:rPr>
+        <w:t>juros_carencia_sem_datas_claras</w:t>
+      </w:r>
+      <w:proofErr w:type="spellEnd"/>
+      <w:r>
+        <w:rPr>
+          <w:color w:val="EE0000"/>
+        </w:rPr>
+        <w:t>]]</w:t>
+      </w:r>
+    </w:p>
+    <w:p>
+      <w:pPr>
         <w:pStyle w:val="Ttulo2"/>
         <w:numPr>
           <w:ilvl w:val="1"/>
@@ -5553,7 +5581,6 @@
         <w:ind w:firstLine="0"/>
       </w:pPr>
       <w:r>
-        <w:lastRenderedPageBreak/>
         <w:t xml:space="preserve">Fonte: Contrato nº </w:t>
       </w:r>
       <w:r>
@@ -5959,7 +5986,11 @@
     </w:p>
     <w:p>
       <w:r>
-        <w:t xml:space="preserve">Nesse sentido, ante a falta de expressa e clara pactuação sobre os pagamentos que deveriam ser realizados no período de carência, compreende-se que, na verdade, a operação não estava em mora, não existindo razões para o vencimento antecipado e, sequer, para a propositura de </w:t>
+        <w:t xml:space="preserve">Nesse sentido, ante a falta de expressa e clara pactuação sobre os pagamentos que deveriam ser realizados no período de carência, compreende-se que, na verdade, a operação não </w:t>
+      </w:r>
+      <w:r>
+        <w:lastRenderedPageBreak/>
+        <w:t xml:space="preserve">estava em mora, não existindo razões para o vencimento antecipado e, sequer, para a propositura de </w:t>
       </w:r>
       <w:r>
         <w:rPr>
@@ -5981,7 +6012,6 @@
         <w:rPr>
           <w:highlight w:val="green"/>
         </w:rPr>
-        <w:lastRenderedPageBreak/>
         <w:t xml:space="preserve">Parágrafo para colocar </w:t>
       </w:r>
       <w:r>
@@ -6224,7 +6254,48 @@
         <w:t>.</w:t>
       </w:r>
     </w:p>
-    <w:p/>
+    <w:p>
+      <w:pPr>
+        <w:ind w:firstLine="0"/>
+        <w:rPr>
+          <w:color w:val="EE0000"/>
+        </w:rPr>
+      </w:pPr>
+      <w:r>
+        <w:rPr>
+          <w:color w:val="EE0000"/>
+        </w:rPr>
+        <w:t>[[END_BLOCK]]</w:t>
+      </w:r>
+    </w:p>
+    <w:p>
+      <w:pPr>
+        <w:ind w:firstLine="0"/>
+        <w:rPr>
+          <w:color w:val="EE0000"/>
+        </w:rPr>
+      </w:pPr>
+      <w:r>
+        <w:rPr>
+          <w:color w:val="EE0000"/>
+        </w:rPr>
+        <w:t xml:space="preserve">[[BLOCK </w:t>
+      </w:r>
+      <w:proofErr w:type="spellStart"/>
+      <w:r>
+        <w:rPr>
+          <w:color w:val="EE0000"/>
+        </w:rPr>
+        <w:t>encadeamento_operacoes</w:t>
+      </w:r>
+      <w:proofErr w:type="spellEnd"/>
+      <w:r>
+        <w:rPr>
+          <w:color w:val="EE0000"/>
+        </w:rPr>
+        <w:t>]]</w:t>
+      </w:r>
+    </w:p>
     <w:p>
       <w:pPr>
         <w:pStyle w:val="Ttulo2"/>
@@ -6235,6 +6306,7 @@
       </w:pPr>
       <w:bookmarkStart w:id="17" w:name="_Toc227827912"/>
       <w:r>
+        <w:lastRenderedPageBreak/>
         <w:t>Encadeamento das operações [Renegociação de crédito rural]</w:t>
       </w:r>
       <w:bookmarkEnd w:id="17"/>
@@ -6274,14 +6346,7 @@
         <w:rPr>
           <w:highlight w:val="yellow"/>
         </w:rPr>
-        <w:t xml:space="preserve">LINHA DE CRÉDITO </w:t>
-      </w:r>
-      <w:r>
-        <w:rPr>
-          <w:highlight w:val="yellow"/>
-        </w:rPr>
-        <w:lastRenderedPageBreak/>
-        <w:t xml:space="preserve">nº </w:t>
+        <w:t xml:space="preserve">LINHA DE CRÉDITO nº </w:t>
       </w:r>
       <w:proofErr w:type="spellStart"/>
       <w:r>
@@ -6480,6 +6545,7 @@
     </w:p>
     <w:p>
       <w:r>
+        <w:lastRenderedPageBreak/>
         <w:t xml:space="preserve">A existência de renegociação e a ligação lógica entre as operações é fato incontroverso. A tomada de novo crédito, através de contrato de empréstimo, à medida que busque a quitação de débitos anteriores, embora </w:t>
       </w:r>
       <w:r>
@@ -6490,11 +6556,7 @@
         <w:t>per se</w:t>
       </w:r>
       <w:r>
-        <w:t xml:space="preserve"> não indique abusividade, deve ser observada no caso concreto. Nesse sentido, havendo encadeamento contratual, fato também conhecido como </w:t>
-      </w:r>
-      <w:r>
-        <w:lastRenderedPageBreak/>
-        <w:t>“operação mata-mata”, deve-se observar que caso reconhecida alguma ilegalidade nos contratos anteriores, deve ocorrer seu expurgo da dívida renegociada.</w:t>
+        <w:t xml:space="preserve"> não indique abusividade, deve ser observada no caso concreto. Nesse sentido, havendo encadeamento contratual, fato também conhecido como “operação mata-mata”, deve-se observar que caso reconhecida alguma ilegalidade nos contratos anteriores, deve ocorrer seu expurgo da dívida renegociada.</w:t>
       </w:r>
     </w:p>
     <w:p>
@@ -6540,11 +6602,11 @@
         <w:t>VIABILIDADE DE REVISÃO JUDICIAL EM SEDE DE EMBARGOS À EXECUÇÃO NOS CASOS DE ABUSIVIDADE OU ILEGALIDADE, SEM IMPORTAR EM OFENSA À BOA-FÉ OBJETIVA OU AO ATO JURÍDICO PERFEITO. POSSIBILIDADE, ADEMAIS, DE REVISÃO DOS CONTRATOS ANTERIORES. EMPRÉSTIMO REALIZADO PARA FINANCIAMENTO DE DÍVIDAS. OCORRÊNCIA DE ENCADEAMENTO CONTRATUAL E OPERAÇÕES MATA-MATA. SÚMULA 286 DO SUPERIOR TRIBUNAL DE JUSTIÇA</w:t>
       </w:r>
       <w:r>
-        <w:t xml:space="preserve">. CAPITALIZAÇÃO DE JUROS. POSSIBILIDADE DE COBRANÇA, DESDE QUE HAJA EXPRESSA PREVISÃO PARA TANTO. PRÁTICA PERMITIDA EXCLUSIVAMENTE NOS CONTRATOS EXIBIDOS, QUE PREVIRAM EXPRESSAMENTE A CAPITALIZAÇÃO. JUROS REMUNERATÓRIOS. LIMITAÇÃO À TAXA MÉDIA DE MERCADO, ANTE A NÃO APRESENTAÇÃO DOS INSTRUMENTOS. MANUTENÇÃO DOS JUROS PACTUADOS EM RELAÇÃO AOS CONTRATOS ACOSTADOS, ANTE A INEXISTÊNCIA DE ABUSIVIDADE. REPETIÇÃO DO INDÉBITO. POSSIBILIDADE NA FORMA SIMPLES, PERMITIDA A COMPENSAÇÃO ENTRE CRÉDITOS E DÉBITOS. IOF. VALOR COBRADO EM EXCESSO. NECESSIDADE DE RECÁLCULO EM RAZÃO DA ALTERAÇÃO DA BASE DE CÁLCULO DESCARACTERIZAÇÃO DA MORA. VIABILIDADE IN CASU. RECURSO ESPECIAL REPRESENTATIVO DE CONTROVÉRSIA Nº </w:t>
+        <w:t xml:space="preserve">. CAPITALIZAÇÃO DE JUROS. POSSIBILIDADE DE COBRANÇA, DESDE QUE HAJA EXPRESSA PREVISÃO PARA TANTO. PRÁTICA PERMITIDA EXCLUSIVAMENTE NOS CONTRATOS EXIBIDOS, QUE PREVIRAM EXPRESSAMENTE A CAPITALIZAÇÃO. JUROS REMUNERATÓRIOS. LIMITAÇÃO À TAXA MÉDIA DE MERCADO, ANTE A NÃO APRESENTAÇÃO DOS INSTRUMENTOS. MANUTENÇÃO DOS JUROS PACTUADOS EM RELAÇÃO AOS CONTRATOS ACOSTADOS, ANTE A INEXISTÊNCIA DE ABUSIVIDADE. REPETIÇÃO DO INDÉBITO. </w:t>
       </w:r>
       <w:r>
         <w:lastRenderedPageBreak/>
-        <w:t>1.061.530/RS. ÔNUS SUCUMBENCIAL. READEQUAÇÃO. HONORÁRIOS ADVOCATÍCIOS. MAJORAÇÃO. SENTENÇA PARCIALMENTE ANULADA E PARCIALMENTE REFORMADA. RECURSOS CONHECIDOS E PARCIALMENTE PROVIDOS.</w:t>
+        <w:t>POSSIBILIDADE NA FORMA SIMPLES, PERMITIDA A COMPENSAÇÃO ENTRE CRÉDITOS E DÉBITOS. IOF. VALOR COBRADO EM EXCESSO. NECESSIDADE DE RECÁLCULO EM RAZÃO DA ALTERAÇÃO DA BASE DE CÁLCULO DESCARACTERIZAÇÃO DA MORA. VIABILIDADE IN CASU. RECURSO ESPECIAL REPRESENTATIVO DE CONTROVÉRSIA Nº 1.061.530/RS. ÔNUS SUCUMBENCIAL. READEQUAÇÃO. HONORÁRIOS ADVOCATÍCIOS. MAJORAÇÃO. SENTENÇA PARCIALMENTE ANULADA E PARCIALMENTE REFORMADA. RECURSOS CONHECIDOS E PARCIALMENTE PROVIDOS.</w:t>
       </w:r>
     </w:p>
     <w:p>
@@ -6696,7 +6758,11 @@
         <w:t>, será possível confirmar a origem rural e verificar se as condições econômico-financeiras dos contratos foram alteradas. Caso seja constatada a elevação das taxas dos encargos remuneratórios</w:t>
       </w:r>
       <w:r>
-        <w:t xml:space="preserve"> em relação ao contrato originário</w:t>
+        <w:t xml:space="preserve"> em relação ao </w:t>
+      </w:r>
+      <w:r>
+        <w:lastRenderedPageBreak/>
+        <w:t>contrato originário</w:t>
       </w:r>
       <w:r>
         <w:t>, os encargos da renegociaç</w:t>
@@ -6729,7 +6795,6 @@
       <w:bookmarkStart w:id="19" w:name="_Toc93933353"/>
       <w:bookmarkStart w:id="20" w:name="_Toc227827913"/>
       <w:r>
-        <w:lastRenderedPageBreak/>
         <w:t>Encadeamento das operações</w:t>
       </w:r>
       <w:bookmarkEnd w:id="19"/>
@@ -6870,6 +6935,7 @@
       <w:bookmarkStart w:id="22" w:name="_Toc227827914"/>
       <w:bookmarkStart w:id="23" w:name="_Toc91076025"/>
       <w:r>
+        <w:lastRenderedPageBreak/>
         <w:t>Taxa Média Ponderada</w:t>
       </w:r>
       <w:bookmarkEnd w:id="21"/>
@@ -7555,7 +7621,6 @@
                 <w:szCs w:val="23"/>
                 <w:lang w:eastAsia="pt-BR"/>
               </w:rPr>
-              <w:lastRenderedPageBreak/>
               <w:t>Total:</w:t>
             </w:r>
           </w:p>
@@ -8236,6 +8301,7 @@
         <w:pStyle w:val="Citaodireta"/>
       </w:pPr>
       <w:r>
+        <w:lastRenderedPageBreak/>
         <w:t>Súmula 286 STJ – “A renegociação de contrato bancário ou a confissão da dívida não impede a possibilidade de discussão sobre eventuais ilegalidades dos contratos anteriores”</w:t>
       </w:r>
     </w:p>
@@ -8264,11 +8330,7 @@
         <w:t>executado</w:t>
       </w:r>
       <w:r>
-        <w:t xml:space="preserve"> foi a realização do pagamento do saldo devedor vencido e vincendo de uma </w:t>
-      </w:r>
-      <w:r>
-        <w:lastRenderedPageBreak/>
-        <w:t xml:space="preserve">operação anterior que, por sua vez, também se refere a uma renegociação. A operação primária de renegociação, registrada sob nº </w:t>
+        <w:t xml:space="preserve"> foi a realização do pagamento do saldo devedor vencido e vincendo de uma operação anterior que, por sua vez, também se refere a uma renegociação. A operação primária de renegociação, registrada sob nº </w:t>
       </w:r>
       <w:proofErr w:type="spellStart"/>
       <w:r>
@@ -8454,7 +8516,11 @@
         <w:t>per se</w:t>
       </w:r>
       <w:r>
-        <w:t xml:space="preserve"> não indique abusividade, deve ser observada no caso concreto. Nesse sentido, havendo encadeamento contratual, fato também conhecido como “operação mata-mata”, deve-se observar que caso reconhecida alguma ilegalidade nos contratos anteriores, deve ocorrer seu expurgo da dívida renegociada.</w:t>
+        <w:t xml:space="preserve"> não indique abusividade, deve ser observada no caso concreto. Nesse sentido, havendo encadeamento contratual, fato também conhecido como </w:t>
+      </w:r>
+      <w:r>
+        <w:lastRenderedPageBreak/>
+        <w:t>“operação mata-mata”, deve-se observar que caso reconhecida alguma ilegalidade nos contratos anteriores, deve ocorrer seu expurgo da dívida renegociada.</w:t>
       </w:r>
     </w:p>
     <w:p>
@@ -8470,11 +8536,7 @@
         <w:t>corolário lógico sob o ponto de vista econômico-financeiro</w:t>
       </w:r>
       <w:r>
-        <w:t xml:space="preserve">. À medida que se reconhece que determinado valor renegociado é indevido, não é racional que seja cobrado na renegociação, com a incidência de novos encargos. Deve-se, portanto, deduzir o excesso de </w:t>
-      </w:r>
-      <w:r>
-        <w:lastRenderedPageBreak/>
-        <w:t xml:space="preserve">origem da base de cálculo da operação de renegociação. Nesse sentido, cita-se ainda a jurisprudência. </w:t>
+        <w:t xml:space="preserve">. À medida que se reconhece que determinado valor renegociado é indevido, não é racional que seja cobrado na renegociação, com a incidência de novos encargos. Deve-se, portanto, deduzir o excesso de origem da base de cálculo da operação de renegociação. Nesse sentido, cita-se ainda a jurisprudência. </w:t>
       </w:r>
     </w:p>
     <w:p>
@@ -8504,7 +8566,11 @@
         <w:t>VIABILIDADE DE REVISÃO JUDICIAL EM SEDE DE EMBARGOS À EXECUÇÃO NOS CASOS DE ABUSIVIDADE OU ILEGALIDADE, SEM IMPORTAR EM OFENSA À BOA-FÉ OBJETIVA OU AO ATO JURÍDICO PERFEITO. POSSIBILIDADE, ADEMAIS, DE REVISÃO DOS CONTRATOS ANTERIORES. EMPRÉSTIMO REALIZADO PARA FINANCIAMENTO DE DÍVIDAS. OCORRÊNCIA DE ENCADEAMENTO CONTRATUAL E OPERAÇÕES MATA-MATA. SÚMULA 286 DO SUPERIOR TRIBUNAL DE JUSTIÇA</w:t>
       </w:r>
       <w:r>
-        <w:t>. CAPITALIZAÇÃO DE JUROS. POSSIBILIDADE DE COBRANÇA, DESDE QUE HAJA EXPRESSA PREVISÃO PARA TANTO. PRÁTICA PERMITIDA EXCLUSIVAMENTE NOS CONTRATOS EXIBIDOS, QUE PREVIRAM EXPRESSAMENTE A CAPITALIZAÇÃO. JUROS REMUNERATÓRIOS. LIMITAÇÃO À TAXA MÉDIA DE MERCADO, ANTE A NÃO APRESENTAÇÃO DOS INSTRUMENTOS. MANUTENÇÃO DOS JUROS PACTUADOS EM RELAÇÃO AOS CONTRATOS ACOSTADOS, ANTE A INEXISTÊNCIA DE ABUSIVIDADE. REPETIÇÃO DO INDÉBITO. POSSIBILIDADE NA FORMA SIMPLES, PERMITIDA A COMPENSAÇÃO ENTRE CRÉDITOS E DÉBITOS. IOF. VALOR COBRADO EM EXCESSO. NECESSIDADE DE RECÁLCULO EM RAZÃO DA ALTERAÇÃO DA BASE DE CÁLCULO DESCARACTERIZAÇÃO DA MORA. VIABILIDADE IN CASU. RECURSO ESPECIAL REPRESENTATIVO DE CONTROVÉRSIA Nº 1.061.530/RS. ÔNUS SUCUMBENCIAL. READEQUAÇÃO. HONORÁRIOS ADVOCATÍCIOS. MAJORAÇÃO. SENTENÇA PARCIALMENTE ANULADA E PARCIALMENTE REFORMADA. RECURSOS CONHECIDOS E PARCIALMENTE PROVIDOS.</w:t>
+        <w:t xml:space="preserve">. CAPITALIZAÇÃO DE JUROS. POSSIBILIDADE DE COBRANÇA, DESDE QUE HAJA EXPRESSA PREVISÃO PARA TANTO. PRÁTICA PERMITIDA EXCLUSIVAMENTE NOS CONTRATOS EXIBIDOS, QUE PREVIRAM EXPRESSAMENTE A CAPITALIZAÇÃO. JUROS REMUNERATÓRIOS. LIMITAÇÃO À TAXA MÉDIA DE MERCADO, ANTE A NÃO APRESENTAÇÃO DOS INSTRUMENTOS. MANUTENÇÃO DOS JUROS PACTUADOS EM RELAÇÃO AOS CONTRATOS ACOSTADOS, ANTE A INEXISTÊNCIA DE ABUSIVIDADE. REPETIÇÃO DO INDÉBITO. POSSIBILIDADE NA FORMA SIMPLES, PERMITIDA A COMPENSAÇÃO ENTRE CRÉDITOS E DÉBITOS. IOF. VALOR COBRADO EM EXCESSO. NECESSIDADE DE RECÁLCULO EM RAZÃO DA ALTERAÇÃO DA BASE DE CÁLCULO DESCARACTERIZAÇÃO DA MORA. VIABILIDADE IN CASU. RECURSO ESPECIAL REPRESENTATIVO DE CONTROVÉRSIA Nº </w:t>
+      </w:r>
+      <w:r>
+        <w:lastRenderedPageBreak/>
+        <w:t>1.061.530/RS. ÔNUS SUCUMBENCIAL. READEQUAÇÃO. HONORÁRIOS ADVOCATÍCIOS. MAJORAÇÃO. SENTENÇA PARCIALMENTE ANULADA E PARCIALMENTE REFORMADA. RECURSOS CONHECIDOS E PARCIALMENTE PROVIDOS.</w:t>
       </w:r>
     </w:p>
     <w:p>
@@ -8543,7 +8609,6 @@
     </w:p>
     <w:p>
       <w:r>
-        <w:lastRenderedPageBreak/>
         <w:t xml:space="preserve">Portanto, ratifica-se a necessidade da apresentação da documentação de origem, para revisão do saldo devedor renegociado pela operação </w:t>
       </w:r>
       <w:r>
@@ -8686,6 +8751,7 @@
       </w:pPr>
       <w:bookmarkStart w:id="27" w:name="_Toc227827917"/>
       <w:r>
+        <w:lastRenderedPageBreak/>
         <w:t>Encadeamento das operações</w:t>
       </w:r>
       <w:bookmarkEnd w:id="9"/>
@@ -8777,7 +8843,6 @@
     </w:p>
     <w:p>
       <w:r>
-        <w:lastRenderedPageBreak/>
         <w:t xml:space="preserve">Nesse sentido, a instituição financeira, ao invés de promover a renegociação da operação de crédito rural, mantendo as condições econômico-financeiras pactuadas no contrato de origem, disponibiliza linhas de crédito diversas ao vínculo rural </w:t>
       </w:r>
       <w:r>
@@ -9029,6 +9094,7 @@
     </w:p>
     <w:p>
       <w:r>
+        <w:lastRenderedPageBreak/>
         <w:t xml:space="preserve">Nesse sentido, considerando o encadeamento das operações, recalculamos a operação </w:t>
       </w:r>
       <w:r>
@@ -9077,7 +9143,6 @@
     </w:p>
     <w:p>
       <w:r>
-        <w:lastRenderedPageBreak/>
         <w:t>Finalmente, destaca-se que a análise do encadeamento apresentada é realizada sob a égide da Súmula 286 do STJ – Supremo Tribunal de Justiça.</w:t>
       </w:r>
     </w:p>
@@ -9143,7 +9208,11 @@
         <w:t>OPERAÇÃO MATA-MATA CARACTERIZADA. POSSIBILIDADE DE DISCUSSÃO DOS CONTRATOS ANTERIORES, INTEGRANTES DO ENCADEAMENTO CONTRATUAL</w:t>
       </w:r>
       <w:r>
-        <w:t xml:space="preserve">. DETERMINAÇÃO DE REVISÃO DE OUTROS INSTRUMENTOS NÃO RELACIONADOS AO TÍTULO EXECUTADO, BEM COMO DA CONTA CORRENTE DO EXECUTADO AVALISTA. DESCABIMENTO. LIMITES DA LIDE EXTRAPOLADOS. PRONUNCIAMENTO EXTRA PETITA NESTE PONTO. NULIDADE RECONHECIDA. AUSÊNCIA DE JUNTADA DE TODOS OS CONTRATOS POR PARTE DA INSTITUIÇÃO FINANCEIRA. APLICAÇÃO DA SANÇÃO DO ART. 400, DO CPC QUANTO AOS DOCUMENTOS NÃO APRESENTADOS. POSSIBILIDADE. FLEXIBILIZAÇÃO DO PRINCÍPIO PACT SUNT SERVANDA. </w:t>
+        <w:t xml:space="preserve">. DETERMINAÇÃO DE REVISÃO DE OUTROS INSTRUMENTOS NÃO RELACIONADOS AO TÍTULO EXECUTADO, BEM COMO DA CONTA CORRENTE DO EXECUTADO AVALISTA. DESCABIMENTO. LIMITES DA LIDE EXTRAPOLADOS. PRONUNCIAMENTO EXTRA PETITA NESTE PONTO. NULIDADE RECONHECIDA. AUSÊNCIA DE JUNTADA DE TODOS OS CONTRATOS POR PARTE DA INSTITUIÇÃO FINANCEIRA. APLICAÇÃO DA SANÇÃO DO ART. </w:t>
+      </w:r>
+      <w:r>
+        <w:lastRenderedPageBreak/>
+        <w:t xml:space="preserve">400, DO CPC QUANTO AOS DOCUMENTOS NÃO APRESENTADOS. POSSIBILIDADE. FLEXIBILIZAÇÃO DO PRINCÍPIO PACT SUNT SERVANDA. </w:t>
       </w:r>
       <w:r>
         <w:rPr>
@@ -9154,11 +9223,7 @@
         <w:t>VIABILIDADE DE REVISÃO JUDICIAL EM SEDE DE EMBARGOS À EXECUÇÃO NOS CASOS DE ABUSIVIDADE OU ILEGALIDADE, SEM IMPORTAR EM OFENSA À BOA-FÉ OBJETIVA OU AO ATO JURÍDICO PERFEITO. POSSIBILIDADE, ADEMAIS, DE REVISÃO DOS CONTRATOS ANTERIORES. EMPRÉSTIMO REALIZADO PARA FINANCIAMENTO DE DÍVIDAS. OCORRÊNCIA DE ENCADEAMENTO CONTRATUAL E OPERAÇÕES MATA-MATA. SÚMULA 286 DO SUPERIOR TRIBUNAL DE JUSTIÇA</w:t>
       </w:r>
       <w:r>
-        <w:t xml:space="preserve">. CAPITALIZAÇÃO DE JUROS. POSSIBILIDADE DE COBRANÇA, </w:t>
-      </w:r>
-      <w:r>
-        <w:lastRenderedPageBreak/>
-        <w:t>DESDE QUE HAJA EXPRESSA PREVISÃO PARA TANTO. PRÁTICA PERMITIDA EXCLUSIVAMENTE NOS CONTRATOS EXIBIDOS, QUE PREVIRAM EXPRESSAMENTE A CAPITALIZAÇÃO. JUROS REMUNERATÓRIOS. LIMITAÇÃO À TAXA MÉDIA DE MERCADO, ANTE A NÃO APRESENTAÇÃO DOS INSTRUMENTOS. MANUTENÇÃO DOS JUROS PACTUADOS EM RELAÇÃO AOS CONTRATOS ACOSTADOS, ANTE A INEXISTÊNCIA DE ABUSIVIDADE. REPETIÇÃO DO INDÉBITO. POSSIBILIDADE NA FORMA SIMPLES, PERMITIDA A COMPENSAÇÃO ENTRE CRÉDITOS E DÉBITOS. IOF. VALOR COBRADO EM EXCESSO. NECESSIDADE DE RECÁLCULO EM RAZÃO DA ALTERAÇÃO DA BASE DE CÁLCULO DESCARACTERIZAÇÃO DA MORA. VIABILIDADE IN CASU. RECURSO ESPECIAL REPRESENTATIVO DE CONTROVÉRSIA Nº 1.061.530/RS. ÔNUS SUCUMBENCIAL. READEQUAÇÃO. HONORÁRIOS ADVOCATÍCIOS. MAJORAÇÃO. SENTENÇA PARCIALMENTE ANULADA E PARCIALMENTE REFORMADA. RECURSOS CONHECIDOS E PARCIALMENTE PROVIDOS.</w:t>
+        <w:t>. CAPITALIZAÇÃO DE JUROS. POSSIBILIDADE DE COBRANÇA, DESDE QUE HAJA EXPRESSA PREVISÃO PARA TANTO. PRÁTICA PERMITIDA EXCLUSIVAMENTE NOS CONTRATOS EXIBIDOS, QUE PREVIRAM EXPRESSAMENTE A CAPITALIZAÇÃO. JUROS REMUNERATÓRIOS. LIMITAÇÃO À TAXA MÉDIA DE MERCADO, ANTE A NÃO APRESENTAÇÃO DOS INSTRUMENTOS. MANUTENÇÃO DOS JUROS PACTUADOS EM RELAÇÃO AOS CONTRATOS ACOSTADOS, ANTE A INEXISTÊNCIA DE ABUSIVIDADE. REPETIÇÃO DO INDÉBITO. POSSIBILIDADE NA FORMA SIMPLES, PERMITIDA A COMPENSAÇÃO ENTRE CRÉDITOS E DÉBITOS. IOF. VALOR COBRADO EM EXCESSO. NECESSIDADE DE RECÁLCULO EM RAZÃO DA ALTERAÇÃO DA BASE DE CÁLCULO DESCARACTERIZAÇÃO DA MORA. VIABILIDADE IN CASU. RECURSO ESPECIAL REPRESENTATIVO DE CONTROVÉRSIA Nº 1.061.530/RS. ÔNUS SUCUMBENCIAL. READEQUAÇÃO. HONORÁRIOS ADVOCATÍCIOS. MAJORAÇÃO. SENTENÇA PARCIALMENTE ANULADA E PARCIALMENTE REFORMADA. RECURSOS CONHECIDOS E PARCIALMENTE PROVIDOS.</w:t>
       </w:r>
     </w:p>
     <w:p>
@@ -9269,6 +9334,7 @@
     </w:p>
     <w:p>
       <w:r>
+        <w:lastRenderedPageBreak/>
         <w:t>Desse modo, surge a necessidade da flexibilização da obrigação dos contratos com vistas de manter o equilíbrio contratual, observando-se ainda a função social dos</w:t>
       </w:r>
       <w:r>
@@ -9306,7 +9372,6 @@
       </w:pPr>
       <w:bookmarkStart w:id="32" w:name="_Toc227827918"/>
       <w:r>
-        <w:lastRenderedPageBreak/>
         <w:t>Encadeamento das operações</w:t>
       </w:r>
       <w:bookmarkEnd w:id="28"/>
@@ -9816,6 +9881,7 @@
     </w:p>
     <w:p>
       <w:r>
+        <w:lastRenderedPageBreak/>
         <w:t xml:space="preserve">Os encargos financeiros foram extremamente elevados na ocasião do aditamento, o que onerou excessivamente </w:t>
       </w:r>
       <w:r>
@@ -9834,11 +9900,7 @@
         <w:t>a produtora</w:t>
       </w:r>
       <w:r>
-        <w:t xml:space="preserve"> e prejudicou o equilíbrio da relação contratual. Nesse sentido, a partir da compreensão do encadeamento, os encargos financeiros a partir da </w:t>
-      </w:r>
-      <w:r>
-        <w:lastRenderedPageBreak/>
-        <w:t>vigência do aditamento foram limitados à taxa do contrato originário</w:t>
+        <w:t xml:space="preserve"> e prejudicou o equilíbrio da relação contratual. Nesse sentido, a partir da compreensão do encadeamento, os encargos financeiros a partir da vigência do aditamento foram limitados à taxa do contrato originário</w:t>
       </w:r>
       <w:r>
         <w:rPr>
@@ -10006,6 +10068,7 @@
     </w:p>
     <w:p>
       <w:r>
+        <w:lastRenderedPageBreak/>
         <w:t xml:space="preserve">Ademais, constou-se que a operação </w:t>
       </w:r>
       <w:proofErr w:type="spellStart"/>
@@ -10028,11 +10091,7 @@
         <w:t>alterou, além do prazo de vencimento, os encargos financeiros praticados</w:t>
       </w:r>
       <w:r>
-        <w:t xml:space="preserve">. Os encargos financeiros foram extremamente elevados na ocasião do último aditamento, o que onerou excessivamente a </w:t>
-      </w:r>
-      <w:r>
-        <w:lastRenderedPageBreak/>
-        <w:t>produtora e prejudicou o equilíbrio da relação contratual. Nesse sentido, a partir da compreensão do encadeamento, os encargos financeiros a partir do aditamento foram limitados à taxa do contrato originário.</w:t>
+        <w:t>. Os encargos financeiros foram extremamente elevados na ocasião do último aditamento, o que onerou excessivamente a produtora e prejudicou o equilíbrio da relação contratual. Nesse sentido, a partir da compreensão do encadeamento, os encargos financeiros a partir do aditamento foram limitados à taxa do contrato originário.</w:t>
       </w:r>
     </w:p>
     <w:p>
@@ -10142,6 +10201,62 @@
           <w:rFonts w:eastAsia="Times New Roman"/>
         </w:rPr>
         <w:t xml:space="preserve"> Desse modo, deve-se limitar os encargos financeiros praticados a partir do aditamento à taxa de juros pactuada no contrato de origem, com vistas a manter o equilíbrio da relação contratual.</w:t>
+      </w:r>
+    </w:p>
+    <w:p>
+      <w:pPr>
+        <w:ind w:firstLine="0"/>
+        <w:rPr>
+          <w:color w:val="EE0000"/>
+        </w:rPr>
+      </w:pPr>
+      <w:r>
+        <w:rPr>
+          <w:color w:val="EE0000"/>
+        </w:rPr>
+        <w:t>[[END_BLOCK]]</w:t>
+      </w:r>
+    </w:p>
+    <w:p>
+      <w:pPr>
+        <w:ind w:firstLine="0"/>
+        <w:rPr>
+          <w:color w:val="EE0000"/>
+        </w:rPr>
+      </w:pPr>
+      <w:r>
+        <w:rPr>
+          <w:color w:val="EE0000"/>
+        </w:rPr>
+        <w:t xml:space="preserve">[[BLOCK </w:t>
+      </w:r>
+      <w:proofErr w:type="spellStart"/>
+      <w:r>
+        <w:rPr>
+          <w:color w:val="EE0000"/>
+        </w:rPr>
+        <w:t>taxa_superior_</w:t>
+      </w:r>
+      <w:proofErr w:type="gramStart"/>
+      <w:r>
+        <w:rPr>
+          <w:color w:val="EE0000"/>
+        </w:rPr>
+        <w:t>media</w:t>
+      </w:r>
+      <w:proofErr w:type="gramEnd"/>
+      <w:r>
+        <w:rPr>
+          <w:color w:val="EE0000"/>
+        </w:rPr>
+        <w:t>_mercado</w:t>
+      </w:r>
+      <w:proofErr w:type="spellEnd"/>
+      <w:r>
+        <w:rPr>
+          <w:color w:val="EE0000"/>
+        </w:rPr>
+        <w:t>]]</w:t>
       </w:r>
     </w:p>
     <w:p>
@@ -10203,7 +10318,7 @@
       <w:proofErr w:type="spellStart"/>
       <w:r>
         <w:rPr>
-          <w:highlight w:val="yellow"/>
+          <w:highlight w:val="green"/>
         </w:rPr>
         <w:t>xxxxx</w:t>
       </w:r>
@@ -10223,11 +10338,77 @@
         </w:rPr>
         <w:t xml:space="preserve"> </w:t>
       </w:r>
+      <w:sdt>
+        <w:sdtPr>
+          <w:rPr>
+            <w:bCs/>
+            <w:highlight w:val="green"/>
+          </w:rPr>
+          <w:id w:val="109482335"/>
+          <w:placeholder>
+            <w:docPart w:val="1950A8E704374EB4BAB75D6839090E91"/>
+          </w:placeholder>
+        </w:sdtPr>
+        <w:sdtContent>
+          <w:r>
+            <w:rPr>
+              <w:bCs/>
+              <w:highlight w:val="green"/>
+            </w:rPr>
+            <w:t>{{</w:t>
+          </w:r>
+          <w:proofErr w:type="spellStart"/>
+          <w:proofErr w:type="gramStart"/>
+          <w:r>
+            <w:rPr>
+              <w:bCs/>
+              <w:highlight w:val="green"/>
+            </w:rPr>
+            <w:t>c.juros</w:t>
+          </w:r>
+          <w:proofErr w:type="spellEnd"/>
+          <w:proofErr w:type="gramEnd"/>
+          <w:r>
+            <w:rPr>
+              <w:bCs/>
+              <w:highlight w:val="green"/>
+            </w:rPr>
+            <w:t>}}</w:t>
+          </w:r>
+        </w:sdtContent>
+      </w:sdt>
+      <w:r>
+        <w:rPr>
+          <w:rFonts w:eastAsia="Times New Roman"/>
+          <w:highlight w:val="yellow"/>
+        </w:rPr>
+        <w:t>% a.a.</w:t>
+      </w:r>
+      <w:r>
+        <w:rPr>
+          <w:rFonts w:eastAsia="Times New Roman"/>
+          <w:highlight w:val="yellow"/>
+        </w:rPr>
+        <w:t xml:space="preserve"> </w:t>
+      </w:r>
+      <w:r>
+        <w:rPr>
+          <w:rFonts w:eastAsia="Times New Roman"/>
+        </w:rPr>
+        <w:t>[</w:t>
+      </w:r>
+      <w:r>
+        <w:rPr>
+          <w:rFonts w:eastAsia="Times New Roman"/>
+          <w:color w:val="FF0000"/>
+        </w:rPr>
+        <w:t xml:space="preserve">quando tiver apenas a taxa mensal: </w:t>
+      </w:r>
       <w:proofErr w:type="spellStart"/>
       <w:r>
         <w:rPr>
           <w:rFonts w:eastAsia="Times New Roman"/>
-          <w:highlight w:val="yellow"/>
+          <w:color w:val="FF0000"/>
         </w:rPr>
         <w:t>xxxx</w:t>
       </w:r>
@@ -10235,14 +10416,87 @@
       <w:r>
         <w:rPr>
           <w:rFonts w:eastAsia="Times New Roman"/>
-          <w:highlight w:val="yellow"/>
+          <w:color w:val="FF0000"/>
+        </w:rPr>
+        <w:t xml:space="preserve">% a.m., equivalente a uma taxa de </w:t>
+      </w:r>
+      <w:proofErr w:type="spellStart"/>
+      <w:r>
+        <w:rPr>
+          <w:rFonts w:eastAsia="Times New Roman"/>
+          <w:color w:val="FF0000"/>
+        </w:rPr>
+        <w:t>xxxx</w:t>
+      </w:r>
+      <w:proofErr w:type="spellEnd"/>
+      <w:r>
+        <w:rPr>
+          <w:rFonts w:eastAsia="Times New Roman"/>
+          <w:color w:val="FF0000"/>
         </w:rPr>
         <w:t>% a.a.</w:t>
       </w:r>
       <w:r>
         <w:rPr>
           <w:rFonts w:eastAsia="Times New Roman"/>
-          <w:highlight w:val="yellow"/>
+        </w:rPr>
+        <w:t>]</w:t>
+      </w:r>
+      <w:r>
+        <w:rPr>
+          <w:rFonts w:eastAsia="Times New Roman"/>
+        </w:rPr>
+        <w:t xml:space="preserve"> A referida taxa foi muito superior à Taxa de juros Média de Mercado para operações com crédito rural, onerando excessivamente </w:t>
+      </w:r>
+      <w:sdt>
+        <w:sdtPr>
+          <w:rPr>
+            <w:bCs/>
+            <w:highlight w:val="green"/>
+          </w:rPr>
+          <w:id w:val="652647087"/>
+          <w:placeholder>
+            <w:docPart w:val="581E7744678040B7AEC54FDA2B0C3E06"/>
+          </w:placeholder>
+        </w:sdtPr>
+        <w:sdtContent>
+          <w:r>
+            <w:rPr>
+              <w:rFonts w:eastAsia="Times New Roman"/>
+              <w:highlight w:val="green"/>
+            </w:rPr>
+            <w:t>{{</w:t>
+          </w:r>
+          <w:proofErr w:type="spellStart"/>
+          <w:r>
+            <w:rPr>
+              <w:rFonts w:eastAsia="Times New Roman"/>
+              <w:highlight w:val="green"/>
+            </w:rPr>
+            <w:t>produtor_</w:t>
+          </w:r>
+          <w:proofErr w:type="gramStart"/>
+          <w:r>
+            <w:rPr>
+              <w:rFonts w:eastAsia="Times New Roman"/>
+              <w:highlight w:val="green"/>
+            </w:rPr>
+            <w:t>genero.sujeito</w:t>
+          </w:r>
+          <w:proofErr w:type="spellEnd"/>
+          <w:proofErr w:type="gramEnd"/>
+          <w:r>
+            <w:rPr>
+              <w:rFonts w:eastAsia="Times New Roman"/>
+              <w:highlight w:val="green"/>
+            </w:rPr>
+            <w:t>}}</w:t>
+          </w:r>
+        </w:sdtContent>
+      </w:sdt>
+      <w:r>
+        <w:rPr>
+          <w:bCs/>
         </w:rPr>
         <w:t xml:space="preserve"> </w:t>
       </w:r>
@@ -10250,99 +10504,14 @@
         <w:rPr>
           <w:rFonts w:eastAsia="Times New Roman"/>
         </w:rPr>
-        <w:t>[</w:t>
-      </w:r>
-      <w:r>
-        <w:rPr>
-          <w:rFonts w:eastAsia="Times New Roman"/>
-          <w:color w:val="FF0000"/>
-        </w:rPr>
-        <w:t xml:space="preserve">quando tiver apenas a taxa mensal: </w:t>
-      </w:r>
-      <w:proofErr w:type="spellStart"/>
-      <w:r>
-        <w:rPr>
-          <w:rFonts w:eastAsia="Times New Roman"/>
-          <w:color w:val="FF0000"/>
-        </w:rPr>
-        <w:t>xxxx</w:t>
-      </w:r>
-      <w:proofErr w:type="spellEnd"/>
-      <w:r>
-        <w:rPr>
-          <w:rFonts w:eastAsia="Times New Roman"/>
-          <w:color w:val="FF0000"/>
-        </w:rPr>
-        <w:t xml:space="preserve">% a.m., equivalente a uma taxa de </w:t>
-      </w:r>
-      <w:proofErr w:type="spellStart"/>
-      <w:r>
-        <w:rPr>
-          <w:rFonts w:eastAsia="Times New Roman"/>
-          <w:color w:val="FF0000"/>
-        </w:rPr>
-        <w:t>xxxx</w:t>
-      </w:r>
-      <w:proofErr w:type="spellEnd"/>
-      <w:r>
-        <w:rPr>
-          <w:rFonts w:eastAsia="Times New Roman"/>
-          <w:color w:val="FF0000"/>
-        </w:rPr>
-        <w:t>% a.a.</w:t>
-      </w:r>
-      <w:r>
-        <w:rPr>
-          <w:rFonts w:eastAsia="Times New Roman"/>
-        </w:rPr>
-        <w:t>]</w:t>
-      </w:r>
-      <w:r>
-        <w:rPr>
-          <w:rFonts w:eastAsia="Times New Roman"/>
-        </w:rPr>
-        <w:t xml:space="preserve"> A referida taxa foi muito superior à Taxa de juros Média de Mercado para operações com crédito rural, onerando excessivamente </w:t>
-      </w:r>
-      <w:r>
-        <w:rPr>
-          <w:rFonts w:eastAsia="Times New Roman"/>
-          <w:highlight w:val="yellow"/>
-        </w:rPr>
-        <w:t xml:space="preserve">o </w:t>
-      </w:r>
-      <w:r>
-        <w:rPr>
-          <w:rFonts w:eastAsia="Times New Roman"/>
-          <w:highlight w:val="yellow"/>
-        </w:rPr>
-        <w:t xml:space="preserve">produtor / a </w:t>
-      </w:r>
-      <w:r>
-        <w:rPr>
-          <w:rFonts w:eastAsia="Times New Roman"/>
-          <w:highlight w:val="yellow"/>
-        </w:rPr>
-        <w:t>produtor</w:t>
-      </w:r>
-      <w:r>
-        <w:rPr>
-          <w:rFonts w:eastAsia="Times New Roman"/>
-          <w:highlight w:val="yellow"/>
-        </w:rPr>
-        <w:t>a</w:t>
-      </w:r>
-      <w:r>
-        <w:rPr>
-          <w:rFonts w:eastAsia="Times New Roman"/>
-          <w:highlight w:val="yellow"/>
-        </w:rPr>
-        <w:t xml:space="preserve"> </w:t>
-      </w:r>
-      <w:r>
-        <w:rPr>
-          <w:rFonts w:eastAsia="Times New Roman"/>
-        </w:rPr>
-        <w:t xml:space="preserve">que buscava </w:t>
+        <w:t xml:space="preserve">que </w:t>
+      </w:r>
+      <w:r>
+        <w:rPr>
+          <w:rFonts w:eastAsia="Times New Roman"/>
+        </w:rPr>
+        <w:lastRenderedPageBreak/>
+        <w:t xml:space="preserve">buscava </w:t>
       </w:r>
       <w:r>
         <w:rPr>
@@ -10443,14 +10612,7 @@
         <w:rPr>
           <w:highlight w:val="yellow"/>
         </w:rPr>
-        <w:t xml:space="preserve"> (estabelece, entre outros parâmetros, o volume de financiamento e a taxa máxima de juros para </w:t>
-      </w:r>
-      <w:r>
-        <w:rPr>
-          <w:highlight w:val="yellow"/>
-        </w:rPr>
-        <w:lastRenderedPageBreak/>
-        <w:t xml:space="preserve">cada produto), consolidadas no </w:t>
+        <w:t xml:space="preserve"> (estabelece, entre outros parâmetros, o volume de financiamento e a taxa máxima de juros para cada produto), consolidadas no </w:t>
       </w:r>
       <w:r>
         <w:rPr>
@@ -10864,6 +11026,7 @@
               <w:rFonts w:ascii="Cambria Math" w:eastAsia="Times New Roman" w:hAnsi="Cambria Math"/>
               <w:lang w:eastAsia="pt-BR"/>
             </w:rPr>
+            <w:lastRenderedPageBreak/>
             <m:t>Diferença relativa=</m:t>
           </m:r>
           <m:d>
@@ -10975,7 +11138,6 @@
                 <w:noProof/>
                 <w:lang w:eastAsia="pt-BR"/>
               </w:rPr>
-              <w:lastRenderedPageBreak/>
               <w:drawing>
                 <wp:inline distT="0" distB="0" distL="0" distR="0" wp14:anchorId="5F36A5AA" wp14:editId="4E7E5F45">
                   <wp:extent cx="4953000" cy="1048323"/>
@@ -11674,6 +11836,7 @@
         <w:rPr>
           <w:rFonts w:eastAsia="Times New Roman"/>
         </w:rPr>
+        <w:lastRenderedPageBreak/>
         <w:t xml:space="preserve">Assim, restou demonstrado que a taxa de juros praticada pelo banco foi </w:t>
       </w:r>
       <w:proofErr w:type="spellStart"/>
@@ -11736,7 +11899,6 @@
         <w:pStyle w:val="Citaodireta"/>
       </w:pPr>
       <w:r>
-        <w:lastRenderedPageBreak/>
         <w:t xml:space="preserve">APELAÇÃO CÍVEL. EMBARGOS À EXECUÇÃO DE TÍTULO EXTRAJUDICIAL. SENTENÇA DE IMPROCEDÊNCIA. CONTRATO DE CRÉDITO BANCÁRIO EMPRÉSTIMO – CAPITAL DE GIRO. INCIDÊNCIA DO CDC. PESSOA JURÍDICA. POSSIBILIDADE DE MITIGAÇÃO DA TEORIA FINALISTA NAS HIPÓTESES EM QUE A PESSOA JURÍDICA, EMBORA NÃO SEJA PROPRIAMENTE CONSUMIDORA FINAL, ESTEJA EM SITUAÇÃO DE VULNERABILIDADE FRENTE À INSTITUIÇÃO FINANCEIRA. PRECEDENTES DO SUPERIOR TRIBUNAL DE JUSTIÇA. </w:t>
       </w:r>
       <w:r>
@@ -12029,6 +12191,7 @@
         <w:rPr>
           <w:rFonts w:eastAsia="Times New Roman"/>
         </w:rPr>
+        <w:lastRenderedPageBreak/>
         <w:t>Entretanto, para enfatizar o impacto dessa diferença entre as taxas, recalculamos a</w:t>
       </w:r>
       <w:r>
@@ -12113,7 +12276,6 @@
         <w:rPr>
           <w:rFonts w:eastAsia="Times New Roman"/>
         </w:rPr>
-        <w:lastRenderedPageBreak/>
         <w:t>------------</w:t>
       </w:r>
     </w:p>
@@ -12365,7 +12527,11 @@
         <w:t xml:space="preserve"> </w:t>
       </w:r>
       <w:r>
-        <w:t>BANCÁRIO. INCIDENTE DE PROCESSO REPETITIVO. JUROS REMUNERATÓRIOS.</w:t>
+        <w:t xml:space="preserve">BANCÁRIO. INCIDENTE DE PROCESSO REPETITIVO. JUROS </w:t>
+      </w:r>
+      <w:r>
+        <w:lastRenderedPageBreak/>
+        <w:t>REMUNERATÓRIOS.</w:t>
       </w:r>
       <w:r>
         <w:t xml:space="preserve"> </w:t>
@@ -12407,7 +12573,6 @@
         <w:spacing w:before="120" w:after="120"/>
       </w:pPr>
       <w:r>
-        <w:lastRenderedPageBreak/>
         <w:t>1 - Nos contratos de mútuo em que a disponibilização do capital é imediata, o montante</w:t>
       </w:r>
       <w:r>
@@ -12485,6 +12650,48 @@
     </w:p>
     <w:p>
       <w:pPr>
+        <w:ind w:firstLine="0"/>
+        <w:rPr>
+          <w:color w:val="EE0000"/>
+        </w:rPr>
+      </w:pPr>
+      <w:r>
+        <w:rPr>
+          <w:color w:val="EE0000"/>
+        </w:rPr>
+        <w:t>[[END_BLOCK]]</w:t>
+      </w:r>
+    </w:p>
+    <w:p>
+      <w:pPr>
+        <w:ind w:firstLine="0"/>
+        <w:rPr>
+          <w:color w:val="EE0000"/>
+        </w:rPr>
+      </w:pPr>
+      <w:r>
+        <w:rPr>
+          <w:color w:val="EE0000"/>
+        </w:rPr>
+        <w:t xml:space="preserve">[[BLOCK </w:t>
+      </w:r>
+      <w:proofErr w:type="spellStart"/>
+      <w:r>
+        <w:rPr>
+          <w:color w:val="EE0000"/>
+        </w:rPr>
+        <w:t>juros_superiores_plano_safra</w:t>
+      </w:r>
+      <w:proofErr w:type="spellEnd"/>
+      <w:r>
+        <w:rPr>
+          <w:color w:val="EE0000"/>
+        </w:rPr>
+        <w:t>]]</w:t>
+      </w:r>
+    </w:p>
+    <w:p>
+      <w:pPr>
         <w:pStyle w:val="Ttulo2"/>
       </w:pPr>
       <w:bookmarkStart w:id="36" w:name="_Toc227827920"/>
@@ -12552,7 +12759,11 @@
         <w:t xml:space="preserve">é regido por regulamentações específicas, considerando, sobretudo, </w:t>
       </w:r>
       <w:r>
-        <w:t>a importância do setor agropecuário para a economia brasileira</w:t>
+        <w:t xml:space="preserve">a importância do setor agropecuário para a economia </w:t>
+      </w:r>
+      <w:r>
+        <w:lastRenderedPageBreak/>
+        <w:t>brasileira</w:t>
       </w:r>
       <w:r>
         <w:t xml:space="preserve"> e </w:t>
@@ -12637,11 +12848,7 @@
         <w:t xml:space="preserve">, </w:t>
       </w:r>
       <w:r>
-        <w:t xml:space="preserve">juntamente com a Secretaria </w:t>
-      </w:r>
-      <w:r>
-        <w:lastRenderedPageBreak/>
-        <w:t xml:space="preserve">de Política Agrícola do </w:t>
+        <w:t xml:space="preserve">juntamente com a Secretaria de Política Agrícola do </w:t>
       </w:r>
       <w:r>
         <w:t>Ministério da Agricultura, Pecuária e Abastecimento</w:t>
@@ -12942,6 +13149,7 @@
         <w:rPr>
           <w:highlight w:val="yellow"/>
         </w:rPr>
+        <w:lastRenderedPageBreak/>
         <w:t xml:space="preserve">O produtor está enquadrado como </w:t>
       </w:r>
       <w:r>
@@ -13044,7 +13252,6 @@
           <w:highlight w:val="yellow"/>
           <w:lang w:eastAsia="pt-BR"/>
         </w:rPr>
-        <w:lastRenderedPageBreak/>
         <w:t xml:space="preserve">Fonte: </w:t>
       </w:r>
       <w:r>
@@ -13450,6 +13657,7 @@
                 <w:sz w:val="22"/>
                 <w:szCs w:val="22"/>
               </w:rPr>
+              <w:lastRenderedPageBreak/>
               <w:drawing>
                 <wp:inline distT="0" distB="0" distL="0" distR="0" wp14:anchorId="6D745F9E" wp14:editId="35B5908F">
                   <wp:extent cx="5778111" cy="1584149"/>
@@ -13605,7 +13813,6 @@
                 <w:sz w:val="22"/>
                 <w:szCs w:val="22"/>
               </w:rPr>
-              <w:lastRenderedPageBreak/>
               <w:drawing>
                 <wp:inline distT="0" distB="0" distL="0" distR="0" wp14:anchorId="55EE34C2" wp14:editId="6241D96C">
                   <wp:extent cx="5964071" cy="471814"/>
@@ -13971,7 +14178,17 @@
           <w:bCs/>
           <w:u w:val="single"/>
         </w:rPr>
-        <w:t>mantivesse a taxa referente ao Plano Safra ao longo de todo o período de vigência da operação</w:t>
+        <w:t xml:space="preserve">mantivesse a taxa referente </w:t>
+      </w:r>
+      <w:r>
+        <w:rPr>
+          <w:rFonts w:eastAsia="Times New Roman"/>
+          <w:b/>
+          <w:bCs/>
+          <w:u w:val="single"/>
+        </w:rPr>
+        <w:lastRenderedPageBreak/>
+        <w:t>ao Plano Safra ao longo de todo o período de vigência da operação</w:t>
       </w:r>
       <w:r>
         <w:rPr>
@@ -15145,7 +15362,6 @@
           <w:sz w:val="22"/>
           <w:szCs w:val="22"/>
         </w:rPr>
-        <w:lastRenderedPageBreak/>
         <w:t>---------</w:t>
       </w:r>
     </w:p>
@@ -15516,6 +15732,7 @@
           <w:rFonts w:eastAsia="Times New Roman"/>
           <w:lang w:eastAsia="pt-BR"/>
         </w:rPr>
+        <w:lastRenderedPageBreak/>
         <w:t xml:space="preserve">Especificamente, vê-se no Quadro-Resumo das Tabelas e Grupos do Pronaf a respeito do </w:t>
       </w:r>
       <w:r>
@@ -15672,12 +15889,53 @@
     </w:p>
     <w:p>
       <w:pPr>
+        <w:ind w:firstLine="0"/>
+        <w:rPr>
+          <w:color w:val="EE0000"/>
+        </w:rPr>
+      </w:pPr>
+      <w:r>
+        <w:rPr>
+          <w:color w:val="EE0000"/>
+        </w:rPr>
+        <w:t>[[END_BLOCK]]</w:t>
+      </w:r>
+    </w:p>
+    <w:p>
+      <w:pPr>
+        <w:ind w:firstLine="0"/>
+        <w:rPr>
+          <w:color w:val="EE0000"/>
+        </w:rPr>
+      </w:pPr>
+      <w:r>
+        <w:rPr>
+          <w:color w:val="EE0000"/>
+        </w:rPr>
+        <w:t>[[BLOCK juros_superiores_12_aa_</w:t>
+      </w:r>
+      <w:proofErr w:type="gramStart"/>
+      <w:r>
+        <w:rPr>
+          <w:color w:val="EE0000"/>
+        </w:rPr>
+        <w:t>credito</w:t>
+      </w:r>
+      <w:proofErr w:type="gramEnd"/>
+      <w:r>
+        <w:rPr>
+          <w:color w:val="EE0000"/>
+        </w:rPr>
+        <w:t>_rural]]</w:t>
+      </w:r>
+    </w:p>
+    <w:p>
+      <w:pPr>
         <w:pStyle w:val="Ttulo2"/>
       </w:pPr>
       <w:bookmarkStart w:id="37" w:name="_Toc85705516"/>
       <w:bookmarkStart w:id="38" w:name="_Toc227827921"/>
       <w:r>
-        <w:lastRenderedPageBreak/>
         <w:t>Juros remuneratórios superiores à taxa de 12,00% a.a. para operações de crédito rural</w:t>
       </w:r>
       <w:bookmarkEnd w:id="34"/>
@@ -15712,7 +15970,15 @@
           <w:rFonts w:eastAsia="Times New Roman"/>
           <w:highlight w:val="yellow"/>
         </w:rPr>
-        <w:t>Nesse sentido, é preciso avaliar as condições contratuais, principalmente no que diz respeito às cláusulas que gerem “a ausência de um equilíbrio mínimo entre as prestações, o que se traduziria em sacrifício do devedor contraposto a enriquecimento excessivo do credor” (CASTRO, 2007, p. 215)</w:t>
+        <w:t xml:space="preserve">Nesse sentido, é preciso avaliar as condições contratuais, principalmente no que diz respeito às cláusulas que gerem “a ausência de um equilíbrio mínimo entre as prestações, o que </w:t>
+      </w:r>
+      <w:r>
+        <w:rPr>
+          <w:rFonts w:eastAsia="Times New Roman"/>
+          <w:highlight w:val="yellow"/>
+        </w:rPr>
+        <w:lastRenderedPageBreak/>
+        <w:t>se traduziria em sacrifício do devedor contraposto a enriquecimento excessivo do credor” (CASTRO, 2007, p. 215)</w:t>
       </w:r>
       <w:r>
         <w:rPr>
@@ -15937,158 +16203,158 @@
     </w:p>
     <w:p>
       <w:r>
+        <w:t xml:space="preserve">Após analisar a operação em tela, observamos que os encargos financeiros pactuados são compostos de encargos básicos dados pelo IRP e encargos adicionais à taxa de juros de </w:t>
+      </w:r>
+      <w:r>
+        <w:rPr>
+          <w:highlight w:val="yellow"/>
+        </w:rPr>
+        <w:t>13,00% a.a.</w:t>
+      </w:r>
+      <w:r>
+        <w:rPr>
+          <w:rFonts w:eastAsia="Times New Roman"/>
+        </w:rPr>
+        <w:t xml:space="preserve"> </w:t>
+      </w:r>
+      <w:r>
+        <w:t xml:space="preserve"> </w:t>
+      </w:r>
+    </w:p>
+    <w:p>
+      <w:pPr>
+        <w:rPr>
+          <w:rFonts w:eastAsia="Times New Roman"/>
+          <w:lang w:eastAsia="pt-BR"/>
+        </w:rPr>
+      </w:pPr>
+      <w:r>
+        <w:rPr>
+          <w:rFonts w:eastAsia="Times New Roman"/>
+          <w:lang w:eastAsia="pt-BR"/>
+        </w:rPr>
+        <w:t>-----</w:t>
+      </w:r>
+    </w:p>
+    <w:p>
+      <w:pPr>
+        <w:rPr>
+          <w:rFonts w:eastAsia="Times New Roman"/>
+          <w:lang w:eastAsia="pt-BR"/>
+        </w:rPr>
+      </w:pPr>
+      <w:r>
+        <w:rPr>
+          <w:rFonts w:eastAsia="Times New Roman"/>
+          <w:lang w:eastAsia="pt-BR"/>
+        </w:rPr>
+        <w:t xml:space="preserve">Porém, a finalidade do crédito tomado, conforme descrito </w:t>
+      </w:r>
+      <w:r>
+        <w:rPr>
+          <w:rFonts w:eastAsia="Times New Roman"/>
+          <w:highlight w:val="yellow"/>
+          <w:lang w:eastAsia="pt-BR"/>
+        </w:rPr>
+        <w:t xml:space="preserve">no contrato [trazer o excerto do contrato, se for o caso] / </w:t>
+      </w:r>
+      <w:r>
+        <w:rPr>
+          <w:rFonts w:eastAsia="Times New Roman"/>
+          <w:highlight w:val="yellow"/>
+          <w:lang w:eastAsia="pt-BR"/>
+        </w:rPr>
+        <w:t>no tópico “Encadeamento das operações”,</w:t>
+      </w:r>
+      <w:r>
+        <w:rPr>
+          <w:rFonts w:eastAsia="Times New Roman"/>
+          <w:lang w:eastAsia="pt-BR"/>
+        </w:rPr>
+        <w:t xml:space="preserve"> foi para </w:t>
+      </w:r>
+      <w:r>
+        <w:rPr>
+          <w:rFonts w:eastAsia="Times New Roman"/>
+          <w:highlight w:val="yellow"/>
+          <w:lang w:eastAsia="pt-BR"/>
+        </w:rPr>
+        <w:t xml:space="preserve">renegociação </w:t>
+      </w:r>
+      <w:r>
+        <w:rPr>
+          <w:rFonts w:eastAsia="Times New Roman"/>
+          <w:highlight w:val="yellow"/>
+          <w:lang w:eastAsia="pt-BR"/>
+        </w:rPr>
+        <w:t xml:space="preserve">/ obtenção </w:t>
+      </w:r>
+      <w:r>
+        <w:rPr>
+          <w:rFonts w:eastAsia="Times New Roman"/>
+          <w:highlight w:val="yellow"/>
+          <w:lang w:eastAsia="pt-BR"/>
+        </w:rPr>
+        <w:t>de crédito</w:t>
+      </w:r>
+      <w:r>
+        <w:rPr>
+          <w:rFonts w:eastAsia="Times New Roman"/>
+          <w:lang w:eastAsia="pt-BR"/>
+        </w:rPr>
+        <w:t xml:space="preserve"> com a </w:t>
+      </w:r>
+      <w:r>
+        <w:rPr>
+          <w:rFonts w:eastAsia="Times New Roman"/>
+          <w:lang w:eastAsia="pt-BR"/>
+        </w:rPr>
+        <w:t>destinação</w:t>
+      </w:r>
+      <w:r>
+        <w:rPr>
+          <w:rFonts w:eastAsia="Times New Roman"/>
+          <w:lang w:eastAsia="pt-BR"/>
+        </w:rPr>
+        <w:t xml:space="preserve"> rural</w:t>
+      </w:r>
+      <w:r>
+        <w:rPr>
+          <w:rFonts w:eastAsia="Times New Roman"/>
+          <w:lang w:eastAsia="pt-BR"/>
+        </w:rPr>
+        <w:t xml:space="preserve">, especificamente </w:t>
+      </w:r>
+      <w:proofErr w:type="spellStart"/>
+      <w:r>
+        <w:rPr>
+          <w:rFonts w:eastAsia="Times New Roman"/>
+          <w:lang w:eastAsia="pt-BR"/>
+        </w:rPr>
+        <w:t>xxxx</w:t>
+      </w:r>
+      <w:proofErr w:type="spellEnd"/>
+      <w:r>
+        <w:rPr>
+          <w:rFonts w:eastAsia="Times New Roman"/>
+          <w:lang w:eastAsia="pt-BR"/>
+        </w:rPr>
+        <w:t>.</w:t>
+      </w:r>
+    </w:p>
+    <w:p>
+      <w:pPr>
+        <w:rPr>
+          <w:rFonts w:eastAsia="Times New Roman"/>
+          <w:lang w:eastAsia="pt-BR"/>
+        </w:rPr>
+      </w:pPr>
+      <w:r>
+        <w:rPr>
+          <w:rFonts w:eastAsia="Times New Roman"/>
+          <w:lang w:eastAsia="pt-BR"/>
+        </w:rPr>
         <w:lastRenderedPageBreak/>
-        <w:t xml:space="preserve">Após analisar a operação em tela, observamos que os encargos financeiros pactuados são compostos de encargos básicos dados pelo IRP e encargos adicionais à taxa de juros de </w:t>
-      </w:r>
-      <w:r>
-        <w:rPr>
-          <w:highlight w:val="yellow"/>
-        </w:rPr>
-        <w:t>13,00% a.a.</w:t>
-      </w:r>
-      <w:r>
-        <w:rPr>
-          <w:rFonts w:eastAsia="Times New Roman"/>
-        </w:rPr>
-        <w:t xml:space="preserve"> </w:t>
-      </w:r>
-      <w:r>
-        <w:t xml:space="preserve"> </w:t>
-      </w:r>
-    </w:p>
-    <w:p>
-      <w:pPr>
-        <w:rPr>
-          <w:rFonts w:eastAsia="Times New Roman"/>
-          <w:lang w:eastAsia="pt-BR"/>
-        </w:rPr>
-      </w:pPr>
-      <w:r>
-        <w:rPr>
-          <w:rFonts w:eastAsia="Times New Roman"/>
-          <w:lang w:eastAsia="pt-BR"/>
-        </w:rPr>
-        <w:t>-----</w:t>
-      </w:r>
-    </w:p>
-    <w:p>
-      <w:pPr>
-        <w:rPr>
-          <w:rFonts w:eastAsia="Times New Roman"/>
-          <w:lang w:eastAsia="pt-BR"/>
-        </w:rPr>
-      </w:pPr>
-      <w:r>
-        <w:rPr>
-          <w:rFonts w:eastAsia="Times New Roman"/>
-          <w:lang w:eastAsia="pt-BR"/>
-        </w:rPr>
-        <w:t xml:space="preserve">Porém, a finalidade do crédito tomado, conforme descrito </w:t>
-      </w:r>
-      <w:r>
-        <w:rPr>
-          <w:rFonts w:eastAsia="Times New Roman"/>
-          <w:highlight w:val="yellow"/>
-          <w:lang w:eastAsia="pt-BR"/>
-        </w:rPr>
-        <w:t xml:space="preserve">no contrato [trazer o excerto do contrato, se for o caso] / </w:t>
-      </w:r>
-      <w:r>
-        <w:rPr>
-          <w:rFonts w:eastAsia="Times New Roman"/>
-          <w:highlight w:val="yellow"/>
-          <w:lang w:eastAsia="pt-BR"/>
-        </w:rPr>
-        <w:t>no tópico “Encadeamento das operações”,</w:t>
-      </w:r>
-      <w:r>
-        <w:rPr>
-          <w:rFonts w:eastAsia="Times New Roman"/>
-          <w:lang w:eastAsia="pt-BR"/>
-        </w:rPr>
-        <w:t xml:space="preserve"> foi para </w:t>
-      </w:r>
-      <w:r>
-        <w:rPr>
-          <w:rFonts w:eastAsia="Times New Roman"/>
-          <w:highlight w:val="yellow"/>
-          <w:lang w:eastAsia="pt-BR"/>
-        </w:rPr>
-        <w:t xml:space="preserve">renegociação </w:t>
-      </w:r>
-      <w:r>
-        <w:rPr>
-          <w:rFonts w:eastAsia="Times New Roman"/>
-          <w:highlight w:val="yellow"/>
-          <w:lang w:eastAsia="pt-BR"/>
-        </w:rPr>
-        <w:t xml:space="preserve">/ obtenção </w:t>
-      </w:r>
-      <w:r>
-        <w:rPr>
-          <w:rFonts w:eastAsia="Times New Roman"/>
-          <w:highlight w:val="yellow"/>
-          <w:lang w:eastAsia="pt-BR"/>
-        </w:rPr>
-        <w:t>de crédito</w:t>
-      </w:r>
-      <w:r>
-        <w:rPr>
-          <w:rFonts w:eastAsia="Times New Roman"/>
-          <w:lang w:eastAsia="pt-BR"/>
-        </w:rPr>
-        <w:t xml:space="preserve"> com a </w:t>
-      </w:r>
-      <w:r>
-        <w:rPr>
-          <w:rFonts w:eastAsia="Times New Roman"/>
-          <w:lang w:eastAsia="pt-BR"/>
-        </w:rPr>
-        <w:t>destinação</w:t>
-      </w:r>
-      <w:r>
-        <w:rPr>
-          <w:rFonts w:eastAsia="Times New Roman"/>
-          <w:lang w:eastAsia="pt-BR"/>
-        </w:rPr>
-        <w:t xml:space="preserve"> rural</w:t>
-      </w:r>
-      <w:r>
-        <w:rPr>
-          <w:rFonts w:eastAsia="Times New Roman"/>
-          <w:lang w:eastAsia="pt-BR"/>
-        </w:rPr>
-        <w:t xml:space="preserve">, especificamente </w:t>
-      </w:r>
-      <w:proofErr w:type="spellStart"/>
-      <w:r>
-        <w:rPr>
-          <w:rFonts w:eastAsia="Times New Roman"/>
-          <w:lang w:eastAsia="pt-BR"/>
-        </w:rPr>
-        <w:t>xxxx</w:t>
-      </w:r>
-      <w:proofErr w:type="spellEnd"/>
-      <w:r>
-        <w:rPr>
-          <w:rFonts w:eastAsia="Times New Roman"/>
-          <w:lang w:eastAsia="pt-BR"/>
-        </w:rPr>
-        <w:t>.</w:t>
-      </w:r>
-    </w:p>
-    <w:p>
-      <w:pPr>
-        <w:rPr>
-          <w:rFonts w:eastAsia="Times New Roman"/>
-          <w:lang w:eastAsia="pt-BR"/>
-        </w:rPr>
-      </w:pPr>
-      <w:r>
-        <w:rPr>
-          <w:rFonts w:eastAsia="Times New Roman"/>
-          <w:lang w:eastAsia="pt-BR"/>
-        </w:rPr>
         <w:t>--------</w:t>
       </w:r>
     </w:p>
@@ -16399,7 +16665,6 @@
         <w:pStyle w:val="Citaodireta"/>
       </w:pPr>
       <w:r>
-        <w:lastRenderedPageBreak/>
         <w:t>Art. 47 (Código de Defesa do Consumidor). As cláusulas contratuais serão interpretadas de maneira mais favorável ao consumidor.</w:t>
       </w:r>
     </w:p>
@@ -16496,6 +16761,7 @@
           <w:highlight w:val="cyan"/>
           <w:lang w:eastAsia="pt-BR"/>
         </w:rPr>
+        <w:lastRenderedPageBreak/>
         <w:t>Porém, a finalidade do crédito tomado foi para obtenção de crédito com a finalidade rural, a partir da linha de crédito para agronegócio BB Giro Agro.</w:t>
       </w:r>
     </w:p>
@@ -16688,43 +16954,36 @@
           <w:rFonts w:eastAsia="Times New Roman"/>
           <w:highlight w:val="yellow"/>
         </w:rPr>
-        <w:t xml:space="preserve">, à medida que sendo recursos </w:t>
-      </w:r>
-      <w:r>
-        <w:rPr>
-          <w:rFonts w:eastAsia="Times New Roman"/>
-          <w:highlight w:val="yellow"/>
+        <w:t>, à medida que sendo recursos para a atividade rural, indicar que se trata de simples ato cooperativo pode ser entendido como mero estratagema para justificar aplicações de taxas significativamente elevadas.</w:t>
+      </w:r>
+    </w:p>
+    <w:p>
+      <w:pPr>
+        <w:rPr>
+          <w:rFonts w:eastAsia="Times New Roman"/>
+        </w:rPr>
+      </w:pPr>
+      <w:r>
+        <w:rPr>
+          <w:rFonts w:eastAsia="Times New Roman"/>
+          <w:highlight w:val="yellow"/>
+        </w:rPr>
+        <w:t>Não obstante, tratando-se de crédito rural, a cooperativa deveria orientar a contratação do crédito na modalidade específica, em atenção ao dever de informação. Muito pelo contrário, a cooperativa se beneficiou da desvantagem informacional do produtor, ao fornecer linhas de crédito diversas, o que a permitiu estipular juros remuneratórios muito além do limite legal, de 12% a.a. para operações rurais, em total prejuízo ao fluxo de caixa.</w:t>
+      </w:r>
+    </w:p>
+    <w:p>
+      <w:pPr>
+        <w:rPr>
+          <w:rFonts w:eastAsia="Times New Roman"/>
+          <w:lang w:eastAsia="pt-BR"/>
+        </w:rPr>
+      </w:pPr>
+      <w:r>
+        <w:rPr>
+          <w:rFonts w:eastAsia="Times New Roman"/>
+          <w:lang w:eastAsia="pt-BR"/>
         </w:rPr>
         <w:lastRenderedPageBreak/>
-        <w:t>para a atividade rural, indicar que se trata de simples ato cooperativo pode ser entendido como mero estratagema para justificar aplicações de taxas significativamente elevadas.</w:t>
-      </w:r>
-    </w:p>
-    <w:p>
-      <w:pPr>
-        <w:rPr>
-          <w:rFonts w:eastAsia="Times New Roman"/>
-        </w:rPr>
-      </w:pPr>
-      <w:r>
-        <w:rPr>
-          <w:rFonts w:eastAsia="Times New Roman"/>
-          <w:highlight w:val="yellow"/>
-        </w:rPr>
-        <w:t>Não obstante, tratando-se de crédito rural, a cooperativa deveria orientar a contratação do crédito na modalidade específica, em atenção ao dever de informação. Muito pelo contrário, a cooperativa se beneficiou da desvantagem informacional do produtor, ao fornecer linhas de crédito diversas, o que a permitiu estipular juros remuneratórios muito além do limite legal, de 12% a.a. para operações rurais, em total prejuízo ao fluxo de caixa.</w:t>
-      </w:r>
-    </w:p>
-    <w:p>
-      <w:pPr>
-        <w:rPr>
-          <w:rFonts w:eastAsia="Times New Roman"/>
-          <w:lang w:eastAsia="pt-BR"/>
-        </w:rPr>
-      </w:pPr>
-      <w:r>
-        <w:rPr>
-          <w:rFonts w:eastAsia="Times New Roman"/>
-          <w:lang w:eastAsia="pt-BR"/>
-        </w:rPr>
         <w:t>----</w:t>
       </w:r>
     </w:p>
@@ -17018,7 +17277,6 @@
                 <w:sz w:val="22"/>
                 <w:szCs w:val="22"/>
               </w:rPr>
-              <w:lastRenderedPageBreak/>
               <w:drawing>
                 <wp:inline distT="0" distB="0" distL="0" distR="0" wp14:anchorId="7AACB63F" wp14:editId="4ED89349">
                   <wp:extent cx="5788549" cy="1389771"/>
@@ -17118,7 +17376,14 @@
         <w:rPr>
           <w:rFonts w:eastAsia="Times New Roman"/>
         </w:rPr>
-        <w:t>. Trata-se, portanto, de legítima operação de crédito rural, sendo que a cooperativa deveria orientar a contratação do crédito na modalidade específica, em atenção ao dever de informação. Muito pelo contrário, a cooperativa se beneficiou da desvantagem informacional do produtor, ao fornecer linhas de crédito diversas, o que a permitiu estipular juros remuneratórios muito além do limite legal, de 12% a.a. para operações rurais, em total prejuízo ao fluxo de caixa.</w:t>
+        <w:t xml:space="preserve">. Trata-se, portanto, de legítima operação de crédito rural, sendo que a cooperativa deveria orientar a contratação do crédito na modalidade específica, em atenção ao </w:t>
+      </w:r>
+      <w:r>
+        <w:rPr>
+          <w:rFonts w:eastAsia="Times New Roman"/>
+        </w:rPr>
+        <w:lastRenderedPageBreak/>
+        <w:t>dever de informação. Muito pelo contrário, a cooperativa se beneficiou da desvantagem informacional do produtor, ao fornecer linhas de crédito diversas, o que a permitiu estipular juros remuneratórios muito além do limite legal, de 12% a.a. para operações rurais, em total prejuízo ao fluxo de caixa.</w:t>
       </w:r>
     </w:p>
     <w:p>
@@ -17196,7 +17461,6 @@
         <w:rPr>
           <w:rFonts w:eastAsia="Times New Roman"/>
         </w:rPr>
-        <w:lastRenderedPageBreak/>
         <w:t>Sabe-se que em operações de crédito rural, há limitação de juros a 12% a.a., bem como os juros moratórios não podem exceder 1% ao ano (</w:t>
       </w:r>
       <w:proofErr w:type="spellStart"/>
@@ -17271,7 +17535,11 @@
         <w:t>, diante da omissão do CMN, ficam sujeitas à limitação de 12% ao ano, prevista no Decreto 22.626/33 (Lei da Usura</w:t>
       </w:r>
       <w:r>
-        <w:t xml:space="preserve">). 2. Agravo interno a que se nega provimento. (STJ - </w:t>
+        <w:t xml:space="preserve">). 2. Agravo </w:t>
+      </w:r>
+      <w:r>
+        <w:lastRenderedPageBreak/>
+        <w:t xml:space="preserve">interno a que se nega provimento. (STJ - </w:t>
       </w:r>
       <w:proofErr w:type="spellStart"/>
       <w:r>
@@ -17418,11 +17686,7 @@
         <w:pStyle w:val="Citaodireta"/>
       </w:pPr>
       <w:r>
-        <w:t xml:space="preserve">5. O art. 5º do Decreto-Lei nº 167/1967, ao determinar que as taxas de juros remuneratórios devem obedecer ao limite fixado pelo CMN, sem </w:t>
-      </w:r>
-      <w:r>
-        <w:lastRenderedPageBreak/>
-        <w:t xml:space="preserve">ressalvas quanto à possibilidade de livre pactuação, </w:t>
+        <w:t xml:space="preserve">5. O art. 5º do Decreto-Lei nº 167/1967, ao determinar que as taxas de juros remuneratórios devem obedecer ao limite fixado pelo CMN, sem ressalvas quanto à possibilidade de livre pactuação, </w:t>
       </w:r>
       <w:r>
         <w:rPr>
@@ -17476,6 +17740,7 @@
         <w:pStyle w:val="Citaodireta"/>
       </w:pPr>
       <w:r>
+        <w:lastRenderedPageBreak/>
         <w:t xml:space="preserve">(REsp n. 1.940.292/PR, relatora Ministra Nancy Andrighi, Terceira Turma, julgado em 3/5/2022, </w:t>
       </w:r>
       <w:proofErr w:type="spellStart"/>
@@ -17845,30 +18110,54 @@
       <w:r>
         <w:rPr>
           <w:rFonts w:eastAsia="Times New Roman"/>
-          <w:highlight w:val="yellow"/>
-        </w:rPr>
-        <w:t xml:space="preserve">o produtor / </w:t>
-      </w:r>
-      <w:r>
-        <w:rPr>
-          <w:rFonts w:eastAsia="Times New Roman"/>
-          <w:highlight w:val="yellow"/>
-        </w:rPr>
-        <w:t>a produtora em uma situação econômica atípica.</w:t>
-      </w:r>
-    </w:p>
-    <w:p>
-      <w:pPr>
-        <w:rPr>
-          <w:rFonts w:eastAsia="Times New Roman"/>
-        </w:rPr>
-      </w:pPr>
-      <w:r>
-        <w:rPr>
-          <w:rFonts w:eastAsia="Times New Roman"/>
-          <w:highlight w:val="yellow"/>
-        </w:rPr>
-        <w:lastRenderedPageBreak/>
+          <w:highlight w:val="green"/>
+        </w:rPr>
+        <w:t>{{</w:t>
+      </w:r>
+      <w:proofErr w:type="spellStart"/>
+      <w:r>
+        <w:rPr>
+          <w:rFonts w:eastAsia="Times New Roman"/>
+          <w:highlight w:val="green"/>
+        </w:rPr>
+        <w:t>produtor_</w:t>
+      </w:r>
+      <w:proofErr w:type="gramStart"/>
+      <w:r>
+        <w:rPr>
+          <w:rFonts w:eastAsia="Times New Roman"/>
+          <w:highlight w:val="green"/>
+        </w:rPr>
+        <w:t>genero.sujeito</w:t>
+      </w:r>
+      <w:proofErr w:type="spellEnd"/>
+      <w:proofErr w:type="gramEnd"/>
+      <w:r>
+        <w:rPr>
+          <w:rFonts w:eastAsia="Times New Roman"/>
+          <w:highlight w:val="green"/>
+        </w:rPr>
+        <w:t>}}</w:t>
+      </w:r>
+      <w:r>
+        <w:rPr>
+          <w:rFonts w:eastAsia="Times New Roman"/>
+          <w:highlight w:val="yellow"/>
+        </w:rPr>
+        <w:t xml:space="preserve"> em uma situação econômica atípica.</w:t>
+      </w:r>
+    </w:p>
+    <w:p>
+      <w:pPr>
+        <w:rPr>
+          <w:rFonts w:eastAsia="Times New Roman"/>
+        </w:rPr>
+      </w:pPr>
+      <w:r>
+        <w:rPr>
+          <w:rFonts w:eastAsia="Times New Roman"/>
+          <w:highlight w:val="yellow"/>
+        </w:rPr>
         <w:t>Portanto, no recálculo da operação, os encargos financeiros totais (básicos e adicionais) foram limitados a 12,00% a.a.</w:t>
       </w:r>
     </w:p>
@@ -17922,6 +18211,48 @@
           <w:rFonts w:eastAsia="Times New Roman"/>
         </w:rPr>
         <w:t>12,00% a.a.</w:t>
+      </w:r>
+    </w:p>
+    <w:p>
+      <w:pPr>
+        <w:ind w:firstLine="0"/>
+        <w:rPr>
+          <w:color w:val="EE0000"/>
+        </w:rPr>
+      </w:pPr>
+      <w:r>
+        <w:rPr>
+          <w:color w:val="EE0000"/>
+        </w:rPr>
+        <w:t>[[END_BLOCK]]</w:t>
+      </w:r>
+    </w:p>
+    <w:p>
+      <w:pPr>
+        <w:ind w:firstLine="0"/>
+        <w:rPr>
+          <w:color w:val="EE0000"/>
+        </w:rPr>
+      </w:pPr>
+      <w:r>
+        <w:rPr>
+          <w:color w:val="EE0000"/>
+        </w:rPr>
+        <w:t xml:space="preserve">[[BLOCK </w:t>
+      </w:r>
+      <w:proofErr w:type="spellStart"/>
+      <w:r>
+        <w:rPr>
+          <w:color w:val="EE0000"/>
+        </w:rPr>
+        <w:t>cdi_com_substituicao_indevida</w:t>
+      </w:r>
+      <w:proofErr w:type="spellEnd"/>
+      <w:r>
+        <w:rPr>
+          <w:color w:val="EE0000"/>
+        </w:rPr>
+        <w:t>]]</w:t>
       </w:r>
     </w:p>
     <w:p>
@@ -17938,6 +18269,7 @@
         <w:rPr>
           <w:highlight w:val="cyan"/>
         </w:rPr>
+        <w:lastRenderedPageBreak/>
         <w:t>Ilegalidade e Onerosidade excessiva: Utilização de CDI como encargo remuneratório e substituição indevida pelo IGP-M (FGV)</w:t>
       </w:r>
       <w:bookmarkEnd w:id="39"/>
@@ -18327,82 +18659,124 @@
           <w:szCs w:val="23"/>
           <w:lang w:eastAsia="pt-BR"/>
         </w:rPr>
+        <w:t>MEDIDA LIMINAR, Processo: 0004419-36.2019.8.16.0112 – Mov. 17.1.</w:t>
+      </w:r>
+    </w:p>
+    <w:p>
+      <w:pPr>
+        <w:rPr>
+          <w:rFonts w:eastAsia="Times New Roman"/>
+          <w:lang w:eastAsia="pt-BR"/>
+        </w:rPr>
+      </w:pPr>
+      <w:r>
+        <w:rPr>
+          <w:rFonts w:eastAsia="Times New Roman"/>
+          <w:lang w:eastAsia="pt-BR"/>
+        </w:rPr>
+        <w:t>S</w:t>
+      </w:r>
+      <w:r>
+        <w:rPr>
+          <w:rFonts w:eastAsia="Times New Roman"/>
+          <w:lang w:eastAsia="pt-BR"/>
+        </w:rPr>
+        <w:t xml:space="preserve">abendo da irregularidade da cobrança de CDI, no demonstrativo apresentado, verificou-se a instituição financeira pratica a cobrança dos encargos básicos com base na variação </w:t>
+      </w:r>
+      <w:r>
+        <w:rPr>
+          <w:rFonts w:eastAsia="Times New Roman"/>
+          <w:highlight w:val="yellow"/>
+          <w:lang w:eastAsia="pt-BR"/>
+        </w:rPr>
+        <w:t>do IGP-M (FGV).</w:t>
+      </w:r>
+      <w:r>
+        <w:rPr>
+          <w:rFonts w:eastAsia="Times New Roman"/>
+          <w:lang w:eastAsia="pt-BR"/>
+        </w:rPr>
+        <w:t xml:space="preserve"> No entanto, tal encargo não foi pactuado em contrato, tornando-o indevido.</w:t>
+      </w:r>
+    </w:p>
+    <w:p>
+      <w:pPr>
+        <w:rPr>
+          <w:rFonts w:eastAsia="Times New Roman"/>
+          <w:lang w:eastAsia="pt-BR"/>
+        </w:rPr>
+      </w:pPr>
+      <w:r>
+        <w:rPr>
+          <w:rFonts w:eastAsia="Times New Roman"/>
+          <w:lang w:eastAsia="pt-BR"/>
+        </w:rPr>
+        <w:t xml:space="preserve">Desse modo, entende que os encargos básicos devem ser expurgados, sejam eles dados pelo CDI (dado que sua cobrança é indevida), sejam eles dados pelo </w:t>
+      </w:r>
+      <w:r>
+        <w:rPr>
+          <w:rFonts w:eastAsia="Times New Roman"/>
+          <w:highlight w:val="yellow"/>
+          <w:lang w:eastAsia="pt-BR"/>
+        </w:rPr>
+        <w:t>IGP-M</w:t>
+      </w:r>
+      <w:r>
+        <w:rPr>
+          <w:rFonts w:eastAsia="Times New Roman"/>
+          <w:lang w:eastAsia="pt-BR"/>
+        </w:rPr>
+        <w:t xml:space="preserve"> (uma vez que não está previsto em </w:t>
+      </w:r>
+      <w:r>
+        <w:rPr>
+          <w:rFonts w:eastAsia="Times New Roman"/>
+          <w:lang w:eastAsia="pt-BR"/>
+        </w:rPr>
+        <w:t>contrato).</w:t>
+      </w:r>
+    </w:p>
+    <w:p>
+      <w:pPr>
+        <w:ind w:firstLine="0"/>
+        <w:rPr>
+          <w:color w:val="EE0000"/>
+        </w:rPr>
+      </w:pPr>
+      <w:r>
+        <w:rPr>
+          <w:color w:val="EE0000"/>
+        </w:rPr>
+        <w:t>[[END_BLOCK]]</w:t>
+      </w:r>
+    </w:p>
+    <w:p>
+      <w:pPr>
+        <w:ind w:firstLine="0"/>
+        <w:rPr>
+          <w:color w:val="EE0000"/>
+        </w:rPr>
+      </w:pPr>
+      <w:r>
+        <w:rPr>
+          <w:color w:val="EE0000"/>
+        </w:rPr>
         <w:lastRenderedPageBreak/>
-        <w:t>MEDIDA LIMINAR, Processo: 0004419-36.2019.8.16.0112 – Mov. 17.1.</w:t>
-      </w:r>
-    </w:p>
-    <w:p>
-      <w:pPr>
-        <w:rPr>
-          <w:rFonts w:eastAsia="Times New Roman"/>
-          <w:lang w:eastAsia="pt-BR"/>
-        </w:rPr>
-      </w:pPr>
-      <w:r>
-        <w:rPr>
-          <w:rFonts w:eastAsia="Times New Roman"/>
-          <w:lang w:eastAsia="pt-BR"/>
-        </w:rPr>
-        <w:t>S</w:t>
-      </w:r>
-      <w:r>
-        <w:rPr>
-          <w:rFonts w:eastAsia="Times New Roman"/>
-          <w:lang w:eastAsia="pt-BR"/>
-        </w:rPr>
-        <w:t xml:space="preserve">abendo da irregularidade da cobrança de CDI, no demonstrativo apresentado, verificou-se a instituição financeira pratica a cobrança dos encargos básicos com base na variação </w:t>
-      </w:r>
-      <w:r>
-        <w:rPr>
-          <w:rFonts w:eastAsia="Times New Roman"/>
-          <w:highlight w:val="yellow"/>
-          <w:lang w:eastAsia="pt-BR"/>
-        </w:rPr>
-        <w:t>do IGP-M (FGV).</w:t>
-      </w:r>
-      <w:r>
-        <w:rPr>
-          <w:rFonts w:eastAsia="Times New Roman"/>
-          <w:lang w:eastAsia="pt-BR"/>
-        </w:rPr>
-        <w:t xml:space="preserve"> No entanto, tal encargo não foi pactuado em contrato, tornando-o indevido.</w:t>
-      </w:r>
-    </w:p>
-    <w:p>
-      <w:pPr>
-        <w:rPr>
-          <w:rFonts w:eastAsia="Times New Roman"/>
-          <w:lang w:eastAsia="pt-BR"/>
-        </w:rPr>
-      </w:pPr>
-      <w:r>
-        <w:rPr>
-          <w:rFonts w:eastAsia="Times New Roman"/>
-          <w:lang w:eastAsia="pt-BR"/>
-        </w:rPr>
-        <w:t xml:space="preserve">Desse modo, entende que os encargos básicos devem ser expurgados, sejam eles dados pelo CDI (dado que sua cobrança é indevida), sejam eles dados pelo </w:t>
-      </w:r>
-      <w:r>
-        <w:rPr>
-          <w:rFonts w:eastAsia="Times New Roman"/>
-          <w:highlight w:val="yellow"/>
-          <w:lang w:eastAsia="pt-BR"/>
-        </w:rPr>
-        <w:t>IGP-M</w:t>
-      </w:r>
-      <w:r>
-        <w:rPr>
-          <w:rFonts w:eastAsia="Times New Roman"/>
-          <w:lang w:eastAsia="pt-BR"/>
-        </w:rPr>
-        <w:t xml:space="preserve"> (uma vez que não está previsto em </w:t>
-      </w:r>
-      <w:r>
-        <w:rPr>
-          <w:rFonts w:eastAsia="Times New Roman"/>
-          <w:lang w:eastAsia="pt-BR"/>
-        </w:rPr>
-        <w:t>contrato).</w:t>
+        <w:t xml:space="preserve">[[BLOCK </w:t>
+      </w:r>
+      <w:proofErr w:type="spellStart"/>
+      <w:r>
+        <w:rPr>
+          <w:color w:val="EE0000"/>
+        </w:rPr>
+        <w:t>cdi_como_encargo_remuneratorio</w:t>
+      </w:r>
+      <w:proofErr w:type="spellEnd"/>
+      <w:r>
+        <w:rPr>
+          <w:color w:val="EE0000"/>
+        </w:rPr>
+        <w:t>]]</w:t>
       </w:r>
     </w:p>
     <w:p>
@@ -18807,29 +19181,36 @@
           <w:rFonts w:eastAsia="Times New Roman"/>
           <w:lang w:eastAsia="pt-BR"/>
         </w:rPr>
+        <w:tab/>
+      </w:r>
+      <w:r>
+        <w:rPr>
+          <w:rFonts w:eastAsia="Times New Roman"/>
+          <w:lang w:eastAsia="pt-BR"/>
+        </w:rPr>
+        <w:t>Diante da abusividade da cobrança de encargos remuneratórios com base no CDI, afastou-se a sua cobrança nos recálculos realizados.</w:t>
+      </w:r>
+    </w:p>
+    <w:p>
+      <w:pPr>
+        <w:rPr>
+          <w:rFonts w:eastAsia="Times New Roman"/>
+        </w:rPr>
+      </w:pPr>
+      <w:r>
+        <w:rPr>
+          <w:rFonts w:eastAsia="Times New Roman"/>
+          <w:highlight w:val="cyan"/>
+        </w:rPr>
+        <w:t xml:space="preserve">O equilíbrio da relação contratual é um dos princípios de uma sociedade justa e ética, em que os membros partícipes do conjunto objetivam a melhoria do todo e não apenas o desenvolvimento próprio em detrimento de outrem. Nesse sentido, é preciso avaliar as condições contratuais, principalmente no que diz respeito às cláusulas que gerem “a ausência de um </w:t>
+      </w:r>
+      <w:r>
+        <w:rPr>
+          <w:rFonts w:eastAsia="Times New Roman"/>
+          <w:highlight w:val="cyan"/>
+        </w:rPr>
         <w:lastRenderedPageBreak/>
-        <w:tab/>
-      </w:r>
-      <w:r>
-        <w:rPr>
-          <w:rFonts w:eastAsia="Times New Roman"/>
-          <w:lang w:eastAsia="pt-BR"/>
-        </w:rPr>
-        <w:t>Diante da abusividade da cobrança de encargos remuneratórios com base no CDI, afastou-se a sua cobrança nos recálculos realizados.</w:t>
-      </w:r>
-    </w:p>
-    <w:p>
-      <w:pPr>
-        <w:rPr>
-          <w:rFonts w:eastAsia="Times New Roman"/>
-        </w:rPr>
-      </w:pPr>
-      <w:r>
-        <w:rPr>
-          <w:rFonts w:eastAsia="Times New Roman"/>
-          <w:highlight w:val="cyan"/>
-        </w:rPr>
-        <w:t>O equilíbrio da relação contratual é um dos princípios de uma sociedade justa e ética, em que os membros partícipes do conjunto objetivam a melhoria do todo e não apenas o desenvolvimento próprio em detrimento de outrem. Nesse sentido, é preciso avaliar as condições contratuais, principalmente no que diz respeito às cláusulas que gerem “a ausência de um equilíbrio mínimo entre as prestações, o que se traduziria em sacrifício do devedor contraposto a enriquecimento excessivo do credor” (CASTRO, 2007, p. 215)</w:t>
+        <w:t>equilíbrio mínimo entre as prestações, o que se traduziria em sacrifício do devedor contraposto a enriquecimento excessivo do credor” (CASTRO, 2007, p. 215)</w:t>
       </w:r>
       <w:r>
         <w:rPr>
@@ -19143,7 +19524,6 @@
           <w:szCs w:val="23"/>
           <w:highlight w:val="yellow"/>
         </w:rPr>
-        <w:lastRenderedPageBreak/>
         <w:t xml:space="preserve">Fonte: </w:t>
       </w:r>
       <w:r>
@@ -19214,7 +19594,16 @@
           <w:highlight w:val="yellow"/>
           <w:lang w:eastAsia="pt-BR"/>
         </w:rPr>
-        <w:t xml:space="preserve"> em alguns períodos, não corresponde efetivamente à variação do poder de compra: mesmo quando o INPC apresentou valores negativos (deflação), o CDI continuou aumentando. Assim também se manifesta a jurisprudência:</w:t>
+        <w:t xml:space="preserve"> em alguns períodos, não corresponde efetivamente à variação do poder de compra: </w:t>
+      </w:r>
+      <w:r>
+        <w:rPr>
+          <w:rFonts w:eastAsia="Times New Roman"/>
+          <w:highlight w:val="yellow"/>
+          <w:lang w:eastAsia="pt-BR"/>
+        </w:rPr>
+        <w:lastRenderedPageBreak/>
+        <w:t>mesmo quando o INPC apresentou valores negativos (deflação), o CDI continuou aumentando. Assim também se manifesta a jurisprudência:</w:t>
       </w:r>
     </w:p>
     <w:p>
@@ -19420,6 +19809,48 @@
     </w:p>
     <w:p>
       <w:pPr>
+        <w:ind w:firstLine="0"/>
+        <w:rPr>
+          <w:color w:val="EE0000"/>
+        </w:rPr>
+      </w:pPr>
+      <w:r>
+        <w:rPr>
+          <w:color w:val="EE0000"/>
+        </w:rPr>
+        <w:t>[[END_BLOCK]]</w:t>
+      </w:r>
+    </w:p>
+    <w:p>
+      <w:pPr>
+        <w:ind w:firstLine="0"/>
+        <w:rPr>
+          <w:color w:val="EE0000"/>
+        </w:rPr>
+      </w:pPr>
+      <w:r>
+        <w:rPr>
+          <w:color w:val="EE0000"/>
+        </w:rPr>
+        <w:t xml:space="preserve">[[BLOCK </w:t>
+      </w:r>
+      <w:proofErr w:type="spellStart"/>
+      <w:r>
+        <w:rPr>
+          <w:color w:val="EE0000"/>
+        </w:rPr>
+        <w:t>taxa_superior_contrato_originario</w:t>
+      </w:r>
+      <w:proofErr w:type="spellEnd"/>
+      <w:r>
+        <w:rPr>
+          <w:color w:val="EE0000"/>
+        </w:rPr>
+        <w:t>]]</w:t>
+      </w:r>
+    </w:p>
+    <w:p>
+      <w:pPr>
         <w:pStyle w:val="Ttulo2"/>
       </w:pPr>
       <w:bookmarkStart w:id="42" w:name="_Toc65841219"/>
@@ -19493,9 +19924,34 @@
       <w:r>
         <w:rPr>
           <w:rFonts w:eastAsia="Times New Roman"/>
-          <w:highlight w:val="yellow"/>
-        </w:rPr>
-        <w:t>o produtor</w:t>
+          <w:highlight w:val="green"/>
+        </w:rPr>
+        <w:t>{{</w:t>
+      </w:r>
+      <w:proofErr w:type="spellStart"/>
+      <w:r>
+        <w:rPr>
+          <w:rFonts w:eastAsia="Times New Roman"/>
+          <w:highlight w:val="green"/>
+        </w:rPr>
+        <w:t>produtor_</w:t>
+      </w:r>
+      <w:proofErr w:type="gramStart"/>
+      <w:r>
+        <w:rPr>
+          <w:rFonts w:eastAsia="Times New Roman"/>
+          <w:highlight w:val="green"/>
+        </w:rPr>
+        <w:t>genero.sujeito</w:t>
+      </w:r>
+      <w:proofErr w:type="spellEnd"/>
+      <w:proofErr w:type="gramEnd"/>
+      <w:r>
+        <w:rPr>
+          <w:rFonts w:eastAsia="Times New Roman"/>
+          <w:highlight w:val="green"/>
+        </w:rPr>
+        <w:t>}}</w:t>
       </w:r>
       <w:r>
         <w:rPr>
@@ -19613,7 +20069,6 @@
           <w:sz w:val="22"/>
           <w:szCs w:val="22"/>
         </w:rPr>
-        <w:lastRenderedPageBreak/>
         <w:t xml:space="preserve">Fonte: </w:t>
       </w:r>
       <w:r>
@@ -19721,7 +20176,15 @@
           <w:rFonts w:eastAsia="Times New Roman"/>
           <w:highlight w:val="yellow"/>
         </w:rPr>
-        <w:t>/ Os encargos financeiros pactuados na renegociação foram compostos de encargos adicionais de xxx,00%, além de encargos básicos dados pela remuneração do IRP.</w:t>
+        <w:t xml:space="preserve">/ Os encargos financeiros pactuados na renegociação </w:t>
+      </w:r>
+      <w:r>
+        <w:rPr>
+          <w:rFonts w:eastAsia="Times New Roman"/>
+          <w:highlight w:val="yellow"/>
+        </w:rPr>
+        <w:lastRenderedPageBreak/>
+        <w:t>foram compostos de encargos adicionais de xxx,00%, além de encargos básicos dados pela remuneração do IRP.</w:t>
       </w:r>
       <w:r>
         <w:rPr>
@@ -20178,16 +20641,34 @@
       <w:r>
         <w:rPr>
           <w:rFonts w:eastAsia="Times New Roman"/>
-          <w:highlight w:val="yellow"/>
-        </w:rPr>
-        <w:t xml:space="preserve">o produtor / </w:t>
-      </w:r>
-      <w:r>
-        <w:rPr>
-          <w:rFonts w:eastAsia="Times New Roman"/>
-          <w:highlight w:val="yellow"/>
-        </w:rPr>
-        <w:t>a produtora</w:t>
+          <w:highlight w:val="green"/>
+        </w:rPr>
+        <w:t>{{</w:t>
+      </w:r>
+      <w:proofErr w:type="spellStart"/>
+      <w:r>
+        <w:rPr>
+          <w:rFonts w:eastAsia="Times New Roman"/>
+          <w:highlight w:val="green"/>
+        </w:rPr>
+        <w:t>produtor_</w:t>
+      </w:r>
+      <w:proofErr w:type="gramStart"/>
+      <w:r>
+        <w:rPr>
+          <w:rFonts w:eastAsia="Times New Roman"/>
+          <w:highlight w:val="green"/>
+        </w:rPr>
+        <w:t>genero.sujeito</w:t>
+      </w:r>
+      <w:proofErr w:type="spellEnd"/>
+      <w:proofErr w:type="gramEnd"/>
+      <w:r>
+        <w:rPr>
+          <w:rFonts w:eastAsia="Times New Roman"/>
+          <w:highlight w:val="green"/>
+        </w:rPr>
+        <w:t>}}</w:t>
       </w:r>
       <w:r>
         <w:rPr>
@@ -20231,18 +20712,15 @@
         <w:t xml:space="preserve">(NO CASO, 3% AO ANO). </w:t>
       </w:r>
       <w:r>
-        <w:t xml:space="preserve">EXTINÇÃO DA EXECUÇÃO DESCABIDA. INADIMPLEMENTO INCONTROVERSO. MERA </w:t>
-      </w:r>
+        <w:t>EXTINÇÃO DA EXECUÇÃO DESCABIDA. INADIMPLEMENTO INCONTROVERSO. MERA DESCONFIGURAÇÃO DA MORA E READEQUAÇÃO DOS CÁLCULOS. JUROS MORATÓRIOS QUE DEVEM SER LIMITADOS A 1% AO ANO. ART. 5º DO DL 167/67. REDISTRIBUIÇÃO DA SUCUMBÊNCIA. EMBARGOS PARCIALMENTE PROCEDENTES.APELAÇÃO CONHECIDA E PARCIALMENTE PROVIDA.</w:t>
+      </w:r>
+    </w:p>
+    <w:p>
+      <w:pPr>
+        <w:pStyle w:val="Citaodireta"/>
+      </w:pPr>
       <w:r>
         <w:lastRenderedPageBreak/>
-        <w:t>DESCONFIGURAÇÃO DA MORA E READEQUAÇÃO DOS CÁLCULOS. JUROS MORATÓRIOS QUE DEVEM SER LIMITADOS A 1% AO ANO. ART. 5º DO DL 167/67. REDISTRIBUIÇÃO DA SUCUMBÊNCIA. EMBARGOS PARCIALMENTE PROCEDENTES.APELAÇÃO CONHECIDA E PARCIALMENTE PROVIDA.</w:t>
-      </w:r>
-    </w:p>
-    <w:p>
-      <w:pPr>
-        <w:pStyle w:val="Citaodireta"/>
-      </w:pPr>
-      <w:r>
         <w:t xml:space="preserve">Em casos como o dos autos, </w:t>
       </w:r>
       <w:r>
@@ -20405,6 +20883,48 @@
           <w:rFonts w:eastAsia="Times New Roman"/>
         </w:rPr>
         <w:t> </w:t>
+      </w:r>
+    </w:p>
+    <w:p>
+      <w:pPr>
+        <w:ind w:firstLine="0"/>
+        <w:rPr>
+          <w:color w:val="EE0000"/>
+        </w:rPr>
+      </w:pPr>
+      <w:r>
+        <w:rPr>
+          <w:color w:val="EE0000"/>
+        </w:rPr>
+        <w:t>[[END_BLOCK]]</w:t>
+      </w:r>
+    </w:p>
+    <w:p>
+      <w:pPr>
+        <w:ind w:firstLine="0"/>
+        <w:rPr>
+          <w:color w:val="EE0000"/>
+        </w:rPr>
+      </w:pPr>
+      <w:r>
+        <w:rPr>
+          <w:color w:val="EE0000"/>
+        </w:rPr>
+        <w:t xml:space="preserve">[[BLOCK </w:t>
+      </w:r>
+      <w:proofErr w:type="spellStart"/>
+      <w:r>
+        <w:rPr>
+          <w:color w:val="EE0000"/>
+        </w:rPr>
+        <w:t>capitalizacao_sem_pactuacao</w:t>
+      </w:r>
+      <w:proofErr w:type="spellEnd"/>
+      <w:r>
+        <w:rPr>
+          <w:color w:val="EE0000"/>
+        </w:rPr>
+        <w:t>]]</w:t>
       </w:r>
     </w:p>
     <w:p>
@@ -27770,7 +28290,10 @@
     </w:p>
     <w:p>
       <w:pPr>
-        <w:pStyle w:val="Ttulo2"/>
+        <w:ind w:firstLine="0"/>
+        <w:rPr>
+          <w:color w:val="EE0000"/>
+        </w:rPr>
       </w:pPr>
       <w:bookmarkStart w:id="58" w:name="_Toc79507786"/>
       <w:bookmarkStart w:id="59" w:name="_Toc93044117"/>
@@ -27778,7 +28301,46 @@
       <w:bookmarkStart w:id="61" w:name="_Toc82773402"/>
       <w:bookmarkEnd w:id="13"/>
       <w:r>
+        <w:rPr>
+          <w:color w:val="EE0000"/>
+        </w:rPr>
         <w:lastRenderedPageBreak/>
+        <w:t>[[END_BLOCK]]</w:t>
+      </w:r>
+    </w:p>
+    <w:p>
+      <w:pPr>
+        <w:ind w:firstLine="0"/>
+        <w:rPr>
+          <w:color w:val="EE0000"/>
+        </w:rPr>
+      </w:pPr>
+      <w:r>
+        <w:rPr>
+          <w:color w:val="EE0000"/>
+        </w:rPr>
+        <w:t xml:space="preserve">[[BLOCK </w:t>
+      </w:r>
+      <w:proofErr w:type="spellStart"/>
+      <w:r>
+        <w:rPr>
+          <w:color w:val="EE0000"/>
+        </w:rPr>
+        <w:t>periodicidade_capitalizacao_rural</w:t>
+      </w:r>
+      <w:proofErr w:type="spellEnd"/>
+      <w:r>
+        <w:rPr>
+          <w:color w:val="EE0000"/>
+        </w:rPr>
+        <w:t>]]</w:t>
+      </w:r>
+    </w:p>
+    <w:p>
+      <w:pPr>
+        <w:pStyle w:val="Ttulo2"/>
+      </w:pPr>
+      <w:r>
         <w:t>Periodicidade da capitalização para contratos rurais e anatocismo</w:t>
       </w:r>
       <w:bookmarkEnd w:id="58"/>
@@ -28307,6 +28869,7 @@
         <w:rPr>
           <w:rFonts w:eastAsia="Times New Roman"/>
         </w:rPr>
+        <w:lastRenderedPageBreak/>
         <w:t xml:space="preserve">aplicação da capitalização </w:t>
       </w:r>
       <w:r>
@@ -28416,7 +28979,6 @@
       <w:bookmarkStart w:id="63" w:name="_Toc227827927"/>
       <w:bookmarkEnd w:id="54"/>
       <w:r>
-        <w:lastRenderedPageBreak/>
         <w:t>Periodicidade da capitalização para contratos rurais e anatocismo</w:t>
       </w:r>
       <w:bookmarkEnd w:id="62"/>
@@ -28932,6 +29494,7 @@
       <w:bookmarkStart w:id="81" w:name="_Toc79509651"/>
       <w:bookmarkEnd w:id="61"/>
       <w:r>
+        <w:lastRenderedPageBreak/>
         <w:t>Capitalização de juros sem expressa pactuação (anatocismo)</w:t>
       </w:r>
       <w:bookmarkEnd w:id="64"/>
@@ -28956,14 +29519,7 @@
         <w:rPr>
           <w:rFonts w:eastAsia="Times New Roman"/>
         </w:rPr>
-        <w:t xml:space="preserve">A capitalização de juros difere do conceito de juros sobre juros (anatocismo), uma vez que o primeiro significa que os juros são exigidos e tornam-se capital do banco (direito de receber), pagos quando os saldos se encontram positivos, e incorporados ao saldo quando está </w:t>
-      </w:r>
-      <w:r>
-        <w:rPr>
-          <w:rFonts w:eastAsia="Times New Roman"/>
-        </w:rPr>
-        <w:lastRenderedPageBreak/>
-        <w:t>devedor; já o segundo refere-se ao cálculo de juros sobre juros (ou sobre um montante composto de capital + juros). Sobre isso já escreveram os professores Romualdo Wilson Cançado e Orlei Claro de Lima em seu livro</w:t>
+        <w:t>A capitalização de juros difere do conceito de juros sobre juros (anatocismo), uma vez que o primeiro significa que os juros são exigidos e tornam-se capital do banco (direito de receber), pagos quando os saldos se encontram positivos, e incorporados ao saldo quando está devedor; já o segundo refere-se ao cálculo de juros sobre juros (ou sobre um montante composto de capital + juros). Sobre isso já escreveram os professores Romualdo Wilson Cançado e Orlei Claro de Lima em seu livro</w:t>
       </w:r>
       <w:r>
         <w:rPr>
@@ -29228,6 +29784,7 @@
           <w:sz w:val="22"/>
           <w:szCs w:val="22"/>
         </w:rPr>
+        <w:lastRenderedPageBreak/>
         <w:t xml:space="preserve">[...] De fato, sendo pacífico o entendimento de que a capitalização inferior à anual depende de pactuação, </w:t>
       </w:r>
       <w:r>
@@ -29268,17 +29825,7 @@
           <w:sz w:val="22"/>
           <w:szCs w:val="22"/>
         </w:rPr>
-        <w:t xml:space="preserve">, embora inexistente qualquer determinação legal nesse sentido, </w:t>
-      </w:r>
-      <w:r>
-        <w:rPr>
-          <w:rFonts w:eastAsia="Times New Roman" w:cs="Times New Roman"/>
-          <w:color w:val="002060"/>
-          <w:sz w:val="22"/>
-          <w:szCs w:val="22"/>
-        </w:rPr>
-        <w:lastRenderedPageBreak/>
-        <w:t xml:space="preserve">pois o artigo 591 do Código Civil apenas permite a capitalização anual e </w:t>
+        <w:t xml:space="preserve">, embora inexistente qualquer determinação legal nesse sentido, pois o artigo 591 do Código Civil apenas permite a capitalização anual e </w:t>
       </w:r>
       <w:r>
         <w:rPr>
@@ -29430,7 +29977,14 @@
         <w:rPr>
           <w:highlight w:val="yellow"/>
         </w:rPr>
-        <w:t>Deve-se observar ainda a regulamentação do Banco Central do Brasil. Conforme a Resolução nº 3.517, de 6 de dezembro de 2007, é dever da instituição financeira cientificar, no momento da contratação, os fluxos considerados no cálculo da operação, que comporão o custo total da operação, representado pelo CET.</w:t>
+        <w:t xml:space="preserve">Deve-se observar ainda a regulamentação do Banco Central do Brasil. Conforme a Resolução nº 3.517, de 6 de dezembro de 2007, é dever da instituição financeira cientificar, no </w:t>
+      </w:r>
+      <w:r>
+        <w:rPr>
+          <w:highlight w:val="yellow"/>
+        </w:rPr>
+        <w:lastRenderedPageBreak/>
+        <w:t>momento da contratação, os fluxos considerados no cálculo da operação, que comporão o custo total da operação, representado pelo CET.</w:t>
       </w:r>
     </w:p>
     <w:p>
@@ -29444,7 +29998,6 @@
         <w:rPr>
           <w:highlight w:val="yellow"/>
         </w:rPr>
-        <w:lastRenderedPageBreak/>
         <w:t xml:space="preserve">Art. 2º </w:t>
       </w:r>
       <w:r>
@@ -29583,11 +30136,11 @@
         <w:pStyle w:val="Citaodireta"/>
       </w:pPr>
       <w:r>
-        <w:t xml:space="preserve">“Interpretando os artigos 46, 52, 54, §§ 3º e 4º, do Código de Defesa do Consumidor, entendeu o acórdão recorrido que a cláusula contratual que previa a capitalização dos juros era nula. Não tendo o recorrente se insurgido contra esse fundamento, que se mostra suficiente, por si só, para manter a conclusão do acórdão, incide na espécie a dicção da Súmula 283 </w:t>
+        <w:t xml:space="preserve">“Interpretando os artigos 46, 52, 54, §§ 3º e 4º, do Código de Defesa do Consumidor, entendeu o acórdão recorrido que a cláusula contratual que previa a capitalização dos juros era nula. Não tendo o recorrente se </w:t>
       </w:r>
       <w:r>
         <w:lastRenderedPageBreak/>
-        <w:t xml:space="preserve">do Supremo Tribunal Federal.” STJ, </w:t>
+        <w:t xml:space="preserve">insurgido contra esse fundamento, que se mostra suficiente, por si só, para manter a conclusão do acórdão, incide na espécie a dicção da Súmula 283 do Supremo Tribunal Federal.” STJ, </w:t>
       </w:r>
       <w:proofErr w:type="spellStart"/>
       <w:r>
@@ -33165,6 +33718,48 @@
     </w:p>
     <w:p>
       <w:pPr>
+        <w:ind w:firstLine="0"/>
+        <w:rPr>
+          <w:color w:val="EE0000"/>
+        </w:rPr>
+      </w:pPr>
+      <w:r>
+        <w:rPr>
+          <w:color w:val="EE0000"/>
+        </w:rPr>
+        <w:t>[[END_BLOCK]]</w:t>
+      </w:r>
+    </w:p>
+    <w:p>
+      <w:pPr>
+        <w:ind w:firstLine="0"/>
+        <w:rPr>
+          <w:color w:val="EE0000"/>
+        </w:rPr>
+      </w:pPr>
+      <w:r>
+        <w:rPr>
+          <w:color w:val="EE0000"/>
+        </w:rPr>
+        <w:t xml:space="preserve">[[BLOCK </w:t>
+      </w:r>
+      <w:proofErr w:type="spellStart"/>
+      <w:r>
+        <w:rPr>
+          <w:color w:val="EE0000"/>
+        </w:rPr>
+        <w:t>capitalizacao_anual_sem_pactuacao</w:t>
+      </w:r>
+      <w:proofErr w:type="spellEnd"/>
+      <w:r>
+        <w:rPr>
+          <w:color w:val="EE0000"/>
+        </w:rPr>
+        <w:t>]]</w:t>
+      </w:r>
+    </w:p>
+    <w:p>
+      <w:pPr>
         <w:pStyle w:val="Ttulo2"/>
         <w:numPr>
           <w:ilvl w:val="1"/>
@@ -33343,6 +33938,7 @@
         <w:pStyle w:val="Citaodireta"/>
       </w:pPr>
       <w:r>
+        <w:lastRenderedPageBreak/>
         <w:t xml:space="preserve">Os regimes de capitalização demonstram como os juros são formados e sucessivamente incorporados ao capital no decorrer do tempo. Nesta conceituação </w:t>
       </w:r>
       <w:r>
@@ -33350,15 +33946,7 @@
           <w:b/>
           <w:bCs/>
         </w:rPr>
-        <w:t xml:space="preserve">podem ser identificados dois regimes de capitalização </w:t>
-      </w:r>
-      <w:r>
-        <w:rPr>
-          <w:b/>
-          <w:bCs/>
-        </w:rPr>
-        <w:lastRenderedPageBreak/>
-        <w:t>dos juros: simples (ou linear) e composto (ou exponencial)</w:t>
+        <w:t>podem ser identificados dois regimes de capitalização dos juros: simples (ou linear) e composto (ou exponencial)</w:t>
       </w:r>
       <w:r>
         <w:t xml:space="preserve"> – O Anatocismo dos Sistemas de Amortização – Jurandir Gurgel Godim Filho</w:t>
@@ -33639,7 +34227,17 @@
           <w:sz w:val="22"/>
           <w:szCs w:val="22"/>
         </w:rPr>
-        <w:t xml:space="preserve">, embora inexistente qualquer determinação legal nesse sentido, pois o artigo 591 do Código Civil apenas permite a capitalização anual e </w:t>
+        <w:t xml:space="preserve">, embora inexistente qualquer determinação legal nesse sentido, </w:t>
+      </w:r>
+      <w:r>
+        <w:rPr>
+          <w:rFonts w:eastAsia="Times New Roman" w:cs="Times New Roman"/>
+          <w:color w:val="002060"/>
+          <w:sz w:val="22"/>
+          <w:szCs w:val="22"/>
+        </w:rPr>
+        <w:lastRenderedPageBreak/>
+        <w:t xml:space="preserve">pois o artigo 591 do Código Civil apenas permite a capitalização anual e </w:t>
       </w:r>
       <w:r>
         <w:rPr>
@@ -33683,7 +34281,6 @@
           <w:sz w:val="22"/>
           <w:szCs w:val="22"/>
         </w:rPr>
-        <w:lastRenderedPageBreak/>
         <w:t xml:space="preserve">[...] Assim, </w:t>
       </w:r>
       <w:r>
@@ -34076,13 +34673,21 @@
           <w:b/>
           <w:szCs w:val="23"/>
         </w:rPr>
-        <w:t>os juros do período de carência serão capitalizados anualmente</w:t>
+        <w:t xml:space="preserve">os juros do período de </w:t>
       </w:r>
       <w:r>
         <w:rPr>
           <w:b/>
           <w:szCs w:val="23"/>
         </w:rPr>
+        <w:lastRenderedPageBreak/>
+        <w:t>carência serão capitalizados anualmente</w:t>
+      </w:r>
+      <w:r>
+        <w:rPr>
+          <w:b/>
+          <w:szCs w:val="23"/>
+        </w:rPr>
         <w:t>,</w:t>
       </w:r>
       <w:r>
@@ -34097,15 +34702,7 @@
           <w:b/>
           <w:bCs/>
         </w:rPr>
-        <w:t xml:space="preserve">sem referência expressa à periodicidade da capitalização dos juros remuneratórios de normalidade para a fase de amortização, isto é, </w:t>
-      </w:r>
-      <w:r>
-        <w:rPr>
-          <w:b/>
-          <w:bCs/>
-        </w:rPr>
-        <w:lastRenderedPageBreak/>
-        <w:t>após findado o período de carência</w:t>
+        <w:t>sem referência expressa à periodicidade da capitalização dos juros remuneratórios de normalidade para a fase de amortização, isto é, após findado o período de carência</w:t>
       </w:r>
       <w:r>
         <w:t xml:space="preserve">. </w:t>
@@ -35232,6 +35829,7 @@
         <w:rPr>
           <w:rFonts w:eastAsia="Times New Roman"/>
         </w:rPr>
+        <w:lastRenderedPageBreak/>
         <w:t xml:space="preserve">“No regime de </w:t>
       </w:r>
       <w:r>
@@ -35283,14 +35881,7 @@
         <w:rPr>
           <w:rFonts w:eastAsia="Times New Roman"/>
         </w:rPr>
-        <w:t xml:space="preserve">. De outra maneira, o capital sobre o qual se calculam os </w:t>
-      </w:r>
-      <w:r>
-        <w:rPr>
-          <w:rFonts w:eastAsia="Times New Roman"/>
-        </w:rPr>
-        <w:lastRenderedPageBreak/>
-        <w:t xml:space="preserve">juros permanece inalterado durante todo o prazo da operação, e </w:t>
+        <w:t xml:space="preserve">. De outra maneira, o capital sobre o qual se calculam os juros permanece inalterado durante todo o prazo da operação, e </w:t>
       </w:r>
       <w:r>
         <w:rPr>
@@ -35328,6 +35919,49 @@
       <w:bookmarkEnd w:id="71"/>
       <w:bookmarkEnd w:id="72"/>
       <w:bookmarkEnd w:id="73"/>
+    </w:p>
+    <w:p>
+      <w:pPr>
+        <w:ind w:firstLine="0"/>
+        <w:rPr>
+          <w:color w:val="EE0000"/>
+        </w:rPr>
+      </w:pPr>
+      <w:bookmarkStart w:id="84" w:name="_Toc227827931"/>
+      <w:r>
+        <w:rPr>
+          <w:color w:val="EE0000"/>
+        </w:rPr>
+        <w:t>[[END_BLOCK]]</w:t>
+      </w:r>
+    </w:p>
+    <w:p>
+      <w:pPr>
+        <w:ind w:firstLine="0"/>
+        <w:rPr>
+          <w:color w:val="EE0000"/>
+        </w:rPr>
+      </w:pPr>
+      <w:r>
+        <w:rPr>
+          <w:color w:val="EE0000"/>
+        </w:rPr>
+        <w:t xml:space="preserve">[[BLOCK </w:t>
+      </w:r>
+      <w:proofErr w:type="spellStart"/>
+      <w:r>
+        <w:rPr>
+          <w:color w:val="EE0000"/>
+        </w:rPr>
+        <w:t>cobranca_indevida_seguros_tarifa</w:t>
+      </w:r>
+      <w:proofErr w:type="spellEnd"/>
+      <w:r>
+        <w:rPr>
+          <w:color w:val="EE0000"/>
+        </w:rPr>
+        <w:t>]]</w:t>
+      </w:r>
     </w:p>
     <w:p>
       <w:pPr>
@@ -35340,7 +35974,6 @@
           <w:highlight w:val="yellow"/>
         </w:rPr>
       </w:pPr>
-      <w:bookmarkStart w:id="84" w:name="_Toc227827931"/>
       <w:r>
         <w:rPr>
           <w:highlight w:val="yellow"/>
@@ -35463,9 +36096,40 @@
       <w:r>
         <w:rPr>
           <w:rFonts w:eastAsia="Times New Roman"/>
-          <w:highlight w:val="yellow"/>
-        </w:rPr>
-        <w:t xml:space="preserve">o produtor </w:t>
+          <w:highlight w:val="green"/>
+        </w:rPr>
+        <w:t>{{</w:t>
+      </w:r>
+      <w:proofErr w:type="spellStart"/>
+      <w:r>
+        <w:rPr>
+          <w:rFonts w:eastAsia="Times New Roman"/>
+          <w:highlight w:val="green"/>
+        </w:rPr>
+        <w:t>produtor_</w:t>
+      </w:r>
+      <w:proofErr w:type="gramStart"/>
+      <w:r>
+        <w:rPr>
+          <w:rFonts w:eastAsia="Times New Roman"/>
+          <w:highlight w:val="green"/>
+        </w:rPr>
+        <w:t>genero.sujeito</w:t>
+      </w:r>
+      <w:proofErr w:type="spellEnd"/>
+      <w:proofErr w:type="gramEnd"/>
+      <w:r>
+        <w:rPr>
+          <w:rFonts w:eastAsia="Times New Roman"/>
+          <w:highlight w:val="green"/>
+        </w:rPr>
+        <w:t>}}</w:t>
+      </w:r>
+      <w:r>
+        <w:rPr>
+          <w:rFonts w:eastAsia="Times New Roman"/>
+        </w:rPr>
+        <w:t xml:space="preserve"> </w:t>
       </w:r>
       <w:r>
         <w:rPr>
@@ -35586,22 +36250,79 @@
         <w:ind w:firstLine="709"/>
       </w:pPr>
       <w:r>
-        <w:t xml:space="preserve">Sobre o seguro agrícola, apesar da pactuação em contrato e as informações darem o entendimento de que se trata de livre iniciativa </w:t>
-      </w:r>
-      <w:r>
-        <w:rPr>
-          <w:highlight w:val="yellow"/>
-        </w:rPr>
-        <w:t>do produtor</w:t>
-      </w:r>
-      <w:r>
-        <w:t xml:space="preserve">, segundo seu relato não foi esse o procedimento adotado pela instituição financeira. Segundo </w:t>
-      </w:r>
-      <w:r>
-        <w:rPr>
-          <w:highlight w:val="yellow"/>
-        </w:rPr>
-        <w:t>ele</w:t>
+        <w:t>Sobre o seguro agrícola, apesar da pactuação em contrato e as informações darem o entendimento de que se trata de livre iniciativa</w:t>
+      </w:r>
+      <w:r>
+        <w:t xml:space="preserve"> </w:t>
+      </w:r>
+      <w:r>
+        <w:rPr>
+          <w:rFonts w:eastAsia="Times New Roman"/>
+          <w:highlight w:val="green"/>
+        </w:rPr>
+        <w:t>{{</w:t>
+      </w:r>
+      <w:proofErr w:type="spellStart"/>
+      <w:r>
+        <w:rPr>
+          <w:rFonts w:eastAsia="Times New Roman"/>
+          <w:highlight w:val="green"/>
+        </w:rPr>
+        <w:t>produtor_</w:t>
+      </w:r>
+      <w:proofErr w:type="gramStart"/>
+      <w:r>
+        <w:rPr>
+          <w:rFonts w:eastAsia="Times New Roman"/>
+          <w:highlight w:val="green"/>
+        </w:rPr>
+        <w:t>genero.sujeito</w:t>
+      </w:r>
+      <w:proofErr w:type="spellEnd"/>
+      <w:proofErr w:type="gramEnd"/>
+      <w:r>
+        <w:rPr>
+          <w:rFonts w:eastAsia="Times New Roman"/>
+          <w:highlight w:val="green"/>
+        </w:rPr>
+        <w:t>}}</w:t>
+      </w:r>
+      <w:r>
+        <w:rPr>
+          <w:rFonts w:eastAsia="Times New Roman"/>
+        </w:rPr>
+        <w:t xml:space="preserve">, </w:t>
+      </w:r>
+      <w:r>
+        <w:t xml:space="preserve">segundo seu relato não foi esse o procedimento adotado pela instituição financeira. Segundo </w:t>
+      </w:r>
+      <w:r>
+        <w:rPr>
+          <w:highlight w:val="green"/>
+        </w:rPr>
+        <w:t>{{</w:t>
+      </w:r>
+      <w:proofErr w:type="spellStart"/>
+      <w:r>
+        <w:rPr>
+          <w:highlight w:val="green"/>
+        </w:rPr>
+        <w:t>produtor_</w:t>
+      </w:r>
+      <w:proofErr w:type="gramStart"/>
+      <w:r>
+        <w:rPr>
+          <w:highlight w:val="green"/>
+        </w:rPr>
+        <w:t>genero.pronome</w:t>
+      </w:r>
+      <w:proofErr w:type="spellEnd"/>
+      <w:proofErr w:type="gramEnd"/>
+      <w:r>
+        <w:rPr>
+          <w:highlight w:val="green"/>
+        </w:rPr>
+        <w:t>}}</w:t>
       </w:r>
       <w:r>
         <w:t>, houve grande insistência e o condicionamento da liberação dos créditos à contratação do seguro.</w:t>
@@ -35682,7 +36403,6 @@
         <w:rPr>
           <w:rFonts w:eastAsia="Times New Roman"/>
         </w:rPr>
-        <w:lastRenderedPageBreak/>
         <w:t>Já sobre o seguro de vida, na documentação disponibilizada nos autos, não foi identificado nenhum dispositivo que pactuasse a cobrança desse seguro e, tampouco, são apresentadas as condições e taxas referentes à sua contratação.</w:t>
       </w:r>
     </w:p>
@@ -36002,6 +36722,7 @@
           <w:rFonts w:eastAsia="Times New Roman"/>
           <w:highlight w:val="green"/>
         </w:rPr>
+        <w:lastRenderedPageBreak/>
         <w:t>Tal fato afronta a tese firmada pelo STJ (REsp n. 1.639.320 e Tema 972), segundo a qual "</w:t>
       </w:r>
       <w:r>
@@ -36033,7 +36754,6 @@
           <w:rFonts w:eastAsia="Times New Roman"/>
           <w:highlight w:val="green"/>
         </w:rPr>
-        <w:lastRenderedPageBreak/>
         <w:t xml:space="preserve">APELAÇÃO CÍVEL. AÇÃO DE REVISÃO DE CONTRATO. CÉDULA DE CRÉDITO BANCÁRIO. TARIFAS DE AVALIAÇÃO E DE REGISTRO DO CONTRATO. ABUSIVIDADE. EXEGESE DO ART. 51, INCISO XII, DO CDC. ENCARGOS AFASTADOS. TARIFAS DE SEGURO E SEGURO AUTO. </w:t>
       </w:r>
       <w:r>
@@ -36214,6 +36934,7 @@
         <w:rPr>
           <w:rFonts w:eastAsia="Times New Roman"/>
         </w:rPr>
+        <w:lastRenderedPageBreak/>
         <w:t xml:space="preserve">[...] é comum bancos adotarem a estratégia de concessão de crédito associada à imposição de certas exigências, como saldo médio ou compra de produtos, como </w:t>
       </w:r>
       <w:r>
@@ -36256,7 +36977,6 @@
         <w:rPr>
           <w:rFonts w:eastAsia="Times New Roman"/>
         </w:rPr>
-        <w:lastRenderedPageBreak/>
         <w:t xml:space="preserve">Ademais, no contrato e na ficha gráfica da operação em análise, foi identificada a cobrança de R$ </w:t>
       </w:r>
       <w:proofErr w:type="spellStart"/>
@@ -36553,6 +37273,48 @@
       </w:r>
       <w:bookmarkEnd w:id="85"/>
       <w:bookmarkEnd w:id="86"/>
+    </w:p>
+    <w:p>
+      <w:pPr>
+        <w:ind w:firstLine="0"/>
+        <w:rPr>
+          <w:color w:val="EE0000"/>
+        </w:rPr>
+      </w:pPr>
+      <w:r>
+        <w:rPr>
+          <w:color w:val="EE0000"/>
+        </w:rPr>
+        <w:t>[[END_BLOCK]]</w:t>
+      </w:r>
+    </w:p>
+    <w:p>
+      <w:pPr>
+        <w:ind w:firstLine="0"/>
+        <w:rPr>
+          <w:color w:val="EE0000"/>
+        </w:rPr>
+      </w:pPr>
+      <w:r>
+        <w:rPr>
+          <w:color w:val="EE0000"/>
+        </w:rPr>
+        <w:t xml:space="preserve">[[BLOCK </w:t>
+      </w:r>
+      <w:proofErr w:type="spellStart"/>
+      <w:r>
+        <w:rPr>
+          <w:color w:val="EE0000"/>
+        </w:rPr>
+        <w:t>inadimplemento_ilegal_oneroso</w:t>
+      </w:r>
+      <w:proofErr w:type="spellEnd"/>
+      <w:r>
+        <w:rPr>
+          <w:color w:val="EE0000"/>
+        </w:rPr>
+        <w:t>]]</w:t>
+      </w:r>
     </w:p>
     <w:p>
       <w:pPr>
@@ -36731,6 +37493,7 @@
           <w:rFonts w:eastAsia="Times New Roman"/>
           <w:lang w:eastAsia="pt-BR"/>
         </w:rPr>
+        <w:lastRenderedPageBreak/>
         <w:t>No entanto,</w:t>
       </w:r>
       <w:r>
@@ -36814,7 +37577,6 @@
           <w:rFonts w:eastAsia="Times New Roman"/>
           <w:lang w:eastAsia="pt-BR"/>
         </w:rPr>
-        <w:lastRenderedPageBreak/>
         <w:t xml:space="preserve">Sabendo da irregularidade, na ficha gráfica da operação, a instituição financeira pratica no período de inadimplemento encargos compostos pelos juros remuneratórios de normalidade, juros de mora de 1,00% a.a. e multa contratual de 2,00%. </w:t>
       </w:r>
       <w:r>
@@ -37114,6 +37876,7 @@
           <w:rFonts w:eastAsia="Times New Roman"/>
           <w:lang w:eastAsia="pt-BR"/>
         </w:rPr>
+        <w:lastRenderedPageBreak/>
         <w:t>Desse modo, a cobrança da multa de 2,00% no caso concreto é indevida, uma vez que sua cobrança não foi expressa e claramente pactuada entre as partes no contrato.</w:t>
       </w:r>
     </w:p>
@@ -37142,7 +37905,6 @@
         <w:rPr>
           <w:rFonts w:eastAsia="Times New Roman"/>
         </w:rPr>
-        <w:lastRenderedPageBreak/>
         <w:t xml:space="preserve">No contrato de crédito rural nº </w:t>
       </w:r>
       <w:r>
@@ -37510,7 +38272,15 @@
           <w:rFonts w:eastAsia="Times New Roman"/>
           <w:lang w:eastAsia="pt-BR"/>
         </w:rPr>
-        <w:t>: note que o lançamento de encargos de inadimplência, isto é, “JUROS INADIMPLENTE” foram cobrados à taxa de 16,68% a.a., que equivale aos juros remuneratórios (4,00% a.a.) acrescidos de juros de mora (1,00% a.m., equivalentes a 12,68% a.a.).</w:t>
+        <w:t xml:space="preserve">: note que o lançamento de encargos de inadimplência, isto é, “JUROS INADIMPLENTE” foram cobrados à taxa </w:t>
+      </w:r>
+      <w:r>
+        <w:rPr>
+          <w:rFonts w:eastAsia="Times New Roman"/>
+          <w:lang w:eastAsia="pt-BR"/>
+        </w:rPr>
+        <w:lastRenderedPageBreak/>
+        <w:t>de 16,68% a.a., que equivale aos juros remuneratórios (4,00% a.a.) acrescidos de juros de mora (1,00% a.m., equivalentes a 12,68% a.a.).</w:t>
       </w:r>
     </w:p>
     <w:p>
@@ -37779,16 +38549,15 @@
     <w:p>
       <w:pPr>
         <w:rPr>
-          <w:rFonts w:eastAsia="Times New Roman" w:cs="Times New Roman"/>
-          <w:sz w:val="22"/>
-          <w:szCs w:val="22"/>
-        </w:rPr>
-      </w:pPr>
-      <w:r>
-        <w:rPr>
           <w:rFonts w:eastAsia="Times New Roman"/>
           <w:lang w:eastAsia="pt-BR"/>
         </w:rPr>
+      </w:pPr>
+      <w:r>
+        <w:rPr>
+          <w:rFonts w:eastAsia="Times New Roman"/>
+          <w:lang w:eastAsia="pt-BR"/>
+        </w:rPr>
         <w:t xml:space="preserve">Desse modo, </w:t>
       </w:r>
       <w:r>
@@ -37825,6 +38594,20 @@
           <w:lang w:eastAsia="pt-BR"/>
         </w:rPr>
         <w:t>.</w:t>
+      </w:r>
+    </w:p>
+    <w:p>
+      <w:pPr>
+        <w:ind w:firstLine="0"/>
+        <w:rPr>
+          <w:color w:val="EE0000"/>
+        </w:rPr>
+      </w:pPr>
+      <w:r>
+        <w:rPr>
+          <w:color w:val="EE0000"/>
+        </w:rPr>
+        <w:t>[[END_BLOCK]]</w:t>
       </w:r>
     </w:p>
     <w:p>
@@ -37937,6 +38720,7 @@
     </w:p>
     <w:p>
       <w:r>
+        <w:lastRenderedPageBreak/>
         <w:t>---------------------------------------------------------------------------------</w:t>
       </w:r>
     </w:p>
@@ -37984,11 +38768,7 @@
       </w:r>
       <w:proofErr w:type="spellEnd"/>
       <w:r>
-        <w:t xml:space="preserve">. Verificou-se as condições pactuadas e praticadas em relação à operação, principalmente no que </w:t>
-      </w:r>
-      <w:r>
-        <w:lastRenderedPageBreak/>
-        <w:t>diz respeito à sua verdadeira finalidade e na busca pela manutenção do equilíbrio econômico-financeiro das operações.</w:t>
+        <w:t>. Verificou-se as condições pactuadas e praticadas em relação à operação, principalmente no que diz respeito à sua verdadeira finalidade e na busca pela manutenção do equilíbrio econômico-financeiro das operações.</w:t>
       </w:r>
     </w:p>
     <w:p>
@@ -38106,6 +38886,7 @@
         </w:rPr>
       </w:pPr>
       <w:r>
+        <w:lastRenderedPageBreak/>
         <w:t xml:space="preserve">Observou-se a cobrança de correção monetária pelo Certificado Depósito Interbancário – CDI; entretanto, conforme </w:t>
       </w:r>
       <w:r>
@@ -38132,103 +38913,103 @@
     </w:p>
     <w:p>
       <w:r>
+        <w:t xml:space="preserve">Verificou-se que foi realizada a capitalização mensal dos juros remuneratórios de normalidade. Em todo caso, após a análise das condições para a expressa pactuação da capitalização e sua periodicidade, verificou-se que </w:t>
+      </w:r>
+      <w:r>
+        <w:rPr>
+          <w:highlight w:val="yellow"/>
+        </w:rPr>
+        <w:t>o contrato não atendeu</w:t>
+      </w:r>
+      <w:r>
+        <w:t xml:space="preserve"> simultaneamente às prerrogativas para praticar a capitalização em nenhuma periodicidade. Desse modo, </w:t>
+      </w:r>
+      <w:r>
+        <w:t xml:space="preserve">afastou-se </w:t>
+      </w:r>
+      <w:r>
+        <w:t xml:space="preserve">a </w:t>
+      </w:r>
+      <w:r>
+        <w:t>capitalização</w:t>
+      </w:r>
+      <w:r>
+        <w:t xml:space="preserve"> de juros em qualquer periodicidade</w:t>
+      </w:r>
+      <w:r>
+        <w:t>.</w:t>
+      </w:r>
+    </w:p>
+    <w:p>
+      <w:r>
+        <w:t xml:space="preserve">Ademais, considerando se tratar de crédito rural, deve-se observar a legislação específica para esse tipo de operação que apregoa que a periodicidade mínima para capitalização dos juros remuneratórios é </w:t>
+      </w:r>
+      <w:r>
+        <w:rPr>
+          <w:highlight w:val="yellow"/>
+        </w:rPr>
+        <w:t>a semestral</w:t>
+      </w:r>
+      <w:r>
+        <w:t>. Desse modo, caso o entendimento sobre o afastamento da capitalização divirja do apresentado, os juros remuneratórios de normalidade devem ser capitalizados semestralmente.</w:t>
+      </w:r>
+    </w:p>
+    <w:p>
+      <w:r>
+        <w:t>Ainda, foi constatada a cobrança de seguro</w:t>
+      </w:r>
+      <w:r>
+        <w:t xml:space="preserve">s diversos na operação, como condição de liberação de crédito </w:t>
+      </w:r>
+      <w:r>
+        <w:rPr>
+          <w:highlight w:val="yellow"/>
+        </w:rPr>
+        <w:t>ao produtor</w:t>
+      </w:r>
+      <w:r>
+        <w:t xml:space="preserve">. Tal prática, além de encarecer o acesso ao crédito para o </w:t>
+      </w:r>
+      <w:r>
+        <w:rPr>
+          <w:highlight w:val="yellow"/>
+        </w:rPr>
+        <w:t>custeio</w:t>
+      </w:r>
+      <w:r>
+        <w:t xml:space="preserve">, é considerada venda casada. Também não há informações claras sobre as condições da contratação. Foi identificada também a cobrança de tarifa de estudos de operações, sobre a qual se entende que se trata de um custo da instituição que não pode ser repassado </w:t>
+      </w:r>
+      <w:r>
+        <w:rPr>
+          <w:highlight w:val="yellow"/>
+        </w:rPr>
+        <w:t>ao produtor.</w:t>
+      </w:r>
+      <w:r>
+        <w:t xml:space="preserve"> Diante de tais irregularidades, as cobranças foram estornadas no recálculo da operação.</w:t>
+      </w:r>
+    </w:p>
+    <w:p>
+      <w:r>
+        <w:t xml:space="preserve">Para o período de inadimplemento da operação, o banco pactuou a cobrança de comissão de permanência, mas sabendo do desacordo com a legislação para crédito rural, a instituição financeira realizou, na ficha gráfica apresentada, a apuração do inadimplemento com juros remuneratórios de normalidade, juros moratórios de 1,00% a.a. e multa contratual de 2,00%. Enquanto a cobrança de juros moratórios independe de previsão contratual para sua aplicação - diante de imposição legal, a multa contratual se trata de uma cláusula penal para quem atrasa o pagamento, devendo estar expressamente pactuada em contrato, o que não ocorreu no caso em tela, de modo que a cobrança da multa de 2,00% é indevida. </w:t>
+      </w:r>
+    </w:p>
+    <w:p>
+      <w:r>
+        <w:t>Destaca-se ainda que os juros remuneratórios cobrados no período de inadimplemento também foram capitalizados mensalmente, mas ressalta-se que eles devem seguir o mesmo fluxo de capitalização do período de normalidade – isto é, a capitalização deve ser afastada.</w:t>
+      </w:r>
+    </w:p>
+    <w:p>
+      <w:r>
+        <w:t>----</w:t>
+      </w:r>
+    </w:p>
+    <w:p>
+      <w:r>
+        <w:rPr>
+          <w:rFonts w:eastAsia="Times New Roman"/>
+        </w:rPr>
         <w:lastRenderedPageBreak/>
-        <w:t xml:space="preserve">Verificou-se que foi realizada a capitalização mensal dos juros remuneratórios de normalidade. Em todo caso, após a análise das condições para a expressa pactuação da capitalização e sua periodicidade, verificou-se que </w:t>
-      </w:r>
-      <w:r>
-        <w:rPr>
-          <w:highlight w:val="yellow"/>
-        </w:rPr>
-        <w:t>o contrato não atendeu</w:t>
-      </w:r>
-      <w:r>
-        <w:t xml:space="preserve"> simultaneamente às prerrogativas para praticar a capitalização em nenhuma periodicidade. Desse modo, </w:t>
-      </w:r>
-      <w:r>
-        <w:t xml:space="preserve">afastou-se </w:t>
-      </w:r>
-      <w:r>
-        <w:t xml:space="preserve">a </w:t>
-      </w:r>
-      <w:r>
-        <w:t>capitalização</w:t>
-      </w:r>
-      <w:r>
-        <w:t xml:space="preserve"> de juros em qualquer periodicidade</w:t>
-      </w:r>
-      <w:r>
-        <w:t>.</w:t>
-      </w:r>
-    </w:p>
-    <w:p>
-      <w:r>
-        <w:t xml:space="preserve">Ademais, considerando se tratar de crédito rural, deve-se observar a legislação específica para esse tipo de operação que apregoa que a periodicidade mínima para capitalização dos juros remuneratórios é </w:t>
-      </w:r>
-      <w:r>
-        <w:rPr>
-          <w:highlight w:val="yellow"/>
-        </w:rPr>
-        <w:t>a semestral</w:t>
-      </w:r>
-      <w:r>
-        <w:t>. Desse modo, caso o entendimento sobre o afastamento da capitalização divirja do apresentado, os juros remuneratórios de normalidade devem ser capitalizados semestralmente.</w:t>
-      </w:r>
-    </w:p>
-    <w:p>
-      <w:r>
-        <w:t>Ainda, foi constatada a cobrança de seguro</w:t>
-      </w:r>
-      <w:r>
-        <w:t xml:space="preserve">s diversos na operação, como condição de liberação de crédito </w:t>
-      </w:r>
-      <w:r>
-        <w:rPr>
-          <w:highlight w:val="yellow"/>
-        </w:rPr>
-        <w:t>ao produtor</w:t>
-      </w:r>
-      <w:r>
-        <w:t xml:space="preserve">. Tal prática, além de encarecer o acesso ao crédito para o </w:t>
-      </w:r>
-      <w:r>
-        <w:rPr>
-          <w:highlight w:val="yellow"/>
-        </w:rPr>
-        <w:t>custeio</w:t>
-      </w:r>
-      <w:r>
-        <w:t xml:space="preserve">, é considerada venda casada. Também não há informações claras sobre as condições da contratação. Foi identificada também a cobrança de tarifa de estudos de operações, sobre a qual se entende que se trata de um custo da instituição que não pode ser repassado </w:t>
-      </w:r>
-      <w:r>
-        <w:rPr>
-          <w:highlight w:val="yellow"/>
-        </w:rPr>
-        <w:t>ao produtor.</w:t>
-      </w:r>
-      <w:r>
-        <w:t xml:space="preserve"> Diante de tais irregularidades, as cobranças foram estornadas no recálculo da operação.</w:t>
-      </w:r>
-    </w:p>
-    <w:p>
-      <w:r>
-        <w:t xml:space="preserve">Para o período de inadimplemento da operação, o banco pactuou a cobrança de comissão de permanência, mas sabendo do desacordo com a legislação para crédito rural, a instituição financeira realizou, na ficha gráfica apresentada, a apuração do inadimplemento com juros remuneratórios de normalidade, juros moratórios de 1,00% a.a. e multa contratual de 2,00%. Enquanto a cobrança de juros moratórios independe de previsão contratual para sua aplicação - diante de imposição legal, a multa contratual se trata de uma cláusula penal para quem atrasa o pagamento, devendo estar expressamente pactuada em contrato, o que não ocorreu no caso em tela, de modo que a cobrança da multa de 2,00% é indevida. </w:t>
-      </w:r>
-    </w:p>
-    <w:p>
-      <w:r>
-        <w:t>Destaca-se ainda que os juros remuneratórios cobrados no período de inadimplemento também foram capitalizados mensalmente, mas ressalta-se que eles devem seguir o mesmo fluxo de capitalização do período de normalidade – isto é, a capitalização deve ser afastada.</w:t>
-      </w:r>
-    </w:p>
-    <w:p>
-      <w:r>
-        <w:t>----</w:t>
-      </w:r>
-    </w:p>
-    <w:p>
-      <w:r>
-        <w:rPr>
-          <w:rFonts w:eastAsia="Times New Roman"/>
-        </w:rPr>
         <w:t xml:space="preserve">Em relação ao inadimplemento, viu-se que os encargos pactuados e praticados foram </w:t>
       </w:r>
       <w:r>
@@ -38251,11 +39032,7 @@
         <w:t xml:space="preserve">Entretanto, considerando a </w:t>
       </w:r>
       <w:r>
-        <w:t xml:space="preserve">legislação vigente que rege crédito rural, os juros de mora devem ser de 1,00% a.a. e não 1,00% a.m. Destaca-se ainda que os juros remuneratórios e moratórios </w:t>
-      </w:r>
-      <w:r>
-        <w:lastRenderedPageBreak/>
-        <w:t>cobrados no período de inadimplemento também foram capitalizados mensalmente, mas ressalta-se que eles devem seguir o mesmo fluxo de capitalização do período de normalidade – isto é, a capitalização deve ser nas parcelas ou na liquidação do débito.</w:t>
+        <w:t>legislação vigente que rege crédito rural, os juros de mora devem ser de 1,00% a.a. e não 1,00% a.m. Destaca-se ainda que os juros remuneratórios e moratórios cobrados no período de inadimplemento também foram capitalizados mensalmente, mas ressalta-se que eles devem seguir o mesmo fluxo de capitalização do período de normalidade – isto é, a capitalização deve ser nas parcelas ou na liquidação do débito.</w:t>
       </w:r>
     </w:p>
     <w:p>
@@ -38434,7 +39211,11 @@
         <w:t>cobrança/execução</w:t>
       </w:r>
       <w:r>
-        <w:t xml:space="preserve">. Por sua vez, considerando os termos do Art. 42, parágrafo único, do Código de Defesa do Consumidor, o valor já pago indevidamente a maior (R$ </w:t>
+        <w:t xml:space="preserve">. Por sua vez, considerando os termos do Art. 42, parágrafo único, do Código </w:t>
+      </w:r>
+      <w:r>
+        <w:lastRenderedPageBreak/>
+        <w:t xml:space="preserve">de Defesa do Consumidor, o valor já pago indevidamente a maior (R$ </w:t>
       </w:r>
       <w:proofErr w:type="spellStart"/>
       <w:r>
@@ -38538,15 +39319,7 @@
           <w:color w:val="FF0000"/>
           <w:highlight w:val="yellow"/>
         </w:rPr>
-        <w:t xml:space="preserve"> </w:t>
-      </w:r>
-      <w:r>
-        <w:rPr>
-          <w:color w:val="FF0000"/>
-          <w:highlight w:val="yellow"/>
-        </w:rPr>
-        <w:lastRenderedPageBreak/>
-        <w:t>Nesse sentido, o presente parecer foi elaborado de forma parcial, a partir dos documentos disponibilizados nos autos e do relato dos responsáveis da empresa, de que o crédito tomado foi destinado para manutenção das atividades produtivas da empresa, isto é, capital de giro.</w:t>
+        <w:t xml:space="preserve"> Nesse sentido, o presente parecer foi elaborado de forma parcial, a partir dos documentos disponibilizados nos autos e do relato dos responsáveis da empresa, de que o crédito tomado foi destinado para manutenção das atividades produtivas da empresa, isto é, capital de giro.</w:t>
       </w:r>
       <w:r>
         <w:rPr>
@@ -38677,6 +39450,7 @@
           <w:rFonts w:eastAsia="Times New Roman"/>
           <w:highlight w:val="green"/>
         </w:rPr>
+        <w:lastRenderedPageBreak/>
         <w:t xml:space="preserve">Em relação ao inadimplemento, viu-se que os encargos pactuados foram compostos por multa de 2% e </w:t>
       </w:r>
       <w:r>
@@ -38697,11 +39471,7 @@
     </w:p>
     <w:p>
       <w:r>
-        <w:t xml:space="preserve">Destaca-se que no Demonstrativo de Débito apresentado, não há informações claras sobre as parcelas anteriores a março de 2019, quando o contrato restou vencido antecipadamente - a operação não teve suas informações de pagamento apresentadas na documentação disponibilizada. Desse modo, para apuração do excesso, estimamos os valores de </w:t>
-      </w:r>
-      <w:r>
-        <w:lastRenderedPageBreak/>
-        <w:t xml:space="preserve">pagamento das parcelas 1 a 23 conforme condições contratuais. Entretanto, solicita-se a ficha gráfica completa da operação para apuração de possíveis irregularidades na cobrança das parcelas pagas. </w:t>
+        <w:t xml:space="preserve">Destaca-se que no Demonstrativo de Débito apresentado, não há informações claras sobre as parcelas anteriores a março de 2019, quando o contrato restou vencido antecipadamente - a operação não teve suas informações de pagamento apresentadas na documentação disponibilizada. Desse modo, para apuração do excesso, estimamos os valores de pagamento das parcelas 1 a 23 conforme condições contratuais. Entretanto, solicita-se a ficha gráfica completa da operação para apuração de possíveis irregularidades na cobrança das parcelas pagas. </w:t>
       </w:r>
     </w:p>
     <w:p>
@@ -39229,7 +39999,7 @@
           <w:noProof/>
           <w:szCs w:val="23"/>
         </w:rPr>
-        <w:t>23 de abril de 2026</w:t>
+        <w:t>29 de abril de 2026</w:t>
       </w:r>
       <w:r>
         <w:rPr>
@@ -39467,7 +40237,6 @@
                 <w:rFonts w:eastAsia="Times New Roman" w:cs="Times New Roman"/>
                 <w:szCs w:val="23"/>
               </w:rPr>
-              <w:lastRenderedPageBreak/>
               <w:t>CNPEF/COFECON</w:t>
             </w:r>
             <w:r>
@@ -39507,7 +40276,6 @@
                 <w:noProof/>
                 <w:szCs w:val="23"/>
               </w:rPr>
-              <w:lastRenderedPageBreak/>
               <w:drawing>
                 <wp:anchor distT="0" distB="0" distL="114300" distR="114300" simplePos="0" relativeHeight="251658254" behindDoc="1" locked="0" layoutInCell="1" allowOverlap="1" wp14:anchorId="0BCF40BE" wp14:editId="28F3641C">
                   <wp:simplePos x="0" y="0"/>
@@ -39619,7 +40387,6 @@
               <w:rPr>
                 <w:szCs w:val="23"/>
               </w:rPr>
-              <w:lastRenderedPageBreak/>
               <w:t>CRC/PR</w:t>
             </w:r>
             <w:r>
@@ -46846,6 +47613,7 @@
   <w:style w:type="character" w:default="1" w:styleId="Fontepargpadro">
     <w:name w:val="Default Paragraph Font"/>
     <w:uiPriority w:val="1"/>
+    <w:semiHidden/>
     <w:unhideWhenUsed/>
   </w:style>
   <w:style w:type="table" w:default="1" w:styleId="Tabelanormal">
@@ -48475,6 +49243,64 @@
         </w:p>
       </w:docPartBody>
     </w:docPart>
+    <w:docPart>
+      <w:docPartPr>
+        <w:name w:val="1950A8E704374EB4BAB75D6839090E91"/>
+        <w:category>
+          <w:name w:val="Geral"/>
+          <w:gallery w:val="placeholder"/>
+        </w:category>
+        <w:types>
+          <w:type w:val="bbPlcHdr"/>
+        </w:types>
+        <w:behaviors>
+          <w:behavior w:val="content"/>
+        </w:behaviors>
+        <w:guid w:val="{4E033378-E8D0-45A7-905A-40B8E765633B}"/>
+      </w:docPartPr>
+      <w:docPartBody>
+        <w:p>
+          <w:pPr>
+            <w:pStyle w:val="1950A8E704374EB4BAB75D6839090E91"/>
+          </w:pPr>
+          <w:r>
+            <w:rPr>
+              <w:rStyle w:val="TextodoEspaoReservado"/>
+            </w:rPr>
+            <w:t>XXXXX</w:t>
+          </w:r>
+        </w:p>
+      </w:docPartBody>
+    </w:docPart>
+    <w:docPart>
+      <w:docPartPr>
+        <w:name w:val="581E7744678040B7AEC54FDA2B0C3E06"/>
+        <w:category>
+          <w:name w:val="Geral"/>
+          <w:gallery w:val="placeholder"/>
+        </w:category>
+        <w:types>
+          <w:type w:val="bbPlcHdr"/>
+        </w:types>
+        <w:behaviors>
+          <w:behavior w:val="content"/>
+        </w:behaviors>
+        <w:guid w:val="{C5A3F27B-C6BF-4739-8F00-349444A5C60B}"/>
+      </w:docPartPr>
+      <w:docPartBody>
+        <w:p>
+          <w:pPr>
+            <w:pStyle w:val="581E7744678040B7AEC54FDA2B0C3E06"/>
+          </w:pPr>
+          <w:r>
+            <w:rPr>
+              <w:rStyle w:val="TextodoEspaoReservado"/>
+            </w:rPr>
+            <w:t>XXXXX</w:t>
+          </w:r>
+        </w:p>
+      </w:docPartBody>
+    </w:docPart>
   </w:docParts>
 </w:glossaryDocument>
 </file>
@@ -48688,6 +49514,7 @@
     <w:rsid w:val="00402088"/>
     <w:rsid w:val="00450E0F"/>
     <w:rsid w:val="004610B4"/>
+    <w:rsid w:val="00481ADE"/>
     <w:rsid w:val="00485B83"/>
     <w:rsid w:val="00487D82"/>
     <w:rsid w:val="00492793"/>
@@ -48788,6 +49615,7 @@
     <w:rsid w:val="00AD1EF3"/>
     <w:rsid w:val="00AD36EC"/>
     <w:rsid w:val="00AD44CA"/>
+    <w:rsid w:val="00AF3380"/>
     <w:rsid w:val="00AF5CAB"/>
     <w:rsid w:val="00B24BAB"/>
     <w:rsid w:val="00B36FF5"/>
@@ -48835,12 +49663,14 @@
     <w:rsid w:val="00DD32DC"/>
     <w:rsid w:val="00DD5B20"/>
     <w:rsid w:val="00DF76B0"/>
+    <w:rsid w:val="00E06755"/>
     <w:rsid w:val="00E150B7"/>
     <w:rsid w:val="00E31949"/>
     <w:rsid w:val="00E54445"/>
     <w:rsid w:val="00E808B0"/>
     <w:rsid w:val="00EA0CF6"/>
     <w:rsid w:val="00EE0B56"/>
+    <w:rsid w:val="00EE4AB1"/>
     <w:rsid w:val="00EF134C"/>
     <w:rsid w:val="00EF1701"/>
     <w:rsid w:val="00EF3C19"/>
@@ -48848,9 +49678,11 @@
     <w:rsid w:val="00F15E56"/>
     <w:rsid w:val="00F22AA7"/>
     <w:rsid w:val="00F237CB"/>
+    <w:rsid w:val="00F36286"/>
     <w:rsid w:val="00F45AC8"/>
     <w:rsid w:val="00F92DB8"/>
     <w:rsid w:val="00F934F4"/>
+    <w:rsid w:val="00F9393F"/>
     <w:rsid w:val="00FB28EA"/>
     <w:rsid w:val="00FC593D"/>
     <w:rsid w:val="00FE2154"/>
@@ -49307,32 +50139,29 @@
     <w:name w:val="Placeholder Text"/>
     <w:basedOn w:val="Fontepargpadro"/>
     <w:uiPriority w:val="99"/>
-    <w:rsid w:val="001E339C"/>
+    <w:rsid w:val="00F9393F"/>
     <w:rPr>
       <w:color w:val="808080"/>
     </w:rPr>
   </w:style>
-  <w:style w:type="paragraph" w:customStyle="1" w:styleId="ADFABC3E2E6943BCAB736EB084B426FB">
-    <w:name w:val="ADFABC3E2E6943BCAB736EB084B426FB"/>
-  </w:style>
-  <w:style w:type="paragraph" w:customStyle="1" w:styleId="50C54617C6BB4867B374DA83983656B9">
-    <w:name w:val="50C54617C6BB4867B374DA83983656B9"/>
-  </w:style>
-  <w:style w:type="paragraph" w:customStyle="1" w:styleId="565F9AA4E7904A52852FD37918C5A772">
-    <w:name w:val="565F9AA4E7904A52852FD37918C5A772"/>
-  </w:style>
-  <w:style w:type="paragraph" w:customStyle="1" w:styleId="AEE82193DEDE4CE4B30C32B78EE9EF0A">
-    <w:name w:val="AEE82193DEDE4CE4B30C32B78EE9EF0A"/>
+  <w:style w:type="paragraph" w:customStyle="1" w:styleId="1950A8E704374EB4BAB75D6839090E91">
+    <w:name w:val="1950A8E704374EB4BAB75D6839090E91"/>
+    <w:rsid w:val="00F36286"/>
+    <w:pPr>
+      <w:spacing w:line="278" w:lineRule="auto"/>
+    </w:pPr>
+    <w:rPr>
+      <w:kern w:val="2"/>
+      <w:sz w:val="24"/>
+      <w:szCs w:val="24"/>
+      <w14:ligatures w14:val="standardContextual"/>
+    </w:rPr>
   </w:style>
   <w:style w:type="paragraph" w:customStyle="1" w:styleId="CB70E464C32D49A9900AA97F6733EDE8">
     <w:name w:val="CB70E464C32D49A9900AA97F6733EDE8"/>
   </w:style>
   <w:style w:type="paragraph" w:customStyle="1" w:styleId="FA01301F769C45BB95F3C9F2F87913B7">
     <w:name w:val="FA01301F769C45BB95F3C9F2F87913B7"/>
-  </w:style>
-  <w:style w:type="paragraph" w:customStyle="1" w:styleId="9B4919D0DEB042C2A4EBEB5EB250EF4A">
-    <w:name w:val="9B4919D0DEB042C2A4EBEB5EB250EF4A"/>
-    <w:rsid w:val="000A3E87"/>
   </w:style>
   <w:style w:type="paragraph" w:customStyle="1" w:styleId="C81CD5F7D8C94BB3A682D57D355F9440">
     <w:name w:val="C81CD5F7D8C94BB3A682D57D355F9440"/>
@@ -49372,58 +50201,6 @@
       <w14:ligatures w14:val="standardContextual"/>
     </w:rPr>
   </w:style>
-  <w:style w:type="paragraph" w:customStyle="1" w:styleId="2813CE83FBB741608652119621530B1E">
-    <w:name w:val="2813CE83FBB741608652119621530B1E"/>
-    <w:rsid w:val="001E339C"/>
-    <w:pPr>
-      <w:spacing w:line="278" w:lineRule="auto"/>
-    </w:pPr>
-    <w:rPr>
-      <w:kern w:val="2"/>
-      <w:sz w:val="24"/>
-      <w:szCs w:val="24"/>
-      <w14:ligatures w14:val="standardContextual"/>
-    </w:rPr>
-  </w:style>
-  <w:style w:type="paragraph" w:customStyle="1" w:styleId="ECFFE2328C7349C284A20C622A679EA1">
-    <w:name w:val="ECFFE2328C7349C284A20C622A679EA1"/>
-    <w:rsid w:val="001E339C"/>
-    <w:pPr>
-      <w:spacing w:line="278" w:lineRule="auto"/>
-    </w:pPr>
-    <w:rPr>
-      <w:kern w:val="2"/>
-      <w:sz w:val="24"/>
-      <w:szCs w:val="24"/>
-      <w14:ligatures w14:val="standardContextual"/>
-    </w:rPr>
-  </w:style>
-  <w:style w:type="paragraph" w:customStyle="1" w:styleId="DAF603EE25D0495CAC150E73A9D37246">
-    <w:name w:val="DAF603EE25D0495CAC150E73A9D37246"/>
-    <w:rsid w:val="001E339C"/>
-    <w:pPr>
-      <w:spacing w:line="278" w:lineRule="auto"/>
-    </w:pPr>
-    <w:rPr>
-      <w:kern w:val="2"/>
-      <w:sz w:val="24"/>
-      <w:szCs w:val="24"/>
-      <w14:ligatures w14:val="standardContextual"/>
-    </w:rPr>
-  </w:style>
-  <w:style w:type="paragraph" w:customStyle="1" w:styleId="40A3AB8583BC42DFB606AF9504F241E9">
-    <w:name w:val="40A3AB8583BC42DFB606AF9504F241E9"/>
-    <w:rsid w:val="001E339C"/>
-    <w:pPr>
-      <w:spacing w:line="278" w:lineRule="auto"/>
-    </w:pPr>
-    <w:rPr>
-      <w:kern w:val="2"/>
-      <w:sz w:val="24"/>
-      <w:szCs w:val="24"/>
-      <w14:ligatures w14:val="standardContextual"/>
-    </w:rPr>
-  </w:style>
   <w:style w:type="paragraph" w:customStyle="1" w:styleId="ECAFEBD54AEA4C0395AE96973C896EB0">
     <w:name w:val="ECAFEBD54AEA4C0395AE96973C896EB0"/>
     <w:rsid w:val="001E339C"/>
@@ -49440,6 +50217,19 @@
   <w:style w:type="paragraph" w:customStyle="1" w:styleId="9A976AECA57E4283B0FA6885D79262E4">
     <w:name w:val="9A976AECA57E4283B0FA6885D79262E4"/>
     <w:rsid w:val="001E339C"/>
+    <w:pPr>
+      <w:spacing w:line="278" w:lineRule="auto"/>
+    </w:pPr>
+    <w:rPr>
+      <w:kern w:val="2"/>
+      <w:sz w:val="24"/>
+      <w:szCs w:val="24"/>
+      <w14:ligatures w14:val="standardContextual"/>
+    </w:rPr>
+  </w:style>
+  <w:style w:type="paragraph" w:customStyle="1" w:styleId="581E7744678040B7AEC54FDA2B0C3E06">
+    <w:name w:val="581E7744678040B7AEC54FDA2B0C3E06"/>
+    <w:rsid w:val="00F9393F"/>
     <w:pPr>
       <w:spacing w:line="278" w:lineRule="auto"/>
     </w:pPr>

</xml_diff>

<commit_message>
ajustes nos laudo_completo com preenchimento
</commit_message>
<xml_diff>
--- a/laudo/templates/laudo_completo.docx
+++ b/laudo/templates/laudo_completo.docx
@@ -3313,7 +3313,6 @@
         <w:t>{{</w:t>
       </w:r>
       <w:proofErr w:type="spellStart"/>
-      <w:proofErr w:type="gramStart"/>
       <w:r>
         <w:rPr>
           <w:highlight w:val="green"/>
@@ -3321,7 +3320,6 @@
         <w:t>c.contrato</w:t>
       </w:r>
       <w:proofErr w:type="spellEnd"/>
-      <w:proofErr w:type="gramEnd"/>
       <w:r>
         <w:rPr>
           <w:highlight w:val="green"/>
@@ -3355,19 +3353,11 @@
         <w:t>{{</w:t>
       </w:r>
       <w:proofErr w:type="spellStart"/>
-      <w:proofErr w:type="gramStart"/>
       <w:r>
         <w:rPr>
           <w:highlight w:val="green"/>
         </w:rPr>
-        <w:t>c.valor</w:t>
-      </w:r>
-      <w:proofErr w:type="gramEnd"/>
-      <w:r>
-        <w:rPr>
-          <w:highlight w:val="green"/>
-        </w:rPr>
-        <w:t>_liberado</w:t>
+        <w:t>c.valor_liberado</w:t>
       </w:r>
       <w:proofErr w:type="spellEnd"/>
       <w:r>
@@ -3420,7 +3410,6 @@
             <w:t>{{</w:t>
           </w:r>
           <w:proofErr w:type="spellStart"/>
-          <w:proofErr w:type="gramStart"/>
           <w:r>
             <w:rPr>
               <w:bCs/>
@@ -3429,7 +3418,6 @@
             <w:t>c.juros</w:t>
           </w:r>
           <w:proofErr w:type="spellEnd"/>
-          <w:proofErr w:type="gramEnd"/>
           <w:r>
             <w:rPr>
               <w:bCs/>
@@ -3476,7 +3464,6 @@
         <w:t xml:space="preserve">{% for item in </w:t>
       </w:r>
       <w:proofErr w:type="spellStart"/>
-      <w:proofErr w:type="gramStart"/>
       <w:r>
         <w:rPr>
           <w:bCs/>
@@ -3485,7 +3472,6 @@
         <w:t>c.itens</w:t>
       </w:r>
       <w:proofErr w:type="spellEnd"/>
-      <w:proofErr w:type="gramEnd"/>
       <w:r>
         <w:rPr>
           <w:bCs/>
@@ -3502,7 +3488,6 @@
           <w:bCs/>
         </w:rPr>
       </w:pPr>
-      <w:proofErr w:type="gramStart"/>
       <w:r>
         <w:rPr>
           <w:b/>
@@ -3518,25 +3503,25 @@
           <w:bCs/>
           <w:highlight w:val="green"/>
         </w:rPr>
-        <w:t>item</w:t>
-      </w:r>
-      <w:proofErr w:type="gramEnd"/>
+        <w:t>item.nome</w:t>
+      </w:r>
+      <w:proofErr w:type="spellEnd"/>
       <w:r>
         <w:rPr>
           <w:b/>
           <w:bCs/>
           <w:highlight w:val="green"/>
         </w:rPr>
-        <w:t>.</w:t>
-      </w:r>
-      <w:proofErr w:type="gramStart"/>
+        <w:t xml:space="preserve"> }}: R$ {{ </w:t>
+      </w:r>
+      <w:proofErr w:type="spellStart"/>
       <w:r>
         <w:rPr>
           <w:b/>
           <w:bCs/>
           <w:highlight w:val="green"/>
         </w:rPr>
-        <w:t>nome</w:t>
+        <w:t>item.valor</w:t>
       </w:r>
       <w:proofErr w:type="spellEnd"/>
       <w:r>
@@ -3545,70 +3530,7 @@
           <w:bCs/>
           <w:highlight w:val="green"/>
         </w:rPr>
-        <w:t xml:space="preserve"> }}:</w:t>
-      </w:r>
-      <w:proofErr w:type="gramEnd"/>
-      <w:r>
-        <w:rPr>
-          <w:b/>
-          <w:bCs/>
-          <w:highlight w:val="green"/>
-        </w:rPr>
-        <w:t xml:space="preserve"> R$ </w:t>
-      </w:r>
-      <w:proofErr w:type="gramStart"/>
-      <w:r>
-        <w:rPr>
-          <w:b/>
-          <w:bCs/>
-          <w:highlight w:val="green"/>
-        </w:rPr>
-        <w:t xml:space="preserve">{{ </w:t>
-      </w:r>
-      <w:proofErr w:type="spellStart"/>
-      <w:r>
-        <w:rPr>
-          <w:b/>
-          <w:bCs/>
-          <w:highlight w:val="green"/>
-        </w:rPr>
-        <w:t>item</w:t>
-      </w:r>
-      <w:proofErr w:type="gramEnd"/>
-      <w:r>
-        <w:rPr>
-          <w:b/>
-          <w:bCs/>
-          <w:highlight w:val="green"/>
-        </w:rPr>
-        <w:t>.</w:t>
-      </w:r>
-      <w:proofErr w:type="gramStart"/>
-      <w:r>
-        <w:rPr>
-          <w:b/>
-          <w:bCs/>
-          <w:highlight w:val="green"/>
-        </w:rPr>
-        <w:t>valor</w:t>
-      </w:r>
-      <w:proofErr w:type="spellEnd"/>
-      <w:r>
-        <w:rPr>
-          <w:b/>
-          <w:bCs/>
-          <w:highlight w:val="green"/>
-        </w:rPr>
-        <w:t xml:space="preserve"> }</w:t>
-      </w:r>
-      <w:proofErr w:type="gramEnd"/>
-      <w:r>
-        <w:rPr>
-          <w:b/>
-          <w:bCs/>
-          <w:highlight w:val="green"/>
-        </w:rPr>
-        <w:t>}</w:t>
+        <w:t xml:space="preserve"> }}</w:t>
       </w:r>
     </w:p>
     <w:p>
@@ -3700,19 +3622,11 @@
         <w:t>{{</w:t>
       </w:r>
       <w:proofErr w:type="spellStart"/>
-      <w:proofErr w:type="gramStart"/>
       <w:r>
         <w:rPr>
           <w:highlight w:val="green"/>
         </w:rPr>
-        <w:t>c.valor</w:t>
-      </w:r>
-      <w:proofErr w:type="gramEnd"/>
-      <w:r>
-        <w:rPr>
-          <w:highlight w:val="green"/>
-        </w:rPr>
-        <w:t>_parcela</w:t>
+        <w:t>c.valor_parcela</w:t>
       </w:r>
       <w:proofErr w:type="spellEnd"/>
       <w:r>
@@ -3762,19 +3676,11 @@
             <w:t>{{</w:t>
           </w:r>
           <w:proofErr w:type="spellStart"/>
-          <w:proofErr w:type="gramStart"/>
           <w:r>
             <w:rPr>
               <w:highlight w:val="green"/>
             </w:rPr>
-            <w:t>c.numero</w:t>
-          </w:r>
-          <w:proofErr w:type="gramEnd"/>
-          <w:r>
-            <w:rPr>
-              <w:highlight w:val="green"/>
-            </w:rPr>
-            <w:t>_parcela</w:t>
+            <w:t>c.numero_parcela</w:t>
           </w:r>
           <w:proofErr w:type="spellEnd"/>
           <w:r>
@@ -4463,15 +4369,7 @@
         <w:contextualSpacing/>
       </w:pPr>
       <w:r>
-        <w:t>Bem, descrição completa (R</w:t>
-      </w:r>
-      <w:proofErr w:type="gramStart"/>
-      <w:r>
-        <w:t>$ )</w:t>
-      </w:r>
-      <w:proofErr w:type="gramEnd"/>
-      <w:r>
-        <w:t>;</w:t>
+        <w:t>Bem, descrição completa (R$ );</w:t>
       </w:r>
     </w:p>
     <w:p>
@@ -4549,21 +4447,7 @@
         <w:rPr>
           <w:highlight w:val="yellow"/>
         </w:rPr>
-        <w:t>1 maquinário, marca, modelo, ano, chassi, demais informações (R</w:t>
-      </w:r>
-      <w:proofErr w:type="gramStart"/>
-      <w:r>
-        <w:rPr>
-          <w:highlight w:val="yellow"/>
-        </w:rPr>
-        <w:t>$ )</w:t>
-      </w:r>
-      <w:proofErr w:type="gramEnd"/>
-      <w:r>
-        <w:rPr>
-          <w:highlight w:val="yellow"/>
-        </w:rPr>
-        <w:t>;</w:t>
+        <w:t>1 maquinário, marca, modelo, ano, chassi, demais informações (R$ );</w:t>
       </w:r>
     </w:p>
     <w:p>
@@ -4724,21 +4608,7 @@
         <w:rPr>
           <w:highlight w:val="yellow"/>
         </w:rPr>
-        <w:t xml:space="preserve"> – Cartório de Registro de Imóveis de XXXXX - UF (R</w:t>
-      </w:r>
-      <w:proofErr w:type="gramStart"/>
-      <w:r>
-        <w:rPr>
-          <w:highlight w:val="yellow"/>
-        </w:rPr>
-        <w:t>$ )</w:t>
-      </w:r>
-      <w:proofErr w:type="gramEnd"/>
-      <w:r>
-        <w:rPr>
-          <w:highlight w:val="yellow"/>
-        </w:rPr>
-        <w:t>;</w:t>
+        <w:t xml:space="preserve"> – Cartório de Registro de Imóveis de XXXXX - UF (R$ );</w:t>
       </w:r>
     </w:p>
     <w:p>
@@ -5778,23 +5648,7 @@
           <w:rFonts w:eastAsia="Times New Roman"/>
           <w:lang w:eastAsia="pt-BR"/>
         </w:rPr>
-        <w:t xml:space="preserve">        I - </w:t>
-      </w:r>
-      <w:proofErr w:type="gramStart"/>
-      <w:r>
-        <w:rPr>
-          <w:rFonts w:eastAsia="Times New Roman"/>
-          <w:lang w:eastAsia="pt-BR"/>
-        </w:rPr>
-        <w:t>preço</w:t>
-      </w:r>
-      <w:proofErr w:type="gramEnd"/>
-      <w:r>
-        <w:rPr>
-          <w:rFonts w:eastAsia="Times New Roman"/>
-          <w:lang w:eastAsia="pt-BR"/>
-        </w:rPr>
-        <w:t xml:space="preserve"> do produto ou serviço em moeda corrente nacional;</w:t>
+        <w:t>        I - preço do produto ou serviço em moeda corrente nacional;</w:t>
       </w:r>
     </w:p>
     <w:p>
@@ -5811,23 +5665,7 @@
           <w:rFonts w:eastAsia="Times New Roman"/>
           <w:lang w:eastAsia="pt-BR"/>
         </w:rPr>
-        <w:t xml:space="preserve">        II - </w:t>
-      </w:r>
-      <w:proofErr w:type="gramStart"/>
-      <w:r>
-        <w:rPr>
-          <w:rFonts w:eastAsia="Times New Roman"/>
-          <w:lang w:eastAsia="pt-BR"/>
-        </w:rPr>
-        <w:t>montante</w:t>
-      </w:r>
-      <w:proofErr w:type="gramEnd"/>
-      <w:r>
-        <w:rPr>
-          <w:rFonts w:eastAsia="Times New Roman"/>
-          <w:lang w:eastAsia="pt-BR"/>
-        </w:rPr>
-        <w:t xml:space="preserve"> dos juros de mora e da taxa efetiva anual de juros;</w:t>
+        <w:t>        II - montante dos juros de mora e da taxa efetiva anual de juros;</w:t>
       </w:r>
     </w:p>
     <w:p>
@@ -5863,7 +5701,6 @@
         </w:rPr>
         <w:t xml:space="preserve">        IV - </w:t>
       </w:r>
-      <w:proofErr w:type="gramStart"/>
       <w:r>
         <w:rPr>
           <w:rFonts w:eastAsia="Times New Roman"/>
@@ -5871,17 +5708,7 @@
           <w:bCs/>
           <w:lang w:eastAsia="pt-BR"/>
         </w:rPr>
-        <w:t>número e periodicidade</w:t>
-      </w:r>
-      <w:proofErr w:type="gramEnd"/>
-      <w:r>
-        <w:rPr>
-          <w:rFonts w:eastAsia="Times New Roman"/>
-          <w:b/>
-          <w:bCs/>
-          <w:lang w:eastAsia="pt-BR"/>
-        </w:rPr>
-        <w:t xml:space="preserve"> das prestações</w:t>
+        <w:t>número e periodicidade das prestações</w:t>
       </w:r>
       <w:r>
         <w:rPr>
@@ -5905,23 +5732,7 @@
           <w:rFonts w:eastAsia="Times New Roman"/>
           <w:lang w:eastAsia="pt-BR"/>
         </w:rPr>
-        <w:t xml:space="preserve">        V - </w:t>
-      </w:r>
-      <w:proofErr w:type="gramStart"/>
-      <w:r>
-        <w:rPr>
-          <w:rFonts w:eastAsia="Times New Roman"/>
-          <w:lang w:eastAsia="pt-BR"/>
-        </w:rPr>
-        <w:t>soma</w:t>
-      </w:r>
-      <w:proofErr w:type="gramEnd"/>
-      <w:r>
-        <w:rPr>
-          <w:rFonts w:eastAsia="Times New Roman"/>
-          <w:lang w:eastAsia="pt-BR"/>
-        </w:rPr>
-        <w:t xml:space="preserve"> total a pagar, com e sem financiamento.</w:t>
+        <w:t>        V - soma total a pagar, com e sem financiamento.</w:t>
       </w:r>
     </w:p>
     <w:p>
@@ -6617,30 +6428,12 @@
         <w:t xml:space="preserve">(TJPR - 16ª </w:t>
       </w:r>
       <w:proofErr w:type="spellStart"/>
-      <w:proofErr w:type="gramStart"/>
       <w:r>
         <w:t>C.Cível</w:t>
       </w:r>
       <w:proofErr w:type="spellEnd"/>
-      <w:proofErr w:type="gramEnd"/>
-      <w:r>
-        <w:t xml:space="preserve"> - 0014684-04.2013.8.16.0017 - Guaraniaçu </w:t>
-      </w:r>
-      <w:proofErr w:type="gramStart"/>
-      <w:r>
-        <w:t>-  Rel.</w:t>
-      </w:r>
-      <w:proofErr w:type="gramEnd"/>
-      <w:r>
-        <w:t xml:space="preserve">: JUÍZA DE DIREITO SUBSTITUTO EM SEGUNDO GRAU VANIA MARIA DA SILVA KRAMER </w:t>
-      </w:r>
-      <w:proofErr w:type="gramStart"/>
-      <w:r>
-        <w:t>-  J.</w:t>
-      </w:r>
-      <w:proofErr w:type="gramEnd"/>
-      <w:r>
-        <w:t xml:space="preserve"> 23.11.2020) [G. N.]</w:t>
+      <w:r>
+        <w:t xml:space="preserve"> - 0014684-04.2013.8.16.0017 - Guaraniaçu -  Rel.: JUÍZA DE DIREITO SUBSTITUTO EM SEGUNDO GRAU VANIA MARIA DA SILVA KRAMER -  J. 23.11.2020) [G. N.]</w:t>
       </w:r>
     </w:p>
     <w:p>
@@ -8581,30 +8374,12 @@
         <w:t xml:space="preserve">(TJPR - 16ª </w:t>
       </w:r>
       <w:proofErr w:type="spellStart"/>
-      <w:proofErr w:type="gramStart"/>
       <w:r>
         <w:t>C.Cível</w:t>
       </w:r>
       <w:proofErr w:type="spellEnd"/>
-      <w:proofErr w:type="gramEnd"/>
-      <w:r>
-        <w:t xml:space="preserve"> - 0014684-04.2013.8.16.0017 - Guaraniaçu </w:t>
-      </w:r>
-      <w:proofErr w:type="gramStart"/>
-      <w:r>
-        <w:t>-  Rel.</w:t>
-      </w:r>
-      <w:proofErr w:type="gramEnd"/>
-      <w:r>
-        <w:t xml:space="preserve">: JUÍZA DE DIREITO SUBSTITUTO EM SEGUNDO GRAU VANIA MARIA DA SILVA KRAMER </w:t>
-      </w:r>
-      <w:proofErr w:type="gramStart"/>
-      <w:r>
-        <w:t>-  J.</w:t>
-      </w:r>
-      <w:proofErr w:type="gramEnd"/>
-      <w:r>
-        <w:t xml:space="preserve"> 23.11.2020) [G. N.]</w:t>
+      <w:r>
+        <w:t xml:space="preserve"> - 0014684-04.2013.8.16.0017 - Guaraniaçu -  Rel.: JUÍZA DE DIREITO SUBSTITUTO EM SEGUNDO GRAU VANIA MARIA DA SILVA KRAMER -  J. 23.11.2020) [G. N.]</w:t>
       </w:r>
     </w:p>
     <w:p>
@@ -9234,30 +9009,12 @@
         <w:t xml:space="preserve">(TJPR - 16ª </w:t>
       </w:r>
       <w:proofErr w:type="spellStart"/>
-      <w:proofErr w:type="gramStart"/>
       <w:r>
         <w:t>C.Cível</w:t>
       </w:r>
       <w:proofErr w:type="spellEnd"/>
-      <w:proofErr w:type="gramEnd"/>
-      <w:r>
-        <w:t xml:space="preserve"> - 0014684-04.2013.8.16.0017 - Guaraniaçu </w:t>
-      </w:r>
-      <w:proofErr w:type="gramStart"/>
-      <w:r>
-        <w:t>-  Rel.</w:t>
-      </w:r>
-      <w:proofErr w:type="gramEnd"/>
-      <w:r>
-        <w:t xml:space="preserve">: JUÍZA DE DIREITO SUBSTITUTO EM SEGUNDO GRAU VANIA MARIA DA SILVA KRAMER </w:t>
-      </w:r>
-      <w:proofErr w:type="gramStart"/>
-      <w:r>
-        <w:t>-  J.</w:t>
-      </w:r>
-      <w:proofErr w:type="gramEnd"/>
-      <w:r>
-        <w:t xml:space="preserve"> 23.11.2020) [G. N.]</w:t>
+      <w:r>
+        <w:t xml:space="preserve"> - 0014684-04.2013.8.16.0017 - Guaraniaçu -  Rel.: JUÍZA DE DIREITO SUBSTITUTO EM SEGUNDO GRAU VANIA MARIA DA SILVA KRAMER -  J. 23.11.2020) [G. N.]</w:t>
       </w:r>
     </w:p>
     <w:p>
@@ -10235,21 +9992,7 @@
         <w:rPr>
           <w:color w:val="EE0000"/>
         </w:rPr>
-        <w:t>taxa_superior_</w:t>
-      </w:r>
-      <w:proofErr w:type="gramStart"/>
-      <w:r>
-        <w:rPr>
-          <w:color w:val="EE0000"/>
-        </w:rPr>
-        <w:t>media</w:t>
-      </w:r>
-      <w:proofErr w:type="gramEnd"/>
-      <w:r>
-        <w:rPr>
-          <w:color w:val="EE0000"/>
-        </w:rPr>
-        <w:t>_mercado</w:t>
+        <w:t>taxa_superior_media_mercado</w:t>
       </w:r>
       <w:proofErr w:type="spellEnd"/>
       <w:r>
@@ -10358,7 +10101,6 @@
             <w:t>{{</w:t>
           </w:r>
           <w:proofErr w:type="spellStart"/>
-          <w:proofErr w:type="gramStart"/>
           <w:r>
             <w:rPr>
               <w:bCs/>
@@ -10367,7 +10109,6 @@
             <w:t>c.juros</w:t>
           </w:r>
           <w:proofErr w:type="spellEnd"/>
-          <w:proofErr w:type="gramEnd"/>
           <w:r>
             <w:rPr>
               <w:bCs/>
@@ -10473,18 +10214,9 @@
               <w:rFonts w:eastAsia="Times New Roman"/>
               <w:highlight w:val="green"/>
             </w:rPr>
-            <w:t>produtor_</w:t>
-          </w:r>
-          <w:proofErr w:type="gramStart"/>
-          <w:r>
-            <w:rPr>
-              <w:rFonts w:eastAsia="Times New Roman"/>
-              <w:highlight w:val="green"/>
-            </w:rPr>
-            <w:t>genero.sujeito</w:t>
+            <w:t>produtor_genero.sujeito</w:t>
           </w:r>
           <w:proofErr w:type="spellEnd"/>
-          <w:proofErr w:type="gramEnd"/>
           <w:r>
             <w:rPr>
               <w:rFonts w:eastAsia="Times New Roman"/>
@@ -11912,30 +11644,12 @@
         <w:t xml:space="preserve">. CAPITALIZAÇÃO DE JUROS. POSSIBILIDADE. ART. 28, § 1º, INCISO I DA LEI 10.931/04. SÚMULA 541, DO STJ. COMISSÃO DE PERMANÊNCIA. PREVISÃO EXPRESSA NO CONTRATO. SÚMULA 472 DO STJ. POSSIBILIDADE. MULTA CONTRATUAL. AUSENCIA DE INTERESSE. AUSÊNCIA DE PREVISÃO EM CONTRATO. ÔNUS DE SUCUMBÊNCIA. ADEQUAÇÃO. SENTENÇA REFORMADA. Apelação Cível parcialmente conhecida e parcialmente provida. (TJPR - 16ª </w:t>
       </w:r>
       <w:proofErr w:type="spellStart"/>
-      <w:proofErr w:type="gramStart"/>
       <w:r>
         <w:t>C.Cível</w:t>
       </w:r>
       <w:proofErr w:type="spellEnd"/>
-      <w:proofErr w:type="gramEnd"/>
-      <w:r>
-        <w:t xml:space="preserve"> - 0029796-22.2017.8.16.0001 - Curitiba </w:t>
-      </w:r>
-      <w:proofErr w:type="gramStart"/>
-      <w:r>
-        <w:t>-  Rel.</w:t>
-      </w:r>
-      <w:proofErr w:type="gramEnd"/>
-      <w:r>
-        <w:t xml:space="preserve">: DESEMBARGADOR PAULO CEZAR BELLIO </w:t>
-      </w:r>
-      <w:proofErr w:type="gramStart"/>
-      <w:r>
-        <w:t>-  J.</w:t>
-      </w:r>
-      <w:proofErr w:type="gramEnd"/>
-      <w:r>
-        <w:t xml:space="preserve"> 04.10.2021)</w:t>
+      <w:r>
+        <w:t xml:space="preserve"> - 0029796-22.2017.8.16.0001 - Curitiba -  Rel.: DESEMBARGADOR PAULO CEZAR BELLIO -  J. 04.10.2021)</w:t>
       </w:r>
     </w:p>
     <w:p>
@@ -15912,21 +15626,7 @@
         <w:rPr>
           <w:color w:val="EE0000"/>
         </w:rPr>
-        <w:t>[[BLOCK juros_superiores_12_aa_</w:t>
-      </w:r>
-      <w:proofErr w:type="gramStart"/>
-      <w:r>
-        <w:rPr>
-          <w:color w:val="EE0000"/>
-        </w:rPr>
-        <w:t>credito</w:t>
-      </w:r>
-      <w:proofErr w:type="gramEnd"/>
-      <w:r>
-        <w:rPr>
-          <w:color w:val="EE0000"/>
-        </w:rPr>
-        <w:t>_rural]]</w:t>
+        <w:t>[[BLOCK juros_superiores_12_aa_credito_rural]]</w:t>
       </w:r>
     </w:p>
     <w:p>
@@ -16075,14 +15775,12 @@
       <w:r>
         <w:t xml:space="preserve"> </w:t>
       </w:r>
-      <w:proofErr w:type="gramStart"/>
       <w:r>
         <w:t>[</w:t>
       </w:r>
       <w:r>
         <w:t>Após</w:t>
       </w:r>
-      <w:proofErr w:type="gramEnd"/>
       <w:r>
         <w:t>]</w:t>
       </w:r>
@@ -17578,26 +17276,43 @@
         </w:rPr>
         <w:t xml:space="preserve">Há de se destacar ainda que, mesmo que se alegue que </w:t>
       </w:r>
-      <w:r>
-        <w:rPr>
-          <w:rFonts w:eastAsia="Times New Roman"/>
-          <w:highlight w:val="yellow"/>
-        </w:rPr>
-        <w:t>a cédula foi celebrada</w:t>
-      </w:r>
-      <w:r>
-        <w:rPr>
-          <w:rFonts w:eastAsia="Times New Roman"/>
-        </w:rPr>
-        <w:t xml:space="preserve"> / </w:t>
-      </w:r>
-      <w:r>
-        <w:rPr>
-          <w:rFonts w:eastAsia="Times New Roman"/>
-          <w:highlight w:val="yellow"/>
-        </w:rPr>
-        <w:t>as cédulas foram celebradas</w:t>
-      </w:r>
+      <w:sdt>
+        <w:sdtPr>
+          <w:rPr>
+            <w:bCs/>
+            <w:highlight w:val="green"/>
+          </w:rPr>
+          <w:id w:val="2047711678"/>
+          <w:placeholder>
+            <w:docPart w:val="A4DD3D226C7D4DD6B2CCE19E3174C36E"/>
+          </w:placeholder>
+        </w:sdtPr>
+        <w:sdtContent>
+          <w:r>
+            <w:rPr>
+              <w:rFonts w:eastAsia="Times New Roman"/>
+              <w:highlight w:val="green"/>
+            </w:rPr>
+            <w:t>{{</w:t>
+          </w:r>
+          <w:proofErr w:type="spellStart"/>
+          <w:r>
+            <w:rPr>
+              <w:rFonts w:eastAsia="Times New Roman"/>
+              <w:highlight w:val="green"/>
+            </w:rPr>
+            <w:t>operacao_tx_limite</w:t>
+          </w:r>
+          <w:proofErr w:type="spellEnd"/>
+          <w:r>
+            <w:rPr>
+              <w:rFonts w:eastAsia="Times New Roman"/>
+              <w:highlight w:val="green"/>
+            </w:rPr>
+            <w:t>}}</w:t>
+          </w:r>
+        </w:sdtContent>
+      </w:sdt>
       <w:r>
         <w:rPr>
           <w:rFonts w:eastAsia="Times New Roman"/>
@@ -18120,18 +17835,9 @@
           <w:rFonts w:eastAsia="Times New Roman"/>
           <w:highlight w:val="green"/>
         </w:rPr>
-        <w:t>produtor_</w:t>
-      </w:r>
-      <w:proofErr w:type="gramStart"/>
-      <w:r>
-        <w:rPr>
-          <w:rFonts w:eastAsia="Times New Roman"/>
-          <w:highlight w:val="green"/>
-        </w:rPr>
-        <w:t>genero.sujeito</w:t>
+        <w:t>produtor_genero.sujeito</w:t>
       </w:r>
       <w:proofErr w:type="spellEnd"/>
-      <w:proofErr w:type="gramEnd"/>
       <w:r>
         <w:rPr>
           <w:rFonts w:eastAsia="Times New Roman"/>
@@ -18552,22 +18258,8 @@
           <w:u w:val="single"/>
           <w:lang w:eastAsia="pt-BR"/>
         </w:rPr>
-        <w:t xml:space="preserve"> [G. </w:t>
-      </w:r>
-      <w:proofErr w:type="gramStart"/>
-      <w:r>
-        <w:rPr>
-          <w:rFonts w:eastAsia="Times New Roman" w:cs="Times New Roman"/>
-          <w:bCs/>
-          <w:iCs/>
-          <w:color w:val="032348"/>
-          <w:szCs w:val="23"/>
-          <w:u w:val="single"/>
-          <w:lang w:eastAsia="pt-BR"/>
-        </w:rPr>
-        <w:t>N. ]</w:t>
-      </w:r>
-      <w:proofErr w:type="gramEnd"/>
+        <w:t xml:space="preserve"> [G. N. ]</w:t>
+      </w:r>
     </w:p>
     <w:p>
       <w:pPr>
@@ -19056,22 +18748,8 @@
           <w:u w:val="single"/>
           <w:lang w:eastAsia="pt-BR"/>
         </w:rPr>
-        <w:t xml:space="preserve"> [G. </w:t>
-      </w:r>
-      <w:proofErr w:type="gramStart"/>
-      <w:r>
-        <w:rPr>
-          <w:rFonts w:eastAsia="Times New Roman" w:cs="Times New Roman"/>
-          <w:bCs/>
-          <w:iCs/>
-          <w:color w:val="032348"/>
-          <w:szCs w:val="23"/>
-          <w:u w:val="single"/>
-          <w:lang w:eastAsia="pt-BR"/>
-        </w:rPr>
-        <w:t>N. ]</w:t>
-      </w:r>
-      <w:proofErr w:type="gramEnd"/>
+        <w:t xml:space="preserve"> [G. N. ]</w:t>
+      </w:r>
     </w:p>
     <w:p>
       <w:pPr>
@@ -19686,7 +19364,6 @@
         <w:t xml:space="preserve">TJPR - 18ª </w:t>
       </w:r>
       <w:proofErr w:type="spellStart"/>
-      <w:proofErr w:type="gramStart"/>
       <w:r>
         <w:rPr>
           <w:rFonts w:eastAsia="Times New Roman"/>
@@ -19696,50 +19373,13 @@
         <w:t>C.Cível</w:t>
       </w:r>
       <w:proofErr w:type="spellEnd"/>
-      <w:proofErr w:type="gramEnd"/>
       <w:r>
         <w:rPr>
           <w:rFonts w:eastAsia="Times New Roman"/>
           <w:highlight w:val="yellow"/>
           <w:lang w:eastAsia="pt-BR"/>
         </w:rPr>
-        <w:t xml:space="preserve"> - 0032455-43.2019.8.16.0030 - Foz do Iguaçu </w:t>
-      </w:r>
-      <w:proofErr w:type="gramStart"/>
-      <w:r>
-        <w:rPr>
-          <w:rFonts w:eastAsia="Times New Roman"/>
-          <w:highlight w:val="yellow"/>
-          <w:lang w:eastAsia="pt-BR"/>
-        </w:rPr>
-        <w:t>-  Rel.</w:t>
-      </w:r>
-      <w:proofErr w:type="gramEnd"/>
-      <w:r>
-        <w:rPr>
-          <w:rFonts w:eastAsia="Times New Roman"/>
-          <w:highlight w:val="yellow"/>
-          <w:lang w:eastAsia="pt-BR"/>
-        </w:rPr>
-        <w:t xml:space="preserve">: Desembargador Marcelo Gobbo Dalla Dea </w:t>
-      </w:r>
-      <w:proofErr w:type="gramStart"/>
-      <w:r>
-        <w:rPr>
-          <w:rFonts w:eastAsia="Times New Roman"/>
-          <w:highlight w:val="yellow"/>
-          <w:lang w:eastAsia="pt-BR"/>
-        </w:rPr>
-        <w:t>-  J.</w:t>
-      </w:r>
-      <w:proofErr w:type="gramEnd"/>
-      <w:r>
-        <w:rPr>
-          <w:rFonts w:eastAsia="Times New Roman"/>
-          <w:highlight w:val="yellow"/>
-          <w:lang w:eastAsia="pt-BR"/>
-        </w:rPr>
-        <w:t xml:space="preserve"> 15.02.2021).</w:t>
+        <w:t xml:space="preserve"> - 0032455-43.2019.8.16.0030 - Foz do Iguaçu -  Rel.: Desembargador Marcelo Gobbo Dalla Dea -  J. 15.02.2021).</w:t>
       </w:r>
     </w:p>
     <w:p>
@@ -19934,18 +19574,9 @@
           <w:rFonts w:eastAsia="Times New Roman"/>
           <w:highlight w:val="green"/>
         </w:rPr>
-        <w:t>produtor_</w:t>
-      </w:r>
-      <w:proofErr w:type="gramStart"/>
-      <w:r>
-        <w:rPr>
-          <w:rFonts w:eastAsia="Times New Roman"/>
-          <w:highlight w:val="green"/>
-        </w:rPr>
-        <w:t>genero.sujeito</w:t>
+        <w:t>produtor_genero.sujeito</w:t>
       </w:r>
       <w:proofErr w:type="spellEnd"/>
-      <w:proofErr w:type="gramEnd"/>
       <w:r>
         <w:rPr>
           <w:rFonts w:eastAsia="Times New Roman"/>
@@ -20651,18 +20282,9 @@
           <w:rFonts w:eastAsia="Times New Roman"/>
           <w:highlight w:val="green"/>
         </w:rPr>
-        <w:t>produtor_</w:t>
-      </w:r>
-      <w:proofErr w:type="gramStart"/>
-      <w:r>
-        <w:rPr>
-          <w:rFonts w:eastAsia="Times New Roman"/>
-          <w:highlight w:val="green"/>
-        </w:rPr>
-        <w:t>genero.sujeito</w:t>
+        <w:t>produtor_genero.sujeito</w:t>
       </w:r>
       <w:proofErr w:type="spellEnd"/>
-      <w:proofErr w:type="gramEnd"/>
       <w:r>
         <w:rPr>
           <w:rFonts w:eastAsia="Times New Roman"/>
@@ -20746,15 +20368,7 @@
         <w:t xml:space="preserve"> (no caso, via Programa Nacional de Fortalecimento da Agricultura Familiar – PRONAF). D</w:t>
       </w:r>
       <w:r>
-        <w:t xml:space="preserve">essa forma, não poderia a apelada renegociar a dívida majorando os juros remuneratórios “carimbados” (regras do CMN) de 3% ao ano (cédula original) para 65,543% ao ano na nova cédula, com o que </w:t>
-      </w:r>
-      <w:proofErr w:type="gramStart"/>
-      <w:r>
-        <w:t>o valor das parcelas constantes no título exequendo foram</w:t>
-      </w:r>
-      <w:proofErr w:type="gramEnd"/>
-      <w:r>
-        <w:t xml:space="preserve"> apuradas em quantia substancialmente superior às efetivamente devidas, caso mantidos os juros de 3% ao ano. </w:t>
+        <w:t xml:space="preserve">essa forma, não poderia a apelada renegociar a dívida majorando os juros remuneratórios “carimbados” (regras do CMN) de 3% ao ano (cédula original) para 65,543% ao ano na nova cédula, com o que o valor das parcelas constantes no título exequendo foram apuradas em quantia substancialmente superior às efetivamente devidas, caso mantidos os juros de 3% ao ano. </w:t>
       </w:r>
       <w:r>
         <w:rPr>
@@ -21074,27 +20688,7 @@
           <w:sz w:val="22"/>
           <w:szCs w:val="22"/>
         </w:rPr>
-        <w:t xml:space="preserve"> </w:t>
-      </w:r>
-      <w:proofErr w:type="gramStart"/>
-      <w:r>
-        <w:rPr>
-          <w:rFonts w:eastAsia="Times New Roman" w:cs="Times New Roman"/>
-          <w:color w:val="002060"/>
-          <w:sz w:val="22"/>
-          <w:szCs w:val="22"/>
-        </w:rPr>
-        <w:t>-  j</w:t>
-      </w:r>
-      <w:proofErr w:type="gramEnd"/>
-      <w:r>
-        <w:rPr>
-          <w:rFonts w:eastAsia="Times New Roman" w:cs="Times New Roman"/>
-          <w:color w:val="002060"/>
-          <w:sz w:val="22"/>
-          <w:szCs w:val="22"/>
-        </w:rPr>
-        <w:t>/p, Forense, 2ª. edição, 1967, p. 903.</w:t>
+        <w:t xml:space="preserve"> -  j/p, Forense, 2ª. edição, 1967, p. 903.</w:t>
       </w:r>
     </w:p>
     <w:p>
@@ -21315,27 +20909,7 @@
           <w:sz w:val="22"/>
           <w:szCs w:val="22"/>
         </w:rPr>
-        <w:t xml:space="preserve">[...] Referido reclamo, no entanto, fora julgado monocraticamente aplicando ao caso o entendimento mais recente do STJ que </w:t>
-      </w:r>
-      <w:proofErr w:type="gramStart"/>
-      <w:r>
-        <w:rPr>
-          <w:rFonts w:eastAsia="Times New Roman" w:cs="Times New Roman"/>
-          <w:color w:val="002060"/>
-          <w:sz w:val="22"/>
-          <w:szCs w:val="22"/>
-        </w:rPr>
-        <w:t>consolidou-se</w:t>
-      </w:r>
-      <w:proofErr w:type="gramEnd"/>
-      <w:r>
-        <w:rPr>
-          <w:rFonts w:eastAsia="Times New Roman" w:cs="Times New Roman"/>
-          <w:color w:val="002060"/>
-          <w:sz w:val="22"/>
-          <w:szCs w:val="22"/>
-        </w:rPr>
-        <w:t xml:space="preserve"> no sentido da </w:t>
+        <w:t xml:space="preserve">[...] Referido reclamo, no entanto, fora julgado monocraticamente aplicando ao caso o entendimento mais recente do STJ que consolidou-se no sentido da </w:t>
       </w:r>
       <w:r>
         <w:rPr>
@@ -26739,23 +26313,7 @@
           <w:rFonts w:eastAsia="Times New Roman"/>
           <w:highlight w:val="yellow"/>
         </w:rPr>
-        <w:t xml:space="preserve">Quando informa diariamente, mas </w:t>
-      </w:r>
-      <w:proofErr w:type="gramStart"/>
-      <w:r>
-        <w:rPr>
-          <w:rFonts w:eastAsia="Times New Roman"/>
-          <w:highlight w:val="yellow"/>
-        </w:rPr>
-        <w:t>pratica</w:t>
-      </w:r>
-      <w:proofErr w:type="gramEnd"/>
-      <w:r>
-        <w:rPr>
-          <w:rFonts w:eastAsia="Times New Roman"/>
-          <w:highlight w:val="yellow"/>
-        </w:rPr>
-        <w:t xml:space="preserve"> mensalmente</w:t>
+        <w:t>Quando informa diariamente, mas pratica mensalmente</w:t>
       </w:r>
     </w:p>
     <w:p>
@@ -27223,31 +26781,126 @@
         </w:rPr>
         <w:t xml:space="preserve">, vê-se que </w:t>
       </w:r>
-      <w:r>
-        <w:rPr>
-          <w:rFonts w:eastAsia="Times New Roman"/>
-          <w:highlight w:val="yellow"/>
-        </w:rPr>
-        <w:t>o contrato não atende</w:t>
-      </w:r>
-      <w:r>
-        <w:rPr>
-          <w:rFonts w:eastAsia="Times New Roman"/>
-        </w:rPr>
-        <w:t xml:space="preserve"> / </w:t>
-      </w:r>
-      <w:r>
-        <w:rPr>
-          <w:rFonts w:eastAsia="Times New Roman"/>
-          <w:highlight w:val="yellow"/>
-        </w:rPr>
-        <w:t>os contratos não atendem</w:t>
-      </w:r>
-      <w:r>
-        <w:rPr>
-          <w:rFonts w:eastAsia="Times New Roman"/>
-        </w:rPr>
-        <w:t xml:space="preserve"> a todas as condições necessárias para que haja a expressa e clara pactuação da capitalização e da periodicidade</w:t>
+      <w:sdt>
+        <w:sdtPr>
+          <w:rPr>
+            <w:bCs/>
+            <w:highlight w:val="green"/>
+          </w:rPr>
+          <w:id w:val="-2125995785"/>
+          <w:placeholder>
+            <w:docPart w:val="AC7CEBFCDC5440B1BCE0F6B403C0A0AD"/>
+          </w:placeholder>
+        </w:sdtPr>
+        <w:sdtContent>
+          <w:r>
+            <w:rPr>
+              <w:rFonts w:eastAsia="Times New Roman"/>
+              <w:highlight w:val="green"/>
+            </w:rPr>
+            <w:t>{{</w:t>
+          </w:r>
+          <w:proofErr w:type="spellStart"/>
+          <w:r>
+            <w:rPr>
+              <w:rFonts w:eastAsia="Times New Roman"/>
+              <w:highlight w:val="green"/>
+            </w:rPr>
+            <w:t>descricao_op_contrato</w:t>
+          </w:r>
+          <w:r>
+            <w:rPr>
+              <w:rFonts w:eastAsia="Times New Roman"/>
+              <w:highlight w:val="green"/>
+            </w:rPr>
+            <w:t>.</w:t>
+          </w:r>
+          <w:r>
+            <w:rPr>
+              <w:rFonts w:eastAsia="Times New Roman"/>
+              <w:highlight w:val="green"/>
+            </w:rPr>
+            <w:t>quantidade</w:t>
+          </w:r>
+          <w:proofErr w:type="spellEnd"/>
+          <w:r>
+            <w:rPr>
+              <w:rFonts w:eastAsia="Times New Roman"/>
+              <w:highlight w:val="green"/>
+            </w:rPr>
+            <w:t>}}</w:t>
+          </w:r>
+        </w:sdtContent>
+      </w:sdt>
+      <w:r>
+        <w:rPr>
+          <w:rFonts w:eastAsia="Times New Roman"/>
+          <w:highlight w:val="yellow"/>
+        </w:rPr>
+        <w:t xml:space="preserve"> não </w:t>
+      </w:r>
+      <w:sdt>
+        <w:sdtPr>
+          <w:rPr>
+            <w:bCs/>
+            <w:highlight w:val="green"/>
+          </w:rPr>
+          <w:id w:val="-172806220"/>
+          <w:placeholder>
+            <w:docPart w:val="A7762009BB5647FB825DD2F4450DCE38"/>
+          </w:placeholder>
+        </w:sdtPr>
+        <w:sdtContent>
+          <w:r>
+            <w:rPr>
+              <w:rFonts w:eastAsia="Times New Roman"/>
+              <w:highlight w:val="green"/>
+            </w:rPr>
+            <w:t>{{</w:t>
+          </w:r>
+          <w:proofErr w:type="spellStart"/>
+          <w:r>
+            <w:rPr>
+              <w:rFonts w:eastAsia="Times New Roman"/>
+              <w:highlight w:val="green"/>
+            </w:rPr>
+            <w:t>descricao_op_contrato</w:t>
+          </w:r>
+          <w:r>
+            <w:rPr>
+              <w:rFonts w:eastAsia="Times New Roman"/>
+              <w:highlight w:val="green"/>
+            </w:rPr>
+            <w:t>.</w:t>
+          </w:r>
+          <w:r>
+            <w:rPr>
+              <w:rFonts w:eastAsia="Times New Roman"/>
+              <w:highlight w:val="green"/>
+            </w:rPr>
+            <w:t>verbo</w:t>
+          </w:r>
+          <w:proofErr w:type="spellEnd"/>
+          <w:r>
+            <w:rPr>
+              <w:rFonts w:eastAsia="Times New Roman"/>
+              <w:highlight w:val="green"/>
+            </w:rPr>
+            <w:t>}}</w:t>
+          </w:r>
+        </w:sdtContent>
+      </w:sdt>
+      <w:r>
+        <w:rPr>
+          <w:rFonts w:eastAsia="Times New Roman"/>
+        </w:rPr>
+        <w:t xml:space="preserve"> </w:t>
+      </w:r>
+      <w:r>
+        <w:rPr>
+          <w:rFonts w:eastAsia="Times New Roman"/>
+        </w:rPr>
+        <w:t>a todas as condições necessárias para que haja a expressa e clara pactuação da capitalização e da periodicidade</w:t>
       </w:r>
       <w:r>
         <w:t>. A tabela a seguir resume essa situação:</w:t>
@@ -28060,13 +27713,64 @@
         </w:rPr>
         <w:t xml:space="preserve">Para o expurgo da capitalização e anatocismo </w:t>
       </w:r>
-      <w:r>
-        <w:rPr>
-          <w:highlight w:val="yellow"/>
-          <w:lang w:eastAsia="pt-BR"/>
-        </w:rPr>
-        <w:t>na operação</w:t>
-      </w:r>
+      <w:sdt>
+        <w:sdtPr>
+          <w:rPr>
+            <w:bCs/>
+            <w:highlight w:val="green"/>
+          </w:rPr>
+          <w:id w:val="691036175"/>
+          <w:placeholder>
+            <w:docPart w:val="C67CE35380144580A121432F4DC0555C"/>
+          </w:placeholder>
+        </w:sdtPr>
+        <w:sdtContent>
+          <w:r>
+            <w:rPr>
+              <w:rFonts w:eastAsia="Times New Roman"/>
+              <w:highlight w:val="green"/>
+            </w:rPr>
+            <w:t>{{</w:t>
+          </w:r>
+          <w:proofErr w:type="spellStart"/>
+          <w:r>
+            <w:rPr>
+              <w:rFonts w:eastAsia="Times New Roman"/>
+              <w:highlight w:val="green"/>
+            </w:rPr>
+            <w:t>descricao_op_contrato</w:t>
+          </w:r>
+          <w:r>
+            <w:rPr>
+              <w:rFonts w:eastAsia="Times New Roman"/>
+              <w:highlight w:val="green"/>
+            </w:rPr>
+            <w:t>.</w:t>
+          </w:r>
+          <w:r>
+            <w:rPr>
+              <w:rFonts w:eastAsia="Times New Roman"/>
+              <w:highlight w:val="green"/>
+            </w:rPr>
+            <w:t>quantidade</w:t>
+          </w:r>
+          <w:r>
+            <w:rPr>
+              <w:rFonts w:eastAsia="Times New Roman"/>
+              <w:highlight w:val="green"/>
+            </w:rPr>
+            <w:t>_op</w:t>
+          </w:r>
+          <w:proofErr w:type="spellEnd"/>
+          <w:r>
+            <w:rPr>
+              <w:rFonts w:eastAsia="Times New Roman"/>
+              <w:highlight w:val="green"/>
+            </w:rPr>
+            <w:t>}}</w:t>
+          </w:r>
+        </w:sdtContent>
+      </w:sdt>
       <w:r>
         <w:rPr>
           <w:lang w:eastAsia="pt-BR"/>
@@ -28666,19 +28370,100 @@
         </w:rPr>
         <w:t xml:space="preserve">Entretanto, destaca-se que </w:t>
       </w:r>
-      <w:r>
-        <w:rPr>
-          <w:rFonts w:eastAsia="Times New Roman"/>
-          <w:highlight w:val="yellow"/>
-        </w:rPr>
-        <w:t xml:space="preserve">o contrato analisado tem </w:t>
-      </w:r>
-      <w:r>
-        <w:rPr>
-          <w:rFonts w:eastAsia="Times New Roman"/>
-          <w:highlight w:val="yellow"/>
-        </w:rPr>
-        <w:t>/ os contratos analisados têm</w:t>
+      <w:sdt>
+        <w:sdtPr>
+          <w:rPr>
+            <w:bCs/>
+            <w:highlight w:val="green"/>
+          </w:rPr>
+          <w:id w:val="1732962681"/>
+          <w:placeholder>
+            <w:docPart w:val="26180DF9FDE241359EE58705ADC5BFB9"/>
+          </w:placeholder>
+        </w:sdtPr>
+        <w:sdtContent>
+          <w:r>
+            <w:rPr>
+              <w:rFonts w:eastAsia="Times New Roman"/>
+              <w:highlight w:val="green"/>
+            </w:rPr>
+            <w:t>{{</w:t>
+          </w:r>
+          <w:proofErr w:type="spellStart"/>
+          <w:r>
+            <w:rPr>
+              <w:rFonts w:eastAsia="Times New Roman"/>
+              <w:highlight w:val="green"/>
+            </w:rPr>
+            <w:t>descricao_op_contrato</w:t>
+          </w:r>
+          <w:r>
+            <w:rPr>
+              <w:rFonts w:eastAsia="Times New Roman"/>
+              <w:highlight w:val="green"/>
+            </w:rPr>
+            <w:t>.</w:t>
+          </w:r>
+          <w:r>
+            <w:rPr>
+              <w:rFonts w:eastAsia="Times New Roman"/>
+              <w:highlight w:val="green"/>
+            </w:rPr>
+            <w:t>quantidade</w:t>
+          </w:r>
+          <w:proofErr w:type="spellEnd"/>
+          <w:r>
+            <w:rPr>
+              <w:rFonts w:eastAsia="Times New Roman"/>
+              <w:highlight w:val="green"/>
+            </w:rPr>
+            <w:t>}}</w:t>
+          </w:r>
+        </w:sdtContent>
+      </w:sdt>
+      <w:r>
+        <w:rPr>
+          <w:rFonts w:eastAsia="Times New Roman"/>
+          <w:highlight w:val="yellow"/>
+        </w:rPr>
+        <w:t xml:space="preserve"> </w:t>
+      </w:r>
+      <w:r>
+        <w:rPr>
+          <w:rFonts w:eastAsia="Times New Roman"/>
+          <w:highlight w:val="green"/>
+        </w:rPr>
+        <w:t>{{</w:t>
+      </w:r>
+      <w:proofErr w:type="spellStart"/>
+      <w:r>
+        <w:rPr>
+          <w:rFonts w:eastAsia="Times New Roman"/>
+          <w:highlight w:val="green"/>
+        </w:rPr>
+        <w:t>descricao_op_contrato</w:t>
+      </w:r>
+      <w:r>
+        <w:rPr>
+          <w:rFonts w:eastAsia="Times New Roman"/>
+          <w:highlight w:val="green"/>
+        </w:rPr>
+        <w:t>.</w:t>
+      </w:r>
+      <w:r>
+        <w:rPr>
+          <w:rFonts w:eastAsia="Times New Roman"/>
+          <w:highlight w:val="green"/>
+        </w:rPr>
+        <w:t>tem</w:t>
+      </w:r>
+      <w:proofErr w:type="spellEnd"/>
+      <w:r>
+        <w:rPr>
+          <w:rFonts w:eastAsia="Times New Roman"/>
+          <w:highlight w:val="green"/>
+        </w:rPr>
+        <w:t>}}</w:t>
       </w:r>
       <w:r>
         <w:rPr>
@@ -28884,21 +28669,12 @@
         </w:rPr>
         <w:t xml:space="preserve">. </w:t>
       </w:r>
-      <w:proofErr w:type="gramStart"/>
-      <w:r>
-        <w:rPr>
-          <w:rFonts w:eastAsia="Times New Roman"/>
-          <w:highlight w:val="yellow"/>
-        </w:rPr>
-        <w:t>[ no</w:t>
-      </w:r>
-      <w:proofErr w:type="gramEnd"/>
-      <w:r>
-        <w:rPr>
-          <w:rFonts w:eastAsia="Times New Roman"/>
-          <w:highlight w:val="yellow"/>
-        </w:rPr>
-        <w:t xml:space="preserve"> caso da operação </w:t>
+      <w:r>
+        <w:rPr>
+          <w:rFonts w:eastAsia="Times New Roman"/>
+          <w:highlight w:val="yellow"/>
+        </w:rPr>
+        <w:t xml:space="preserve">[ no caso da operação </w:t>
       </w:r>
       <w:proofErr w:type="spellStart"/>
       <w:r>
@@ -29191,18 +28967,112 @@
         </w:rPr>
         <w:t xml:space="preserve">Entretanto, destaca-se que </w:t>
       </w:r>
-      <w:r>
-        <w:rPr>
-          <w:rFonts w:eastAsia="Times New Roman"/>
-          <w:highlight w:val="yellow"/>
-        </w:rPr>
-        <w:t>o contrato analisado tem / os contratos analisados têm</w:t>
-      </w:r>
-      <w:r>
-        <w:rPr>
-          <w:rFonts w:eastAsia="Times New Roman"/>
-        </w:rPr>
-        <w:t xml:space="preserve"> a finalidade de obtenção </w:t>
+      <w:sdt>
+        <w:sdtPr>
+          <w:rPr>
+            <w:bCs/>
+            <w:highlight w:val="green"/>
+          </w:rPr>
+          <w:id w:val="1456833669"/>
+          <w:placeholder>
+            <w:docPart w:val="DFF6E68E360749EEAC734F36DE20BCDA"/>
+          </w:placeholder>
+        </w:sdtPr>
+        <w:sdtContent>
+          <w:r>
+            <w:rPr>
+              <w:rFonts w:eastAsia="Times New Roman"/>
+              <w:highlight w:val="green"/>
+            </w:rPr>
+            <w:t>{{</w:t>
+          </w:r>
+          <w:proofErr w:type="spellStart"/>
+          <w:r>
+            <w:rPr>
+              <w:rFonts w:eastAsia="Times New Roman"/>
+              <w:highlight w:val="green"/>
+            </w:rPr>
+            <w:t>descricao_op_contrato</w:t>
+          </w:r>
+          <w:r>
+            <w:rPr>
+              <w:rFonts w:eastAsia="Times New Roman"/>
+              <w:highlight w:val="green"/>
+            </w:rPr>
+            <w:t>.</w:t>
+          </w:r>
+          <w:r>
+            <w:rPr>
+              <w:rFonts w:eastAsia="Times New Roman"/>
+              <w:highlight w:val="green"/>
+            </w:rPr>
+            <w:t>quantidade</w:t>
+          </w:r>
+          <w:proofErr w:type="spellEnd"/>
+          <w:r>
+            <w:rPr>
+              <w:rFonts w:eastAsia="Times New Roman"/>
+              <w:highlight w:val="green"/>
+            </w:rPr>
+            <w:t>}}</w:t>
+          </w:r>
+        </w:sdtContent>
+      </w:sdt>
+      <w:r>
+        <w:rPr>
+          <w:rFonts w:eastAsia="Times New Roman"/>
+          <w:highlight w:val="yellow"/>
+        </w:rPr>
+        <w:t xml:space="preserve"> </w:t>
+      </w:r>
+      <w:r>
+        <w:rPr>
+          <w:rFonts w:eastAsia="Times New Roman"/>
+          <w:highlight w:val="green"/>
+        </w:rPr>
+        <w:t>{{</w:t>
+      </w:r>
+      <w:proofErr w:type="spellStart"/>
+      <w:r>
+        <w:rPr>
+          <w:rFonts w:eastAsia="Times New Roman"/>
+          <w:highlight w:val="green"/>
+        </w:rPr>
+        <w:t>descricao_op_contrato</w:t>
+      </w:r>
+      <w:r>
+        <w:rPr>
+          <w:rFonts w:eastAsia="Times New Roman"/>
+          <w:highlight w:val="green"/>
+        </w:rPr>
+        <w:t>.</w:t>
+      </w:r>
+      <w:r>
+        <w:rPr>
+          <w:rFonts w:eastAsia="Times New Roman"/>
+          <w:highlight w:val="green"/>
+        </w:rPr>
+        <w:t>tem</w:t>
+      </w:r>
+      <w:proofErr w:type="spellEnd"/>
+      <w:r>
+        <w:rPr>
+          <w:rFonts w:eastAsia="Times New Roman"/>
+          <w:highlight w:val="green"/>
+        </w:rPr>
+        <w:t>}}</w:t>
+      </w:r>
+      <w:r>
+        <w:rPr>
+          <w:rFonts w:eastAsia="Times New Roman"/>
+        </w:rPr>
+        <w:t xml:space="preserve"> </w:t>
+      </w:r>
+      <w:r>
+        <w:rPr>
+          <w:rFonts w:eastAsia="Times New Roman"/>
+        </w:rPr>
+        <w:t xml:space="preserve">a finalidade de obtenção </w:t>
       </w:r>
       <w:r>
         <w:rPr>
@@ -29403,21 +29273,12 @@
         </w:rPr>
         <w:t xml:space="preserve">. </w:t>
       </w:r>
-      <w:proofErr w:type="gramStart"/>
-      <w:r>
-        <w:rPr>
-          <w:rFonts w:eastAsia="Times New Roman"/>
-          <w:highlight w:val="yellow"/>
-        </w:rPr>
-        <w:t>[ no</w:t>
-      </w:r>
-      <w:proofErr w:type="gramEnd"/>
-      <w:r>
-        <w:rPr>
-          <w:rFonts w:eastAsia="Times New Roman"/>
-          <w:highlight w:val="yellow"/>
-        </w:rPr>
-        <w:t xml:space="preserve"> caso da operação </w:t>
+      <w:r>
+        <w:rPr>
+          <w:rFonts w:eastAsia="Times New Roman"/>
+          <w:highlight w:val="yellow"/>
+        </w:rPr>
+        <w:t xml:space="preserve">[ no caso da operação </w:t>
       </w:r>
       <w:proofErr w:type="spellStart"/>
       <w:r>
@@ -29613,27 +29474,7 @@
           <w:sz w:val="22"/>
           <w:szCs w:val="22"/>
         </w:rPr>
-        <w:t xml:space="preserve"> </w:t>
-      </w:r>
-      <w:proofErr w:type="gramStart"/>
-      <w:r>
-        <w:rPr>
-          <w:rFonts w:eastAsia="Times New Roman" w:cs="Times New Roman"/>
-          <w:color w:val="002060"/>
-          <w:sz w:val="22"/>
-          <w:szCs w:val="22"/>
-        </w:rPr>
-        <w:t>-  j</w:t>
-      </w:r>
-      <w:proofErr w:type="gramEnd"/>
-      <w:r>
-        <w:rPr>
-          <w:rFonts w:eastAsia="Times New Roman" w:cs="Times New Roman"/>
-          <w:color w:val="002060"/>
-          <w:sz w:val="22"/>
-          <w:szCs w:val="22"/>
-        </w:rPr>
-        <w:t>/p, forense, 2 a   edição, 1967, p. 903.</w:t>
+        <w:t xml:space="preserve"> -  j/p, forense, 2 a   edição, 1967, p. 903.</w:t>
       </w:r>
     </w:p>
     <w:p>
@@ -29719,27 +29560,7 @@
           <w:sz w:val="22"/>
           <w:szCs w:val="22"/>
         </w:rPr>
-        <w:t xml:space="preserve">[...] Referido reclamo, no entanto, fora julgado monocraticamente aplicando ao caso o entendimento mais recente do STJ que </w:t>
-      </w:r>
-      <w:proofErr w:type="gramStart"/>
-      <w:r>
-        <w:rPr>
-          <w:rFonts w:eastAsia="Times New Roman" w:cs="Times New Roman"/>
-          <w:color w:val="002060"/>
-          <w:sz w:val="22"/>
-          <w:szCs w:val="22"/>
-        </w:rPr>
-        <w:t>consolidou-se</w:t>
-      </w:r>
-      <w:proofErr w:type="gramEnd"/>
-      <w:r>
-        <w:rPr>
-          <w:rFonts w:eastAsia="Times New Roman" w:cs="Times New Roman"/>
-          <w:color w:val="002060"/>
-          <w:sz w:val="22"/>
-          <w:szCs w:val="22"/>
-        </w:rPr>
-        <w:t xml:space="preserve"> no sentido da </w:t>
+        <w:t xml:space="preserve">[...] Referido reclamo, no entanto, fora julgado monocraticamente aplicando ao caso o entendimento mais recente do STJ que consolidou-se no sentido da </w:t>
       </w:r>
       <w:r>
         <w:rPr>
@@ -31550,25 +31371,7 @@
           <w:sz w:val="22"/>
           <w:szCs w:val="22"/>
         </w:rPr>
-        <w:t xml:space="preserve">Calculamos as parcelas conforme as condições contratuais pactuadas (taxas de juros, número de </w:t>
-      </w:r>
-      <w:proofErr w:type="gramStart"/>
-      <w:r>
-        <w:rPr>
-          <w:rFonts w:eastAsia="Times New Roman" w:cs="Times New Roman"/>
-          <w:sz w:val="22"/>
-          <w:szCs w:val="22"/>
-        </w:rPr>
-        <w:t>parcelas, etc.</w:t>
-      </w:r>
-      <w:proofErr w:type="gramEnd"/>
-      <w:r>
-        <w:rPr>
-          <w:rFonts w:eastAsia="Times New Roman" w:cs="Times New Roman"/>
-          <w:sz w:val="22"/>
-          <w:szCs w:val="22"/>
-        </w:rPr>
-        <w:t xml:space="preserve">), considerando para isso o valor total da operação (montante): </w:t>
+        <w:t xml:space="preserve">Calculamos as parcelas conforme as condições contratuais pactuadas (taxas de juros, número de parcelas, etc.), considerando para isso o valor total da operação (montante): </w:t>
       </w:r>
       <w:r>
         <w:rPr>
@@ -32052,27 +31855,7 @@
           <w:sz w:val="22"/>
           <w:szCs w:val="22"/>
         </w:rPr>
-        <w:t xml:space="preserve"> </w:t>
-      </w:r>
-      <w:proofErr w:type="gramStart"/>
-      <w:r>
-        <w:rPr>
-          <w:rFonts w:eastAsia="Times New Roman" w:cs="Times New Roman"/>
-          <w:color w:val="002060"/>
-          <w:sz w:val="22"/>
-          <w:szCs w:val="22"/>
-        </w:rPr>
-        <w:t>-  j</w:t>
-      </w:r>
-      <w:proofErr w:type="gramEnd"/>
-      <w:r>
-        <w:rPr>
-          <w:rFonts w:eastAsia="Times New Roman" w:cs="Times New Roman"/>
-          <w:color w:val="002060"/>
-          <w:sz w:val="22"/>
-          <w:szCs w:val="22"/>
-        </w:rPr>
-        <w:t>/p, forense, 2 a   edição, 1967, p. 903.</w:t>
+        <w:t xml:space="preserve"> -  j/p, forense, 2 a   edição, 1967, p. 903.</w:t>
       </w:r>
     </w:p>
     <w:p>
@@ -33156,12 +32939,10 @@
         <w:t xml:space="preserve">TJMG, </w:t>
       </w:r>
       <w:proofErr w:type="spellStart"/>
-      <w:proofErr w:type="gramStart"/>
       <w:r>
         <w:t>Ap.Cív</w:t>
       </w:r>
       <w:proofErr w:type="spellEnd"/>
-      <w:proofErr w:type="gramEnd"/>
       <w:r>
         <w:t xml:space="preserve"> nº 1.0145.05.222381-8/002, Rel. Elpídio Donizetti, j. 13/05/2008.</w:t>
       </w:r>
@@ -33455,25 +33236,7 @@
           <w:sz w:val="22"/>
           <w:szCs w:val="22"/>
         </w:rPr>
-        <w:t xml:space="preserve">Calculamos as parcelas conforme as condições contratuais pactuadas (taxas de juros, número de </w:t>
-      </w:r>
-      <w:proofErr w:type="gramStart"/>
-      <w:r>
-        <w:rPr>
-          <w:rFonts w:eastAsia="Times New Roman" w:cs="Times New Roman"/>
-          <w:sz w:val="22"/>
-          <w:szCs w:val="22"/>
-        </w:rPr>
-        <w:t>parcelas, etc.</w:t>
-      </w:r>
-      <w:proofErr w:type="gramEnd"/>
-      <w:r>
-        <w:rPr>
-          <w:rFonts w:eastAsia="Times New Roman" w:cs="Times New Roman"/>
-          <w:sz w:val="22"/>
-          <w:szCs w:val="22"/>
-        </w:rPr>
-        <w:t xml:space="preserve">), considerando para isso o valor total da operação (montante): </w:t>
+        <w:t xml:space="preserve">Calculamos as parcelas conforme as condições contratuais pactuadas (taxas de juros, número de parcelas, etc.), considerando para isso o valor total da operação (montante): </w:t>
       </w:r>
       <w:r>
         <w:rPr>
@@ -33905,27 +33668,7 @@
           <w:sz w:val="22"/>
           <w:szCs w:val="22"/>
         </w:rPr>
-        <w:t xml:space="preserve"> </w:t>
-      </w:r>
-      <w:proofErr w:type="gramStart"/>
-      <w:r>
-        <w:rPr>
-          <w:rFonts w:eastAsia="Times New Roman" w:cs="Times New Roman"/>
-          <w:color w:val="002060"/>
-          <w:sz w:val="22"/>
-          <w:szCs w:val="22"/>
-        </w:rPr>
-        <w:t>-  j</w:t>
-      </w:r>
-      <w:proofErr w:type="gramEnd"/>
-      <w:r>
-        <w:rPr>
-          <w:rFonts w:eastAsia="Times New Roman" w:cs="Times New Roman"/>
-          <w:color w:val="002060"/>
-          <w:sz w:val="22"/>
-          <w:szCs w:val="22"/>
-        </w:rPr>
-        <w:t>/p, forense, 2 a   edição, 1967, p. 903.</w:t>
+        <w:t xml:space="preserve"> -  j/p, forense, 2 a   edição, 1967, p. 903.</w:t>
       </w:r>
     </w:p>
     <w:p>
@@ -34122,27 +33865,7 @@
           <w:sz w:val="22"/>
           <w:szCs w:val="22"/>
         </w:rPr>
-        <w:t xml:space="preserve">[...] Referido reclamo, no entanto, fora julgado monocraticamente aplicando ao caso o entendimento mais recente do STJ que </w:t>
-      </w:r>
-      <w:proofErr w:type="gramStart"/>
-      <w:r>
-        <w:rPr>
-          <w:rFonts w:eastAsia="Times New Roman" w:cs="Times New Roman"/>
-          <w:color w:val="002060"/>
-          <w:sz w:val="22"/>
-          <w:szCs w:val="22"/>
-        </w:rPr>
-        <w:t>consolidou-se</w:t>
-      </w:r>
-      <w:proofErr w:type="gramEnd"/>
-      <w:r>
-        <w:rPr>
-          <w:rFonts w:eastAsia="Times New Roman" w:cs="Times New Roman"/>
-          <w:color w:val="002060"/>
-          <w:sz w:val="22"/>
-          <w:szCs w:val="22"/>
-        </w:rPr>
-        <w:t xml:space="preserve"> no sentido da </w:t>
+        <w:t xml:space="preserve">[...] Referido reclamo, no entanto, fora julgado monocraticamente aplicando ao caso o entendimento mais recente do STJ que consolidou-se no sentido da </w:t>
       </w:r>
       <w:r>
         <w:rPr>
@@ -36106,18 +35829,9 @@
           <w:rFonts w:eastAsia="Times New Roman"/>
           <w:highlight w:val="green"/>
         </w:rPr>
-        <w:t>produtor_</w:t>
-      </w:r>
-      <w:proofErr w:type="gramStart"/>
-      <w:r>
-        <w:rPr>
-          <w:rFonts w:eastAsia="Times New Roman"/>
-          <w:highlight w:val="green"/>
-        </w:rPr>
-        <w:t>genero.sujeito</w:t>
+        <w:t>produtor_genero.sujeito</w:t>
       </w:r>
       <w:proofErr w:type="spellEnd"/>
-      <w:proofErr w:type="gramEnd"/>
       <w:r>
         <w:rPr>
           <w:rFonts w:eastAsia="Times New Roman"/>
@@ -36268,56 +35982,39 @@
           <w:rFonts w:eastAsia="Times New Roman"/>
           <w:highlight w:val="green"/>
         </w:rPr>
-        <w:t>produtor_</w:t>
-      </w:r>
-      <w:proofErr w:type="gramStart"/>
+        <w:t>produtor_genero.sujeito</w:t>
+      </w:r>
+      <w:proofErr w:type="spellEnd"/>
       <w:r>
         <w:rPr>
           <w:rFonts w:eastAsia="Times New Roman"/>
           <w:highlight w:val="green"/>
         </w:rPr>
-        <w:t>genero.sujeito</w:t>
+        <w:t>}}</w:t>
+      </w:r>
+      <w:r>
+        <w:rPr>
+          <w:rFonts w:eastAsia="Times New Roman"/>
+        </w:rPr>
+        <w:t xml:space="preserve">, </w:t>
+      </w:r>
+      <w:r>
+        <w:t xml:space="preserve">segundo seu relato não foi esse o procedimento adotado pela instituição financeira. Segundo </w:t>
+      </w:r>
+      <w:r>
+        <w:rPr>
+          <w:highlight w:val="green"/>
+        </w:rPr>
+        <w:t>{{</w:t>
+      </w:r>
+      <w:proofErr w:type="spellStart"/>
+      <w:r>
+        <w:rPr>
+          <w:highlight w:val="green"/>
+        </w:rPr>
+        <w:t>produtor_genero.pronome</w:t>
       </w:r>
       <w:proofErr w:type="spellEnd"/>
-      <w:proofErr w:type="gramEnd"/>
-      <w:r>
-        <w:rPr>
-          <w:rFonts w:eastAsia="Times New Roman"/>
-          <w:highlight w:val="green"/>
-        </w:rPr>
-        <w:t>}}</w:t>
-      </w:r>
-      <w:r>
-        <w:rPr>
-          <w:rFonts w:eastAsia="Times New Roman"/>
-        </w:rPr>
-        <w:t xml:space="preserve">, </w:t>
-      </w:r>
-      <w:r>
-        <w:t xml:space="preserve">segundo seu relato não foi esse o procedimento adotado pela instituição financeira. Segundo </w:t>
-      </w:r>
-      <w:r>
-        <w:rPr>
-          <w:highlight w:val="green"/>
-        </w:rPr>
-        <w:t>{{</w:t>
-      </w:r>
-      <w:proofErr w:type="spellStart"/>
-      <w:r>
-        <w:rPr>
-          <w:highlight w:val="green"/>
-        </w:rPr>
-        <w:t>produtor_</w:t>
-      </w:r>
-      <w:proofErr w:type="gramStart"/>
-      <w:r>
-        <w:rPr>
-          <w:highlight w:val="green"/>
-        </w:rPr>
-        <w:t>genero.pronome</w:t>
-      </w:r>
-      <w:proofErr w:type="spellEnd"/>
-      <w:proofErr w:type="gramEnd"/>
       <w:r>
         <w:rPr>
           <w:highlight w:val="green"/>
@@ -36597,23 +36294,13 @@
         </w:rPr>
         <w:t xml:space="preserve">        I - </w:t>
       </w:r>
-      <w:proofErr w:type="gramStart"/>
       <w:r>
         <w:rPr>
           <w:b/>
           <w:bCs/>
           <w:highlight w:val="green"/>
         </w:rPr>
-        <w:t>condicionar</w:t>
-      </w:r>
-      <w:proofErr w:type="gramEnd"/>
-      <w:r>
-        <w:rPr>
-          <w:b/>
-          <w:bCs/>
-          <w:highlight w:val="green"/>
-        </w:rPr>
-        <w:t xml:space="preserve"> o fornecimento de produto ou de serviço ao fornecimento de outro produto ou serviço, bem como, sem justa causa, a limites quantitativos;</w:t>
+        <w:t>condicionar o fornecimento de produto ou de serviço ao fornecimento de outro produto ou serviço, bem como, sem justa causa, a limites quantitativos;</w:t>
       </w:r>
     </w:p>
     <w:p>
@@ -36628,21 +36315,7 @@
         <w:rPr>
           <w:highlight w:val="green"/>
         </w:rPr>
-        <w:t xml:space="preserve">        II - </w:t>
-      </w:r>
-      <w:proofErr w:type="gramStart"/>
-      <w:r>
-        <w:rPr>
-          <w:highlight w:val="green"/>
-        </w:rPr>
-        <w:t>recusar</w:t>
-      </w:r>
-      <w:proofErr w:type="gramEnd"/>
-      <w:r>
-        <w:rPr>
-          <w:highlight w:val="green"/>
-        </w:rPr>
-        <w:t xml:space="preserve"> atendimento às demandas dos consumidores, na exata medida de suas disponibilidades de estoque, e, ainda, de conformidade com os usos e costumes;</w:t>
+        <w:t>        II - recusar atendimento às demandas dos consumidores, na exata medida de suas disponibilidades de estoque, e, ainda, de conformidade com os usos e costumes;</w:t>
       </w:r>
     </w:p>
     <w:p>
@@ -36672,21 +36345,7 @@
         <w:rPr>
           <w:highlight w:val="green"/>
         </w:rPr>
-        <w:t xml:space="preserve">        IV - </w:t>
-      </w:r>
-      <w:proofErr w:type="gramStart"/>
-      <w:r>
-        <w:rPr>
-          <w:highlight w:val="green"/>
-        </w:rPr>
-        <w:t>prevalecer-se</w:t>
-      </w:r>
-      <w:proofErr w:type="gramEnd"/>
-      <w:r>
-        <w:rPr>
-          <w:highlight w:val="green"/>
-        </w:rPr>
-        <w:t xml:space="preserve"> da fraqueza ou ignorância do consumidor, tendo em vista sua idade, saúde, conhecimento ou condição social, para impingir-lhe seus produtos ou serviços [G.N.];</w:t>
+        <w:t>        IV - prevalecer-se da fraqueza ou ignorância do consumidor, tendo em vista sua idade, saúde, conhecimento ou condição social, para impingir-lhe seus produtos ou serviços [G.N.];</w:t>
       </w:r>
     </w:p>
     <w:p>
@@ -37216,27 +36875,7 @@
           <w:sz w:val="22"/>
           <w:szCs w:val="22"/>
         </w:rPr>
-        <w:t xml:space="preserve">I - </w:t>
-      </w:r>
-      <w:proofErr w:type="gramStart"/>
-      <w:r>
-        <w:rPr>
-          <w:rFonts w:eastAsia="Times New Roman" w:cs="Times New Roman"/>
-          <w:color w:val="002060"/>
-          <w:sz w:val="22"/>
-          <w:szCs w:val="22"/>
-        </w:rPr>
-        <w:t>a</w:t>
-      </w:r>
-      <w:proofErr w:type="gramEnd"/>
-      <w:r>
-        <w:rPr>
-          <w:rFonts w:eastAsia="Times New Roman" w:cs="Times New Roman"/>
-          <w:color w:val="002060"/>
-          <w:sz w:val="22"/>
-          <w:szCs w:val="22"/>
-        </w:rPr>
-        <w:t xml:space="preserve"> cobrança de clientes atendidos pelo correspondente de </w:t>
+        <w:t xml:space="preserve">I - a cobrança de clientes atendidos pelo correspondente de </w:t>
       </w:r>
       <w:r>
         <w:rPr>
@@ -39999,7 +39638,7 @@
           <w:noProof/>
           <w:szCs w:val="23"/>
         </w:rPr>
-        <w:t>29 de abril de 2026</w:t>
+        <w:t>4 de maio de 2026</w:t>
       </w:r>
       <w:r>
         <w:rPr>
@@ -47613,7 +47252,6 @@
   <w:style w:type="character" w:default="1" w:styleId="Fontepargpadro">
     <w:name w:val="Default Paragraph Font"/>
     <w:uiPriority w:val="1"/>
-    <w:semiHidden/>
     <w:unhideWhenUsed/>
   </w:style>
   <w:style w:type="table" w:default="1" w:styleId="Tabelanormal">
@@ -49301,6 +48939,180 @@
         </w:p>
       </w:docPartBody>
     </w:docPart>
+    <w:docPart>
+      <w:docPartPr>
+        <w:name w:val="A4DD3D226C7D4DD6B2CCE19E3174C36E"/>
+        <w:category>
+          <w:name w:val="Geral"/>
+          <w:gallery w:val="placeholder"/>
+        </w:category>
+        <w:types>
+          <w:type w:val="bbPlcHdr"/>
+        </w:types>
+        <w:behaviors>
+          <w:behavior w:val="content"/>
+        </w:behaviors>
+        <w:guid w:val="{AD047E35-B402-4D2C-A865-02FB1406CB99}"/>
+      </w:docPartPr>
+      <w:docPartBody>
+        <w:p>
+          <w:pPr>
+            <w:pStyle w:val="A4DD3D226C7D4DD6B2CCE19E3174C36E"/>
+          </w:pPr>
+          <w:r>
+            <w:rPr>
+              <w:rStyle w:val="TextodoEspaoReservado"/>
+            </w:rPr>
+            <w:t>XXXXX</w:t>
+          </w:r>
+        </w:p>
+      </w:docPartBody>
+    </w:docPart>
+    <w:docPart>
+      <w:docPartPr>
+        <w:name w:val="AC7CEBFCDC5440B1BCE0F6B403C0A0AD"/>
+        <w:category>
+          <w:name w:val="Geral"/>
+          <w:gallery w:val="placeholder"/>
+        </w:category>
+        <w:types>
+          <w:type w:val="bbPlcHdr"/>
+        </w:types>
+        <w:behaviors>
+          <w:behavior w:val="content"/>
+        </w:behaviors>
+        <w:guid w:val="{B39CF8C0-F4FC-4D19-B2DE-C823E2A1C5A5}"/>
+      </w:docPartPr>
+      <w:docPartBody>
+        <w:p>
+          <w:pPr>
+            <w:pStyle w:val="AC7CEBFCDC5440B1BCE0F6B403C0A0AD"/>
+          </w:pPr>
+          <w:r>
+            <w:rPr>
+              <w:rStyle w:val="TextodoEspaoReservado"/>
+            </w:rPr>
+            <w:t>XXXXX</w:t>
+          </w:r>
+        </w:p>
+      </w:docPartBody>
+    </w:docPart>
+    <w:docPart>
+      <w:docPartPr>
+        <w:name w:val="A7762009BB5647FB825DD2F4450DCE38"/>
+        <w:category>
+          <w:name w:val="Geral"/>
+          <w:gallery w:val="placeholder"/>
+        </w:category>
+        <w:types>
+          <w:type w:val="bbPlcHdr"/>
+        </w:types>
+        <w:behaviors>
+          <w:behavior w:val="content"/>
+        </w:behaviors>
+        <w:guid w:val="{E8B0F13A-9C2D-425D-9CCC-2BBA77BA094E}"/>
+      </w:docPartPr>
+      <w:docPartBody>
+        <w:p>
+          <w:pPr>
+            <w:pStyle w:val="A7762009BB5647FB825DD2F4450DCE38"/>
+          </w:pPr>
+          <w:r>
+            <w:rPr>
+              <w:rStyle w:val="TextodoEspaoReservado"/>
+            </w:rPr>
+            <w:t>XXXXX</w:t>
+          </w:r>
+        </w:p>
+      </w:docPartBody>
+    </w:docPart>
+    <w:docPart>
+      <w:docPartPr>
+        <w:name w:val="C67CE35380144580A121432F4DC0555C"/>
+        <w:category>
+          <w:name w:val="Geral"/>
+          <w:gallery w:val="placeholder"/>
+        </w:category>
+        <w:types>
+          <w:type w:val="bbPlcHdr"/>
+        </w:types>
+        <w:behaviors>
+          <w:behavior w:val="content"/>
+        </w:behaviors>
+        <w:guid w:val="{20F7AE4A-274B-4416-A6C7-3C944279EEFD}"/>
+      </w:docPartPr>
+      <w:docPartBody>
+        <w:p>
+          <w:pPr>
+            <w:pStyle w:val="C67CE35380144580A121432F4DC0555C"/>
+          </w:pPr>
+          <w:r>
+            <w:rPr>
+              <w:rStyle w:val="TextodoEspaoReservado"/>
+            </w:rPr>
+            <w:t>XXXXX</w:t>
+          </w:r>
+        </w:p>
+      </w:docPartBody>
+    </w:docPart>
+    <w:docPart>
+      <w:docPartPr>
+        <w:name w:val="26180DF9FDE241359EE58705ADC5BFB9"/>
+        <w:category>
+          <w:name w:val="Geral"/>
+          <w:gallery w:val="placeholder"/>
+        </w:category>
+        <w:types>
+          <w:type w:val="bbPlcHdr"/>
+        </w:types>
+        <w:behaviors>
+          <w:behavior w:val="content"/>
+        </w:behaviors>
+        <w:guid w:val="{E2791EC6-FD73-4CCB-9751-545D86AD3D0D}"/>
+      </w:docPartPr>
+      <w:docPartBody>
+        <w:p>
+          <w:pPr>
+            <w:pStyle w:val="26180DF9FDE241359EE58705ADC5BFB9"/>
+          </w:pPr>
+          <w:r>
+            <w:rPr>
+              <w:rStyle w:val="TextodoEspaoReservado"/>
+            </w:rPr>
+            <w:t>XXXXX</w:t>
+          </w:r>
+        </w:p>
+      </w:docPartBody>
+    </w:docPart>
+    <w:docPart>
+      <w:docPartPr>
+        <w:name w:val="DFF6E68E360749EEAC734F36DE20BCDA"/>
+        <w:category>
+          <w:name w:val="Geral"/>
+          <w:gallery w:val="placeholder"/>
+        </w:category>
+        <w:types>
+          <w:type w:val="bbPlcHdr"/>
+        </w:types>
+        <w:behaviors>
+          <w:behavior w:val="content"/>
+        </w:behaviors>
+        <w:guid w:val="{2704CA2D-559E-44DB-AFCF-30C09177FDDB}"/>
+      </w:docPartPr>
+      <w:docPartBody>
+        <w:p>
+          <w:pPr>
+            <w:pStyle w:val="DFF6E68E360749EEAC734F36DE20BCDA"/>
+          </w:pPr>
+          <w:r>
+            <w:rPr>
+              <w:rStyle w:val="TextodoEspaoReservado"/>
+            </w:rPr>
+            <w:t>XXXXX</w:t>
+          </w:r>
+        </w:p>
+      </w:docPartBody>
+    </w:docPart>
   </w:docParts>
 </w:glossaryDocument>
 </file>
@@ -49613,6 +49425,7 @@
     <w:rsid w:val="00AC1DE1"/>
     <w:rsid w:val="00AC677B"/>
     <w:rsid w:val="00AD1EF3"/>
+    <w:rsid w:val="00AD2F45"/>
     <w:rsid w:val="00AD36EC"/>
     <w:rsid w:val="00AD44CA"/>
     <w:rsid w:val="00AF3380"/>
@@ -49666,8 +49479,10 @@
     <w:rsid w:val="00E06755"/>
     <w:rsid w:val="00E150B7"/>
     <w:rsid w:val="00E31949"/>
+    <w:rsid w:val="00E47109"/>
     <w:rsid w:val="00E54445"/>
     <w:rsid w:val="00E808B0"/>
+    <w:rsid w:val="00E83E72"/>
     <w:rsid w:val="00EA0CF6"/>
     <w:rsid w:val="00EE0B56"/>
     <w:rsid w:val="00EE4AB1"/>
@@ -50139,7 +49954,7 @@
     <w:name w:val="Placeholder Text"/>
     <w:basedOn w:val="Fontepargpadro"/>
     <w:uiPriority w:val="99"/>
-    <w:rsid w:val="00F9393F"/>
+    <w:rsid w:val="00E83E72"/>
     <w:rPr>
       <w:color w:val="808080"/>
     </w:rPr>
@@ -50230,6 +50045,84 @@
   <w:style w:type="paragraph" w:customStyle="1" w:styleId="581E7744678040B7AEC54FDA2B0C3E06">
     <w:name w:val="581E7744678040B7AEC54FDA2B0C3E06"/>
     <w:rsid w:val="00F9393F"/>
+    <w:pPr>
+      <w:spacing w:line="278" w:lineRule="auto"/>
+    </w:pPr>
+    <w:rPr>
+      <w:kern w:val="2"/>
+      <w:sz w:val="24"/>
+      <w:szCs w:val="24"/>
+      <w14:ligatures w14:val="standardContextual"/>
+    </w:rPr>
+  </w:style>
+  <w:style w:type="paragraph" w:customStyle="1" w:styleId="A4DD3D226C7D4DD6B2CCE19E3174C36E">
+    <w:name w:val="A4DD3D226C7D4DD6B2CCE19E3174C36E"/>
+    <w:rsid w:val="00E83E72"/>
+    <w:pPr>
+      <w:spacing w:line="278" w:lineRule="auto"/>
+    </w:pPr>
+    <w:rPr>
+      <w:kern w:val="2"/>
+      <w:sz w:val="24"/>
+      <w:szCs w:val="24"/>
+      <w14:ligatures w14:val="standardContextual"/>
+    </w:rPr>
+  </w:style>
+  <w:style w:type="paragraph" w:customStyle="1" w:styleId="AC7CEBFCDC5440B1BCE0F6B403C0A0AD">
+    <w:name w:val="AC7CEBFCDC5440B1BCE0F6B403C0A0AD"/>
+    <w:rsid w:val="00E83E72"/>
+    <w:pPr>
+      <w:spacing w:line="278" w:lineRule="auto"/>
+    </w:pPr>
+    <w:rPr>
+      <w:kern w:val="2"/>
+      <w:sz w:val="24"/>
+      <w:szCs w:val="24"/>
+      <w14:ligatures w14:val="standardContextual"/>
+    </w:rPr>
+  </w:style>
+  <w:style w:type="paragraph" w:customStyle="1" w:styleId="A7762009BB5647FB825DD2F4450DCE38">
+    <w:name w:val="A7762009BB5647FB825DD2F4450DCE38"/>
+    <w:rsid w:val="00E83E72"/>
+    <w:pPr>
+      <w:spacing w:line="278" w:lineRule="auto"/>
+    </w:pPr>
+    <w:rPr>
+      <w:kern w:val="2"/>
+      <w:sz w:val="24"/>
+      <w:szCs w:val="24"/>
+      <w14:ligatures w14:val="standardContextual"/>
+    </w:rPr>
+  </w:style>
+  <w:style w:type="paragraph" w:customStyle="1" w:styleId="C67CE35380144580A121432F4DC0555C">
+    <w:name w:val="C67CE35380144580A121432F4DC0555C"/>
+    <w:rsid w:val="00E83E72"/>
+    <w:pPr>
+      <w:spacing w:line="278" w:lineRule="auto"/>
+    </w:pPr>
+    <w:rPr>
+      <w:kern w:val="2"/>
+      <w:sz w:val="24"/>
+      <w:szCs w:val="24"/>
+      <w14:ligatures w14:val="standardContextual"/>
+    </w:rPr>
+  </w:style>
+  <w:style w:type="paragraph" w:customStyle="1" w:styleId="26180DF9FDE241359EE58705ADC5BFB9">
+    <w:name w:val="26180DF9FDE241359EE58705ADC5BFB9"/>
+    <w:rsid w:val="00E83E72"/>
+    <w:pPr>
+      <w:spacing w:line="278" w:lineRule="auto"/>
+    </w:pPr>
+    <w:rPr>
+      <w:kern w:val="2"/>
+      <w:sz w:val="24"/>
+      <w:szCs w:val="24"/>
+      <w14:ligatures w14:val="standardContextual"/>
+    </w:rPr>
+  </w:style>
+  <w:style w:type="paragraph" w:customStyle="1" w:styleId="DFF6E68E360749EEAC734F36DE20BCDA">
+    <w:name w:val="DFF6E68E360749EEAC734F36DE20BCDA"/>
+    <w:rsid w:val="00E83E72"/>
     <w:pPr>
       <w:spacing w:line="278" w:lineRule="auto"/>
     </w:pPr>

</xml_diff>

<commit_message>
ajuste final no  render_docx
</commit_message>
<xml_diff>
--- a/laudo/templates/laudo_completo.docx
+++ b/laudo/templates/laudo_completo.docx
@@ -54,6 +54,38 @@
           <w:lang w:eastAsia="pt-BR"/>
         </w:rPr>
         <w:t xml:space="preserve"> </w:t>
+      </w:r>
+      <w:r>
+        <w:rPr>
+          <w:rFonts w:eastAsia="Times New Roman" w:cs="Times New Roman"/>
+          <w:color w:val="EE0000"/>
+          <w:szCs w:val="23"/>
+          <w:highlight w:val="yellow"/>
+          <w:lang w:eastAsia="pt-BR"/>
+        </w:rPr>
+        <w:t xml:space="preserve">XXXX </w:t>
+      </w:r>
+      <w:proofErr w:type="gramStart"/>
+      <w:r>
+        <w:rPr>
+          <w:rFonts w:eastAsia="Times New Roman" w:cs="Times New Roman"/>
+          <w:color w:val="EE0000"/>
+          <w:szCs w:val="23"/>
+          <w:highlight w:val="yellow"/>
+          <w:lang w:eastAsia="pt-BR"/>
+        </w:rPr>
+        <w:t>-  COLOCAR</w:t>
+      </w:r>
+      <w:proofErr w:type="gramEnd"/>
+      <w:r>
+        <w:rPr>
+          <w:rFonts w:eastAsia="Times New Roman" w:cs="Times New Roman"/>
+          <w:color w:val="EE0000"/>
+          <w:szCs w:val="23"/>
+          <w:highlight w:val="yellow"/>
+          <w:lang w:eastAsia="pt-BR"/>
+        </w:rPr>
+        <w:t xml:space="preserve"> AUTOR</w:t>
       </w:r>
     </w:p>
     <w:p>
@@ -36451,6 +36483,34 @@
     </w:p>
     <w:p>
       <w:pPr>
+        <w:ind w:firstLine="0"/>
+        <w:rPr>
+          <w:color w:val="EE0000"/>
+        </w:rPr>
+      </w:pPr>
+      <w:r>
+        <w:rPr>
+          <w:color w:val="EE0000"/>
+        </w:rPr>
+        <w:t xml:space="preserve">[[BLOCK </w:t>
+      </w:r>
+      <w:proofErr w:type="spellStart"/>
+      <w:r>
+        <w:rPr>
+          <w:color w:val="EE0000"/>
+        </w:rPr>
+        <w:t>seguro_penhor</w:t>
+      </w:r>
+      <w:proofErr w:type="spellEnd"/>
+      <w:r>
+        <w:rPr>
+          <w:color w:val="EE0000"/>
+        </w:rPr>
+        <w:t>]]</w:t>
+      </w:r>
+    </w:p>
+    <w:p>
+      <w:pPr>
         <w:rPr>
           <w:rFonts w:eastAsia="Times New Roman"/>
           <w:u w:val="single"/>
@@ -36614,6 +36674,60 @@
     </w:p>
     <w:p>
       <w:pPr>
+        <w:ind w:firstLine="0"/>
+        <w:rPr>
+          <w:color w:val="EE0000"/>
+        </w:rPr>
+      </w:pPr>
+      <w:r>
+        <w:rPr>
+          <w:color w:val="EE0000"/>
+        </w:rPr>
+        <w:t>[[END_BLOCK]]</w:t>
+      </w:r>
+    </w:p>
+    <w:p>
+      <w:pPr>
+        <w:ind w:firstLine="0"/>
+        <w:rPr>
+          <w:color w:val="EE0000"/>
+        </w:rPr>
+      </w:pPr>
+      <w:r>
+        <w:rPr>
+          <w:color w:val="EE0000"/>
+        </w:rPr>
+        <w:t>[[BLOCK</w:t>
+      </w:r>
+      <w:r>
+        <w:rPr>
+          <w:color w:val="EE0000"/>
+        </w:rPr>
+        <w:t xml:space="preserve"> </w:t>
+      </w:r>
+      <w:proofErr w:type="spellStart"/>
+      <w:r>
+        <w:rPr>
+          <w:color w:val="EE0000"/>
+        </w:rPr>
+        <w:t>seguro_</w:t>
+      </w:r>
+      <w:r>
+        <w:rPr>
+          <w:color w:val="EE0000"/>
+        </w:rPr>
+        <w:t>agricola</w:t>
+      </w:r>
+      <w:proofErr w:type="spellEnd"/>
+      <w:r>
+        <w:rPr>
+          <w:color w:val="EE0000"/>
+        </w:rPr>
+        <w:t>]]</w:t>
+      </w:r>
+    </w:p>
+    <w:p>
+      <w:pPr>
         <w:spacing w:before="0"/>
         <w:ind w:firstLine="709"/>
         <w:rPr>
@@ -36633,6 +36747,7 @@
         <w:ind w:firstLine="709"/>
       </w:pPr>
       <w:r>
+        <w:lastRenderedPageBreak/>
         <w:t>Sobre o seguro agrícola, apesar da pactuação em contrato e as informações darem o entendimento de que se trata de livre iniciativa</w:t>
       </w:r>
       <w:r>
@@ -36765,6 +36880,54 @@
     </w:p>
     <w:p>
       <w:pPr>
+        <w:ind w:firstLine="0"/>
+        <w:rPr>
+          <w:color w:val="EE0000"/>
+        </w:rPr>
+      </w:pPr>
+      <w:r>
+        <w:rPr>
+          <w:color w:val="EE0000"/>
+        </w:rPr>
+        <w:t>[[END_BLOCK]]</w:t>
+      </w:r>
+    </w:p>
+    <w:p>
+      <w:pPr>
+        <w:ind w:firstLine="0"/>
+        <w:rPr>
+          <w:color w:val="EE0000"/>
+        </w:rPr>
+      </w:pPr>
+      <w:r>
+        <w:rPr>
+          <w:color w:val="EE0000"/>
+        </w:rPr>
+        <w:t>[[BLOCK</w:t>
+      </w:r>
+      <w:r>
+        <w:rPr>
+          <w:color w:val="EE0000"/>
+        </w:rPr>
+        <w:t xml:space="preserve"> </w:t>
+      </w:r>
+      <w:proofErr w:type="spellStart"/>
+      <w:r>
+        <w:rPr>
+          <w:color w:val="EE0000"/>
+        </w:rPr>
+        <w:t>seguro_vida</w:t>
+      </w:r>
+      <w:proofErr w:type="spellEnd"/>
+      <w:r>
+        <w:rPr>
+          <w:color w:val="EE0000"/>
+        </w:rPr>
+        <w:t>]]</w:t>
+      </w:r>
+    </w:p>
+    <w:p>
+      <w:pPr>
         <w:rPr>
           <w:rFonts w:eastAsia="Times New Roman"/>
         </w:rPr>
@@ -37128,6 +37291,7 @@
         <w:rPr>
           <w:highlight w:val="green"/>
         </w:rPr>
+        <w:lastRenderedPageBreak/>
         <w:t>        III - enviar ou entregar ao consumidor, sem solicitação prévia, qualquer produto, ou fornecer qualquer serviço;</w:t>
       </w:r>
     </w:p>
@@ -37193,7 +37357,6 @@
           <w:rFonts w:eastAsia="Times New Roman"/>
           <w:highlight w:val="green"/>
         </w:rPr>
-        <w:lastRenderedPageBreak/>
         <w:t>Tal fato afronta a tese firmada pelo STJ (REsp n. 1.639.320 e Tema 972), segundo a qual "</w:t>
       </w:r>
       <w:r>
@@ -37286,10 +37449,44 @@
       </w:r>
       <w:r>
         <w:rPr>
-          <w:rFonts w:eastAsia="Times New Roman"/>
-          <w:highlight w:val="yellow"/>
-        </w:rPr>
-        <w:t>Seguro Penhor e o Seguro Agrícola</w:t>
+          <w:highlight w:val="green"/>
+        </w:rPr>
+        <w:t>{{</w:t>
+      </w:r>
+      <w:proofErr w:type="spellStart"/>
+      <w:r>
+        <w:rPr>
+          <w:highlight w:val="green"/>
+        </w:rPr>
+        <w:t>estornos</w:t>
+      </w:r>
+      <w:r>
+        <w:rPr>
+          <w:highlight w:val="green"/>
+        </w:rPr>
+        <w:t>.</w:t>
+      </w:r>
+      <w:r>
+        <w:rPr>
+          <w:highlight w:val="green"/>
+        </w:rPr>
+        <w:t>s</w:t>
+      </w:r>
+      <w:r>
+        <w:rPr>
+          <w:highlight w:val="green"/>
+        </w:rPr>
+        <w:t>eguro</w:t>
+      </w:r>
+      <w:proofErr w:type="spellEnd"/>
+      <w:r>
+        <w:rPr>
+          <w:highlight w:val="green"/>
+        </w:rPr>
+        <w:t>}</w:t>
+      </w:r>
+      <w:r>
+        <w:t>}</w:t>
       </w:r>
       <w:r>
         <w:rPr>
@@ -37359,6 +37556,7 @@
         <w:rPr>
           <w:rFonts w:eastAsia="Times New Roman"/>
         </w:rPr>
+        <w:lastRenderedPageBreak/>
         <w:t xml:space="preserve">Assim, considerando que não </w:t>
       </w:r>
       <w:r>
@@ -37405,7 +37603,6 @@
         <w:rPr>
           <w:rFonts w:eastAsia="Times New Roman"/>
         </w:rPr>
-        <w:lastRenderedPageBreak/>
         <w:t xml:space="preserve">[...] é comum bancos adotarem a estratégia de concessão de crédito associada à imposição de certas exigências, como saldo médio ou compra de produtos, como </w:t>
       </w:r>
       <w:r>
@@ -37421,6 +37618,52 @@
           <w:rFonts w:eastAsia="Times New Roman"/>
         </w:rPr>
         <w:t>. Os preços cobrados são, não raro, muito superiores aos de mercado.</w:t>
+      </w:r>
+    </w:p>
+    <w:p>
+      <w:pPr>
+        <w:ind w:firstLine="0"/>
+        <w:rPr>
+          <w:color w:val="EE0000"/>
+        </w:rPr>
+      </w:pPr>
+      <w:r>
+        <w:rPr>
+          <w:color w:val="EE0000"/>
+        </w:rPr>
+        <w:t>[[END_BLOCK]]</w:t>
+      </w:r>
+    </w:p>
+    <w:p>
+      <w:pPr>
+        <w:ind w:firstLine="0"/>
+        <w:rPr>
+          <w:color w:val="EE0000"/>
+        </w:rPr>
+      </w:pPr>
+      <w:r>
+        <w:rPr>
+          <w:color w:val="EE0000"/>
+        </w:rPr>
+        <w:t>[[BLOCK</w:t>
+      </w:r>
+      <w:r>
+        <w:rPr>
+          <w:color w:val="EE0000"/>
+        </w:rPr>
+        <w:t xml:space="preserve"> </w:t>
+      </w:r>
+      <w:r>
+        <w:rPr>
+          <w:color w:val="EE0000"/>
+        </w:rPr>
+        <w:t>tarifa</w:t>
+      </w:r>
+      <w:r>
+        <w:rPr>
+          <w:color w:val="EE0000"/>
+        </w:rPr>
+        <w:t>]]</w:t>
       </w:r>
     </w:p>
     <w:p>
@@ -37740,10 +37983,25 @@
         <w:rPr>
           <w:rFonts w:eastAsia="Times New Roman"/>
         </w:rPr>
+        <w:lastRenderedPageBreak/>
         <w:t>Nesse sentido, procedemos o estorno dos valores cobrados.</w:t>
       </w:r>
       <w:bookmarkEnd w:id="85"/>
       <w:bookmarkEnd w:id="86"/>
+    </w:p>
+    <w:p>
+      <w:pPr>
+        <w:ind w:firstLine="0"/>
+        <w:rPr>
+          <w:color w:val="EE0000"/>
+        </w:rPr>
+      </w:pPr>
+      <w:r>
+        <w:rPr>
+          <w:color w:val="EE0000"/>
+        </w:rPr>
+        <w:t>[[END_BLOCK]]</w:t>
+      </w:r>
     </w:p>
     <w:p>
       <w:pPr>
@@ -37964,7 +38222,6 @@
           <w:rFonts w:eastAsia="Times New Roman"/>
           <w:lang w:eastAsia="pt-BR"/>
         </w:rPr>
-        <w:lastRenderedPageBreak/>
         <w:t>No entanto,</w:t>
       </w:r>
       <w:r>
@@ -38199,7 +38456,15 @@
           <w:rFonts w:eastAsia="Times New Roman"/>
           <w:lang w:eastAsia="pt-BR"/>
         </w:rPr>
-        <w:t>RECURSO ESPECIAL. PROCESSUAL CIVIL E CIVIL. CONTRATOS BANCÁRIOS. AÇÃO REVISIONAL. JUNTADA DO CONTRATO. AUSÊNCIA. ART. 359/CPC/1973. EFEITOS. PRESUNÇÃO DE VERACIDADE. JUROS DE MORA. COBRANÇA. POSSIBILIDADE. MULTA MORATÓRIA. PACTUAÇÃO. NECESSIDADE.</w:t>
+        <w:t xml:space="preserve">RECURSO ESPECIAL. PROCESSUAL CIVIL E CIVIL. CONTRATOS BANCÁRIOS. AÇÃO REVISIONAL. JUNTADA DO CONTRATO. AUSÊNCIA. ART. 359/CPC/1973. EFEITOS. PRESUNÇÃO DE VERACIDADE. JUROS DE MORA. </w:t>
+      </w:r>
+      <w:r>
+        <w:rPr>
+          <w:rFonts w:eastAsia="Times New Roman"/>
+          <w:lang w:eastAsia="pt-BR"/>
+        </w:rPr>
+        <w:lastRenderedPageBreak/>
+        <w:t>COBRANÇA. POSSIBILIDADE. MULTA MORATÓRIA. PACTUAÇÃO. NECESSIDADE.</w:t>
       </w:r>
     </w:p>
     <w:p>
@@ -38347,7 +38612,6 @@
           <w:rFonts w:eastAsia="Times New Roman"/>
           <w:lang w:eastAsia="pt-BR"/>
         </w:rPr>
-        <w:lastRenderedPageBreak/>
         <w:t>Desse modo, a cobrança da multa de 2,00% no caso concreto é indevida, uma vez que sua cobrança não foi expressa e claramente pactuada entre as partes no contrato.</w:t>
       </w:r>
     </w:p>
@@ -38601,6 +38865,7 @@
           <w:rFonts w:eastAsia="Times New Roman"/>
           <w:lang w:eastAsia="pt-BR"/>
         </w:rPr>
+        <w:lastRenderedPageBreak/>
         <w:t xml:space="preserve">A instituição financeira praticou os encargos pactuados em contrato; no entanto, como a operação </w:t>
       </w:r>
       <w:r>
@@ -38743,15 +39008,7 @@
           <w:rFonts w:eastAsia="Times New Roman"/>
           <w:lang w:eastAsia="pt-BR"/>
         </w:rPr>
-        <w:t xml:space="preserve">: note que o lançamento de encargos de inadimplência, isto é, “JUROS INADIMPLENTE” foram cobrados à taxa </w:t>
-      </w:r>
-      <w:r>
-        <w:rPr>
-          <w:rFonts w:eastAsia="Times New Roman"/>
-          <w:lang w:eastAsia="pt-BR"/>
-        </w:rPr>
-        <w:lastRenderedPageBreak/>
-        <w:t>de 16,68% a.a., que equivale aos juros remuneratórios (4,00% a.a.) acrescidos de juros de mora (1,00% a.m., equivalentes a 12,68% a.a.).</w:t>
+        <w:t>: note que o lançamento de encargos de inadimplência, isto é, “JUROS INADIMPLENTE” foram cobrados à taxa de 16,68% a.a., que equivale aos juros remuneratórios (4,00% a.a.) acrescidos de juros de mora (1,00% a.m., equivalentes a 12,68% a.a.).</w:t>
       </w:r>
     </w:p>
     <w:p>
@@ -38939,6 +39196,7 @@
           <w:rFonts w:eastAsia="Times New Roman"/>
           <w:lang w:eastAsia="pt-BR"/>
         </w:rPr>
+        <w:lastRenderedPageBreak/>
         <w:t xml:space="preserve">De acordo com o </w:t>
       </w:r>
       <w:proofErr w:type="spellStart"/>
@@ -39191,90 +39449,90 @@
     </w:p>
     <w:p>
       <w:r>
+        <w:t>---------------------------------------------------------------------------------</w:t>
+      </w:r>
+    </w:p>
+    <w:p>
+      <w:r>
+        <w:t xml:space="preserve">O presente Parecer Técnico teve como finalidade analisar a operação BB Crédito Automático CDC nº </w:t>
+      </w:r>
+      <w:proofErr w:type="spellStart"/>
+      <w:r>
+        <w:rPr>
+          <w:rFonts w:eastAsia="Times New Roman"/>
+        </w:rPr>
+        <w:t>xxxxx</w:t>
+      </w:r>
+      <w:proofErr w:type="spellEnd"/>
+      <w:r>
+        <w:t xml:space="preserve">, </w:t>
+      </w:r>
+      <w:r>
+        <w:rPr>
+          <w:highlight w:val="yellow"/>
+        </w:rPr>
+        <w:t xml:space="preserve">cujo emitente / cuja emitente é o agricultor </w:t>
+      </w:r>
+      <w:proofErr w:type="spellStart"/>
+      <w:r>
+        <w:rPr>
+          <w:highlight w:val="yellow"/>
+        </w:rPr>
+        <w:t>xxxxx</w:t>
+      </w:r>
+      <w:proofErr w:type="spellEnd"/>
+      <w:r>
+        <w:rPr>
+          <w:highlight w:val="yellow"/>
+        </w:rPr>
+        <w:t xml:space="preserve"> / a agricultora </w:t>
+      </w:r>
+      <w:proofErr w:type="spellStart"/>
+      <w:r>
+        <w:rPr>
+          <w:highlight w:val="yellow"/>
+        </w:rPr>
+        <w:t>xxxx</w:t>
+      </w:r>
+      <w:proofErr w:type="spellEnd"/>
+      <w:r>
+        <w:t>. Verificou-se as condições pactuadas e praticadas em relação à operação, principalmente no que diz respeito à sua verdadeira finalidade e na busca pela manutenção do equilíbrio econômico-financeiro das operações.</w:t>
+      </w:r>
+    </w:p>
+    <w:p>
+      <w:r>
+        <w:t xml:space="preserve">Constatou-se o encadeamento entre operações: na movimentação no extrato da conta corrente, acostada aos autos pela requerente, vê-se os créditos da operação </w:t>
+      </w:r>
+      <w:proofErr w:type="spellStart"/>
+      <w:r>
+        <w:t>xxxx</w:t>
+      </w:r>
+      <w:proofErr w:type="spellEnd"/>
+      <w:r>
+        <w:t xml:space="preserve"> foram liberados e integralmente destinados ao pagamento do saldo devedor do contrato </w:t>
+      </w:r>
+      <w:proofErr w:type="spellStart"/>
+      <w:r>
+        <w:t>xxx</w:t>
+      </w:r>
+      <w:proofErr w:type="spellEnd"/>
+      <w:r>
+        <w:t xml:space="preserve">, cuja origem é rural. Verificou-se que as condições econômico-financeiras foram alteradas, à medida que a taxa pactuada na operação 919.055.620 é extremamente superior às taxas condizentes com crédito rural, onerando sobremaneira o produtor rural que buscava quitar seus débitos. </w:t>
+      </w:r>
+    </w:p>
+    <w:p>
+      <w:r>
+        <w:t>---------------------------------------------------------------------------------</w:t>
+      </w:r>
+    </w:p>
+    <w:p>
+      <w:r>
+        <w:t>A taxa de juros praticada foi extremamente superior à taxa limitada de 12,00% a.a. para operações de crédito rural. Diante disso, no recálculo realizado, considerando a finalidade rural do crédito e a legislação aplicável, deve-se limitar os encargos à taxa de 12,00% a.a.</w:t>
+      </w:r>
+    </w:p>
+    <w:p>
+      <w:r>
         <w:lastRenderedPageBreak/>
-        <w:t>---------------------------------------------------------------------------------</w:t>
-      </w:r>
-    </w:p>
-    <w:p>
-      <w:r>
-        <w:t xml:space="preserve">O presente Parecer Técnico teve como finalidade analisar a operação BB Crédito Automático CDC nº </w:t>
-      </w:r>
-      <w:proofErr w:type="spellStart"/>
-      <w:r>
-        <w:rPr>
-          <w:rFonts w:eastAsia="Times New Roman"/>
-        </w:rPr>
-        <w:t>xxxxx</w:t>
-      </w:r>
-      <w:proofErr w:type="spellEnd"/>
-      <w:r>
-        <w:t xml:space="preserve">, </w:t>
-      </w:r>
-      <w:r>
-        <w:rPr>
-          <w:highlight w:val="yellow"/>
-        </w:rPr>
-        <w:t xml:space="preserve">cujo emitente / cuja emitente é o agricultor </w:t>
-      </w:r>
-      <w:proofErr w:type="spellStart"/>
-      <w:r>
-        <w:rPr>
-          <w:highlight w:val="yellow"/>
-        </w:rPr>
-        <w:t>xxxxx</w:t>
-      </w:r>
-      <w:proofErr w:type="spellEnd"/>
-      <w:r>
-        <w:rPr>
-          <w:highlight w:val="yellow"/>
-        </w:rPr>
-        <w:t xml:space="preserve"> / a agricultora </w:t>
-      </w:r>
-      <w:proofErr w:type="spellStart"/>
-      <w:r>
-        <w:rPr>
-          <w:highlight w:val="yellow"/>
-        </w:rPr>
-        <w:t>xxxx</w:t>
-      </w:r>
-      <w:proofErr w:type="spellEnd"/>
-      <w:r>
-        <w:t>. Verificou-se as condições pactuadas e praticadas em relação à operação, principalmente no que diz respeito à sua verdadeira finalidade e na busca pela manutenção do equilíbrio econômico-financeiro das operações.</w:t>
-      </w:r>
-    </w:p>
-    <w:p>
-      <w:r>
-        <w:t xml:space="preserve">Constatou-se o encadeamento entre operações: na movimentação no extrato da conta corrente, acostada aos autos pela requerente, vê-se os créditos da operação </w:t>
-      </w:r>
-      <w:proofErr w:type="spellStart"/>
-      <w:r>
-        <w:t>xxxx</w:t>
-      </w:r>
-      <w:proofErr w:type="spellEnd"/>
-      <w:r>
-        <w:t xml:space="preserve"> foram liberados e integralmente destinados ao pagamento do saldo devedor do contrato </w:t>
-      </w:r>
-      <w:proofErr w:type="spellStart"/>
-      <w:r>
-        <w:t>xxx</w:t>
-      </w:r>
-      <w:proofErr w:type="spellEnd"/>
-      <w:r>
-        <w:t xml:space="preserve">, cuja origem é rural. Verificou-se que as condições econômico-financeiras foram alteradas, à medida que a taxa pactuada na operação 919.055.620 é extremamente superior às taxas condizentes com crédito rural, onerando sobremaneira o produtor rural que buscava quitar seus débitos. </w:t>
-      </w:r>
-    </w:p>
-    <w:p>
-      <w:r>
-        <w:t>---------------------------------------------------------------------------------</w:t>
-      </w:r>
-    </w:p>
-    <w:p>
-      <w:r>
-        <w:t>A taxa de juros praticada foi extremamente superior à taxa limitada de 12,00% a.a. para operações de crédito rural. Diante disso, no recálculo realizado, considerando a finalidade rural do crédito e a legislação aplicável, deve-se limitar os encargos à taxa de 12,00% a.a.</w:t>
-      </w:r>
-    </w:p>
-    <w:p>
-      <w:r>
         <w:t xml:space="preserve">Os juros remuneratórios praticados foram cobrados à taxa muito superior que a média de mercado para o mesmo tipo de operação, onerando excessivamente </w:t>
       </w:r>
       <w:r>
@@ -39357,118 +39615,161 @@
         </w:rPr>
       </w:pPr>
       <w:r>
+        <w:t xml:space="preserve">Observou-se a cobrança de correção monetária pelo Certificado Depósito Interbancário – CDI; entretanto, conforme </w:t>
+      </w:r>
+      <w:r>
+        <w:rPr>
+          <w:rFonts w:eastAsia="Times New Roman"/>
+          <w:lang w:eastAsia="pt-BR"/>
+        </w:rPr>
+        <w:t>entendimento dado pela Súmula nº 176 do STJ,</w:t>
+      </w:r>
+      <w:r>
+        <w:rPr>
+          <w:rFonts w:eastAsia="Times New Roman"/>
+          <w:lang w:eastAsia="pt-BR"/>
+        </w:rPr>
+        <w:t xml:space="preserve"> </w:t>
+      </w:r>
+      <w:r>
+        <w:rPr>
+          <w:rFonts w:eastAsia="Times New Roman"/>
+          <w:lang w:eastAsia="pt-BR"/>
+        </w:rPr>
+        <w:t>há abusividade da cobrança dos encargos básicos ao utilizar a taxa referente ao CDI. Além disso, sua cobrança onera sobremaneira a contratação do crédito. Diante disso, estornamos os valores referentes ao CDI.</w:t>
+      </w:r>
+    </w:p>
+    <w:p>
+      <w:r>
+        <w:t xml:space="preserve">Verificou-se que foi realizada a capitalização mensal dos juros remuneratórios de normalidade. Em todo caso, após a análise das condições para a expressa pactuação da capitalização e sua periodicidade, verificou-se que </w:t>
+      </w:r>
+      <w:r>
+        <w:rPr>
+          <w:highlight w:val="yellow"/>
+        </w:rPr>
+        <w:t>o contrato não atendeu</w:t>
+      </w:r>
+      <w:r>
+        <w:t xml:space="preserve"> simultaneamente às prerrogativas para praticar a capitalização em nenhuma periodicidade. Desse modo, </w:t>
+      </w:r>
+      <w:r>
+        <w:t xml:space="preserve">afastou-se </w:t>
+      </w:r>
+      <w:r>
+        <w:t xml:space="preserve">a </w:t>
+      </w:r>
+      <w:r>
+        <w:t>capitalização</w:t>
+      </w:r>
+      <w:r>
+        <w:t xml:space="preserve"> de juros em qualquer periodicidade</w:t>
+      </w:r>
+      <w:r>
+        <w:t>.</w:t>
+      </w:r>
+    </w:p>
+    <w:p>
+      <w:r>
+        <w:t xml:space="preserve">Ademais, considerando se tratar de crédito rural, deve-se observar a legislação específica para esse tipo de operação que apregoa que a periodicidade mínima para capitalização dos juros remuneratórios é </w:t>
+      </w:r>
+      <w:r>
+        <w:rPr>
+          <w:highlight w:val="yellow"/>
+        </w:rPr>
+        <w:t>a semestral</w:t>
+      </w:r>
+      <w:r>
+        <w:t>. Desse modo, caso o entendimento sobre o afastamento da capitalização divirja do apresentado, os juros remuneratórios de normalidade devem ser capitalizados semestralmente.</w:t>
+      </w:r>
+    </w:p>
+    <w:p>
+      <w:r>
+        <w:t>Ainda, foi constatada a cobrança de seguro</w:t>
+      </w:r>
+      <w:r>
+        <w:t xml:space="preserve">s diversos na operação, como condição de liberação de crédito </w:t>
+      </w:r>
+      <w:r>
+        <w:rPr>
+          <w:highlight w:val="yellow"/>
+        </w:rPr>
+        <w:t>ao produtor</w:t>
+      </w:r>
+      <w:r>
+        <w:t xml:space="preserve">. Tal prática, além de encarecer o acesso ao crédito para o </w:t>
+      </w:r>
+      <w:r>
+        <w:rPr>
+          <w:highlight w:val="yellow"/>
+        </w:rPr>
+        <w:t>custeio</w:t>
+      </w:r>
+      <w:r>
+        <w:t xml:space="preserve">, </w:t>
+      </w:r>
+      <w:r>
         <w:lastRenderedPageBreak/>
-        <w:t xml:space="preserve">Observou-se a cobrança de correção monetária pelo Certificado Depósito Interbancário – CDI; entretanto, conforme </w:t>
+        <w:t xml:space="preserve">é considerada venda casada. Também não há informações claras sobre as condições da contratação. Foi identificada também a cobrança de tarifa de estudos de operações, sobre a qual se entende que se trata de um custo da instituição que não pode ser repassado </w:t>
+      </w:r>
+      <w:r>
+        <w:rPr>
+          <w:highlight w:val="yellow"/>
+        </w:rPr>
+        <w:t>ao produtor.</w:t>
+      </w:r>
+      <w:r>
+        <w:t xml:space="preserve"> Diante de tais irregularidades, as cobranças foram estornadas no recálculo da operação.</w:t>
+      </w:r>
+    </w:p>
+    <w:p>
+      <w:r>
+        <w:t xml:space="preserve">Para o período de inadimplemento da operação, o banco pactuou a cobrança de comissão de permanência, mas sabendo do desacordo com a legislação para crédito rural, a instituição financeira realizou, na ficha gráfica apresentada, a apuração do inadimplemento com juros remuneratórios de normalidade, juros moratórios de 1,00% a.a. e multa contratual de 2,00%. Enquanto a cobrança de juros moratórios independe de previsão contratual para sua aplicação - diante de imposição legal, a multa contratual se trata de uma cláusula penal para quem atrasa o pagamento, devendo estar expressamente pactuada em contrato, o que não ocorreu no caso em tela, de modo que a cobrança da multa de 2,00% é indevida. </w:t>
+      </w:r>
+    </w:p>
+    <w:p>
+      <w:r>
+        <w:t>Destaca-se ainda que os juros remuneratórios cobrados no período de inadimplemento também foram capitalizados mensalmente, mas ressalta-se que eles devem seguir o mesmo fluxo de capitalização do período de normalidade – isto é, a capitalização deve ser afastada.</w:t>
+      </w:r>
+    </w:p>
+    <w:p>
+      <w:r>
+        <w:t>----</w:t>
+      </w:r>
+    </w:p>
+    <w:p>
+      <w:r>
+        <w:rPr>
+          <w:rFonts w:eastAsia="Times New Roman"/>
+        </w:rPr>
+        <w:t xml:space="preserve">Em relação ao inadimplemento, viu-se que os encargos pactuados e praticados foram </w:t>
+      </w:r>
+      <w:r>
+        <w:rPr>
+          <w:rFonts w:eastAsia="Times New Roman"/>
+        </w:rPr>
+        <w:t xml:space="preserve">compostos de </w:t>
+      </w:r>
+      <w:r>
+        <w:rPr>
+          <w:rFonts w:eastAsia="Times New Roman"/>
+        </w:rPr>
+        <w:t xml:space="preserve">multa de 2%, juros moratórios de 1,00% a.m., além dos encargos de normalidade. </w:t>
       </w:r>
       <w:r>
         <w:rPr>
           <w:rFonts w:eastAsia="Times New Roman"/>
           <w:lang w:eastAsia="pt-BR"/>
         </w:rPr>
-        <w:t>entendimento dado pela Súmula nº 176 do STJ,</w:t>
-      </w:r>
-      <w:r>
-        <w:rPr>
-          <w:rFonts w:eastAsia="Times New Roman"/>
-          <w:lang w:eastAsia="pt-BR"/>
-        </w:rPr>
-        <w:t xml:space="preserve"> </w:t>
-      </w:r>
-      <w:r>
-        <w:rPr>
-          <w:rFonts w:eastAsia="Times New Roman"/>
-          <w:lang w:eastAsia="pt-BR"/>
-        </w:rPr>
-        <w:t>há abusividade da cobrança dos encargos básicos ao utilizar a taxa referente ao CDI. Além disso, sua cobrança onera sobremaneira a contratação do crédito. Diante disso, estornamos os valores referentes ao CDI.</w:t>
-      </w:r>
-    </w:p>
-    <w:p>
-      <w:r>
-        <w:t xml:space="preserve">Verificou-se que foi realizada a capitalização mensal dos juros remuneratórios de normalidade. Em todo caso, após a análise das condições para a expressa pactuação da capitalização e sua periodicidade, verificou-se que </w:t>
-      </w:r>
-      <w:r>
-        <w:rPr>
-          <w:highlight w:val="yellow"/>
-        </w:rPr>
-        <w:t>o contrato não atendeu</w:t>
-      </w:r>
-      <w:r>
-        <w:t xml:space="preserve"> simultaneamente às prerrogativas para praticar a capitalização em nenhuma periodicidade. Desse modo, </w:t>
-      </w:r>
-      <w:r>
-        <w:t xml:space="preserve">afastou-se </w:t>
-      </w:r>
-      <w:r>
-        <w:t xml:space="preserve">a </w:t>
-      </w:r>
-      <w:r>
-        <w:t>capitalização</w:t>
-      </w:r>
-      <w:r>
-        <w:t xml:space="preserve"> de juros em qualquer periodicidade</w:t>
-      </w:r>
-      <w:r>
-        <w:t>.</w:t>
-      </w:r>
-    </w:p>
-    <w:p>
-      <w:r>
-        <w:t xml:space="preserve">Ademais, considerando se tratar de crédito rural, deve-se observar a legislação específica para esse tipo de operação que apregoa que a periodicidade mínima para capitalização dos juros remuneratórios é </w:t>
-      </w:r>
-      <w:r>
-        <w:rPr>
-          <w:highlight w:val="yellow"/>
-        </w:rPr>
-        <w:t>a semestral</w:t>
-      </w:r>
-      <w:r>
-        <w:t>. Desse modo, caso o entendimento sobre o afastamento da capitalização divirja do apresentado, os juros remuneratórios de normalidade devem ser capitalizados semestralmente.</w:t>
-      </w:r>
-    </w:p>
-    <w:p>
-      <w:r>
-        <w:t>Ainda, foi constatada a cobrança de seguro</w:t>
-      </w:r>
-      <w:r>
-        <w:t xml:space="preserve">s diversos na operação, como condição de liberação de crédito </w:t>
-      </w:r>
-      <w:r>
-        <w:rPr>
-          <w:highlight w:val="yellow"/>
-        </w:rPr>
-        <w:t>ao produtor</w:t>
-      </w:r>
-      <w:r>
-        <w:t xml:space="preserve">. Tal prática, além de encarecer o acesso ao crédito para o </w:t>
-      </w:r>
-      <w:r>
-        <w:rPr>
-          <w:highlight w:val="yellow"/>
-        </w:rPr>
-        <w:t>custeio</w:t>
-      </w:r>
-      <w:r>
-        <w:t xml:space="preserve">, é considerada venda casada. Também não há informações claras sobre as condições da contratação. Foi identificada também a cobrança de tarifa de estudos de operações, sobre a qual se entende que se trata de um custo da instituição que não pode ser repassado </w:t>
-      </w:r>
-      <w:r>
-        <w:rPr>
-          <w:highlight w:val="yellow"/>
-        </w:rPr>
-        <w:t>ao produtor.</w:t>
-      </w:r>
-      <w:r>
-        <w:t xml:space="preserve"> Diante de tais irregularidades, as cobranças foram estornadas no recálculo da operação.</w:t>
-      </w:r>
-    </w:p>
-    <w:p>
-      <w:r>
-        <w:t xml:space="preserve">Para o período de inadimplemento da operação, o banco pactuou a cobrança de comissão de permanência, mas sabendo do desacordo com a legislação para crédito rural, a instituição financeira realizou, na ficha gráfica apresentada, a apuração do inadimplemento com juros remuneratórios de normalidade, juros moratórios de 1,00% a.a. e multa contratual de 2,00%. Enquanto a cobrança de juros moratórios independe de previsão contratual para sua aplicação - diante de imposição legal, a multa contratual se trata de uma cláusula penal para quem atrasa o pagamento, devendo estar expressamente pactuada em contrato, o que não ocorreu no caso em tela, de modo que a cobrança da multa de 2,00% é indevida. </w:t>
-      </w:r>
-    </w:p>
-    <w:p>
-      <w:r>
-        <w:t>Destaca-se ainda que os juros remuneratórios cobrados no período de inadimplemento também foram capitalizados mensalmente, mas ressalta-se que eles devem seguir o mesmo fluxo de capitalização do período de normalidade – isto é, a capitalização deve ser afastada.</w:t>
-      </w:r>
+        <w:t xml:space="preserve">Entretanto, considerando a </w:t>
+      </w:r>
+      <w:r>
+        <w:t>legislação vigente que rege crédito rural, os juros de mora devem ser de 1,00% a.a. e não 1,00% a.m. Destaca-se ainda que os juros remuneratórios e moratórios cobrados no período de inadimplemento também foram capitalizados mensalmente, mas ressalta-se que eles devem seguir o mesmo fluxo de capitalização do período de normalidade – isto é, a capitalização deve ser nas parcelas ou na liquidação do débito.</w:t>
+      </w:r>
+    </w:p>
+    <w:p>
+      <w:pPr>
+        <w:jc w:val="center"/>
+      </w:pPr>
     </w:p>
     <w:p>
       <w:r>
@@ -39477,52 +39778,12 @@
     </w:p>
     <w:p>
       <w:r>
-        <w:rPr>
-          <w:rFonts w:eastAsia="Times New Roman"/>
-        </w:rPr>
+        <w:t>Para o período de inadimplemento da operação, o banco pactuou e praticou a cobrança de juros remuneratórios de normalidade, juros moratórios de 1,00% a.a. e multa contratual de 2,00%, o que está de acordo com a legislação. Destaca-se, porém, que os juros remuneratórios cobrados no período de inadimplemento também foram capitalizados mensalmente, mas ressalta-se que eles devem seguir o mesmo fluxo de capitalização do período de normalidade - isto é, a capitalização deve ser afastada.</w:t>
+      </w:r>
+    </w:p>
+    <w:p>
+      <w:r>
         <w:lastRenderedPageBreak/>
-        <w:t xml:space="preserve">Em relação ao inadimplemento, viu-se que os encargos pactuados e praticados foram </w:t>
-      </w:r>
-      <w:r>
-        <w:rPr>
-          <w:rFonts w:eastAsia="Times New Roman"/>
-        </w:rPr>
-        <w:t xml:space="preserve">compostos de </w:t>
-      </w:r>
-      <w:r>
-        <w:rPr>
-          <w:rFonts w:eastAsia="Times New Roman"/>
-        </w:rPr>
-        <w:t xml:space="preserve">multa de 2%, juros moratórios de 1,00% a.m., além dos encargos de normalidade. </w:t>
-      </w:r>
-      <w:r>
-        <w:rPr>
-          <w:rFonts w:eastAsia="Times New Roman"/>
-          <w:lang w:eastAsia="pt-BR"/>
-        </w:rPr>
-        <w:t xml:space="preserve">Entretanto, considerando a </w:t>
-      </w:r>
-      <w:r>
-        <w:t>legislação vigente que rege crédito rural, os juros de mora devem ser de 1,00% a.a. e não 1,00% a.m. Destaca-se ainda que os juros remuneratórios e moratórios cobrados no período de inadimplemento também foram capitalizados mensalmente, mas ressalta-se que eles devem seguir o mesmo fluxo de capitalização do período de normalidade – isto é, a capitalização deve ser nas parcelas ou na liquidação do débito.</w:t>
-      </w:r>
-    </w:p>
-    <w:p>
-      <w:pPr>
-        <w:jc w:val="center"/>
-      </w:pPr>
-    </w:p>
-    <w:p>
-      <w:r>
-        <w:t>----</w:t>
-      </w:r>
-    </w:p>
-    <w:p>
-      <w:r>
-        <w:t>Para o período de inadimplemento da operação, o banco pactuou e praticou a cobrança de juros remuneratórios de normalidade, juros moratórios de 1,00% a.a. e multa contratual de 2,00%, o que está de acordo com a legislação. Destaca-se, porém, que os juros remuneratórios cobrados no período de inadimplemento também foram capitalizados mensalmente, mas ressalta-se que eles devem seguir o mesmo fluxo de capitalização do período de normalidade - isto é, a capitalização deve ser afastada.</w:t>
-      </w:r>
-    </w:p>
-    <w:p>
-      <w:r>
         <w:t>----</w:t>
       </w:r>
     </w:p>
@@ -39682,11 +39943,7 @@
         <w:t>cobrança/execução</w:t>
       </w:r>
       <w:r>
-        <w:t xml:space="preserve">. Por sua vez, considerando os termos do Art. 42, parágrafo único, do Código </w:t>
-      </w:r>
-      <w:r>
-        <w:lastRenderedPageBreak/>
-        <w:t xml:space="preserve">de Defesa do Consumidor, o valor já pago indevidamente a maior (R$ </w:t>
+        <w:t xml:space="preserve">. Por sua vez, considerando os termos do Art. 42, parágrafo único, do Código de Defesa do Consumidor, o valor já pago indevidamente a maior (R$ </w:t>
       </w:r>
       <w:proofErr w:type="spellStart"/>
       <w:r>
@@ -39857,7 +40114,15 @@
           <w:rFonts w:eastAsia="Times New Roman"/>
           <w:lang w:eastAsia="pt-BR"/>
         </w:rPr>
-        <w:t>há abusividade da cobrança dos encargos básicos ao utilizar a taxa referente ao CDI. Além disso, sua cobrança onera sobremaneira a contratação do crédito. Diante disso, estornamos os valores referentes ao CDI.</w:t>
+        <w:t xml:space="preserve">há abusividade da </w:t>
+      </w:r>
+      <w:r>
+        <w:rPr>
+          <w:rFonts w:eastAsia="Times New Roman"/>
+          <w:lang w:eastAsia="pt-BR"/>
+        </w:rPr>
+        <w:lastRenderedPageBreak/>
+        <w:t>cobrança dos encargos básicos ao utilizar a taxa referente ao CDI. Além disso, sua cobrança onera sobremaneira a contratação do crédito. Diante disso, estornamos os valores referentes ao CDI.</w:t>
       </w:r>
     </w:p>
     <w:p>
@@ -39921,7 +40186,6 @@
           <w:rFonts w:eastAsia="Times New Roman"/>
           <w:highlight w:val="green"/>
         </w:rPr>
-        <w:lastRenderedPageBreak/>
         <w:t xml:space="preserve">Em relação ao inadimplemento, viu-se que os encargos pactuados foram compostos por multa de 2% e </w:t>
       </w:r>
       <w:r>
@@ -40004,7 +40268,11 @@
         <w:t>a Memória de Cálculo referente ao período de inadimplemento do contrato</w:t>
       </w:r>
       <w:r>
-        <w:t xml:space="preserve">. Desse modo, procedeu-se o recálculo do período de normalidade conforme condições contratuais, </w:t>
+        <w:t xml:space="preserve">. Desse modo, procedeu-se o </w:t>
+      </w:r>
+      <w:r>
+        <w:lastRenderedPageBreak/>
+        <w:t xml:space="preserve">recálculo do período de normalidade conforme condições contratuais, </w:t>
       </w:r>
       <w:r>
         <w:rPr>
@@ -40470,7 +40738,7 @@
           <w:noProof/>
           <w:szCs w:val="23"/>
         </w:rPr>
-        <w:t>5 de maio de 2026</w:t>
+        <w:t>6 de maio de 2026</w:t>
       </w:r>
       <w:r>
         <w:rPr>
@@ -41215,6 +41483,7 @@
           <w:color w:val="EE0000"/>
           <w:szCs w:val="23"/>
         </w:rPr>
+        <w:lastRenderedPageBreak/>
         <w:t>FORAM FEITAS AS CAPAS D</w:t>
       </w:r>
       <w:r>
@@ -50258,6 +50527,7 @@
     <w:rsid w:val="00A32620"/>
     <w:rsid w:val="00A37769"/>
     <w:rsid w:val="00AA76A1"/>
+    <w:rsid w:val="00AB0FC2"/>
     <w:rsid w:val="00AC1DE1"/>
     <w:rsid w:val="00AC677B"/>
     <w:rsid w:val="00AD1EF3"/>
@@ -50276,6 +50546,7 @@
     <w:rsid w:val="00B77453"/>
     <w:rsid w:val="00B77903"/>
     <w:rsid w:val="00B8138C"/>
+    <w:rsid w:val="00B93519"/>
     <w:rsid w:val="00BC4E05"/>
     <w:rsid w:val="00BD1CE9"/>
     <w:rsid w:val="00BD46AB"/>

</xml_diff>

<commit_message>
corrigindo os formatos nos laudos
</commit_message>
<xml_diff>
--- a/laudo/templates/laudo_completo.docx
+++ b/laudo/templates/laudo_completo.docx
@@ -3263,21 +3263,23 @@
         </w:rPr>
         <w:t>{{</w:t>
       </w:r>
+      <w:bookmarkEnd w:id="2"/>
       <w:r>
         <w:rPr>
           <w:rFonts w:eastAsia="Times New Roman"/>
           <w:highlight w:val="green"/>
           <w:lang w:eastAsia="pt-BR"/>
         </w:rPr>
-        <w:t>agente_continuidade</w:t>
-      </w:r>
-      <w:r>
-        <w:rPr>
+        <w:t xml:space="preserve">agente_continuidade|frase_maiuscula </w:t>
+      </w:r>
+      <w:r>
+        <w:rPr>
+          <w:rFonts w:eastAsia="Times New Roman"/>
           <w:highlight w:val="green"/>
+          <w:lang w:eastAsia="pt-BR"/>
         </w:rPr>
         <w:t>}}</w:t>
       </w:r>
-      <w:bookmarkEnd w:id="2"/>
     </w:p>
     <w:p>
       <w:pPr>
@@ -3290,7 +3292,19 @@
         <w:rPr>
           <w:color w:val="EE0000"/>
         </w:rPr>
-        <w:t>{% for c in contratos %}</w:t>
+        <w:t>{%</w:t>
+      </w:r>
+      <w:r>
+        <w:rPr>
+          <w:color w:val="EE0000"/>
+        </w:rPr>
+        <w:t>p</w:t>
+      </w:r>
+      <w:r>
+        <w:rPr>
+          <w:color w:val="EE0000"/>
+        </w:rPr>
+        <w:t xml:space="preserve"> for c in contratos %}</w:t>
       </w:r>
     </w:p>
     <w:p>
@@ -3436,7 +3450,21 @@
           <w:bCs/>
           <w:color w:val="EE0000"/>
         </w:rPr>
-        <w:t>{% for item in c.itens %}</w:t>
+        <w:t>{%</w:t>
+      </w:r>
+      <w:r>
+        <w:rPr>
+          <w:bCs/>
+          <w:color w:val="EE0000"/>
+        </w:rPr>
+        <w:t>p</w:t>
+      </w:r>
+      <w:r>
+        <w:rPr>
+          <w:bCs/>
+          <w:color w:val="EE0000"/>
+        </w:rPr>
+        <w:t xml:space="preserve"> for item in c.itens %}</w:t>
       </w:r>
     </w:p>
     <w:p>
@@ -3472,7 +3500,19 @@
         <w:rPr>
           <w:color w:val="EE0000"/>
         </w:rPr>
-        <w:t>{% endfor %}</w:t>
+        <w:t>{%</w:t>
+      </w:r>
+      <w:r>
+        <w:rPr>
+          <w:color w:val="EE0000"/>
+        </w:rPr>
+        <w:t>p</w:t>
+      </w:r>
+      <w:r>
+        <w:rPr>
+          <w:color w:val="EE0000"/>
+        </w:rPr>
+        <w:t xml:space="preserve"> endfor %}</w:t>
       </w:r>
     </w:p>
     <w:p>
@@ -3563,6 +3603,18 @@
         <w:rPr>
           <w:color w:val="EE0000"/>
         </w:rPr>
+        <w:t>p</w:t>
+      </w:r>
+      <w:r>
+        <w:rPr>
+          <w:color w:val="EE0000"/>
+        </w:rPr>
+        <w:t xml:space="preserve"> if</w:t>
+      </w:r>
+      <w:r>
+        <w:rPr>
+          <w:color w:val="EE0000"/>
+        </w:rPr>
         <w:t xml:space="preserve"> </w:t>
       </w:r>
       <w:r>
@@ -3581,19 +3633,25 @@
         <w:rPr>
           <w:color w:val="EE0000"/>
         </w:rPr>
-        <w:t xml:space="preserve"> == “di</w:t>
+        <w:t xml:space="preserve"> == </w:t>
       </w:r>
       <w:r>
         <w:rPr>
           <w:color w:val="EE0000"/>
         </w:rPr>
-        <w:t>a</w:t>
+        <w:t>"</w:t>
       </w:r>
       <w:r>
         <w:rPr>
           <w:color w:val="EE0000"/>
         </w:rPr>
-        <w:t>rio”</w:t>
+        <w:t>diário</w:t>
+      </w:r>
+      <w:r>
+        <w:rPr>
+          <w:color w:val="EE0000"/>
+        </w:rPr>
+        <w:t>"</w:t>
       </w:r>
       <w:r>
         <w:rPr>
@@ -3757,7 +3815,19 @@
         <w:rPr>
           <w:color w:val="EE0000"/>
         </w:rPr>
-        <w:t>{% else %}</w:t>
+        <w:t>{%</w:t>
+      </w:r>
+      <w:r>
+        <w:rPr>
+          <w:color w:val="EE0000"/>
+        </w:rPr>
+        <w:t>p</w:t>
+      </w:r>
+      <w:r>
+        <w:rPr>
+          <w:color w:val="EE0000"/>
+        </w:rPr>
+        <w:t xml:space="preserve"> else %}</w:t>
       </w:r>
     </w:p>
     <w:p>
@@ -3891,7 +3961,19 @@
         <w:rPr>
           <w:color w:val="EE0000"/>
         </w:rPr>
-        <w:t>{% endif %}</w:t>
+        <w:t>{%</w:t>
+      </w:r>
+      <w:r>
+        <w:rPr>
+          <w:color w:val="EE0000"/>
+        </w:rPr>
+        <w:t>p</w:t>
+      </w:r>
+      <w:r>
+        <w:rPr>
+          <w:color w:val="EE0000"/>
+        </w:rPr>
+        <w:t xml:space="preserve"> endif %}</w:t>
       </w:r>
     </w:p>
     <w:p>
@@ -3993,12 +4075,24 @@
         <w:rPr>
           <w:color w:val="EE0000"/>
         </w:rPr>
-        <w:t>{% if</w:t>
+        <w:t>{%</w:t>
       </w:r>
       <w:r>
         <w:rPr>
           <w:color w:val="EE0000"/>
         </w:rPr>
+        <w:t>p</w:t>
+      </w:r>
+      <w:r>
+        <w:rPr>
+          <w:color w:val="EE0000"/>
+        </w:rPr>
+        <w:t xml:space="preserve"> if</w:t>
+      </w:r>
+      <w:r>
+        <w:rPr>
+          <w:color w:val="EE0000"/>
+        </w:rPr>
         <w:t xml:space="preserve"> </w:t>
       </w:r>
       <w:r>
@@ -4017,19 +4111,25 @@
         <w:rPr>
           <w:color w:val="EE0000"/>
         </w:rPr>
-        <w:t xml:space="preserve"> == “</w:t>
+        <w:t xml:space="preserve"> == </w:t>
       </w:r>
       <w:r>
         <w:rPr>
           <w:color w:val="EE0000"/>
         </w:rPr>
+        <w:t>"</w:t>
+      </w:r>
+      <w:r>
+        <w:rPr>
+          <w:color w:val="EE0000"/>
+        </w:rPr>
         <w:t>Aval</w:t>
       </w:r>
       <w:r>
         <w:rPr>
           <w:color w:val="EE0000"/>
         </w:rPr>
-        <w:t>”</w:t>
+        <w:t>"</w:t>
       </w:r>
       <w:r>
         <w:rPr>
@@ -4084,12 +4184,24 @@
         <w:rPr>
           <w:color w:val="EE0000"/>
         </w:rPr>
-        <w:t>{% elif</w:t>
+        <w:t>{%</w:t>
       </w:r>
       <w:r>
         <w:rPr>
           <w:color w:val="EE0000"/>
         </w:rPr>
+        <w:t>p</w:t>
+      </w:r>
+      <w:r>
+        <w:rPr>
+          <w:color w:val="EE0000"/>
+        </w:rPr>
+        <w:t xml:space="preserve"> elif</w:t>
+      </w:r>
+      <w:r>
+        <w:rPr>
+          <w:color w:val="EE0000"/>
+        </w:rPr>
         <w:t xml:space="preserve"> </w:t>
       </w:r>
       <w:r>
@@ -4114,13 +4226,19 @@
         <w:rPr>
           <w:color w:val="EE0000"/>
         </w:rPr>
-        <w:t>“</w:t>
+        <w:t>"</w:t>
       </w:r>
       <w:r>
         <w:rPr>
           <w:color w:val="EE0000"/>
         </w:rPr>
-        <w:t>Penhor cedular”</w:t>
+        <w:t>Penhor cedular</w:t>
+      </w:r>
+      <w:r>
+        <w:rPr>
+          <w:color w:val="EE0000"/>
+        </w:rPr>
+        <w:t>"</w:t>
       </w:r>
       <w:r>
         <w:rPr>
@@ -4247,7 +4365,19 @@
         <w:rPr>
           <w:color w:val="EE0000"/>
         </w:rPr>
-        <w:t>{% else %}</w:t>
+        <w:t>{%</w:t>
+      </w:r>
+      <w:r>
+        <w:rPr>
+          <w:color w:val="EE0000"/>
+        </w:rPr>
+        <w:t>p</w:t>
+      </w:r>
+      <w:r>
+        <w:rPr>
+          <w:color w:val="EE0000"/>
+        </w:rPr>
+        <w:t xml:space="preserve"> else %}</w:t>
       </w:r>
     </w:p>
     <w:p>
@@ -4323,7 +4453,19 @@
         <w:rPr>
           <w:color w:val="EE0000"/>
         </w:rPr>
-        <w:t>{% endif %}</w:t>
+        <w:t>{%</w:t>
+      </w:r>
+      <w:r>
+        <w:rPr>
+          <w:color w:val="EE0000"/>
+        </w:rPr>
+        <w:t>p</w:t>
+      </w:r>
+      <w:r>
+        <w:rPr>
+          <w:color w:val="EE0000"/>
+        </w:rPr>
+        <w:t xml:space="preserve"> endif %}</w:t>
       </w:r>
     </w:p>
     <w:p>
@@ -38214,7 +38356,7 @@
           <w:noProof/>
           <w:szCs w:val="23"/>
         </w:rPr>
-        <w:t>28 de maio de 2026</w:t>
+        <w:t>29 de maio de 2026</w:t>
       </w:r>
       <w:r>
         <w:rPr>
@@ -47936,9 +48078,11 @@
     <w:rsid w:val="005F2F38"/>
     <w:rsid w:val="0062037F"/>
     <w:rsid w:val="00622E5B"/>
+    <w:rsid w:val="00624866"/>
     <w:rsid w:val="00625389"/>
     <w:rsid w:val="00631257"/>
     <w:rsid w:val="00636C75"/>
+    <w:rsid w:val="00640D1A"/>
     <w:rsid w:val="00641FF6"/>
     <w:rsid w:val="00642A99"/>
     <w:rsid w:val="00651A01"/>
@@ -47967,6 +48111,7 @@
     <w:rsid w:val="007B6E53"/>
     <w:rsid w:val="007D2DCD"/>
     <w:rsid w:val="007D54C8"/>
+    <w:rsid w:val="00806132"/>
     <w:rsid w:val="00837A1D"/>
     <w:rsid w:val="00840F96"/>
     <w:rsid w:val="00842E74"/>
@@ -47987,9 +48132,11 @@
     <w:rsid w:val="009035EE"/>
     <w:rsid w:val="00907CD1"/>
     <w:rsid w:val="0092040D"/>
+    <w:rsid w:val="009216C8"/>
     <w:rsid w:val="00927417"/>
     <w:rsid w:val="0093286F"/>
     <w:rsid w:val="00940CC8"/>
+    <w:rsid w:val="009458FD"/>
     <w:rsid w:val="0095497F"/>
     <w:rsid w:val="00963288"/>
     <w:rsid w:val="009A6F55"/>
@@ -48017,6 +48164,7 @@
     <w:rsid w:val="00B24BAB"/>
     <w:rsid w:val="00B36FF5"/>
     <w:rsid w:val="00B4584D"/>
+    <w:rsid w:val="00B466D6"/>
     <w:rsid w:val="00B53086"/>
     <w:rsid w:val="00B6252D"/>
     <w:rsid w:val="00B66021"/>
@@ -48067,6 +48215,7 @@
     <w:rsid w:val="00DF76B0"/>
     <w:rsid w:val="00E06755"/>
     <w:rsid w:val="00E150B7"/>
+    <w:rsid w:val="00E17B98"/>
     <w:rsid w:val="00E31949"/>
     <w:rsid w:val="00E47109"/>
     <w:rsid w:val="00E54445"/>
@@ -48074,6 +48223,7 @@
     <w:rsid w:val="00E83E72"/>
     <w:rsid w:val="00EA0CF6"/>
     <w:rsid w:val="00EC4FD4"/>
+    <w:rsid w:val="00ED7D33"/>
     <w:rsid w:val="00EE0B56"/>
     <w:rsid w:val="00EE4AB1"/>
     <w:rsid w:val="00EF134C"/>

</xml_diff>

<commit_message>
ajustando os valores de estorno e no plan - historico estorno
</commit_message>
<xml_diff>
--- a/laudo/templates/laudo_completo.docx
+++ b/laudo/templates/laudo_completo.docx
@@ -3329,7 +3329,7 @@
     </w:p>
     <w:p>
       <w:pPr>
-        <w:ind w:firstLine="0"/>
+        <w:ind w:firstLine="360"/>
         <w:rPr>
           <w:color w:val="EE0000"/>
         </w:rPr>
@@ -4690,13 +4690,7 @@
         <w:rPr>
           <w:color w:val="EE0000"/>
         </w:rPr>
-        <w:t>.</w:t>
-      </w:r>
-      <w:r>
-        <w:rPr>
-          <w:color w:val="EE0000"/>
-        </w:rPr>
-        <w:t>penhor</w:t>
+        <w:t>.penhor</w:t>
       </w:r>
       <w:proofErr w:type="gramEnd"/>
       <w:r>
@@ -5018,13 +5012,7 @@
         <w:rPr>
           <w:color w:val="EE0000"/>
         </w:rPr>
-        <w:t>.</w:t>
-      </w:r>
-      <w:r>
-        <w:rPr>
-          <w:color w:val="EE0000"/>
-        </w:rPr>
-        <w:t>hipoteca</w:t>
+        <w:t>.hipoteca</w:t>
       </w:r>
       <w:proofErr w:type="gramEnd"/>
       <w:r>
@@ -41379,7 +41367,7 @@
           <w:noProof/>
           <w:szCs w:val="23"/>
         </w:rPr>
-        <w:t>3 de junho de 2026</w:t>
+        <w:t>8 de junho de 2026</w:t>
       </w:r>
       <w:r>
         <w:rPr>
@@ -48994,6 +48982,7 @@
   <w:style w:type="character" w:default="1" w:styleId="Fontepargpadro">
     <w:name w:val="Default Paragraph Font"/>
     <w:uiPriority w:val="1"/>
+    <w:semiHidden/>
     <w:unhideWhenUsed/>
   </w:style>
   <w:style w:type="table" w:default="1" w:styleId="Tabelanormal">
@@ -51210,7 +51199,9 @@
     <w:rsid w:val="00C55585"/>
     <w:rsid w:val="00C7070B"/>
     <w:rsid w:val="00C73D52"/>
+    <w:rsid w:val="00C74B3D"/>
     <w:rsid w:val="00C90573"/>
+    <w:rsid w:val="00C931DB"/>
     <w:rsid w:val="00CA599B"/>
     <w:rsid w:val="00CB61B7"/>
     <w:rsid w:val="00CB72C6"/>

</xml_diff>

<commit_message>
ajustando a função historico de estorno
</commit_message>
<xml_diff>
--- a/laudo/templates/laudo_completo.docx
+++ b/laudo/templates/laudo_completo.docx
@@ -3509,7 +3509,6 @@
             <w:t>{{</w:t>
           </w:r>
           <w:proofErr w:type="spellStart"/>
-          <w:proofErr w:type="gramStart"/>
           <w:r>
             <w:rPr>
               <w:bCs/>
@@ -3518,7 +3517,6 @@
             <w:t>c.juros</w:t>
           </w:r>
           <w:proofErr w:type="spellEnd"/>
-          <w:proofErr w:type="gramEnd"/>
           <w:r>
             <w:rPr>
               <w:bCs/>
@@ -3616,7 +3614,6 @@
           <w:bCs/>
         </w:rPr>
       </w:pPr>
-      <w:proofErr w:type="gramStart"/>
       <w:r>
         <w:rPr>
           <w:b/>
@@ -3632,25 +3629,25 @@
           <w:bCs/>
           <w:highlight w:val="green"/>
         </w:rPr>
-        <w:t>item</w:t>
-      </w:r>
-      <w:proofErr w:type="gramEnd"/>
+        <w:t>item.nome</w:t>
+      </w:r>
+      <w:proofErr w:type="spellEnd"/>
       <w:r>
         <w:rPr>
           <w:b/>
           <w:bCs/>
           <w:highlight w:val="green"/>
         </w:rPr>
-        <w:t>.</w:t>
-      </w:r>
-      <w:proofErr w:type="gramStart"/>
+        <w:t xml:space="preserve"> }}: R$ {{ </w:t>
+      </w:r>
+      <w:proofErr w:type="spellStart"/>
       <w:r>
         <w:rPr>
           <w:b/>
           <w:bCs/>
           <w:highlight w:val="green"/>
         </w:rPr>
-        <w:t>nome</w:t>
+        <w:t>item.valor</w:t>
       </w:r>
       <w:proofErr w:type="spellEnd"/>
       <w:r>
@@ -3659,70 +3656,7 @@
           <w:bCs/>
           <w:highlight w:val="green"/>
         </w:rPr>
-        <w:t xml:space="preserve"> }}:</w:t>
-      </w:r>
-      <w:proofErr w:type="gramEnd"/>
-      <w:r>
-        <w:rPr>
-          <w:b/>
-          <w:bCs/>
-          <w:highlight w:val="green"/>
-        </w:rPr>
-        <w:t xml:space="preserve"> R$ </w:t>
-      </w:r>
-      <w:proofErr w:type="gramStart"/>
-      <w:r>
-        <w:rPr>
-          <w:b/>
-          <w:bCs/>
-          <w:highlight w:val="green"/>
-        </w:rPr>
-        <w:t xml:space="preserve">{{ </w:t>
-      </w:r>
-      <w:proofErr w:type="spellStart"/>
-      <w:r>
-        <w:rPr>
-          <w:b/>
-          <w:bCs/>
-          <w:highlight w:val="green"/>
-        </w:rPr>
-        <w:t>item</w:t>
-      </w:r>
-      <w:proofErr w:type="gramEnd"/>
-      <w:r>
-        <w:rPr>
-          <w:b/>
-          <w:bCs/>
-          <w:highlight w:val="green"/>
-        </w:rPr>
-        <w:t>.</w:t>
-      </w:r>
-      <w:proofErr w:type="gramStart"/>
-      <w:r>
-        <w:rPr>
-          <w:b/>
-          <w:bCs/>
-          <w:highlight w:val="green"/>
-        </w:rPr>
-        <w:t>valor</w:t>
-      </w:r>
-      <w:proofErr w:type="spellEnd"/>
-      <w:r>
-        <w:rPr>
-          <w:b/>
-          <w:bCs/>
-          <w:highlight w:val="green"/>
-        </w:rPr>
-        <w:t xml:space="preserve"> }</w:t>
-      </w:r>
-      <w:proofErr w:type="gramEnd"/>
-      <w:r>
-        <w:rPr>
-          <w:b/>
-          <w:bCs/>
-          <w:highlight w:val="green"/>
-        </w:rPr>
-        <w:t>}</w:t>
+        <w:t xml:space="preserve"> }}</w:t>
       </w:r>
     </w:p>
     <w:p>
@@ -3793,19 +3727,11 @@
         <w:t>{{</w:t>
       </w:r>
       <w:proofErr w:type="spellStart"/>
-      <w:proofErr w:type="gramStart"/>
       <w:r>
         <w:rPr>
           <w:highlight w:val="green"/>
         </w:rPr>
-        <w:t>c.valor</w:t>
-      </w:r>
-      <w:proofErr w:type="gramEnd"/>
-      <w:r>
-        <w:rPr>
-          <w:highlight w:val="green"/>
-        </w:rPr>
-        <w:t>_parcela</w:t>
+        <w:t>c.valor_parcela</w:t>
       </w:r>
       <w:proofErr w:type="spellEnd"/>
       <w:r>
@@ -3855,19 +3781,11 @@
             <w:t>{{</w:t>
           </w:r>
           <w:proofErr w:type="spellStart"/>
-          <w:proofErr w:type="gramStart"/>
           <w:r>
             <w:rPr>
               <w:highlight w:val="green"/>
             </w:rPr>
-            <w:t>c.numero</w:t>
-          </w:r>
-          <w:proofErr w:type="gramEnd"/>
-          <w:r>
-            <w:rPr>
-              <w:highlight w:val="green"/>
-            </w:rPr>
-            <w:t>_parcela</w:t>
+            <w:t>c.numero_parcela</w:t>
           </w:r>
           <w:proofErr w:type="spellEnd"/>
           <w:r>
@@ -3925,7 +3843,6 @@
         <w:t xml:space="preserve"> </w:t>
       </w:r>
       <w:proofErr w:type="spellStart"/>
-      <w:proofErr w:type="gramStart"/>
       <w:r>
         <w:rPr>
           <w:color w:val="EE0000"/>
@@ -3939,7 +3856,6 @@
         <w:t>periodo</w:t>
       </w:r>
       <w:proofErr w:type="spellEnd"/>
-      <w:proofErr w:type="gramEnd"/>
       <w:r>
         <w:rPr>
           <w:color w:val="EE0000"/>
@@ -4501,7 +4417,6 @@
         <w:t xml:space="preserve"> </w:t>
       </w:r>
       <w:proofErr w:type="spellStart"/>
-      <w:proofErr w:type="gramStart"/>
       <w:r>
         <w:rPr>
           <w:color w:val="EE0000"/>
@@ -4512,36 +4427,21 @@
         <w:rPr>
           <w:color w:val="EE0000"/>
         </w:rPr>
-        <w:t>opcoes</w:t>
-      </w:r>
-      <w:proofErr w:type="gramEnd"/>
+        <w:t>opcoes_garantias</w:t>
+      </w:r>
       <w:r>
         <w:rPr>
           <w:color w:val="EE0000"/>
         </w:rPr>
-        <w:t>_</w:t>
-      </w:r>
-      <w:proofErr w:type="gramStart"/>
+        <w:t>.</w:t>
+      </w:r>
       <w:r>
         <w:rPr>
           <w:color w:val="EE0000"/>
         </w:rPr>
-        <w:t>garantias</w:t>
-      </w:r>
-      <w:r>
-        <w:rPr>
-          <w:color w:val="EE0000"/>
-        </w:rPr>
-        <w:t>.</w:t>
-      </w:r>
-      <w:r>
-        <w:rPr>
-          <w:color w:val="EE0000"/>
-        </w:rPr>
         <w:t>aval</w:t>
       </w:r>
       <w:proofErr w:type="spellEnd"/>
-      <w:proofErr w:type="gramEnd"/>
       <w:r>
         <w:rPr>
           <w:color w:val="EE0000"/>
@@ -4665,39 +4565,17 @@
         <w:t xml:space="preserve"> </w:t>
       </w:r>
       <w:proofErr w:type="spellStart"/>
-      <w:proofErr w:type="gramStart"/>
       <w:r>
         <w:rPr>
           <w:color w:val="EE0000"/>
         </w:rPr>
-        <w:t>c.opcoes</w:t>
-      </w:r>
-      <w:proofErr w:type="gramEnd"/>
+        <w:t>c.opcoes_garantias</w:t>
+      </w:r>
       <w:r>
         <w:rPr>
           <w:color w:val="EE0000"/>
         </w:rPr>
-        <w:t>_</w:t>
-      </w:r>
-      <w:proofErr w:type="gramStart"/>
-      <w:r>
-        <w:rPr>
-          <w:color w:val="EE0000"/>
-        </w:rPr>
-        <w:t>garantias</w:t>
-      </w:r>
-      <w:r>
-        <w:rPr>
-          <w:color w:val="EE0000"/>
-        </w:rPr>
-        <w:t>.penhor</w:t>
-      </w:r>
-      <w:proofErr w:type="gramEnd"/>
-      <w:r>
-        <w:rPr>
-          <w:color w:val="EE0000"/>
-        </w:rPr>
-        <w:t>_cedular</w:t>
+        <w:t>.penhor_cedular</w:t>
       </w:r>
       <w:proofErr w:type="spellEnd"/>
       <w:r>
@@ -4749,15 +4627,7 @@
         <w:contextualSpacing/>
       </w:pPr>
       <w:r>
-        <w:t>Bem, descrição completa (R</w:t>
-      </w:r>
-      <w:proofErr w:type="gramStart"/>
-      <w:r>
-        <w:t>$ )</w:t>
-      </w:r>
-      <w:proofErr w:type="gramEnd"/>
-      <w:r>
-        <w:t>;</w:t>
+        <w:t>Bem, descrição completa (R$ );</w:t>
       </w:r>
     </w:p>
     <w:p>
@@ -4835,21 +4705,7 @@
         <w:rPr>
           <w:highlight w:val="yellow"/>
         </w:rPr>
-        <w:t>1 maquinário, marca, modelo, ano, chassi, demais informações (R</w:t>
-      </w:r>
-      <w:proofErr w:type="gramStart"/>
-      <w:r>
-        <w:rPr>
-          <w:highlight w:val="yellow"/>
-        </w:rPr>
-        <w:t>$ )</w:t>
-      </w:r>
-      <w:proofErr w:type="gramEnd"/>
-      <w:r>
-        <w:rPr>
-          <w:highlight w:val="yellow"/>
-        </w:rPr>
-        <w:t>;</w:t>
+        <w:t>1 maquinário, marca, modelo, ano, chassi, demais informações (R$ );</w:t>
       </w:r>
     </w:p>
     <w:p>
@@ -4987,39 +4843,17 @@
         <w:t xml:space="preserve"> </w:t>
       </w:r>
       <w:proofErr w:type="spellStart"/>
-      <w:proofErr w:type="gramStart"/>
       <w:r>
         <w:rPr>
           <w:color w:val="EE0000"/>
         </w:rPr>
-        <w:t>c.opcoes</w:t>
-      </w:r>
-      <w:proofErr w:type="gramEnd"/>
+        <w:t>c.opcoes_garantias</w:t>
+      </w:r>
       <w:r>
         <w:rPr>
           <w:color w:val="EE0000"/>
         </w:rPr>
-        <w:t>_</w:t>
-      </w:r>
-      <w:proofErr w:type="gramStart"/>
-      <w:r>
-        <w:rPr>
-          <w:color w:val="EE0000"/>
-        </w:rPr>
-        <w:t>garantias</w:t>
-      </w:r>
-      <w:r>
-        <w:rPr>
-          <w:color w:val="EE0000"/>
-        </w:rPr>
-        <w:t>.hipoteca</w:t>
-      </w:r>
-      <w:proofErr w:type="gramEnd"/>
-      <w:r>
-        <w:rPr>
-          <w:color w:val="EE0000"/>
-        </w:rPr>
-        <w:t>_cedular</w:t>
+        <w:t>.hipoteca_cedular</w:t>
       </w:r>
       <w:proofErr w:type="spellEnd"/>
       <w:r>
@@ -5111,21 +4945,7 @@
         <w:rPr>
           <w:highlight w:val="yellow"/>
         </w:rPr>
-        <w:t xml:space="preserve"> – Cartório de Registro de Imóveis de XXXXX - UF (R</w:t>
-      </w:r>
-      <w:proofErr w:type="gramStart"/>
-      <w:r>
-        <w:rPr>
-          <w:highlight w:val="yellow"/>
-        </w:rPr>
-        <w:t>$ )</w:t>
-      </w:r>
-      <w:proofErr w:type="gramEnd"/>
-      <w:r>
-        <w:rPr>
-          <w:highlight w:val="yellow"/>
-        </w:rPr>
-        <w:t>;</w:t>
+        <w:t xml:space="preserve"> – Cartório de Registro de Imóveis de XXXXX - UF (R$ );</w:t>
       </w:r>
     </w:p>
     <w:p>
@@ -5214,23 +5034,13 @@
         <w:t xml:space="preserve">{%p for item in </w:t>
       </w:r>
       <w:proofErr w:type="spellStart"/>
-      <w:proofErr w:type="gramStart"/>
       <w:r>
         <w:rPr>
           <w:bCs/>
           <w:color w:val="EE0000"/>
           <w:highlight w:val="yellow"/>
         </w:rPr>
-        <w:t>c.opcoes</w:t>
-      </w:r>
-      <w:proofErr w:type="gramEnd"/>
-      <w:r>
-        <w:rPr>
-          <w:bCs/>
-          <w:color w:val="EE0000"/>
-          <w:highlight w:val="yellow"/>
-        </w:rPr>
-        <w:t>_inadimplento</w:t>
+        <w:t>c.opcoes_inadimplento</w:t>
       </w:r>
       <w:proofErr w:type="spellEnd"/>
       <w:r>
@@ -5254,7 +5064,6 @@
           <w:bCs/>
         </w:rPr>
       </w:pPr>
-      <w:proofErr w:type="gramStart"/>
       <w:r>
         <w:rPr>
           <w:b/>
@@ -5270,43 +5079,16 @@
           <w:bCs/>
           <w:highlight w:val="green"/>
         </w:rPr>
-        <w:t>item</w:t>
-      </w:r>
-      <w:proofErr w:type="gramEnd"/>
+        <w:t>item.nome</w:t>
+      </w:r>
+      <w:proofErr w:type="spellEnd"/>
       <w:r>
         <w:rPr>
           <w:b/>
           <w:bCs/>
           <w:highlight w:val="green"/>
         </w:rPr>
-        <w:t>.</w:t>
-      </w:r>
-      <w:proofErr w:type="gramStart"/>
-      <w:r>
-        <w:rPr>
-          <w:b/>
-          <w:bCs/>
-          <w:highlight w:val="green"/>
-        </w:rPr>
-        <w:t>nome</w:t>
-      </w:r>
-      <w:proofErr w:type="spellEnd"/>
-      <w:r>
-        <w:rPr>
-          <w:b/>
-          <w:bCs/>
-          <w:highlight w:val="green"/>
-        </w:rPr>
-        <w:t xml:space="preserve"> }</w:t>
-      </w:r>
-      <w:proofErr w:type="gramEnd"/>
-      <w:r>
-        <w:rPr>
-          <w:b/>
-          <w:bCs/>
-          <w:highlight w:val="green"/>
-        </w:rPr>
-        <w:t>}</w:t>
+        <w:t xml:space="preserve"> }}</w:t>
       </w:r>
     </w:p>
     <w:p>
@@ -5374,7 +5156,6 @@
         <w:t>{{</w:t>
       </w:r>
       <w:proofErr w:type="spellStart"/>
-      <w:proofErr w:type="gramStart"/>
       <w:r>
         <w:rPr>
           <w:color w:val="EE0000"/>
@@ -5385,14 +5166,7 @@
         <w:rPr>
           <w:color w:val="EE0000"/>
         </w:rPr>
-        <w:t>finalidade</w:t>
-      </w:r>
-      <w:proofErr w:type="gramEnd"/>
-      <w:r>
-        <w:rPr>
-          <w:color w:val="EE0000"/>
-        </w:rPr>
-        <w:t>_op</w:t>
+        <w:t>finalidade_op</w:t>
       </w:r>
       <w:proofErr w:type="spellEnd"/>
       <w:r>
@@ -5466,7 +5240,19 @@
           <w:numId w:val="0"/>
         </w:numPr>
         <w:spacing w:before="100" w:beforeAutospacing="1" w:after="100" w:afterAutospacing="1"/>
-        <w:ind w:left="720" w:hanging="360"/>
+        <w:ind w:left="1080"/>
+        <w:contextualSpacing/>
+      </w:pPr>
+    </w:p>
+    <w:p>
+      <w:pPr>
+        <w:pStyle w:val="List1"/>
+        <w:numPr>
+          <w:ilvl w:val="0"/>
+          <w:numId w:val="0"/>
+        </w:numPr>
+        <w:spacing w:before="100" w:beforeAutospacing="1" w:after="100" w:afterAutospacing="1"/>
+        <w:ind w:left="720" w:hanging="144"/>
         <w:contextualSpacing/>
         <w:rPr>
           <w:color w:val="EE0000"/>
@@ -5936,6 +5722,7 @@
     </w:p>
     <w:p>
       <w:r>
+        <w:lastRenderedPageBreak/>
         <w:t xml:space="preserve">Ocorre que a cláusula “Forma de Pagamento” estabelece que a operação, a ser paga em </w:t>
       </w:r>
       <w:proofErr w:type="spellStart"/>
@@ -6474,11 +6261,8 @@
     </w:p>
     <w:p>
       <w:r>
-        <w:t xml:space="preserve">Nesse sentido, ante a falta de expressa e clara pactuação sobre os pagamentos que deveriam ser realizados no período de carência, compreende-se que, na verdade, a operação não </w:t>
-      </w:r>
-      <w:r>
         <w:lastRenderedPageBreak/>
-        <w:t xml:space="preserve">estava em mora, não existindo razões para o vencimento antecipado e, sequer, para a propositura de </w:t>
+        <w:t xml:space="preserve">Nesse sentido, ante a falta de expressa e clara pactuação sobre os pagamentos que deveriam ser realizados no período de carência, compreende-se que, na verdade, a operação não estava em mora, não existindo razões para o vencimento antecipado e, sequer, para a propositura de </w:t>
       </w:r>
       <w:r>
         <w:rPr>
@@ -6767,6 +6551,7 @@
         <w:rPr>
           <w:color w:val="EE0000"/>
         </w:rPr>
+        <w:lastRenderedPageBreak/>
         <w:t xml:space="preserve">[[BLOCK </w:t>
       </w:r>
       <w:proofErr w:type="spellStart"/>
@@ -6794,7 +6579,6 @@
       </w:pPr>
       <w:bookmarkStart w:id="17" w:name="_Toc227827912"/>
       <w:r>
-        <w:lastRenderedPageBreak/>
         <w:t>Encadeamento das operações [Renegociação de crédito rural]</w:t>
       </w:r>
       <w:bookmarkEnd w:id="17"/>
@@ -7025,6 +6809,7 @@
         <w:pStyle w:val="Citaodireta"/>
       </w:pPr>
       <w:r>
+        <w:lastRenderedPageBreak/>
         <w:t>Súmula 286 STJ – “A renegociação de contrato bancário ou a confissão da dívida não impede a possibilidade de discussão sobre eventuais ilegalidades dos contratos anteriores”</w:t>
       </w:r>
       <w:r>
@@ -7033,7 +6818,6 @@
     </w:p>
     <w:p>
       <w:r>
-        <w:lastRenderedPageBreak/>
         <w:t xml:space="preserve">A existência de renegociação e a ligação lógica entre as operações é fato incontroverso. A tomada de novo crédito, através de contrato de empréstimo, à medida que busque a quitação de débitos anteriores, embora </w:t>
       </w:r>
       <w:r>
@@ -7098,11 +6882,11 @@
         <w:t>VIABILIDADE DE REVISÃO JUDICIAL EM SEDE DE EMBARGOS À EXECUÇÃO NOS CASOS DE ABUSIVIDADE OU ILEGALIDADE, SEM IMPORTAR EM OFENSA À BOA-FÉ OBJETIVA OU AO ATO JURÍDICO PERFEITO. POSSIBILIDADE, ADEMAIS, DE REVISÃO DOS CONTRATOS ANTERIORES. EMPRÉSTIMO REALIZADO PARA FINANCIAMENTO DE DÍVIDAS. OCORRÊNCIA DE ENCADEAMENTO CONTRATUAL E OPERAÇÕES MATA-MATA. SÚMULA 286 DO SUPERIOR TRIBUNAL DE JUSTIÇA</w:t>
       </w:r>
       <w:r>
-        <w:t xml:space="preserve">. CAPITALIZAÇÃO DE JUROS. POSSIBILIDADE DE COBRANÇA, DESDE QUE HAJA EXPRESSA PREVISÃO PARA TANTO. PRÁTICA PERMITIDA EXCLUSIVAMENTE NOS CONTRATOS EXIBIDOS, QUE PREVIRAM EXPRESSAMENTE A CAPITALIZAÇÃO. JUROS REMUNERATÓRIOS. LIMITAÇÃO À TAXA MÉDIA DE MERCADO, ANTE A NÃO APRESENTAÇÃO DOS INSTRUMENTOS. MANUTENÇÃO DOS JUROS PACTUADOS EM RELAÇÃO AOS CONTRATOS ACOSTADOS, ANTE A INEXISTÊNCIA DE ABUSIVIDADE. REPETIÇÃO DO INDÉBITO. </w:t>
+        <w:t xml:space="preserve">. CAPITALIZAÇÃO DE JUROS. POSSIBILIDADE DE COBRANÇA, DESDE QUE HAJA EXPRESSA PREVISÃO PARA TANTO. PRÁTICA PERMITIDA EXCLUSIVAMENTE NOS CONTRATOS EXIBIDOS, QUE PREVIRAM EXPRESSAMENTE A CAPITALIZAÇÃO. JUROS </w:t>
       </w:r>
       <w:r>
         <w:lastRenderedPageBreak/>
-        <w:t>POSSIBILIDADE NA FORMA SIMPLES, PERMITIDA A COMPENSAÇÃO ENTRE CRÉDITOS E DÉBITOS. IOF. VALOR COBRADO EM EXCESSO. NECESSIDADE DE RECÁLCULO EM RAZÃO DA ALTERAÇÃO DA BASE DE CÁLCULO DESCARACTERIZAÇÃO DA MORA. VIABILIDADE IN CASU. RECURSO ESPECIAL REPRESENTATIVO DE CONTROVÉRSIA Nº 1.061.530/RS. ÔNUS SUCUMBENCIAL. READEQUAÇÃO. HONORÁRIOS ADVOCATÍCIOS. MAJORAÇÃO. SENTENÇA PARCIALMENTE ANULADA E PARCIALMENTE REFORMADA. RECURSOS CONHECIDOS E PARCIALMENTE PROVIDOS.</w:t>
+        <w:t>REMUNERATÓRIOS. LIMITAÇÃO À TAXA MÉDIA DE MERCADO, ANTE A NÃO APRESENTAÇÃO DOS INSTRUMENTOS. MANUTENÇÃO DOS JUROS PACTUADOS EM RELAÇÃO AOS CONTRATOS ACOSTADOS, ANTE A INEXISTÊNCIA DE ABUSIVIDADE. REPETIÇÃO DO INDÉBITO. POSSIBILIDADE NA FORMA SIMPLES, PERMITIDA A COMPENSAÇÃO ENTRE CRÉDITOS E DÉBITOS. IOF. VALOR COBRADO EM EXCESSO. NECESSIDADE DE RECÁLCULO EM RAZÃO DA ALTERAÇÃO DA BASE DE CÁLCULO DESCARACTERIZAÇÃO DA MORA. VIABILIDADE IN CASU. RECURSO ESPECIAL REPRESENTATIVO DE CONTROVÉRSIA Nº 1.061.530/RS. ÔNUS SUCUMBENCIAL. READEQUAÇÃO. HONORÁRIOS ADVOCATÍCIOS. MAJORAÇÃO. SENTENÇA PARCIALMENTE ANULADA E PARCIALMENTE REFORMADA. RECURSOS CONHECIDOS E PARCIALMENTE PROVIDOS.</w:t>
       </w:r>
     </w:p>
     <w:p>
@@ -41367,7 +41151,7 @@
           <w:noProof/>
           <w:szCs w:val="23"/>
         </w:rPr>
-        <w:t>8 de junho de 2026</w:t>
+        <w:t>9 de junho de 2026</w:t>
       </w:r>
       <w:r>
         <w:rPr>
@@ -51063,6 +50847,7 @@
     <w:rsid w:val="00485B83"/>
     <w:rsid w:val="00487D82"/>
     <w:rsid w:val="00492793"/>
+    <w:rsid w:val="004A2795"/>
     <w:rsid w:val="004B218A"/>
     <w:rsid w:val="004B2FD0"/>
     <w:rsid w:val="004B6FE5"/>
@@ -51116,6 +50901,7 @@
     <w:rsid w:val="007234CA"/>
     <w:rsid w:val="0077279F"/>
     <w:rsid w:val="00786664"/>
+    <w:rsid w:val="00786E46"/>
     <w:rsid w:val="00792861"/>
     <w:rsid w:val="00795A1C"/>
     <w:rsid w:val="007A2D3D"/>
@@ -51203,6 +50989,7 @@
     <w:rsid w:val="00C90573"/>
     <w:rsid w:val="00C931DB"/>
     <w:rsid w:val="00CA599B"/>
+    <w:rsid w:val="00CA7BA5"/>
     <w:rsid w:val="00CB61B7"/>
     <w:rsid w:val="00CB72C6"/>
     <w:rsid w:val="00CE17B7"/>
@@ -51249,6 +51036,7 @@
     <w:rsid w:val="00F22AA7"/>
     <w:rsid w:val="00F237CB"/>
     <w:rsid w:val="00F36286"/>
+    <w:rsid w:val="00F431B6"/>
     <w:rsid w:val="00F45AC8"/>
     <w:rsid w:val="00F92DB8"/>
     <w:rsid w:val="00F934F4"/>

</xml_diff>

<commit_message>
ajustando a janela dos input dos dados que não estava aparecendo
</commit_message>
<xml_diff>
--- a/laudo/templates/laudo_completo.docx
+++ b/laudo/templates/laudo_completo.docx
@@ -3509,6 +3509,7 @@
             <w:t>{{</w:t>
           </w:r>
           <w:proofErr w:type="spellStart"/>
+          <w:proofErr w:type="gramStart"/>
           <w:r>
             <w:rPr>
               <w:bCs/>
@@ -3517,6 +3518,7 @@
             <w:t>c.juros</w:t>
           </w:r>
           <w:proofErr w:type="spellEnd"/>
+          <w:proofErr w:type="gramEnd"/>
           <w:r>
             <w:rPr>
               <w:bCs/>
@@ -3614,6 +3616,7 @@
           <w:bCs/>
         </w:rPr>
       </w:pPr>
+      <w:proofErr w:type="gramStart"/>
       <w:r>
         <w:rPr>
           <w:b/>
@@ -3629,25 +3632,25 @@
           <w:bCs/>
           <w:highlight w:val="green"/>
         </w:rPr>
-        <w:t>item.nome</w:t>
-      </w:r>
-      <w:proofErr w:type="spellEnd"/>
+        <w:t>item</w:t>
+      </w:r>
+      <w:proofErr w:type="gramEnd"/>
       <w:r>
         <w:rPr>
           <w:b/>
           <w:bCs/>
           <w:highlight w:val="green"/>
         </w:rPr>
-        <w:t xml:space="preserve"> }}: R$ {{ </w:t>
-      </w:r>
-      <w:proofErr w:type="spellStart"/>
+        <w:t>.</w:t>
+      </w:r>
+      <w:proofErr w:type="gramStart"/>
       <w:r>
         <w:rPr>
           <w:b/>
           <w:bCs/>
           <w:highlight w:val="green"/>
         </w:rPr>
-        <w:t>item.valor</w:t>
+        <w:t>nome</w:t>
       </w:r>
       <w:proofErr w:type="spellEnd"/>
       <w:r>
@@ -3656,7 +3659,70 @@
           <w:bCs/>
           <w:highlight w:val="green"/>
         </w:rPr>
-        <w:t xml:space="preserve"> }}</w:t>
+        <w:t xml:space="preserve"> }}:</w:t>
+      </w:r>
+      <w:proofErr w:type="gramEnd"/>
+      <w:r>
+        <w:rPr>
+          <w:b/>
+          <w:bCs/>
+          <w:highlight w:val="green"/>
+        </w:rPr>
+        <w:t xml:space="preserve"> R$ </w:t>
+      </w:r>
+      <w:proofErr w:type="gramStart"/>
+      <w:r>
+        <w:rPr>
+          <w:b/>
+          <w:bCs/>
+          <w:highlight w:val="green"/>
+        </w:rPr>
+        <w:t xml:space="preserve">{{ </w:t>
+      </w:r>
+      <w:proofErr w:type="spellStart"/>
+      <w:r>
+        <w:rPr>
+          <w:b/>
+          <w:bCs/>
+          <w:highlight w:val="green"/>
+        </w:rPr>
+        <w:t>item</w:t>
+      </w:r>
+      <w:proofErr w:type="gramEnd"/>
+      <w:r>
+        <w:rPr>
+          <w:b/>
+          <w:bCs/>
+          <w:highlight w:val="green"/>
+        </w:rPr>
+        <w:t>.</w:t>
+      </w:r>
+      <w:proofErr w:type="gramStart"/>
+      <w:r>
+        <w:rPr>
+          <w:b/>
+          <w:bCs/>
+          <w:highlight w:val="green"/>
+        </w:rPr>
+        <w:t>valor</w:t>
+      </w:r>
+      <w:proofErr w:type="spellEnd"/>
+      <w:r>
+        <w:rPr>
+          <w:b/>
+          <w:bCs/>
+          <w:highlight w:val="green"/>
+        </w:rPr>
+        <w:t xml:space="preserve"> }</w:t>
+      </w:r>
+      <w:proofErr w:type="gramEnd"/>
+      <w:r>
+        <w:rPr>
+          <w:b/>
+          <w:bCs/>
+          <w:highlight w:val="green"/>
+        </w:rPr>
+        <w:t>}</w:t>
       </w:r>
     </w:p>
     <w:p>
@@ -3727,11 +3793,19 @@
         <w:t>{{</w:t>
       </w:r>
       <w:proofErr w:type="spellStart"/>
+      <w:proofErr w:type="gramStart"/>
       <w:r>
         <w:rPr>
           <w:highlight w:val="green"/>
         </w:rPr>
-        <w:t>c.valor_parcela</w:t>
+        <w:t>c.valor</w:t>
+      </w:r>
+      <w:proofErr w:type="gramEnd"/>
+      <w:r>
+        <w:rPr>
+          <w:highlight w:val="green"/>
+        </w:rPr>
+        <w:t>_parcela</w:t>
       </w:r>
       <w:proofErr w:type="spellEnd"/>
       <w:r>
@@ -3781,11 +3855,19 @@
             <w:t>{{</w:t>
           </w:r>
           <w:proofErr w:type="spellStart"/>
+          <w:proofErr w:type="gramStart"/>
           <w:r>
             <w:rPr>
               <w:highlight w:val="green"/>
             </w:rPr>
-            <w:t>c.numero_parcela</w:t>
+            <w:t>c.numero</w:t>
+          </w:r>
+          <w:proofErr w:type="gramEnd"/>
+          <w:r>
+            <w:rPr>
+              <w:highlight w:val="green"/>
+            </w:rPr>
+            <w:t>_parcela</w:t>
           </w:r>
           <w:proofErr w:type="spellEnd"/>
           <w:r>
@@ -3843,6 +3925,7 @@
         <w:t xml:space="preserve"> </w:t>
       </w:r>
       <w:proofErr w:type="spellStart"/>
+      <w:proofErr w:type="gramStart"/>
       <w:r>
         <w:rPr>
           <w:color w:val="EE0000"/>
@@ -3856,6 +3939,7 @@
         <w:t>periodo</w:t>
       </w:r>
       <w:proofErr w:type="spellEnd"/>
+      <w:proofErr w:type="gramEnd"/>
       <w:r>
         <w:rPr>
           <w:color w:val="EE0000"/>
@@ -4417,6 +4501,7 @@
         <w:t xml:space="preserve"> </w:t>
       </w:r>
       <w:proofErr w:type="spellStart"/>
+      <w:proofErr w:type="gramStart"/>
       <w:r>
         <w:rPr>
           <w:color w:val="EE0000"/>
@@ -4427,12 +4512,26 @@
         <w:rPr>
           <w:color w:val="EE0000"/>
         </w:rPr>
-        <w:t>opcoes_garantias</w:t>
-      </w:r>
+        <w:t>opcoes</w:t>
+      </w:r>
+      <w:proofErr w:type="gramEnd"/>
       <w:r>
         <w:rPr>
           <w:color w:val="EE0000"/>
         </w:rPr>
+        <w:t>_</w:t>
+      </w:r>
+      <w:proofErr w:type="gramStart"/>
+      <w:r>
+        <w:rPr>
+          <w:color w:val="EE0000"/>
+        </w:rPr>
+        <w:t>garantias</w:t>
+      </w:r>
+      <w:r>
+        <w:rPr>
+          <w:color w:val="EE0000"/>
+        </w:rPr>
         <w:t>.</w:t>
       </w:r>
       <w:r>
@@ -4442,6 +4541,7 @@
         <w:t>aval</w:t>
       </w:r>
       <w:proofErr w:type="spellEnd"/>
+      <w:proofErr w:type="gramEnd"/>
       <w:r>
         <w:rPr>
           <w:color w:val="EE0000"/>
@@ -4565,17 +4665,39 @@
         <w:t xml:space="preserve"> </w:t>
       </w:r>
       <w:proofErr w:type="spellStart"/>
+      <w:proofErr w:type="gramStart"/>
       <w:r>
         <w:rPr>
           <w:color w:val="EE0000"/>
         </w:rPr>
-        <w:t>c.opcoes_garantias</w:t>
-      </w:r>
+        <w:t>c.opcoes</w:t>
+      </w:r>
+      <w:proofErr w:type="gramEnd"/>
       <w:r>
         <w:rPr>
           <w:color w:val="EE0000"/>
         </w:rPr>
-        <w:t>.penhor_cedular</w:t>
+        <w:t>_</w:t>
+      </w:r>
+      <w:proofErr w:type="gramStart"/>
+      <w:r>
+        <w:rPr>
+          <w:color w:val="EE0000"/>
+        </w:rPr>
+        <w:t>garantias</w:t>
+      </w:r>
+      <w:r>
+        <w:rPr>
+          <w:color w:val="EE0000"/>
+        </w:rPr>
+        <w:t>.penhor</w:t>
+      </w:r>
+      <w:proofErr w:type="gramEnd"/>
+      <w:r>
+        <w:rPr>
+          <w:color w:val="EE0000"/>
+        </w:rPr>
+        <w:t>_cedular</w:t>
       </w:r>
       <w:proofErr w:type="spellEnd"/>
       <w:r>
@@ -4627,7 +4749,15 @@
         <w:contextualSpacing/>
       </w:pPr>
       <w:r>
-        <w:t>Bem, descrição completa (R$ );</w:t>
+        <w:t>Bem, descrição completa (R</w:t>
+      </w:r>
+      <w:proofErr w:type="gramStart"/>
+      <w:r>
+        <w:t>$ )</w:t>
+      </w:r>
+      <w:proofErr w:type="gramEnd"/>
+      <w:r>
+        <w:t>;</w:t>
       </w:r>
     </w:p>
     <w:p>
@@ -4705,7 +4835,21 @@
         <w:rPr>
           <w:highlight w:val="yellow"/>
         </w:rPr>
-        <w:t>1 maquinário, marca, modelo, ano, chassi, demais informações (R$ );</w:t>
+        <w:t>1 maquinário, marca, modelo, ano, chassi, demais informações (R</w:t>
+      </w:r>
+      <w:proofErr w:type="gramStart"/>
+      <w:r>
+        <w:rPr>
+          <w:highlight w:val="yellow"/>
+        </w:rPr>
+        <w:t>$ )</w:t>
+      </w:r>
+      <w:proofErr w:type="gramEnd"/>
+      <w:r>
+        <w:rPr>
+          <w:highlight w:val="yellow"/>
+        </w:rPr>
+        <w:t>;</w:t>
       </w:r>
     </w:p>
     <w:p>
@@ -4843,17 +4987,39 @@
         <w:t xml:space="preserve"> </w:t>
       </w:r>
       <w:proofErr w:type="spellStart"/>
+      <w:proofErr w:type="gramStart"/>
       <w:r>
         <w:rPr>
           <w:color w:val="EE0000"/>
         </w:rPr>
-        <w:t>c.opcoes_garantias</w:t>
-      </w:r>
+        <w:t>c.opcoes</w:t>
+      </w:r>
+      <w:proofErr w:type="gramEnd"/>
       <w:r>
         <w:rPr>
           <w:color w:val="EE0000"/>
         </w:rPr>
-        <w:t>.hipoteca_cedular</w:t>
+        <w:t>_</w:t>
+      </w:r>
+      <w:proofErr w:type="gramStart"/>
+      <w:r>
+        <w:rPr>
+          <w:color w:val="EE0000"/>
+        </w:rPr>
+        <w:t>garantias</w:t>
+      </w:r>
+      <w:r>
+        <w:rPr>
+          <w:color w:val="EE0000"/>
+        </w:rPr>
+        <w:t>.hipoteca</w:t>
+      </w:r>
+      <w:proofErr w:type="gramEnd"/>
+      <w:r>
+        <w:rPr>
+          <w:color w:val="EE0000"/>
+        </w:rPr>
+        <w:t>_cedular</w:t>
       </w:r>
       <w:proofErr w:type="spellEnd"/>
       <w:r>
@@ -4945,7 +5111,21 @@
         <w:rPr>
           <w:highlight w:val="yellow"/>
         </w:rPr>
-        <w:t xml:space="preserve"> – Cartório de Registro de Imóveis de XXXXX - UF (R$ );</w:t>
+        <w:t xml:space="preserve"> – Cartório de Registro de Imóveis de XXXXX - UF (R</w:t>
+      </w:r>
+      <w:proofErr w:type="gramStart"/>
+      <w:r>
+        <w:rPr>
+          <w:highlight w:val="yellow"/>
+        </w:rPr>
+        <w:t>$ )</w:t>
+      </w:r>
+      <w:proofErr w:type="gramEnd"/>
+      <w:r>
+        <w:rPr>
+          <w:highlight w:val="yellow"/>
+        </w:rPr>
+        <w:t>;</w:t>
       </w:r>
     </w:p>
     <w:p>
@@ -5034,13 +5214,23 @@
         <w:t xml:space="preserve">{%p for item in </w:t>
       </w:r>
       <w:proofErr w:type="spellStart"/>
+      <w:proofErr w:type="gramStart"/>
       <w:r>
         <w:rPr>
           <w:bCs/>
           <w:color w:val="EE0000"/>
           <w:highlight w:val="yellow"/>
         </w:rPr>
-        <w:t>c.opcoes_inadimplento</w:t>
+        <w:t>c.opcoes</w:t>
+      </w:r>
+      <w:proofErr w:type="gramEnd"/>
+      <w:r>
+        <w:rPr>
+          <w:bCs/>
+          <w:color w:val="EE0000"/>
+          <w:highlight w:val="yellow"/>
+        </w:rPr>
+        <w:t>_inadimplento</w:t>
       </w:r>
       <w:proofErr w:type="spellEnd"/>
       <w:r>
@@ -5064,6 +5254,7 @@
           <w:bCs/>
         </w:rPr>
       </w:pPr>
+      <w:proofErr w:type="gramStart"/>
       <w:r>
         <w:rPr>
           <w:b/>
@@ -5079,16 +5270,43 @@
           <w:bCs/>
           <w:highlight w:val="green"/>
         </w:rPr>
-        <w:t>item.nome</w:t>
-      </w:r>
-      <w:proofErr w:type="spellEnd"/>
+        <w:t>item</w:t>
+      </w:r>
+      <w:proofErr w:type="gramEnd"/>
       <w:r>
         <w:rPr>
           <w:b/>
           <w:bCs/>
           <w:highlight w:val="green"/>
         </w:rPr>
-        <w:t xml:space="preserve"> }}</w:t>
+        <w:t>.</w:t>
+      </w:r>
+      <w:proofErr w:type="gramStart"/>
+      <w:r>
+        <w:rPr>
+          <w:b/>
+          <w:bCs/>
+          <w:highlight w:val="green"/>
+        </w:rPr>
+        <w:t>nome</w:t>
+      </w:r>
+      <w:proofErr w:type="spellEnd"/>
+      <w:r>
+        <w:rPr>
+          <w:b/>
+          <w:bCs/>
+          <w:highlight w:val="green"/>
+        </w:rPr>
+        <w:t xml:space="preserve"> }</w:t>
+      </w:r>
+      <w:proofErr w:type="gramEnd"/>
+      <w:r>
+        <w:rPr>
+          <w:b/>
+          <w:bCs/>
+          <w:highlight w:val="green"/>
+        </w:rPr>
+        <w:t>}</w:t>
       </w:r>
     </w:p>
     <w:p>
@@ -5156,6 +5374,7 @@
         <w:t>{{</w:t>
       </w:r>
       <w:proofErr w:type="spellStart"/>
+      <w:proofErr w:type="gramStart"/>
       <w:r>
         <w:rPr>
           <w:color w:val="EE0000"/>
@@ -5166,7 +5385,14 @@
         <w:rPr>
           <w:color w:val="EE0000"/>
         </w:rPr>
-        <w:t>finalidade_op</w:t>
+        <w:t>finalidade</w:t>
+      </w:r>
+      <w:proofErr w:type="gramEnd"/>
+      <w:r>
+        <w:rPr>
+          <w:color w:val="EE0000"/>
+        </w:rPr>
+        <w:t>_op</w:t>
       </w:r>
       <w:proofErr w:type="spellEnd"/>
       <w:r>
@@ -6543,9 +6769,6 @@
     <w:p>
       <w:pPr>
         <w:ind w:firstLine="0"/>
-        <w:rPr>
-          <w:color w:val="EE0000"/>
-        </w:rPr>
       </w:pPr>
       <w:r>
         <w:rPr>
@@ -10503,12 +10726,12 @@
       <w:pPr>
         <w:ind w:firstLine="0"/>
         <w:rPr>
-          <w:color w:val="EE0000"/>
-        </w:rPr>
-      </w:pPr>
-      <w:r>
-        <w:rPr>
-          <w:color w:val="EE0000"/>
+          <w:rFonts w:eastAsia="Times New Roman"/>
+        </w:rPr>
+      </w:pPr>
+      <w:r>
+        <w:rPr>
+          <w:rFonts w:eastAsia="Times New Roman"/>
         </w:rPr>
         <w:t>[[END_BLOCK]]</w:t>
       </w:r>
@@ -12933,11 +13156,13 @@
       <w:pPr>
         <w:ind w:firstLine="0"/>
         <w:rPr>
+          <w:rFonts w:eastAsia="Times New Roman"/>
           <w:color w:val="EE0000"/>
         </w:rPr>
       </w:pPr>
       <w:r>
         <w:rPr>
+          <w:rFonts w:eastAsia="Times New Roman"/>
           <w:color w:val="EE0000"/>
         </w:rPr>
         <w:t>[[END_BLOCK]]</w:t>
@@ -41151,7 +41376,7 @@
           <w:noProof/>
           <w:szCs w:val="23"/>
         </w:rPr>
-        <w:t>9 de junho de 2026</w:t>
+        <w:t>10 de junho de 2026</w:t>
       </w:r>
       <w:r>
         <w:rPr>
@@ -50842,7 +51067,9 @@
     <w:rsid w:val="003F413A"/>
     <w:rsid w:val="00402088"/>
     <w:rsid w:val="00450E0F"/>
+    <w:rsid w:val="00451395"/>
     <w:rsid w:val="004610B4"/>
+    <w:rsid w:val="004631CE"/>
     <w:rsid w:val="00481ADE"/>
     <w:rsid w:val="00485B83"/>
     <w:rsid w:val="00487D82"/>
@@ -50892,6 +51119,7 @@
     <w:rsid w:val="006B25A2"/>
     <w:rsid w:val="006B57A4"/>
     <w:rsid w:val="006C0E29"/>
+    <w:rsid w:val="006C7BAF"/>
     <w:rsid w:val="006D2C9A"/>
     <w:rsid w:val="006E3351"/>
     <w:rsid w:val="006F5B8F"/>
@@ -50904,6 +51132,7 @@
     <w:rsid w:val="00786E46"/>
     <w:rsid w:val="00792861"/>
     <w:rsid w:val="00795A1C"/>
+    <w:rsid w:val="00797204"/>
     <w:rsid w:val="007A2D3D"/>
     <w:rsid w:val="007B0292"/>
     <w:rsid w:val="007B6E53"/>
@@ -50979,7 +51208,9 @@
     <w:rsid w:val="00C05B14"/>
     <w:rsid w:val="00C1093C"/>
     <w:rsid w:val="00C10EFA"/>
+    <w:rsid w:val="00C11BEA"/>
     <w:rsid w:val="00C14CEB"/>
+    <w:rsid w:val="00C15988"/>
     <w:rsid w:val="00C375CC"/>
     <w:rsid w:val="00C45714"/>
     <w:rsid w:val="00C55585"/>

</xml_diff>

<commit_message>
ajustando as informações de garantias e datas do contrato
</commit_message>
<xml_diff>
--- a/laudo/templates/laudo_completo.docx
+++ b/laudo/templates/laudo_completo.docx
@@ -3517,8 +3517,15 @@
             </w:rPr>
             <w:t>c.juros</w:t>
           </w:r>
+          <w:proofErr w:type="gramEnd"/>
+          <w:r>
+            <w:rPr>
+              <w:bCs/>
+              <w:highlight w:val="green"/>
+            </w:rPr>
+            <w:t>_texto</w:t>
+          </w:r>
           <w:proofErr w:type="spellEnd"/>
-          <w:proofErr w:type="gramEnd"/>
           <w:r>
             <w:rPr>
               <w:bCs/>
@@ -3533,13 +3540,7 @@
           <w:bCs/>
           <w:highlight w:val="yellow"/>
         </w:rPr>
-        <w:t>% a.a.</w:t>
-      </w:r>
-      <w:r>
-        <w:rPr>
-          <w:bCs/>
-        </w:rPr>
-        <w:t xml:space="preserve"> </w:t>
+        <w:t>.</w:t>
       </w:r>
     </w:p>
     <w:p>
@@ -4365,19 +4366,32 @@
           </w:placeholder>
         </w:sdtPr>
         <w:sdtContent>
+          <w:r>
+            <w:rPr>
+              <w:highlight w:val="green"/>
+            </w:rPr>
+            <w:t>{{</w:t>
+          </w:r>
           <w:proofErr w:type="spellStart"/>
           <w:r>
-            <w:t>dd</w:t>
+            <w:rPr>
+              <w:highlight w:val="green"/>
+            </w:rPr>
+            <w:t>c.</w:t>
+          </w:r>
+          <w:r>
+            <w:rPr>
+              <w:highlight w:val="green"/>
+            </w:rPr>
+            <w:t>data_contrato</w:t>
           </w:r>
           <w:proofErr w:type="spellEnd"/>
           <w:r>
-            <w:t>/mm/</w:t>
+            <w:rPr>
+              <w:highlight w:val="green"/>
+            </w:rPr>
+            <w:t>}}</w:t>
           </w:r>
-          <w:proofErr w:type="spellStart"/>
-          <w:r>
-            <w:t>aaaa</w:t>
-          </w:r>
-          <w:proofErr w:type="spellEnd"/>
         </w:sdtContent>
       </w:sdt>
     </w:p>
@@ -4397,19 +4411,48 @@
           </w:placeholder>
         </w:sdtPr>
         <w:sdtContent>
-          <w:proofErr w:type="spellStart"/>
-          <w:r>
-            <w:t>dd</w:t>
-          </w:r>
-          <w:proofErr w:type="spellEnd"/>
-          <w:r>
-            <w:t>/mm/</w:t>
-          </w:r>
-          <w:proofErr w:type="spellStart"/>
-          <w:r>
-            <w:t>aaaa</w:t>
-          </w:r>
-          <w:proofErr w:type="spellEnd"/>
+          <w:sdt>
+            <w:sdtPr>
+              <w:id w:val="-1432729818"/>
+              <w:placeholder>
+                <w:docPart w:val="120CB71C57204D75A5F61A29EA290ACA"/>
+              </w:placeholder>
+            </w:sdtPr>
+            <w:sdtContent>
+              <w:r>
+                <w:rPr>
+                  <w:highlight w:val="green"/>
+                </w:rPr>
+                <w:t>{{</w:t>
+              </w:r>
+              <w:proofErr w:type="spellStart"/>
+              <w:r>
+                <w:rPr>
+                  <w:highlight w:val="green"/>
+                </w:rPr>
+                <w:t>c.</w:t>
+              </w:r>
+              <w:r>
+                <w:rPr>
+                  <w:highlight w:val="green"/>
+                </w:rPr>
+                <w:t>data_</w:t>
+              </w:r>
+              <w:r>
+                <w:rPr>
+                  <w:highlight w:val="green"/>
+                </w:rPr>
+                <w:t>pagamento</w:t>
+              </w:r>
+              <w:proofErr w:type="spellEnd"/>
+              <w:r>
+                <w:rPr>
+                  <w:highlight w:val="green"/>
+                </w:rPr>
+                <w:t>}}</w:t>
+              </w:r>
+            </w:sdtContent>
+          </w:sdt>
         </w:sdtContent>
       </w:sdt>
     </w:p>
@@ -4429,19 +4472,48 @@
           </w:placeholder>
         </w:sdtPr>
         <w:sdtContent>
-          <w:proofErr w:type="spellStart"/>
-          <w:r>
-            <w:t>dd</w:t>
-          </w:r>
-          <w:proofErr w:type="spellEnd"/>
-          <w:r>
-            <w:t>/mm/</w:t>
-          </w:r>
-          <w:proofErr w:type="spellStart"/>
-          <w:r>
-            <w:t>aaaa</w:t>
-          </w:r>
-          <w:proofErr w:type="spellEnd"/>
+          <w:sdt>
+            <w:sdtPr>
+              <w:id w:val="-919096331"/>
+              <w:placeholder>
+                <w:docPart w:val="7E49BA581B714D46AA0DB7A918C164B6"/>
+              </w:placeholder>
+            </w:sdtPr>
+            <w:sdtContent>
+              <w:r>
+                <w:rPr>
+                  <w:highlight w:val="green"/>
+                </w:rPr>
+                <w:t>{{</w:t>
+              </w:r>
+              <w:proofErr w:type="spellStart"/>
+              <w:r>
+                <w:rPr>
+                  <w:highlight w:val="green"/>
+                </w:rPr>
+                <w:t>c.</w:t>
+              </w:r>
+              <w:r>
+                <w:rPr>
+                  <w:highlight w:val="green"/>
+                </w:rPr>
+                <w:t>data_</w:t>
+              </w:r>
+              <w:r>
+                <w:rPr>
+                  <w:highlight w:val="green"/>
+                </w:rPr>
+                <w:t>vencimento</w:t>
+              </w:r>
+              <w:proofErr w:type="spellEnd"/>
+              <w:r>
+                <w:rPr>
+                  <w:highlight w:val="green"/>
+                </w:rPr>
+                <w:t>}}</w:t>
+              </w:r>
+            </w:sdtContent>
+          </w:sdt>
         </w:sdtContent>
       </w:sdt>
     </w:p>
@@ -4472,19 +4544,7 @@
         <w:rPr>
           <w:color w:val="EE0000"/>
         </w:rPr>
-        <w:t>{%</w:t>
-      </w:r>
-      <w:r>
-        <w:rPr>
-          <w:color w:val="EE0000"/>
-        </w:rPr>
-        <w:t>p</w:t>
-      </w:r>
-      <w:r>
-        <w:rPr>
-          <w:color w:val="EE0000"/>
-        </w:rPr>
-        <w:t xml:space="preserve"> </w:t>
+        <w:t xml:space="preserve">{%p </w:t>
       </w:r>
       <w:proofErr w:type="spellStart"/>
       <w:r>
@@ -4532,13 +4592,7 @@
         <w:rPr>
           <w:color w:val="EE0000"/>
         </w:rPr>
-        <w:t>.</w:t>
-      </w:r>
-      <w:r>
-        <w:rPr>
-          <w:color w:val="EE0000"/>
-        </w:rPr>
-        <w:t>aval</w:t>
+        <w:t>.aval</w:t>
       </w:r>
       <w:proofErr w:type="spellEnd"/>
       <w:proofErr w:type="gramEnd"/>
@@ -4568,22 +4622,121 @@
       <w:pPr>
         <w:pStyle w:val="List1"/>
         <w:numPr>
+          <w:ilvl w:val="0"/>
+          <w:numId w:val="0"/>
+        </w:numPr>
+        <w:spacing w:before="100" w:beforeAutospacing="1" w:after="100" w:afterAutospacing="1"/>
+        <w:ind w:left="1083"/>
+        <w:contextualSpacing/>
+        <w:rPr>
+          <w:color w:val="EE0000"/>
+        </w:rPr>
+      </w:pPr>
+      <w:r>
+        <w:rPr>
+          <w:color w:val="EE0000"/>
+        </w:rPr>
+        <w:t xml:space="preserve">{%p for avalista in </w:t>
+      </w:r>
+      <w:proofErr w:type="spellStart"/>
+      <w:proofErr w:type="gramStart"/>
+      <w:r>
+        <w:rPr>
+          <w:color w:val="EE0000"/>
+        </w:rPr>
+        <w:t>c.</w:t>
+      </w:r>
+      <w:r>
+        <w:rPr>
+          <w:color w:val="EE0000"/>
+        </w:rPr>
+        <w:t>garantias</w:t>
+      </w:r>
+      <w:proofErr w:type="gramEnd"/>
+      <w:r>
+        <w:rPr>
+          <w:color w:val="EE0000"/>
+        </w:rPr>
+        <w:t>_</w:t>
+      </w:r>
+      <w:proofErr w:type="gramStart"/>
+      <w:r>
+        <w:rPr>
+          <w:color w:val="EE0000"/>
+        </w:rPr>
+        <w:t>aval</w:t>
+      </w:r>
+      <w:r>
+        <w:rPr>
+          <w:color w:val="EE0000"/>
+        </w:rPr>
+        <w:t>.aval</w:t>
+      </w:r>
+      <w:proofErr w:type="spellEnd"/>
+      <w:proofErr w:type="gramEnd"/>
+      <w:r>
+        <w:rPr>
+          <w:color w:val="EE0000"/>
+        </w:rPr>
+        <w:t xml:space="preserve"> %}</w:t>
+      </w:r>
+    </w:p>
+    <w:p>
+      <w:pPr>
+        <w:pStyle w:val="List1"/>
+        <w:numPr>
           <w:ilvl w:val="2"/>
           <w:numId w:val="1"/>
         </w:numPr>
         <w:spacing w:before="100" w:beforeAutospacing="1" w:after="100" w:afterAutospacing="1"/>
         <w:ind w:hanging="357"/>
         <w:contextualSpacing/>
-      </w:pPr>
-      <w:r>
-        <w:t xml:space="preserve">Nome, CPF: </w:t>
+        <w:rPr>
+          <w:color w:val="EE0000"/>
+        </w:rPr>
+      </w:pPr>
+      <w:r>
+        <w:rPr>
+          <w:color w:val="EE0000"/>
+        </w:rPr>
+        <w:t>{{</w:t>
       </w:r>
       <w:proofErr w:type="spellStart"/>
-      <w:r>
-        <w:t>xxx</w:t>
+      <w:proofErr w:type="gramStart"/>
+      <w:r>
+        <w:rPr>
+          <w:color w:val="EE0000"/>
+        </w:rPr>
+        <w:t>avalista.nome</w:t>
       </w:r>
       <w:proofErr w:type="spellEnd"/>
-      <w:r>
+      <w:proofErr w:type="gramEnd"/>
+      <w:r>
+        <w:rPr>
+          <w:color w:val="EE0000"/>
+        </w:rPr>
+        <w:t>}}, CPF: {{</w:t>
+      </w:r>
+      <w:proofErr w:type="spellStart"/>
+      <w:proofErr w:type="gramStart"/>
+      <w:r>
+        <w:rPr>
+          <w:color w:val="EE0000"/>
+        </w:rPr>
+        <w:t>avalista.documento</w:t>
+      </w:r>
+      <w:proofErr w:type="spellEnd"/>
+      <w:proofErr w:type="gramEnd"/>
+      <w:r>
+        <w:rPr>
+          <w:color w:val="EE0000"/>
+        </w:rPr>
+        <w:t>}}</w:t>
+      </w:r>
+      <w:r>
+        <w:rPr>
+          <w:color w:val="EE0000"/>
+        </w:rPr>
         <w:t>;</w:t>
       </w:r>
     </w:p>
@@ -4610,6 +4763,39 @@
         <w:rPr>
           <w:color w:val="EE0000"/>
         </w:rPr>
+        <w:t>endfor</w:t>
+      </w:r>
+      <w:proofErr w:type="spellEnd"/>
+      <w:r>
+        <w:rPr>
+          <w:color w:val="EE0000"/>
+        </w:rPr>
+        <w:t xml:space="preserve"> %}</w:t>
+      </w:r>
+    </w:p>
+    <w:p>
+      <w:pPr>
+        <w:pStyle w:val="List1"/>
+        <w:numPr>
+          <w:ilvl w:val="0"/>
+          <w:numId w:val="0"/>
+        </w:numPr>
+        <w:ind w:left="720" w:firstLine="363"/>
+        <w:rPr>
+          <w:color w:val="EE0000"/>
+        </w:rPr>
+      </w:pPr>
+      <w:r>
+        <w:rPr>
+          <w:color w:val="EE0000"/>
+        </w:rPr>
+        <w:t xml:space="preserve">{%p </w:t>
+      </w:r>
+      <w:proofErr w:type="spellStart"/>
+      <w:r>
+        <w:rPr>
+          <w:color w:val="EE0000"/>
+        </w:rPr>
         <w:t>endif</w:t>
       </w:r>
       <w:proofErr w:type="spellEnd"/>
@@ -4670,7 +4856,19 @@
         <w:rPr>
           <w:color w:val="EE0000"/>
         </w:rPr>
-        <w:t>c.opcoes</w:t>
+        <w:t>c</w:t>
+      </w:r>
+      <w:r>
+        <w:rPr>
+          <w:color w:val="EE0000"/>
+        </w:rPr>
+        <w:t>.</w:t>
+      </w:r>
+      <w:r>
+        <w:rPr>
+          <w:color w:val="EE0000"/>
+        </w:rPr>
+        <w:t>opcoes</w:t>
       </w:r>
       <w:proofErr w:type="gramEnd"/>
       <w:r>
@@ -4747,17 +4945,213 @@
         <w:spacing w:before="100" w:beforeAutospacing="1" w:after="100" w:afterAutospacing="1"/>
         <w:ind w:hanging="357"/>
         <w:contextualSpacing/>
-      </w:pPr>
-      <w:r>
-        <w:t>Bem, descrição completa (R</w:t>
-      </w:r>
+        <w:rPr>
+          <w:color w:val="EE0000"/>
+        </w:rPr>
+      </w:pPr>
+      <w:r>
+        <w:rPr>
+          <w:color w:val="EE0000"/>
+        </w:rPr>
+        <w:t>{{</w:t>
+      </w:r>
+      <w:proofErr w:type="spellStart"/>
       <w:proofErr w:type="gramStart"/>
       <w:r>
-        <w:t>$ )</w:t>
+        <w:rPr>
+          <w:color w:val="EE0000"/>
+        </w:rPr>
+        <w:t>c.</w:t>
+      </w:r>
+      <w:r>
+        <w:rPr>
+          <w:color w:val="EE0000"/>
+        </w:rPr>
+        <w:t>garantias</w:t>
       </w:r>
       <w:proofErr w:type="gramEnd"/>
       <w:r>
-        <w:t>;</w:t>
+        <w:rPr>
+          <w:color w:val="EE0000"/>
+        </w:rPr>
+        <w:t>_</w:t>
+      </w:r>
+      <w:proofErr w:type="gramStart"/>
+      <w:r>
+        <w:rPr>
+          <w:color w:val="EE0000"/>
+        </w:rPr>
+        <w:t>penhor</w:t>
+      </w:r>
+      <w:r>
+        <w:rPr>
+          <w:color w:val="EE0000"/>
+        </w:rPr>
+        <w:t>.penhor</w:t>
+      </w:r>
+      <w:proofErr w:type="gramEnd"/>
+      <w:r>
+        <w:rPr>
+          <w:color w:val="EE0000"/>
+        </w:rPr>
+        <w:t>_cedular</w:t>
+      </w:r>
+      <w:proofErr w:type="spellEnd"/>
+      <w:r>
+        <w:rPr>
+          <w:color w:val="EE0000"/>
+        </w:rPr>
+        <w:t>}}</w:t>
+      </w:r>
+    </w:p>
+    <w:p>
+      <w:pPr>
+        <w:pStyle w:val="List1"/>
+        <w:numPr>
+          <w:ilvl w:val="0"/>
+          <w:numId w:val="0"/>
+        </w:numPr>
+        <w:ind w:left="720" w:firstLine="363"/>
+        <w:rPr>
+          <w:color w:val="EE0000"/>
+        </w:rPr>
+      </w:pPr>
+      <w:r>
+        <w:rPr>
+          <w:color w:val="EE0000"/>
+        </w:rPr>
+        <w:t xml:space="preserve">{%p </w:t>
+      </w:r>
+      <w:proofErr w:type="spellStart"/>
+      <w:r>
+        <w:rPr>
+          <w:color w:val="EE0000"/>
+        </w:rPr>
+        <w:t>endif</w:t>
+      </w:r>
+      <w:proofErr w:type="spellEnd"/>
+      <w:r>
+        <w:rPr>
+          <w:color w:val="EE0000"/>
+        </w:rPr>
+        <w:t xml:space="preserve"> %}</w:t>
+      </w:r>
+    </w:p>
+    <w:p>
+      <w:pPr>
+        <w:pStyle w:val="List1"/>
+        <w:numPr>
+          <w:ilvl w:val="0"/>
+          <w:numId w:val="0"/>
+        </w:numPr>
+        <w:ind w:left="720" w:firstLine="363"/>
+        <w:rPr>
+          <w:color w:val="EE0000"/>
+        </w:rPr>
+      </w:pPr>
+      <w:r>
+        <w:rPr>
+          <w:color w:val="EE0000"/>
+        </w:rPr>
+        <w:t>{%</w:t>
+      </w:r>
+      <w:r>
+        <w:rPr>
+          <w:color w:val="EE0000"/>
+        </w:rPr>
+        <w:t>p</w:t>
+      </w:r>
+      <w:r>
+        <w:rPr>
+          <w:color w:val="EE0000"/>
+        </w:rPr>
+        <w:t xml:space="preserve"> </w:t>
+      </w:r>
+      <w:proofErr w:type="spellStart"/>
+      <w:r>
+        <w:rPr>
+          <w:color w:val="EE0000"/>
+        </w:rPr>
+        <w:t>if</w:t>
+      </w:r>
+      <w:proofErr w:type="spellEnd"/>
+      <w:r>
+        <w:rPr>
+          <w:color w:val="EE0000"/>
+        </w:rPr>
+        <w:t xml:space="preserve"> </w:t>
+      </w:r>
+      <w:proofErr w:type="spellStart"/>
+      <w:proofErr w:type="gramStart"/>
+      <w:r>
+        <w:rPr>
+          <w:color w:val="EE0000"/>
+        </w:rPr>
+        <w:t>c.</w:t>
+      </w:r>
+      <w:r>
+        <w:rPr>
+          <w:color w:val="EE0000"/>
+        </w:rPr>
+        <w:t>opcoes</w:t>
+      </w:r>
+      <w:proofErr w:type="gramEnd"/>
+      <w:r>
+        <w:rPr>
+          <w:color w:val="EE0000"/>
+        </w:rPr>
+        <w:t>_</w:t>
+      </w:r>
+      <w:proofErr w:type="gramStart"/>
+      <w:r>
+        <w:rPr>
+          <w:color w:val="EE0000"/>
+        </w:rPr>
+        <w:t>garantias</w:t>
+      </w:r>
+      <w:r>
+        <w:rPr>
+          <w:color w:val="EE0000"/>
+        </w:rPr>
+        <w:t>.hipoteca</w:t>
+      </w:r>
+      <w:proofErr w:type="gramEnd"/>
+      <w:r>
+        <w:rPr>
+          <w:color w:val="EE0000"/>
+        </w:rPr>
+        <w:t>_cedular</w:t>
+      </w:r>
+      <w:proofErr w:type="spellEnd"/>
+      <w:r>
+        <w:rPr>
+          <w:color w:val="EE0000"/>
+        </w:rPr>
+        <w:t xml:space="preserve"> %}</w:t>
+      </w:r>
+    </w:p>
+    <w:p>
+      <w:pPr>
+        <w:pStyle w:val="List1"/>
+        <w:numPr>
+          <w:ilvl w:val="1"/>
+          <w:numId w:val="1"/>
+        </w:numPr>
+        <w:spacing w:before="100" w:beforeAutospacing="1" w:after="100" w:afterAutospacing="1"/>
+        <w:ind w:hanging="357"/>
+        <w:contextualSpacing/>
+      </w:pPr>
+      <w:r>
+        <w:t xml:space="preserve">Hipoteca cedular de </w:t>
+      </w:r>
+      <w:r>
+        <w:rPr>
+          <w:color w:val="FF0000"/>
+        </w:rPr>
+        <w:t xml:space="preserve">primeiro </w:t>
+      </w:r>
+      <w:r>
+        <w:t>grau e sem concorrência de terceiros:</w:t>
       </w:r>
     </w:p>
     <w:p>
@@ -4771,361 +5165,62 @@
         <w:ind w:hanging="357"/>
         <w:contextualSpacing/>
         <w:rPr>
-          <w:highlight w:val="yellow"/>
-        </w:rPr>
-      </w:pPr>
+          <w:color w:val="EE0000"/>
+        </w:rPr>
+      </w:pPr>
+      <w:proofErr w:type="gramStart"/>
+      <w:r>
+        <w:rPr>
+          <w:color w:val="EE0000"/>
+        </w:rPr>
+        <w:t xml:space="preserve">{{ </w:t>
+      </w:r>
       <w:proofErr w:type="spellStart"/>
       <w:r>
         <w:rPr>
-          <w:highlight w:val="yellow"/>
-        </w:rPr>
-        <w:t>Xxxxxx</w:t>
+          <w:color w:val="EE0000"/>
+        </w:rPr>
+        <w:t>c</w:t>
+      </w:r>
+      <w:proofErr w:type="gramEnd"/>
+      <w:r>
+        <w:rPr>
+          <w:color w:val="EE0000"/>
+        </w:rPr>
+        <w:t>.</w:t>
+      </w:r>
+      <w:r>
+        <w:rPr>
+          <w:color w:val="EE0000"/>
+        </w:rPr>
+        <w:t>garantias_</w:t>
+      </w:r>
+      <w:proofErr w:type="gramStart"/>
+      <w:r>
+        <w:rPr>
+          <w:color w:val="EE0000"/>
+        </w:rPr>
+        <w:t>penhor</w:t>
+      </w:r>
+      <w:r>
+        <w:rPr>
+          <w:color w:val="EE0000"/>
+        </w:rPr>
+        <w:t>.hipoteca</w:t>
+      </w:r>
+      <w:proofErr w:type="gramEnd"/>
+      <w:r>
+        <w:rPr>
+          <w:color w:val="EE0000"/>
+        </w:rPr>
+        <w:t>_cedular</w:t>
       </w:r>
       <w:proofErr w:type="spellEnd"/>
       <w:r>
         <w:rPr>
-          <w:highlight w:val="yellow"/>
-        </w:rPr>
-        <w:t xml:space="preserve"> kg de milho/soja/trigo em grãos, período agrícola entre XXXX/</w:t>
-      </w:r>
-      <w:proofErr w:type="spellStart"/>
-      <w:r>
-        <w:rPr>
-          <w:highlight w:val="yellow"/>
-        </w:rPr>
-        <w:t>aaaa</w:t>
-      </w:r>
-      <w:proofErr w:type="spellEnd"/>
-      <w:r>
-        <w:rPr>
-          <w:highlight w:val="yellow"/>
-        </w:rPr>
-        <w:t xml:space="preserve"> e YYYY/</w:t>
-      </w:r>
-      <w:proofErr w:type="spellStart"/>
-      <w:r>
-        <w:rPr>
-          <w:highlight w:val="yellow"/>
-        </w:rPr>
-        <w:t>aaaa</w:t>
-      </w:r>
-      <w:proofErr w:type="spellEnd"/>
-      <w:r>
-        <w:rPr>
-          <w:highlight w:val="yellow"/>
-        </w:rPr>
-        <w:t xml:space="preserve"> (R$ 106.111,50);</w:t>
-      </w:r>
-    </w:p>
-    <w:p>
-      <w:pPr>
-        <w:pStyle w:val="List1"/>
-        <w:numPr>
-          <w:ilvl w:val="2"/>
-          <w:numId w:val="1"/>
-        </w:numPr>
-        <w:spacing w:before="100" w:beforeAutospacing="1" w:after="100" w:afterAutospacing="1"/>
-        <w:ind w:hanging="357"/>
-        <w:contextualSpacing/>
-        <w:rPr>
-          <w:highlight w:val="yellow"/>
-        </w:rPr>
-      </w:pPr>
-      <w:r>
-        <w:rPr>
-          <w:highlight w:val="yellow"/>
-        </w:rPr>
-        <w:t>1 maquinário, marca, modelo, ano, chassi, demais informações (R</w:t>
-      </w:r>
-      <w:proofErr w:type="gramStart"/>
-      <w:r>
-        <w:rPr>
-          <w:highlight w:val="yellow"/>
-        </w:rPr>
-        <w:t>$ )</w:t>
-      </w:r>
-      <w:proofErr w:type="gramEnd"/>
-      <w:r>
-        <w:rPr>
-          <w:highlight w:val="yellow"/>
-        </w:rPr>
-        <w:t>;</w:t>
-      </w:r>
-    </w:p>
-    <w:p>
-      <w:pPr>
-        <w:pStyle w:val="List1"/>
-        <w:numPr>
-          <w:ilvl w:val="2"/>
-          <w:numId w:val="1"/>
-        </w:numPr>
-        <w:spacing w:before="100" w:beforeAutospacing="1" w:after="100" w:afterAutospacing="1"/>
-        <w:ind w:hanging="357"/>
-        <w:contextualSpacing/>
-        <w:rPr>
-          <w:highlight w:val="yellow"/>
-        </w:rPr>
-      </w:pPr>
-      <w:proofErr w:type="spellStart"/>
-      <w:r>
-        <w:rPr>
-          <w:highlight w:val="yellow"/>
-        </w:rPr>
-        <w:t>Xx</w:t>
-      </w:r>
-      <w:proofErr w:type="spellEnd"/>
-      <w:r>
-        <w:rPr>
-          <w:highlight w:val="yellow"/>
-        </w:rPr>
-        <w:t xml:space="preserve"> vacas/novilhos/bois, </w:t>
-      </w:r>
-      <w:proofErr w:type="spellStart"/>
-      <w:r>
-        <w:rPr>
-          <w:highlight w:val="yellow"/>
-        </w:rPr>
-        <w:t>xx</w:t>
-      </w:r>
-      <w:proofErr w:type="spellEnd"/>
-      <w:r>
-        <w:rPr>
-          <w:highlight w:val="yellow"/>
-        </w:rPr>
-        <w:t xml:space="preserve"> meses de idade (R$ </w:t>
-      </w:r>
-      <w:proofErr w:type="spellStart"/>
-      <w:r>
-        <w:rPr>
-          <w:highlight w:val="yellow"/>
-        </w:rPr>
-        <w:t>xxxx</w:t>
-      </w:r>
-      <w:proofErr w:type="spellEnd"/>
-      <w:r>
-        <w:rPr>
-          <w:highlight w:val="yellow"/>
-        </w:rPr>
-        <w:t>)</w:t>
-      </w:r>
-    </w:p>
-    <w:p>
-      <w:pPr>
-        <w:pStyle w:val="List1"/>
-        <w:numPr>
-          <w:ilvl w:val="0"/>
-          <w:numId w:val="0"/>
-        </w:numPr>
-        <w:ind w:left="720" w:firstLine="363"/>
-        <w:rPr>
           <w:color w:val="EE0000"/>
         </w:rPr>
-      </w:pPr>
-      <w:r>
-        <w:rPr>
-          <w:color w:val="EE0000"/>
-        </w:rPr>
-        <w:t xml:space="preserve">{%p </w:t>
-      </w:r>
-      <w:proofErr w:type="spellStart"/>
-      <w:r>
-        <w:rPr>
-          <w:color w:val="EE0000"/>
-        </w:rPr>
-        <w:t>endif</w:t>
-      </w:r>
-      <w:proofErr w:type="spellEnd"/>
-      <w:r>
-        <w:rPr>
-          <w:color w:val="EE0000"/>
-        </w:rPr>
-        <w:t xml:space="preserve"> %}</w:t>
-      </w:r>
-    </w:p>
-    <w:p>
-      <w:pPr>
-        <w:pStyle w:val="List1"/>
-        <w:numPr>
-          <w:ilvl w:val="0"/>
-          <w:numId w:val="0"/>
-        </w:numPr>
-        <w:ind w:left="720" w:firstLine="363"/>
-        <w:rPr>
-          <w:color w:val="EE0000"/>
-        </w:rPr>
-      </w:pPr>
-      <w:r>
-        <w:rPr>
-          <w:color w:val="EE0000"/>
-        </w:rPr>
-        <w:t>{%</w:t>
-      </w:r>
-      <w:r>
-        <w:rPr>
-          <w:color w:val="EE0000"/>
-        </w:rPr>
-        <w:t>p</w:t>
-      </w:r>
-      <w:r>
-        <w:rPr>
-          <w:color w:val="EE0000"/>
-        </w:rPr>
-        <w:t xml:space="preserve"> </w:t>
-      </w:r>
-      <w:proofErr w:type="spellStart"/>
-      <w:r>
-        <w:rPr>
-          <w:color w:val="EE0000"/>
-        </w:rPr>
-        <w:t>if</w:t>
-      </w:r>
-      <w:proofErr w:type="spellEnd"/>
-      <w:r>
-        <w:rPr>
-          <w:color w:val="EE0000"/>
-        </w:rPr>
-        <w:t xml:space="preserve"> </w:t>
-      </w:r>
-      <w:proofErr w:type="spellStart"/>
-      <w:proofErr w:type="gramStart"/>
-      <w:r>
-        <w:rPr>
-          <w:color w:val="EE0000"/>
-        </w:rPr>
-        <w:t>c.opcoes</w:t>
-      </w:r>
-      <w:proofErr w:type="gramEnd"/>
-      <w:r>
-        <w:rPr>
-          <w:color w:val="EE0000"/>
-        </w:rPr>
-        <w:t>_</w:t>
-      </w:r>
-      <w:proofErr w:type="gramStart"/>
-      <w:r>
-        <w:rPr>
-          <w:color w:val="EE0000"/>
-        </w:rPr>
-        <w:t>garantias</w:t>
-      </w:r>
-      <w:r>
-        <w:rPr>
-          <w:color w:val="EE0000"/>
-        </w:rPr>
-        <w:t>.hipoteca</w:t>
-      </w:r>
-      <w:proofErr w:type="gramEnd"/>
-      <w:r>
-        <w:rPr>
-          <w:color w:val="EE0000"/>
-        </w:rPr>
-        <w:t>_cedular</w:t>
-      </w:r>
-      <w:proofErr w:type="spellEnd"/>
-      <w:r>
-        <w:rPr>
-          <w:color w:val="EE0000"/>
-        </w:rPr>
-        <w:t xml:space="preserve"> %}</w:t>
-      </w:r>
-    </w:p>
-    <w:p>
-      <w:pPr>
-        <w:pStyle w:val="List1"/>
-        <w:numPr>
-          <w:ilvl w:val="1"/>
-          <w:numId w:val="1"/>
-        </w:numPr>
-        <w:spacing w:before="100" w:beforeAutospacing="1" w:after="100" w:afterAutospacing="1"/>
-        <w:ind w:hanging="357"/>
-        <w:contextualSpacing/>
-      </w:pPr>
-      <w:r>
-        <w:t xml:space="preserve">Hipoteca cedular de </w:t>
-      </w:r>
-      <w:r>
-        <w:rPr>
-          <w:color w:val="FF0000"/>
-        </w:rPr>
-        <w:t xml:space="preserve">primeiro </w:t>
-      </w:r>
-      <w:r>
-        <w:t>grau e sem concorrência de terceiros:</w:t>
-      </w:r>
-    </w:p>
-    <w:p>
-      <w:pPr>
-        <w:pStyle w:val="List1"/>
-        <w:numPr>
-          <w:ilvl w:val="2"/>
-          <w:numId w:val="1"/>
-        </w:numPr>
-        <w:spacing w:before="100" w:beforeAutospacing="1" w:after="100" w:afterAutospacing="1"/>
-        <w:ind w:hanging="357"/>
-        <w:contextualSpacing/>
-        <w:rPr>
-          <w:highlight w:val="yellow"/>
-        </w:rPr>
-      </w:pPr>
-      <w:r>
-        <w:rPr>
-          <w:highlight w:val="yellow"/>
-        </w:rPr>
-        <w:t>Imóvel (Fazenda</w:t>
-      </w:r>
-      <w:r>
-        <w:rPr>
-          <w:highlight w:val="yellow"/>
-        </w:rPr>
-        <w:t>, Sítio, Imóvel rural, Imóvel urbano</w:t>
-      </w:r>
-      <w:r>
-        <w:rPr>
-          <w:highlight w:val="yellow"/>
-        </w:rPr>
-        <w:t xml:space="preserve"> </w:t>
-      </w:r>
-      <w:proofErr w:type="spellStart"/>
-      <w:r>
-        <w:rPr>
-          <w:highlight w:val="yellow"/>
-        </w:rPr>
-        <w:t>Xxxxx</w:t>
-      </w:r>
-      <w:proofErr w:type="spellEnd"/>
-      <w:r>
-        <w:rPr>
-          <w:highlight w:val="yellow"/>
-        </w:rPr>
-        <w:t xml:space="preserve">), descrição, área, matrícula nº </w:t>
-      </w:r>
-      <w:proofErr w:type="spellStart"/>
-      <w:r>
-        <w:rPr>
-          <w:highlight w:val="yellow"/>
-        </w:rPr>
-        <w:t>xxxxx</w:t>
-      </w:r>
-      <w:proofErr w:type="spellEnd"/>
-      <w:r>
-        <w:rPr>
-          <w:highlight w:val="yellow"/>
-        </w:rPr>
-        <w:t xml:space="preserve"> – Cartório de Registro de Imóveis de XXXXX - UF (R</w:t>
-      </w:r>
-      <w:proofErr w:type="gramStart"/>
-      <w:r>
-        <w:rPr>
-          <w:highlight w:val="yellow"/>
-        </w:rPr>
-        <w:t>$ )</w:t>
-      </w:r>
-      <w:proofErr w:type="gramEnd"/>
-      <w:r>
-        <w:rPr>
-          <w:highlight w:val="yellow"/>
-        </w:rPr>
-        <w:t>;</w:t>
+        <w:t>}}</w:t>
       </w:r>
     </w:p>
     <w:p>
@@ -5405,6 +5500,53 @@
     <w:p>
       <w:pPr>
         <w:pStyle w:val="List1"/>
+        <w:numPr>
+          <w:ilvl w:val="0"/>
+          <w:numId w:val="0"/>
+        </w:numPr>
+        <w:spacing w:before="0" w:after="60" w:line="240" w:lineRule="auto"/>
+        <w:ind w:left="360"/>
+      </w:pPr>
+      <w:r>
+        <w:rPr>
+          <w:color w:val="EE0000"/>
+        </w:rPr>
+        <w:t xml:space="preserve">{%p </w:t>
+      </w:r>
+      <w:proofErr w:type="spellStart"/>
+      <w:r>
+        <w:rPr>
+          <w:color w:val="EE0000"/>
+        </w:rPr>
+        <w:t>if</w:t>
+      </w:r>
+      <w:proofErr w:type="spellEnd"/>
+      <w:r>
+        <w:rPr>
+          <w:color w:val="EE0000"/>
+        </w:rPr>
+        <w:t xml:space="preserve"> </w:t>
+      </w:r>
+      <w:proofErr w:type="spellStart"/>
+      <w:proofErr w:type="gramStart"/>
+      <w:r>
+        <w:rPr>
+          <w:color w:val="EE0000"/>
+        </w:rPr>
+        <w:t>c.aditivo</w:t>
+      </w:r>
+      <w:proofErr w:type="spellEnd"/>
+      <w:proofErr w:type="gramEnd"/>
+      <w:r>
+        <w:rPr>
+          <w:color w:val="EE0000"/>
+        </w:rPr>
+        <w:t xml:space="preserve"> %}</w:t>
+      </w:r>
+    </w:p>
+    <w:p>
+      <w:pPr>
+        <w:pStyle w:val="List1"/>
         <w:spacing w:before="100" w:beforeAutospacing="1" w:after="100" w:afterAutospacing="1"/>
         <w:ind w:hanging="357"/>
         <w:contextualSpacing/>
@@ -5440,7 +5582,6 @@
         <w:contextualSpacing/>
       </w:pPr>
       <w:r>
-        <w:lastRenderedPageBreak/>
         <w:t xml:space="preserve">Alteração do prazo de vencimento: </w:t>
       </w:r>
     </w:p>
@@ -5469,6 +5610,41 @@
         <w:ind w:left="1080"/>
         <w:contextualSpacing/>
       </w:pPr>
+    </w:p>
+    <w:p>
+      <w:pPr>
+        <w:pStyle w:val="List1"/>
+        <w:numPr>
+          <w:ilvl w:val="0"/>
+          <w:numId w:val="0"/>
+        </w:numPr>
+        <w:spacing w:before="100" w:beforeAutospacing="1" w:after="100" w:afterAutospacing="1"/>
+        <w:ind w:left="720" w:hanging="144"/>
+        <w:contextualSpacing/>
+        <w:rPr>
+          <w:color w:val="EE0000"/>
+        </w:rPr>
+      </w:pPr>
+      <w:r>
+        <w:rPr>
+          <w:color w:val="EE0000"/>
+        </w:rPr>
+        <w:t xml:space="preserve">{%p </w:t>
+      </w:r>
+      <w:proofErr w:type="spellStart"/>
+      <w:r>
+        <w:rPr>
+          <w:color w:val="EE0000"/>
+        </w:rPr>
+        <w:t>endif</w:t>
+      </w:r>
+      <w:proofErr w:type="spellEnd"/>
+      <w:r>
+        <w:rPr>
+          <w:color w:val="EE0000"/>
+        </w:rPr>
+        <w:t xml:space="preserve"> %}</w:t>
+      </w:r>
     </w:p>
     <w:p>
       <w:pPr>
@@ -5948,7 +6124,6 @@
     </w:p>
     <w:p>
       <w:r>
-        <w:lastRenderedPageBreak/>
         <w:t xml:space="preserve">Ocorre que a cláusula “Forma de Pagamento” estabelece que a operação, a ser paga em </w:t>
       </w:r>
       <w:proofErr w:type="spellStart"/>
@@ -6487,8 +6662,11 @@
     </w:p>
     <w:p>
       <w:r>
+        <w:t xml:space="preserve">Nesse sentido, ante a falta de expressa e clara pactuação sobre os pagamentos que deveriam ser realizados no período de carência, compreende-se que, na verdade, a operação não </w:t>
+      </w:r>
+      <w:r>
         <w:lastRenderedPageBreak/>
-        <w:t xml:space="preserve">Nesse sentido, ante a falta de expressa e clara pactuação sobre os pagamentos que deveriam ser realizados no período de carência, compreende-se que, na verdade, a operação não estava em mora, não existindo razões para o vencimento antecipado e, sequer, para a propositura de </w:t>
+        <w:t xml:space="preserve">estava em mora, não existindo razões para o vencimento antecipado e, sequer, para a propositura de </w:t>
       </w:r>
       <w:r>
         <w:rPr>
@@ -6774,7 +6952,6 @@
         <w:rPr>
           <w:color w:val="EE0000"/>
         </w:rPr>
-        <w:lastRenderedPageBreak/>
         <w:t xml:space="preserve">[[BLOCK </w:t>
       </w:r>
       <w:proofErr w:type="spellStart"/>
@@ -6802,6 +6979,7 @@
       </w:pPr>
       <w:bookmarkStart w:id="17" w:name="_Toc227827912"/>
       <w:r>
+        <w:lastRenderedPageBreak/>
         <w:t>Encadeamento das operações [Renegociação de crédito rural]</w:t>
       </w:r>
       <w:bookmarkEnd w:id="17"/>
@@ -7032,15 +7210,15 @@
         <w:pStyle w:val="Citaodireta"/>
       </w:pPr>
       <w:r>
+        <w:t>Súmula 286 STJ – “A renegociação de contrato bancário ou a confissão da dívida não impede a possibilidade de discussão sobre eventuais ilegalidades dos contratos anteriores”</w:t>
+      </w:r>
+      <w:r>
+        <w:t>.</w:t>
+      </w:r>
+    </w:p>
+    <w:p>
+      <w:r>
         <w:lastRenderedPageBreak/>
-        <w:t>Súmula 286 STJ – “A renegociação de contrato bancário ou a confissão da dívida não impede a possibilidade de discussão sobre eventuais ilegalidades dos contratos anteriores”</w:t>
-      </w:r>
-      <w:r>
-        <w:t>.</w:t>
-      </w:r>
-    </w:p>
-    <w:p>
-      <w:r>
         <w:t xml:space="preserve">A existência de renegociação e a ligação lógica entre as operações é fato incontroverso. A tomada de novo crédito, através de contrato de empréstimo, à medida que busque a quitação de débitos anteriores, embora </w:t>
       </w:r>
       <w:r>
@@ -7105,11 +7283,11 @@
         <w:t>VIABILIDADE DE REVISÃO JUDICIAL EM SEDE DE EMBARGOS À EXECUÇÃO NOS CASOS DE ABUSIVIDADE OU ILEGALIDADE, SEM IMPORTAR EM OFENSA À BOA-FÉ OBJETIVA OU AO ATO JURÍDICO PERFEITO. POSSIBILIDADE, ADEMAIS, DE REVISÃO DOS CONTRATOS ANTERIORES. EMPRÉSTIMO REALIZADO PARA FINANCIAMENTO DE DÍVIDAS. OCORRÊNCIA DE ENCADEAMENTO CONTRATUAL E OPERAÇÕES MATA-MATA. SÚMULA 286 DO SUPERIOR TRIBUNAL DE JUSTIÇA</w:t>
       </w:r>
       <w:r>
-        <w:t xml:space="preserve">. CAPITALIZAÇÃO DE JUROS. POSSIBILIDADE DE COBRANÇA, DESDE QUE HAJA EXPRESSA PREVISÃO PARA TANTO. PRÁTICA PERMITIDA EXCLUSIVAMENTE NOS CONTRATOS EXIBIDOS, QUE PREVIRAM EXPRESSAMENTE A CAPITALIZAÇÃO. JUROS </w:t>
+        <w:t xml:space="preserve">. CAPITALIZAÇÃO DE JUROS. POSSIBILIDADE DE COBRANÇA, DESDE QUE HAJA EXPRESSA PREVISÃO PARA TANTO. PRÁTICA PERMITIDA EXCLUSIVAMENTE NOS CONTRATOS EXIBIDOS, QUE PREVIRAM EXPRESSAMENTE A CAPITALIZAÇÃO. JUROS REMUNERATÓRIOS. LIMITAÇÃO À TAXA MÉDIA DE MERCADO, ANTE A NÃO APRESENTAÇÃO DOS INSTRUMENTOS. MANUTENÇÃO DOS JUROS PACTUADOS EM RELAÇÃO AOS CONTRATOS ACOSTADOS, ANTE A INEXISTÊNCIA DE ABUSIVIDADE. REPETIÇÃO DO INDÉBITO. </w:t>
       </w:r>
       <w:r>
         <w:lastRenderedPageBreak/>
-        <w:t>REMUNERATÓRIOS. LIMITAÇÃO À TAXA MÉDIA DE MERCADO, ANTE A NÃO APRESENTAÇÃO DOS INSTRUMENTOS. MANUTENÇÃO DOS JUROS PACTUADOS EM RELAÇÃO AOS CONTRATOS ACOSTADOS, ANTE A INEXISTÊNCIA DE ABUSIVIDADE. REPETIÇÃO DO INDÉBITO. POSSIBILIDADE NA FORMA SIMPLES, PERMITIDA A COMPENSAÇÃO ENTRE CRÉDITOS E DÉBITOS. IOF. VALOR COBRADO EM EXCESSO. NECESSIDADE DE RECÁLCULO EM RAZÃO DA ALTERAÇÃO DA BASE DE CÁLCULO DESCARACTERIZAÇÃO DA MORA. VIABILIDADE IN CASU. RECURSO ESPECIAL REPRESENTATIVO DE CONTROVÉRSIA Nº 1.061.530/RS. ÔNUS SUCUMBENCIAL. READEQUAÇÃO. HONORÁRIOS ADVOCATÍCIOS. MAJORAÇÃO. SENTENÇA PARCIALMENTE ANULADA E PARCIALMENTE REFORMADA. RECURSOS CONHECIDOS E PARCIALMENTE PROVIDOS.</w:t>
+        <w:t>POSSIBILIDADE NA FORMA SIMPLES, PERMITIDA A COMPENSAÇÃO ENTRE CRÉDITOS E DÉBITOS. IOF. VALOR COBRADO EM EXCESSO. NECESSIDADE DE RECÁLCULO EM RAZÃO DA ALTERAÇÃO DA BASE DE CÁLCULO DESCARACTERIZAÇÃO DA MORA. VIABILIDADE IN CASU. RECURSO ESPECIAL REPRESENTATIVO DE CONTROVÉRSIA Nº 1.061.530/RS. ÔNUS SUCUMBENCIAL. READEQUAÇÃO. HONORÁRIOS ADVOCATÍCIOS. MAJORAÇÃO. SENTENÇA PARCIALMENTE ANULADA E PARCIALMENTE REFORMADA. RECURSOS CONHECIDOS E PARCIALMENTE PROVIDOS.</w:t>
       </w:r>
     </w:p>
     <w:p>
@@ -41376,7 +41554,7 @@
           <w:noProof/>
           <w:szCs w:val="23"/>
         </w:rPr>
-        <w:t>10 de junho de 2026</w:t>
+        <w:t>24 de junho de 2026</w:t>
       </w:r>
       <w:r>
         <w:rPr>
@@ -48991,7 +49169,6 @@
   <w:style w:type="character" w:default="1" w:styleId="Fontepargpadro">
     <w:name w:val="Default Paragraph Font"/>
     <w:uiPriority w:val="1"/>
-    <w:semiHidden/>
     <w:unhideWhenUsed/>
   </w:style>
   <w:style w:type="table" w:default="1" w:styleId="Tabelanormal">
@@ -50853,6 +51030,64 @@
         </w:p>
       </w:docPartBody>
     </w:docPart>
+    <w:docPart>
+      <w:docPartPr>
+        <w:name w:val="120CB71C57204D75A5F61A29EA290ACA"/>
+        <w:category>
+          <w:name w:val="Geral"/>
+          <w:gallery w:val="placeholder"/>
+        </w:category>
+        <w:types>
+          <w:type w:val="bbPlcHdr"/>
+        </w:types>
+        <w:behaviors>
+          <w:behavior w:val="content"/>
+        </w:behaviors>
+        <w:guid w:val="{67197A59-E470-4D3B-8553-5DFD165ACA37}"/>
+      </w:docPartPr>
+      <w:docPartBody>
+        <w:p>
+          <w:pPr>
+            <w:pStyle w:val="120CB71C57204D75A5F61A29EA290ACA"/>
+          </w:pPr>
+          <w:r>
+            <w:rPr>
+              <w:rStyle w:val="TextodoEspaoReservado"/>
+            </w:rPr>
+            <w:t>XXXXX</w:t>
+          </w:r>
+        </w:p>
+      </w:docPartBody>
+    </w:docPart>
+    <w:docPart>
+      <w:docPartPr>
+        <w:name w:val="7E49BA581B714D46AA0DB7A918C164B6"/>
+        <w:category>
+          <w:name w:val="Geral"/>
+          <w:gallery w:val="placeholder"/>
+        </w:category>
+        <w:types>
+          <w:type w:val="bbPlcHdr"/>
+        </w:types>
+        <w:behaviors>
+          <w:behavior w:val="content"/>
+        </w:behaviors>
+        <w:guid w:val="{DFA39A5A-33BA-4F63-81F1-176DBDA96930}"/>
+      </w:docPartPr>
+      <w:docPartBody>
+        <w:p>
+          <w:pPr>
+            <w:pStyle w:val="7E49BA581B714D46AA0DB7A918C164B6"/>
+          </w:pPr>
+          <w:r>
+            <w:rPr>
+              <w:rStyle w:val="TextodoEspaoReservado"/>
+            </w:rPr>
+            <w:t>XXXXX</w:t>
+          </w:r>
+        </w:p>
+      </w:docPartBody>
+    </w:docPart>
   </w:docParts>
 </w:glossaryDocument>
 </file>
@@ -51003,6 +51238,7 @@
   </w:compat>
   <w:rsids>
     <w:rsidRoot w:val="00B36FF5"/>
+    <w:rsid w:val="00007117"/>
     <w:rsid w:val="00011554"/>
     <w:rsid w:val="00027B7C"/>
     <w:rsid w:val="0003011A"/>
@@ -51010,6 +51246,7 @@
     <w:rsid w:val="00055533"/>
     <w:rsid w:val="0005556E"/>
     <w:rsid w:val="00064438"/>
+    <w:rsid w:val="000756B4"/>
     <w:rsid w:val="00091D1C"/>
     <w:rsid w:val="000A37B7"/>
     <w:rsid w:val="000A3E87"/>
@@ -51025,9 +51262,11 @@
     <w:rsid w:val="001265C4"/>
     <w:rsid w:val="001358A9"/>
     <w:rsid w:val="0015690A"/>
+    <w:rsid w:val="00163744"/>
     <w:rsid w:val="00172CD0"/>
     <w:rsid w:val="00180382"/>
     <w:rsid w:val="001808B4"/>
+    <w:rsid w:val="0018380A"/>
     <w:rsid w:val="00193ADC"/>
     <w:rsid w:val="001E339C"/>
     <w:rsid w:val="001E4240"/>
@@ -51051,6 +51290,7 @@
     <w:rsid w:val="0030396C"/>
     <w:rsid w:val="003206FE"/>
     <w:rsid w:val="003211EC"/>
+    <w:rsid w:val="00322F07"/>
     <w:rsid w:val="00327C86"/>
     <w:rsid w:val="003311E4"/>
     <w:rsid w:val="00333CE9"/>
@@ -51187,6 +51427,7 @@
     <w:rsid w:val="00AD36EC"/>
     <w:rsid w:val="00AD44CA"/>
     <w:rsid w:val="00AF3380"/>
+    <w:rsid w:val="00AF4411"/>
     <w:rsid w:val="00AF5CAB"/>
     <w:rsid w:val="00B24BAB"/>
     <w:rsid w:val="00B36FF5"/>
@@ -51245,6 +51486,7 @@
     <w:rsid w:val="00DD1BAE"/>
     <w:rsid w:val="00DD32DC"/>
     <w:rsid w:val="00DD5B20"/>
+    <w:rsid w:val="00DE3849"/>
     <w:rsid w:val="00DF76B0"/>
     <w:rsid w:val="00E06755"/>
     <w:rsid w:val="00E150B7"/>
@@ -51263,6 +51505,7 @@
     <w:rsid w:val="00EF1701"/>
     <w:rsid w:val="00EF3C19"/>
     <w:rsid w:val="00F048F4"/>
+    <w:rsid w:val="00F115C5"/>
     <w:rsid w:val="00F15E56"/>
     <w:rsid w:val="00F22AA7"/>
     <w:rsid w:val="00F237CB"/>
@@ -51729,7 +51972,7 @@
     <w:name w:val="Placeholder Text"/>
     <w:basedOn w:val="Fontepargpadro"/>
     <w:uiPriority w:val="99"/>
-    <w:rsid w:val="00E83E72"/>
+    <w:rsid w:val="00007117"/>
     <w:rPr>
       <w:color w:val="808080"/>
     </w:rPr>
@@ -51898,6 +52141,32 @@
   <w:style w:type="paragraph" w:customStyle="1" w:styleId="DFF6E68E360749EEAC734F36DE20BCDA">
     <w:name w:val="DFF6E68E360749EEAC734F36DE20BCDA"/>
     <w:rsid w:val="00E83E72"/>
+    <w:pPr>
+      <w:spacing w:line="278" w:lineRule="auto"/>
+    </w:pPr>
+    <w:rPr>
+      <w:kern w:val="2"/>
+      <w:sz w:val="24"/>
+      <w:szCs w:val="24"/>
+      <w14:ligatures w14:val="standardContextual"/>
+    </w:rPr>
+  </w:style>
+  <w:style w:type="paragraph" w:customStyle="1" w:styleId="120CB71C57204D75A5F61A29EA290ACA">
+    <w:name w:val="120CB71C57204D75A5F61A29EA290ACA"/>
+    <w:rsid w:val="00007117"/>
+    <w:pPr>
+      <w:spacing w:line="278" w:lineRule="auto"/>
+    </w:pPr>
+    <w:rPr>
+      <w:kern w:val="2"/>
+      <w:sz w:val="24"/>
+      <w:szCs w:val="24"/>
+      <w14:ligatures w14:val="standardContextual"/>
+    </w:rPr>
+  </w:style>
+  <w:style w:type="paragraph" w:customStyle="1" w:styleId="7E49BA581B714D46AA0DB7A918C164B6">
+    <w:name w:val="7E49BA581B714D46AA0DB7A918C164B6"/>
+    <w:rsid w:val="00007117"/>
     <w:pPr>
       <w:spacing w:line="278" w:lineRule="auto"/>
     </w:pPr>

</xml_diff>

<commit_message>
ajustes nos preenchimentos de laudos
</commit_message>
<xml_diff>
--- a/laudo/templates/laudo_completo.docx
+++ b/laudo/templates/laudo_completo.docx
@@ -3289,42 +3289,24 @@
           <w:highlight w:val="green"/>
           <w:lang w:eastAsia="pt-BR"/>
         </w:rPr>
-        <w:t>agente_continuidade|frase_</w:t>
-      </w:r>
-      <w:proofErr w:type="gramStart"/>
+        <w:t>agente_continuidade|frase_maiuscula</w:t>
+      </w:r>
+      <w:proofErr w:type="spellEnd"/>
       <w:r>
         <w:rPr>
           <w:rFonts w:eastAsia="Times New Roman"/>
           <w:highlight w:val="green"/>
           <w:lang w:eastAsia="pt-BR"/>
         </w:rPr>
-        <w:t>maiuscula</w:t>
-      </w:r>
-      <w:proofErr w:type="spellEnd"/>
+        <w:t xml:space="preserve"> </w:t>
+      </w:r>
       <w:r>
         <w:rPr>
           <w:rFonts w:eastAsia="Times New Roman"/>
           <w:highlight w:val="green"/>
           <w:lang w:eastAsia="pt-BR"/>
         </w:rPr>
-        <w:t xml:space="preserve"> </w:t>
-      </w:r>
-      <w:r>
-        <w:rPr>
-          <w:rFonts w:eastAsia="Times New Roman"/>
-          <w:highlight w:val="green"/>
-          <w:lang w:eastAsia="pt-BR"/>
-        </w:rPr>
-        <w:t>}</w:t>
-      </w:r>
-      <w:proofErr w:type="gramEnd"/>
-      <w:r>
-        <w:rPr>
-          <w:rFonts w:eastAsia="Times New Roman"/>
-          <w:highlight w:val="green"/>
-          <w:lang w:eastAsia="pt-BR"/>
-        </w:rPr>
-        <w:t>}</w:t>
+        <w:t>}}</w:t>
       </w:r>
     </w:p>
     <w:p>
@@ -3371,7 +3353,6 @@
         <w:t>{{</w:t>
       </w:r>
       <w:proofErr w:type="spellStart"/>
-      <w:proofErr w:type="gramStart"/>
       <w:r>
         <w:rPr>
           <w:highlight w:val="green"/>
@@ -3385,7 +3366,6 @@
         <w:t>instrumento</w:t>
       </w:r>
       <w:proofErr w:type="spellEnd"/>
-      <w:proofErr w:type="gramEnd"/>
       <w:r>
         <w:rPr>
           <w:highlight w:val="green"/>
@@ -3402,7 +3382,6 @@
         <w:t>{{</w:t>
       </w:r>
       <w:proofErr w:type="spellStart"/>
-      <w:proofErr w:type="gramStart"/>
       <w:r>
         <w:rPr>
           <w:highlight w:val="green"/>
@@ -3410,7 +3389,6 @@
         <w:t>c.contrato</w:t>
       </w:r>
       <w:proofErr w:type="spellEnd"/>
-      <w:proofErr w:type="gramEnd"/>
       <w:r>
         <w:rPr>
           <w:highlight w:val="green"/>
@@ -3444,19 +3422,11 @@
         <w:t>{{</w:t>
       </w:r>
       <w:proofErr w:type="spellStart"/>
-      <w:proofErr w:type="gramStart"/>
       <w:r>
         <w:rPr>
           <w:highlight w:val="green"/>
         </w:rPr>
-        <w:t>c.valor</w:t>
-      </w:r>
-      <w:proofErr w:type="gramEnd"/>
-      <w:r>
-        <w:rPr>
-          <w:highlight w:val="green"/>
-        </w:rPr>
-        <w:t>_liberado</w:t>
+        <w:t>c.valor_liberado</w:t>
       </w:r>
       <w:proofErr w:type="spellEnd"/>
       <w:r>
@@ -3509,7 +3479,6 @@
             <w:t>{{</w:t>
           </w:r>
           <w:proofErr w:type="spellStart"/>
-          <w:proofErr w:type="gramStart"/>
           <w:r>
             <w:rPr>
               <w:bCs/>
@@ -3517,7 +3486,6 @@
             </w:rPr>
             <w:t>c.juros</w:t>
           </w:r>
-          <w:proofErr w:type="gramEnd"/>
           <w:r>
             <w:rPr>
               <w:bCs/>
@@ -3617,7 +3585,6 @@
           <w:bCs/>
         </w:rPr>
       </w:pPr>
-      <w:proofErr w:type="gramStart"/>
       <w:r>
         <w:rPr>
           <w:b/>
@@ -3633,25 +3600,25 @@
           <w:bCs/>
           <w:highlight w:val="green"/>
         </w:rPr>
-        <w:t>item</w:t>
-      </w:r>
-      <w:proofErr w:type="gramEnd"/>
+        <w:t>item.nome</w:t>
+      </w:r>
+      <w:proofErr w:type="spellEnd"/>
       <w:r>
         <w:rPr>
           <w:b/>
           <w:bCs/>
           <w:highlight w:val="green"/>
         </w:rPr>
-        <w:t>.</w:t>
-      </w:r>
-      <w:proofErr w:type="gramStart"/>
+        <w:t xml:space="preserve"> }}: R$ {{ </w:t>
+      </w:r>
+      <w:proofErr w:type="spellStart"/>
       <w:r>
         <w:rPr>
           <w:b/>
           <w:bCs/>
           <w:highlight w:val="green"/>
         </w:rPr>
-        <w:t>nome</w:t>
+        <w:t>item.valor</w:t>
       </w:r>
       <w:proofErr w:type="spellEnd"/>
       <w:r>
@@ -3660,70 +3627,7 @@
           <w:bCs/>
           <w:highlight w:val="green"/>
         </w:rPr>
-        <w:t xml:space="preserve"> }}:</w:t>
-      </w:r>
-      <w:proofErr w:type="gramEnd"/>
-      <w:r>
-        <w:rPr>
-          <w:b/>
-          <w:bCs/>
-          <w:highlight w:val="green"/>
-        </w:rPr>
-        <w:t xml:space="preserve"> R$ </w:t>
-      </w:r>
-      <w:proofErr w:type="gramStart"/>
-      <w:r>
-        <w:rPr>
-          <w:b/>
-          <w:bCs/>
-          <w:highlight w:val="green"/>
-        </w:rPr>
-        <w:t xml:space="preserve">{{ </w:t>
-      </w:r>
-      <w:proofErr w:type="spellStart"/>
-      <w:r>
-        <w:rPr>
-          <w:b/>
-          <w:bCs/>
-          <w:highlight w:val="green"/>
-        </w:rPr>
-        <w:t>item</w:t>
-      </w:r>
-      <w:proofErr w:type="gramEnd"/>
-      <w:r>
-        <w:rPr>
-          <w:b/>
-          <w:bCs/>
-          <w:highlight w:val="green"/>
-        </w:rPr>
-        <w:t>.</w:t>
-      </w:r>
-      <w:proofErr w:type="gramStart"/>
-      <w:r>
-        <w:rPr>
-          <w:b/>
-          <w:bCs/>
-          <w:highlight w:val="green"/>
-        </w:rPr>
-        <w:t>valor</w:t>
-      </w:r>
-      <w:proofErr w:type="spellEnd"/>
-      <w:r>
-        <w:rPr>
-          <w:b/>
-          <w:bCs/>
-          <w:highlight w:val="green"/>
-        </w:rPr>
-        <w:t xml:space="preserve"> }</w:t>
-      </w:r>
-      <w:proofErr w:type="gramEnd"/>
-      <w:r>
-        <w:rPr>
-          <w:b/>
-          <w:bCs/>
-          <w:highlight w:val="green"/>
-        </w:rPr>
-        <w:t>}</w:t>
+        <w:t xml:space="preserve"> }}</w:t>
       </w:r>
     </w:p>
     <w:p>
@@ -3794,19 +3698,11 @@
         <w:t>{{</w:t>
       </w:r>
       <w:proofErr w:type="spellStart"/>
-      <w:proofErr w:type="gramStart"/>
       <w:r>
         <w:rPr>
           <w:highlight w:val="green"/>
         </w:rPr>
-        <w:t>c.valor</w:t>
-      </w:r>
-      <w:proofErr w:type="gramEnd"/>
-      <w:r>
-        <w:rPr>
-          <w:highlight w:val="green"/>
-        </w:rPr>
-        <w:t>_parcela</w:t>
+        <w:t>c.valor_parcela</w:t>
       </w:r>
       <w:proofErr w:type="spellEnd"/>
       <w:r>
@@ -3856,19 +3752,11 @@
             <w:t>{{</w:t>
           </w:r>
           <w:proofErr w:type="spellStart"/>
-          <w:proofErr w:type="gramStart"/>
           <w:r>
             <w:rPr>
               <w:highlight w:val="green"/>
             </w:rPr>
-            <w:t>c.numero</w:t>
-          </w:r>
-          <w:proofErr w:type="gramEnd"/>
-          <w:r>
-            <w:rPr>
-              <w:highlight w:val="green"/>
-            </w:rPr>
-            <w:t>_parcela</w:t>
+            <w:t>c.numero_parcela</w:t>
           </w:r>
           <w:proofErr w:type="spellEnd"/>
           <w:r>
@@ -3926,7 +3814,6 @@
         <w:t xml:space="preserve"> </w:t>
       </w:r>
       <w:proofErr w:type="spellStart"/>
-      <w:proofErr w:type="gramStart"/>
       <w:r>
         <w:rPr>
           <w:color w:val="EE0000"/>
@@ -3940,7 +3827,6 @@
         <w:t>periodo</w:t>
       </w:r>
       <w:proofErr w:type="spellEnd"/>
-      <w:proofErr w:type="gramEnd"/>
       <w:r>
         <w:rPr>
           <w:color w:val="EE0000"/>
@@ -4561,7 +4447,6 @@
         <w:t xml:space="preserve"> </w:t>
       </w:r>
       <w:proofErr w:type="spellStart"/>
-      <w:proofErr w:type="gramStart"/>
       <w:r>
         <w:rPr>
           <w:color w:val="EE0000"/>
@@ -4572,30 +4457,15 @@
         <w:rPr>
           <w:color w:val="EE0000"/>
         </w:rPr>
-        <w:t>opcoes</w:t>
-      </w:r>
-      <w:proofErr w:type="gramEnd"/>
+        <w:t>opcoes_garantias</w:t>
+      </w:r>
       <w:r>
         <w:rPr>
           <w:color w:val="EE0000"/>
         </w:rPr>
-        <w:t>_</w:t>
-      </w:r>
-      <w:proofErr w:type="gramStart"/>
-      <w:r>
-        <w:rPr>
-          <w:color w:val="EE0000"/>
-        </w:rPr>
-        <w:t>garantias</w:t>
-      </w:r>
-      <w:r>
-        <w:rPr>
-          <w:color w:val="EE0000"/>
-        </w:rPr>
         <w:t>.aval</w:t>
       </w:r>
       <w:proofErr w:type="spellEnd"/>
-      <w:proofErr w:type="gramEnd"/>
       <w:r>
         <w:rPr>
           <w:color w:val="EE0000"/>
@@ -4639,7 +4509,6 @@
         <w:t xml:space="preserve">{%p for avalista in </w:t>
       </w:r>
       <w:proofErr w:type="spellStart"/>
-      <w:proofErr w:type="gramStart"/>
       <w:r>
         <w:rPr>
           <w:color w:val="EE0000"/>
@@ -4650,30 +4519,9 @@
         <w:rPr>
           <w:color w:val="EE0000"/>
         </w:rPr>
-        <w:t>garantias</w:t>
-      </w:r>
-      <w:proofErr w:type="gramEnd"/>
-      <w:r>
-        <w:rPr>
-          <w:color w:val="EE0000"/>
-        </w:rPr>
-        <w:t>_</w:t>
-      </w:r>
-      <w:proofErr w:type="gramStart"/>
-      <w:r>
-        <w:rPr>
-          <w:color w:val="EE0000"/>
-        </w:rPr>
-        <w:t>aval</w:t>
-      </w:r>
-      <w:r>
-        <w:rPr>
-          <w:color w:val="EE0000"/>
-        </w:rPr>
-        <w:t>.aval</w:t>
+        <w:t>garantias_aval</w:t>
       </w:r>
       <w:proofErr w:type="spellEnd"/>
-      <w:proofErr w:type="gramEnd"/>
       <w:r>
         <w:rPr>
           <w:color w:val="EE0000"/>
@@ -4702,7 +4550,6 @@
         <w:t>{{</w:t>
       </w:r>
       <w:proofErr w:type="spellStart"/>
-      <w:proofErr w:type="gramStart"/>
       <w:r>
         <w:rPr>
           <w:color w:val="EE0000"/>
@@ -4710,7 +4557,6 @@
         <w:t>avalista.nome</w:t>
       </w:r>
       <w:proofErr w:type="spellEnd"/>
-      <w:proofErr w:type="gramEnd"/>
       <w:r>
         <w:rPr>
           <w:color w:val="EE0000"/>
@@ -4718,7 +4564,6 @@
         <w:t>}}, CPF: {{</w:t>
       </w:r>
       <w:proofErr w:type="spellStart"/>
-      <w:proofErr w:type="gramStart"/>
       <w:r>
         <w:rPr>
           <w:color w:val="EE0000"/>
@@ -4726,7 +4571,6 @@
         <w:t>avalista.documento</w:t>
       </w:r>
       <w:proofErr w:type="spellEnd"/>
-      <w:proofErr w:type="gramEnd"/>
       <w:r>
         <w:rPr>
           <w:color w:val="EE0000"/>
@@ -4851,7 +4695,6 @@
         <w:t xml:space="preserve"> </w:t>
       </w:r>
       <w:proofErr w:type="spellStart"/>
-      <w:proofErr w:type="gramStart"/>
       <w:r>
         <w:rPr>
           <w:color w:val="EE0000"/>
@@ -4868,34 +4711,13 @@
         <w:rPr>
           <w:color w:val="EE0000"/>
         </w:rPr>
-        <w:t>opcoes</w:t>
-      </w:r>
-      <w:proofErr w:type="gramEnd"/>
+        <w:t>opcoes_garantias</w:t>
+      </w:r>
       <w:r>
         <w:rPr>
           <w:color w:val="EE0000"/>
         </w:rPr>
-        <w:t>_</w:t>
-      </w:r>
-      <w:proofErr w:type="gramStart"/>
-      <w:r>
-        <w:rPr>
-          <w:color w:val="EE0000"/>
-        </w:rPr>
-        <w:t>garantias</w:t>
-      </w:r>
-      <w:r>
-        <w:rPr>
-          <w:color w:val="EE0000"/>
-        </w:rPr>
-        <w:t>.penhor</w:t>
-      </w:r>
-      <w:proofErr w:type="gramEnd"/>
-      <w:r>
-        <w:rPr>
-          <w:color w:val="EE0000"/>
-        </w:rPr>
-        <w:t>_cedular</w:t>
+        <w:t>.penhor_cedular</w:t>
       </w:r>
       <w:proofErr w:type="spellEnd"/>
       <w:r>
@@ -4956,7 +4778,6 @@
         <w:t>{{</w:t>
       </w:r>
       <w:proofErr w:type="spellStart"/>
-      <w:proofErr w:type="gramStart"/>
       <w:r>
         <w:rPr>
           <w:color w:val="EE0000"/>
@@ -4967,36 +4788,15 @@
         <w:rPr>
           <w:color w:val="EE0000"/>
         </w:rPr>
-        <w:t>garantias</w:t>
-      </w:r>
-      <w:proofErr w:type="gramEnd"/>
+        <w:t>garantias_penhor</w:t>
+      </w:r>
+      <w:proofErr w:type="spellEnd"/>
       <w:r>
         <w:rPr>
           <w:color w:val="EE0000"/>
         </w:rPr>
-        <w:t>_</w:t>
-      </w:r>
-      <w:proofErr w:type="gramStart"/>
-      <w:r>
-        <w:rPr>
-          <w:color w:val="EE0000"/>
-        </w:rPr>
-        <w:t>penhor</w:t>
-      </w:r>
-      <w:r>
-        <w:rPr>
-          <w:color w:val="EE0000"/>
-        </w:rPr>
-        <w:t>.penhor</w:t>
-      </w:r>
-      <w:proofErr w:type="gramEnd"/>
-      <w:r>
-        <w:rPr>
-          <w:color w:val="EE0000"/>
-        </w:rPr>
-        <w:t>_cedular</w:t>
-      </w:r>
-      <w:proofErr w:type="spellEnd"/>
+        <w:t xml:space="preserve"> </w:t>
+      </w:r>
       <w:r>
         <w:rPr>
           <w:color w:val="EE0000"/>
@@ -5082,7 +4882,6 @@
         <w:t xml:space="preserve"> </w:t>
       </w:r>
       <w:proofErr w:type="spellStart"/>
-      <w:proofErr w:type="gramStart"/>
       <w:r>
         <w:rPr>
           <w:color w:val="EE0000"/>
@@ -5093,34 +4892,13 @@
         <w:rPr>
           <w:color w:val="EE0000"/>
         </w:rPr>
-        <w:t>opcoes</w:t>
-      </w:r>
-      <w:proofErr w:type="gramEnd"/>
+        <w:t>opcoes_garantias</w:t>
+      </w:r>
       <w:r>
         <w:rPr>
           <w:color w:val="EE0000"/>
         </w:rPr>
-        <w:t>_</w:t>
-      </w:r>
-      <w:proofErr w:type="gramStart"/>
-      <w:r>
-        <w:rPr>
-          <w:color w:val="EE0000"/>
-        </w:rPr>
-        <w:t>garantias</w:t>
-      </w:r>
-      <w:r>
-        <w:rPr>
-          <w:color w:val="EE0000"/>
-        </w:rPr>
-        <w:t>.hipoteca</w:t>
-      </w:r>
-      <w:proofErr w:type="gramEnd"/>
-      <w:r>
-        <w:rPr>
-          <w:color w:val="EE0000"/>
-        </w:rPr>
-        <w:t>_cedular</w:t>
+        <w:t>.hipoteca_cedular</w:t>
       </w:r>
       <w:proofErr w:type="spellEnd"/>
       <w:r>
@@ -5168,7 +4946,6 @@
           <w:color w:val="EE0000"/>
         </w:rPr>
       </w:pPr>
-      <w:proofErr w:type="gramStart"/>
       <w:r>
         <w:rPr>
           <w:color w:val="EE0000"/>
@@ -5180,40 +4957,13 @@
         <w:rPr>
           <w:color w:val="EE0000"/>
         </w:rPr>
-        <w:t>c</w:t>
-      </w:r>
-      <w:proofErr w:type="gramEnd"/>
+        <w:t>c.</w:t>
+      </w:r>
       <w:r>
         <w:rPr>
           <w:color w:val="EE0000"/>
         </w:rPr>
-        <w:t>.</w:t>
-      </w:r>
-      <w:r>
-        <w:rPr>
-          <w:color w:val="EE0000"/>
-        </w:rPr>
-        <w:t>garantias_</w:t>
-      </w:r>
-      <w:proofErr w:type="gramStart"/>
-      <w:r>
-        <w:rPr>
-          <w:color w:val="EE0000"/>
-        </w:rPr>
-        <w:t>penhor</w:t>
-      </w:r>
-      <w:r>
-        <w:rPr>
-          <w:color w:val="EE0000"/>
-        </w:rPr>
-        <w:t>.hipoteca</w:t>
-      </w:r>
-      <w:proofErr w:type="gramEnd"/>
-      <w:r>
-        <w:rPr>
-          <w:color w:val="EE0000"/>
-        </w:rPr>
-        <w:t>_cedular</w:t>
+        <w:t>garantias_hipoteca</w:t>
       </w:r>
       <w:proofErr w:type="spellEnd"/>
       <w:r>
@@ -5309,23 +5059,13 @@
         <w:t xml:space="preserve">{%p for item in </w:t>
       </w:r>
       <w:proofErr w:type="spellStart"/>
-      <w:proofErr w:type="gramStart"/>
       <w:r>
         <w:rPr>
           <w:bCs/>
           <w:color w:val="EE0000"/>
           <w:highlight w:val="yellow"/>
         </w:rPr>
-        <w:t>c.opcoes</w:t>
-      </w:r>
-      <w:proofErr w:type="gramEnd"/>
-      <w:r>
-        <w:rPr>
-          <w:bCs/>
-          <w:color w:val="EE0000"/>
-          <w:highlight w:val="yellow"/>
-        </w:rPr>
-        <w:t>_inadimplento</w:t>
+        <w:t>c.opcoes_inadimplento</w:t>
       </w:r>
       <w:proofErr w:type="spellEnd"/>
       <w:r>
@@ -5349,7 +5089,6 @@
           <w:bCs/>
         </w:rPr>
       </w:pPr>
-      <w:proofErr w:type="gramStart"/>
       <w:r>
         <w:rPr>
           <w:b/>
@@ -5365,43 +5104,16 @@
           <w:bCs/>
           <w:highlight w:val="green"/>
         </w:rPr>
-        <w:t>item</w:t>
-      </w:r>
-      <w:proofErr w:type="gramEnd"/>
+        <w:t>item.nome</w:t>
+      </w:r>
+      <w:proofErr w:type="spellEnd"/>
       <w:r>
         <w:rPr>
           <w:b/>
           <w:bCs/>
           <w:highlight w:val="green"/>
         </w:rPr>
-        <w:t>.</w:t>
-      </w:r>
-      <w:proofErr w:type="gramStart"/>
-      <w:r>
-        <w:rPr>
-          <w:b/>
-          <w:bCs/>
-          <w:highlight w:val="green"/>
-        </w:rPr>
-        <w:t>nome</w:t>
-      </w:r>
-      <w:proofErr w:type="spellEnd"/>
-      <w:r>
-        <w:rPr>
-          <w:b/>
-          <w:bCs/>
-          <w:highlight w:val="green"/>
-        </w:rPr>
-        <w:t xml:space="preserve"> }</w:t>
-      </w:r>
-      <w:proofErr w:type="gramEnd"/>
-      <w:r>
-        <w:rPr>
-          <w:b/>
-          <w:bCs/>
-          <w:highlight w:val="green"/>
-        </w:rPr>
-        <w:t>}</w:t>
+        <w:t xml:space="preserve"> }}</w:t>
       </w:r>
     </w:p>
     <w:p>
@@ -5469,7 +5181,6 @@
         <w:t>{{</w:t>
       </w:r>
       <w:proofErr w:type="spellStart"/>
-      <w:proofErr w:type="gramStart"/>
       <w:r>
         <w:rPr>
           <w:color w:val="EE0000"/>
@@ -5480,14 +5191,7 @@
         <w:rPr>
           <w:color w:val="EE0000"/>
         </w:rPr>
-        <w:t>finalidade</w:t>
-      </w:r>
-      <w:proofErr w:type="gramEnd"/>
-      <w:r>
-        <w:rPr>
-          <w:color w:val="EE0000"/>
-        </w:rPr>
-        <w:t>_op</w:t>
+        <w:t>finalidade_op</w:t>
       </w:r>
       <w:proofErr w:type="spellEnd"/>
       <w:r>
@@ -5528,7 +5232,6 @@
         <w:t xml:space="preserve"> </w:t>
       </w:r>
       <w:proofErr w:type="spellStart"/>
-      <w:proofErr w:type="gramStart"/>
       <w:r>
         <w:rPr>
           <w:color w:val="EE0000"/>
@@ -5536,7 +5239,6 @@
         <w:t>c.aditivo</w:t>
       </w:r>
       <w:proofErr w:type="spellEnd"/>
-      <w:proofErr w:type="gramEnd"/>
       <w:r>
         <w:rPr>
           <w:color w:val="EE0000"/>
@@ -6454,23 +6156,7 @@
           <w:rFonts w:eastAsia="Times New Roman"/>
           <w:lang w:eastAsia="pt-BR"/>
         </w:rPr>
-        <w:t xml:space="preserve">        I - </w:t>
-      </w:r>
-      <w:proofErr w:type="gramStart"/>
-      <w:r>
-        <w:rPr>
-          <w:rFonts w:eastAsia="Times New Roman"/>
-          <w:lang w:eastAsia="pt-BR"/>
-        </w:rPr>
-        <w:t>preço</w:t>
-      </w:r>
-      <w:proofErr w:type="gramEnd"/>
-      <w:r>
-        <w:rPr>
-          <w:rFonts w:eastAsia="Times New Roman"/>
-          <w:lang w:eastAsia="pt-BR"/>
-        </w:rPr>
-        <w:t xml:space="preserve"> do produto ou serviço em moeda corrente nacional;</w:t>
+        <w:t>        I - preço do produto ou serviço em moeda corrente nacional;</w:t>
       </w:r>
     </w:p>
     <w:p>
@@ -6487,23 +6173,7 @@
           <w:rFonts w:eastAsia="Times New Roman"/>
           <w:lang w:eastAsia="pt-BR"/>
         </w:rPr>
-        <w:t xml:space="preserve">        II - </w:t>
-      </w:r>
-      <w:proofErr w:type="gramStart"/>
-      <w:r>
-        <w:rPr>
-          <w:rFonts w:eastAsia="Times New Roman"/>
-          <w:lang w:eastAsia="pt-BR"/>
-        </w:rPr>
-        <w:t>montante</w:t>
-      </w:r>
-      <w:proofErr w:type="gramEnd"/>
-      <w:r>
-        <w:rPr>
-          <w:rFonts w:eastAsia="Times New Roman"/>
-          <w:lang w:eastAsia="pt-BR"/>
-        </w:rPr>
-        <w:t xml:space="preserve"> dos juros de mora e da taxa efetiva anual de juros;</w:t>
+        <w:t>        II - montante dos juros de mora e da taxa efetiva anual de juros;</w:t>
       </w:r>
     </w:p>
     <w:p>
@@ -6539,7 +6209,6 @@
         </w:rPr>
         <w:t xml:space="preserve">        IV - </w:t>
       </w:r>
-      <w:proofErr w:type="gramStart"/>
       <w:r>
         <w:rPr>
           <w:rFonts w:eastAsia="Times New Roman"/>
@@ -6547,17 +6216,7 @@
           <w:bCs/>
           <w:lang w:eastAsia="pt-BR"/>
         </w:rPr>
-        <w:t>número e periodicidade</w:t>
-      </w:r>
-      <w:proofErr w:type="gramEnd"/>
-      <w:r>
-        <w:rPr>
-          <w:rFonts w:eastAsia="Times New Roman"/>
-          <w:b/>
-          <w:bCs/>
-          <w:lang w:eastAsia="pt-BR"/>
-        </w:rPr>
-        <w:t xml:space="preserve"> das prestações</w:t>
+        <w:t>número e periodicidade das prestações</w:t>
       </w:r>
       <w:r>
         <w:rPr>
@@ -6581,23 +6240,7 @@
           <w:rFonts w:eastAsia="Times New Roman"/>
           <w:lang w:eastAsia="pt-BR"/>
         </w:rPr>
-        <w:t xml:space="preserve">        V - </w:t>
-      </w:r>
-      <w:proofErr w:type="gramStart"/>
-      <w:r>
-        <w:rPr>
-          <w:rFonts w:eastAsia="Times New Roman"/>
-          <w:lang w:eastAsia="pt-BR"/>
-        </w:rPr>
-        <w:t>soma</w:t>
-      </w:r>
-      <w:proofErr w:type="gramEnd"/>
-      <w:r>
-        <w:rPr>
-          <w:rFonts w:eastAsia="Times New Roman"/>
-          <w:lang w:eastAsia="pt-BR"/>
-        </w:rPr>
-        <w:t xml:space="preserve"> total a pagar, com e sem financiamento.</w:t>
+        <w:t>        V - soma total a pagar, com e sem financiamento.</w:t>
       </w:r>
     </w:p>
     <w:p>
@@ -7298,30 +6941,12 @@
         <w:t xml:space="preserve">(TJPR - 16ª </w:t>
       </w:r>
       <w:proofErr w:type="spellStart"/>
-      <w:proofErr w:type="gramStart"/>
       <w:r>
         <w:t>C.Cível</w:t>
       </w:r>
       <w:proofErr w:type="spellEnd"/>
-      <w:proofErr w:type="gramEnd"/>
-      <w:r>
-        <w:t xml:space="preserve"> - 0014684-04.2013.8.16.0017 - Guaraniaçu </w:t>
-      </w:r>
-      <w:proofErr w:type="gramStart"/>
-      <w:r>
-        <w:t>-  Rel.</w:t>
-      </w:r>
-      <w:proofErr w:type="gramEnd"/>
-      <w:r>
-        <w:t xml:space="preserve">: JUÍZA DE DIREITO SUBSTITUTO EM SEGUNDO GRAU VANIA MARIA DA SILVA KRAMER </w:t>
-      </w:r>
-      <w:proofErr w:type="gramStart"/>
-      <w:r>
-        <w:t>-  J.</w:t>
-      </w:r>
-      <w:proofErr w:type="gramEnd"/>
-      <w:r>
-        <w:t xml:space="preserve"> 23.11.2020) [G. N.]</w:t>
+      <w:r>
+        <w:t xml:space="preserve"> - 0014684-04.2013.8.16.0017 - Guaraniaçu -  Rel.: JUÍZA DE DIREITO SUBSTITUTO EM SEGUNDO GRAU VANIA MARIA DA SILVA KRAMER -  J. 23.11.2020) [G. N.]</w:t>
       </w:r>
     </w:p>
     <w:p>
@@ -9270,30 +8895,12 @@
         <w:t xml:space="preserve">(TJPR - 16ª </w:t>
       </w:r>
       <w:proofErr w:type="spellStart"/>
-      <w:proofErr w:type="gramStart"/>
       <w:r>
         <w:t>C.Cível</w:t>
       </w:r>
       <w:proofErr w:type="spellEnd"/>
-      <w:proofErr w:type="gramEnd"/>
-      <w:r>
-        <w:t xml:space="preserve"> - 0014684-04.2013.8.16.0017 - Guaraniaçu </w:t>
-      </w:r>
-      <w:proofErr w:type="gramStart"/>
-      <w:r>
-        <w:t>-  Rel.</w:t>
-      </w:r>
-      <w:proofErr w:type="gramEnd"/>
-      <w:r>
-        <w:t xml:space="preserve">: JUÍZA DE DIREITO SUBSTITUTO EM SEGUNDO GRAU VANIA MARIA DA SILVA KRAMER </w:t>
-      </w:r>
-      <w:proofErr w:type="gramStart"/>
-      <w:r>
-        <w:t>-  J.</w:t>
-      </w:r>
-      <w:proofErr w:type="gramEnd"/>
-      <w:r>
-        <w:t xml:space="preserve"> 23.11.2020) [G. N.]</w:t>
+      <w:r>
+        <w:t xml:space="preserve"> - 0014684-04.2013.8.16.0017 - Guaraniaçu -  Rel.: JUÍZA DE DIREITO SUBSTITUTO EM SEGUNDO GRAU VANIA MARIA DA SILVA KRAMER -  J. 23.11.2020) [G. N.]</w:t>
       </w:r>
     </w:p>
     <w:p>
@@ -9931,30 +9538,12 @@
         <w:t xml:space="preserve">(TJPR - 16ª </w:t>
       </w:r>
       <w:proofErr w:type="spellStart"/>
-      <w:proofErr w:type="gramStart"/>
       <w:r>
         <w:t>C.Cível</w:t>
       </w:r>
       <w:proofErr w:type="spellEnd"/>
-      <w:proofErr w:type="gramEnd"/>
-      <w:r>
-        <w:t xml:space="preserve"> - 0014684-04.2013.8.16.0017 - Guaraniaçu </w:t>
-      </w:r>
-      <w:proofErr w:type="gramStart"/>
-      <w:r>
-        <w:t>-  Rel.</w:t>
-      </w:r>
-      <w:proofErr w:type="gramEnd"/>
-      <w:r>
-        <w:t xml:space="preserve">: JUÍZA DE DIREITO SUBSTITUTO EM SEGUNDO GRAU VANIA MARIA DA SILVA KRAMER </w:t>
-      </w:r>
-      <w:proofErr w:type="gramStart"/>
-      <w:r>
-        <w:t>-  J.</w:t>
-      </w:r>
-      <w:proofErr w:type="gramEnd"/>
-      <w:r>
-        <w:t xml:space="preserve"> 23.11.2020) [G. N.]</w:t>
+      <w:r>
+        <w:t xml:space="preserve"> - 0014684-04.2013.8.16.0017 - Guaraniaçu -  Rel.: JUÍZA DE DIREITO SUBSTITUTO EM SEGUNDO GRAU VANIA MARIA DA SILVA KRAMER -  J. 23.11.2020) [G. N.]</w:t>
       </w:r>
     </w:p>
     <w:p>
@@ -10932,21 +10521,7 @@
         <w:rPr>
           <w:color w:val="EE0000"/>
         </w:rPr>
-        <w:t>taxa_superior_</w:t>
-      </w:r>
-      <w:proofErr w:type="gramStart"/>
-      <w:r>
-        <w:rPr>
-          <w:color w:val="EE0000"/>
-        </w:rPr>
-        <w:t>media</w:t>
-      </w:r>
-      <w:proofErr w:type="gramEnd"/>
-      <w:r>
-        <w:rPr>
-          <w:color w:val="EE0000"/>
-        </w:rPr>
-        <w:t>_mercado</w:t>
+        <w:t>taxa_superior_media_mercado</w:t>
       </w:r>
       <w:proofErr w:type="spellEnd"/>
       <w:r>
@@ -11161,18 +10736,9 @@
               <w:rFonts w:eastAsia="Times New Roman"/>
               <w:highlight w:val="green"/>
             </w:rPr>
-            <w:t>produtor_</w:t>
-          </w:r>
-          <w:proofErr w:type="gramStart"/>
-          <w:r>
-            <w:rPr>
-              <w:rFonts w:eastAsia="Times New Roman"/>
-              <w:highlight w:val="green"/>
-            </w:rPr>
-            <w:t>genero.sujeito</w:t>
+            <w:t>produtor_genero.sujeito</w:t>
           </w:r>
           <w:proofErr w:type="spellEnd"/>
-          <w:proofErr w:type="gramEnd"/>
           <w:r>
             <w:rPr>
               <w:rFonts w:eastAsia="Times New Roman"/>
@@ -12594,30 +12160,12 @@
         <w:t xml:space="preserve">. CAPITALIZAÇÃO DE JUROS. POSSIBILIDADE. ART. 28, § 1º, INCISO I DA LEI 10.931/04. SÚMULA 541, DO STJ. COMISSÃO DE PERMANÊNCIA. PREVISÃO EXPRESSA NO CONTRATO. SÚMULA 472 DO STJ. POSSIBILIDADE. MULTA CONTRATUAL. AUSENCIA DE INTERESSE. AUSÊNCIA DE PREVISÃO EM CONTRATO. ÔNUS DE SUCUMBÊNCIA. ADEQUAÇÃO. SENTENÇA REFORMADA. Apelação Cível parcialmente conhecida e parcialmente provida. (TJPR - 16ª </w:t>
       </w:r>
       <w:proofErr w:type="spellStart"/>
-      <w:proofErr w:type="gramStart"/>
       <w:r>
         <w:t>C.Cível</w:t>
       </w:r>
       <w:proofErr w:type="spellEnd"/>
-      <w:proofErr w:type="gramEnd"/>
-      <w:r>
-        <w:t xml:space="preserve"> - 0029796-22.2017.8.16.0001 - Curitiba </w:t>
-      </w:r>
-      <w:proofErr w:type="gramStart"/>
-      <w:r>
-        <w:t>-  Rel.</w:t>
-      </w:r>
-      <w:proofErr w:type="gramEnd"/>
-      <w:r>
-        <w:t xml:space="preserve">: DESEMBARGADOR PAULO CEZAR BELLIO </w:t>
-      </w:r>
-      <w:proofErr w:type="gramStart"/>
-      <w:r>
-        <w:t>-  J.</w:t>
-      </w:r>
-      <w:proofErr w:type="gramEnd"/>
-      <w:r>
-        <w:t xml:space="preserve"> 04.10.2021)</w:t>
+      <w:r>
+        <w:t xml:space="preserve"> - 0029796-22.2017.8.16.0001 - Curitiba -  Rel.: DESEMBARGADOR PAULO CEZAR BELLIO -  J. 04.10.2021)</w:t>
       </w:r>
     </w:p>
     <w:p>
@@ -16596,21 +16144,7 @@
         <w:rPr>
           <w:color w:val="EE0000"/>
         </w:rPr>
-        <w:t>[[BLOCK juros_superiores_12_aa_</w:t>
-      </w:r>
-      <w:proofErr w:type="gramStart"/>
-      <w:r>
-        <w:rPr>
-          <w:color w:val="EE0000"/>
-        </w:rPr>
-        <w:t>credito</w:t>
-      </w:r>
-      <w:proofErr w:type="gramEnd"/>
-      <w:r>
-        <w:rPr>
-          <w:color w:val="EE0000"/>
-        </w:rPr>
-        <w:t>_rural]]</w:t>
+        <w:t>[[BLOCK juros_superiores_12_aa_credito_rural]]</w:t>
       </w:r>
     </w:p>
     <w:p>
@@ -16759,14 +16293,12 @@
       <w:r>
         <w:t xml:space="preserve"> </w:t>
       </w:r>
-      <w:proofErr w:type="gramStart"/>
       <w:r>
         <w:t>[</w:t>
       </w:r>
       <w:r>
         <w:t>Após</w:t>
       </w:r>
-      <w:proofErr w:type="gramEnd"/>
       <w:r>
         <w:t>]</w:t>
       </w:r>
@@ -18821,18 +18353,9 @@
           <w:rFonts w:eastAsia="Times New Roman"/>
           <w:highlight w:val="green"/>
         </w:rPr>
-        <w:t>produtor_</w:t>
-      </w:r>
-      <w:proofErr w:type="gramStart"/>
-      <w:r>
-        <w:rPr>
-          <w:rFonts w:eastAsia="Times New Roman"/>
-          <w:highlight w:val="green"/>
-        </w:rPr>
-        <w:t>genero.sujeito</w:t>
+        <w:t>produtor_genero.sujeito</w:t>
       </w:r>
       <w:proofErr w:type="spellEnd"/>
-      <w:proofErr w:type="gramEnd"/>
       <w:r>
         <w:rPr>
           <w:rFonts w:eastAsia="Times New Roman"/>
@@ -19253,22 +18776,8 @@
           <w:u w:val="single"/>
           <w:lang w:eastAsia="pt-BR"/>
         </w:rPr>
-        <w:t xml:space="preserve"> [G. </w:t>
-      </w:r>
-      <w:proofErr w:type="gramStart"/>
-      <w:r>
-        <w:rPr>
-          <w:rFonts w:eastAsia="Times New Roman" w:cs="Times New Roman"/>
-          <w:bCs/>
-          <w:iCs/>
-          <w:color w:val="032348"/>
-          <w:szCs w:val="23"/>
-          <w:u w:val="single"/>
-          <w:lang w:eastAsia="pt-BR"/>
-        </w:rPr>
-        <w:t>N. ]</w:t>
-      </w:r>
-      <w:proofErr w:type="gramEnd"/>
+        <w:t xml:space="preserve"> [G. N. ]</w:t>
+      </w:r>
     </w:p>
     <w:p>
       <w:pPr>
@@ -19757,22 +19266,8 @@
           <w:u w:val="single"/>
           <w:lang w:eastAsia="pt-BR"/>
         </w:rPr>
-        <w:t xml:space="preserve"> [G. </w:t>
-      </w:r>
-      <w:proofErr w:type="gramStart"/>
-      <w:r>
-        <w:rPr>
-          <w:rFonts w:eastAsia="Times New Roman" w:cs="Times New Roman"/>
-          <w:bCs/>
-          <w:iCs/>
-          <w:color w:val="032348"/>
-          <w:szCs w:val="23"/>
-          <w:u w:val="single"/>
-          <w:lang w:eastAsia="pt-BR"/>
-        </w:rPr>
-        <w:t>N. ]</w:t>
-      </w:r>
-      <w:proofErr w:type="gramEnd"/>
+        <w:t xml:space="preserve"> [G. N. ]</w:t>
+      </w:r>
     </w:p>
     <w:p>
       <w:pPr>
@@ -20387,7 +19882,6 @@
         <w:t xml:space="preserve">TJPR - 18ª </w:t>
       </w:r>
       <w:proofErr w:type="spellStart"/>
-      <w:proofErr w:type="gramStart"/>
       <w:r>
         <w:rPr>
           <w:rFonts w:eastAsia="Times New Roman"/>
@@ -20397,50 +19891,13 @@
         <w:t>C.Cível</w:t>
       </w:r>
       <w:proofErr w:type="spellEnd"/>
-      <w:proofErr w:type="gramEnd"/>
       <w:r>
         <w:rPr>
           <w:rFonts w:eastAsia="Times New Roman"/>
           <w:highlight w:val="yellow"/>
           <w:lang w:eastAsia="pt-BR"/>
         </w:rPr>
-        <w:t xml:space="preserve"> - 0032455-43.2019.8.16.0030 - Foz do Iguaçu </w:t>
-      </w:r>
-      <w:proofErr w:type="gramStart"/>
-      <w:r>
-        <w:rPr>
-          <w:rFonts w:eastAsia="Times New Roman"/>
-          <w:highlight w:val="yellow"/>
-          <w:lang w:eastAsia="pt-BR"/>
-        </w:rPr>
-        <w:t>-  Rel.</w:t>
-      </w:r>
-      <w:proofErr w:type="gramEnd"/>
-      <w:r>
-        <w:rPr>
-          <w:rFonts w:eastAsia="Times New Roman"/>
-          <w:highlight w:val="yellow"/>
-          <w:lang w:eastAsia="pt-BR"/>
-        </w:rPr>
-        <w:t xml:space="preserve">: Desembargador Marcelo Gobbo Dalla Dea </w:t>
-      </w:r>
-      <w:proofErr w:type="gramStart"/>
-      <w:r>
-        <w:rPr>
-          <w:rFonts w:eastAsia="Times New Roman"/>
-          <w:highlight w:val="yellow"/>
-          <w:lang w:eastAsia="pt-BR"/>
-        </w:rPr>
-        <w:t>-  J.</w:t>
-      </w:r>
-      <w:proofErr w:type="gramEnd"/>
-      <w:r>
-        <w:rPr>
-          <w:rFonts w:eastAsia="Times New Roman"/>
-          <w:highlight w:val="yellow"/>
-          <w:lang w:eastAsia="pt-BR"/>
-        </w:rPr>
-        <w:t xml:space="preserve"> 15.02.2021).</w:t>
+        <w:t xml:space="preserve"> - 0032455-43.2019.8.16.0030 - Foz do Iguaçu -  Rel.: Desembargador Marcelo Gobbo Dalla Dea -  J. 15.02.2021).</w:t>
       </w:r>
     </w:p>
     <w:p>
@@ -20635,18 +20092,9 @@
           <w:rFonts w:eastAsia="Times New Roman"/>
           <w:highlight w:val="green"/>
         </w:rPr>
-        <w:t>produtor_</w:t>
-      </w:r>
-      <w:proofErr w:type="gramStart"/>
-      <w:r>
-        <w:rPr>
-          <w:rFonts w:eastAsia="Times New Roman"/>
-          <w:highlight w:val="green"/>
-        </w:rPr>
-        <w:t>genero.sujeito</w:t>
+        <w:t>produtor_genero.sujeito</w:t>
       </w:r>
       <w:proofErr w:type="spellEnd"/>
-      <w:proofErr w:type="gramEnd"/>
       <w:r>
         <w:rPr>
           <w:rFonts w:eastAsia="Times New Roman"/>
@@ -21352,18 +20800,9 @@
           <w:rFonts w:eastAsia="Times New Roman"/>
           <w:highlight w:val="green"/>
         </w:rPr>
-        <w:t>produtor_</w:t>
-      </w:r>
-      <w:proofErr w:type="gramStart"/>
-      <w:r>
-        <w:rPr>
-          <w:rFonts w:eastAsia="Times New Roman"/>
-          <w:highlight w:val="green"/>
-        </w:rPr>
-        <w:t>genero.sujeito</w:t>
+        <w:t>produtor_genero.sujeito</w:t>
       </w:r>
       <w:proofErr w:type="spellEnd"/>
-      <w:proofErr w:type="gramEnd"/>
       <w:r>
         <w:rPr>
           <w:rFonts w:eastAsia="Times New Roman"/>
@@ -21447,15 +20886,7 @@
         <w:t xml:space="preserve"> (no caso, via Programa Nacional de Fortalecimento da Agricultura Familiar – PRONAF). D</w:t>
       </w:r>
       <w:r>
-        <w:t xml:space="preserve">essa forma, não poderia a apelada renegociar a dívida majorando os juros remuneratórios “carimbados” (regras do CMN) de 3% ao ano (cédula original) para 65,543% ao ano na nova cédula, com o que </w:t>
-      </w:r>
-      <w:proofErr w:type="gramStart"/>
-      <w:r>
-        <w:t>o valor das parcelas constantes no título exequendo foram</w:t>
-      </w:r>
-      <w:proofErr w:type="gramEnd"/>
-      <w:r>
-        <w:t xml:space="preserve"> apuradas em quantia substancialmente superior às efetivamente devidas, caso mantidos os juros de 3% ao ano. </w:t>
+        <w:t xml:space="preserve">essa forma, não poderia a apelada renegociar a dívida majorando os juros remuneratórios “carimbados” (regras do CMN) de 3% ao ano (cédula original) para 65,543% ao ano na nova cédula, com o que o valor das parcelas constantes no título exequendo foram apuradas em quantia substancialmente superior às efetivamente devidas, caso mantidos os juros de 3% ao ano. </w:t>
       </w:r>
       <w:r>
         <w:rPr>
@@ -21775,27 +21206,7 @@
           <w:sz w:val="22"/>
           <w:szCs w:val="22"/>
         </w:rPr>
-        <w:t xml:space="preserve"> </w:t>
-      </w:r>
-      <w:proofErr w:type="gramStart"/>
-      <w:r>
-        <w:rPr>
-          <w:rFonts w:eastAsia="Times New Roman" w:cs="Times New Roman"/>
-          <w:color w:val="002060"/>
-          <w:sz w:val="22"/>
-          <w:szCs w:val="22"/>
-        </w:rPr>
-        <w:t>-  j</w:t>
-      </w:r>
-      <w:proofErr w:type="gramEnd"/>
-      <w:r>
-        <w:rPr>
-          <w:rFonts w:eastAsia="Times New Roman" w:cs="Times New Roman"/>
-          <w:color w:val="002060"/>
-          <w:sz w:val="22"/>
-          <w:szCs w:val="22"/>
-        </w:rPr>
-        <w:t>/p, Forense, 2ª. edição, 1967, p. 903.</w:t>
+        <w:t xml:space="preserve"> -  j/p, Forense, 2ª. edição, 1967, p. 903.</w:t>
       </w:r>
     </w:p>
     <w:p>
@@ -22024,27 +21435,7 @@
           <w:sz w:val="22"/>
           <w:szCs w:val="22"/>
         </w:rPr>
-        <w:t xml:space="preserve">[...] Referido reclamo, no entanto, fora julgado monocraticamente aplicando ao caso o entendimento mais recente do STJ que </w:t>
-      </w:r>
-      <w:proofErr w:type="gramStart"/>
-      <w:r>
-        <w:rPr>
-          <w:rFonts w:eastAsia="Times New Roman" w:cs="Times New Roman"/>
-          <w:color w:val="002060"/>
-          <w:sz w:val="22"/>
-          <w:szCs w:val="22"/>
-        </w:rPr>
-        <w:t>consolidou-se</w:t>
-      </w:r>
-      <w:proofErr w:type="gramEnd"/>
-      <w:r>
-        <w:rPr>
-          <w:rFonts w:eastAsia="Times New Roman" w:cs="Times New Roman"/>
-          <w:color w:val="002060"/>
-          <w:sz w:val="22"/>
-          <w:szCs w:val="22"/>
-        </w:rPr>
-        <w:t xml:space="preserve"> no sentido da </w:t>
+        <w:t xml:space="preserve">[...] Referido reclamo, no entanto, fora julgado monocraticamente aplicando ao caso o entendimento mais recente do STJ que consolidou-se no sentido da </w:t>
       </w:r>
       <w:r>
         <w:rPr>
@@ -27464,23 +26855,7 @@
           <w:rFonts w:eastAsia="Times New Roman"/>
           <w:highlight w:val="yellow"/>
         </w:rPr>
-        <w:t xml:space="preserve">Quando informa diariamente, mas </w:t>
-      </w:r>
-      <w:proofErr w:type="gramStart"/>
-      <w:r>
-        <w:rPr>
-          <w:rFonts w:eastAsia="Times New Roman"/>
-          <w:highlight w:val="yellow"/>
-        </w:rPr>
-        <w:t>pratica</w:t>
-      </w:r>
-      <w:proofErr w:type="gramEnd"/>
-      <w:r>
-        <w:rPr>
-          <w:rFonts w:eastAsia="Times New Roman"/>
-          <w:highlight w:val="yellow"/>
-        </w:rPr>
-        <w:t xml:space="preserve"> mensalmente</w:t>
+        <w:t>Quando informa diariamente, mas pratica mensalmente</w:t>
       </w:r>
     </w:p>
     <w:p>
@@ -27973,15 +27348,7 @@
               <w:rFonts w:eastAsia="Times New Roman"/>
               <w:highlight w:val="green"/>
             </w:rPr>
-            <w:t>descricao_op_</w:t>
-          </w:r>
-          <w:proofErr w:type="gramStart"/>
-          <w:r>
-            <w:rPr>
-              <w:rFonts w:eastAsia="Times New Roman"/>
-              <w:highlight w:val="green"/>
-            </w:rPr>
-            <w:t>contrato</w:t>
+            <w:t>descricao_op_contrato</w:t>
           </w:r>
           <w:r>
             <w:rPr>
@@ -27998,7 +27365,6 @@
             <w:t>quantidade</w:t>
           </w:r>
           <w:proofErr w:type="spellEnd"/>
-          <w:proofErr w:type="gramEnd"/>
           <w:r>
             <w:rPr>
               <w:rFonts w:eastAsia="Times New Roman"/>
@@ -28040,15 +27406,7 @@
               <w:rFonts w:eastAsia="Times New Roman"/>
               <w:highlight w:val="green"/>
             </w:rPr>
-            <w:t>descricao_op_</w:t>
-          </w:r>
-          <w:proofErr w:type="gramStart"/>
-          <w:r>
-            <w:rPr>
-              <w:rFonts w:eastAsia="Times New Roman"/>
-              <w:highlight w:val="green"/>
-            </w:rPr>
-            <w:t>contrato</w:t>
+            <w:t>descricao_op_contrato</w:t>
           </w:r>
           <w:r>
             <w:rPr>
@@ -28065,7 +27423,6 @@
             <w:t>verbo</w:t>
           </w:r>
           <w:proofErr w:type="spellEnd"/>
-          <w:proofErr w:type="gramEnd"/>
           <w:r>
             <w:rPr>
               <w:rFonts w:eastAsia="Times New Roman"/>
@@ -28923,15 +28280,7 @@
               <w:rFonts w:eastAsia="Times New Roman"/>
               <w:highlight w:val="green"/>
             </w:rPr>
-            <w:t>descricao_op_</w:t>
-          </w:r>
-          <w:proofErr w:type="gramStart"/>
-          <w:r>
-            <w:rPr>
-              <w:rFonts w:eastAsia="Times New Roman"/>
-              <w:highlight w:val="green"/>
-            </w:rPr>
-            <w:t>contrato</w:t>
+            <w:t>descricao_op_contrato</w:t>
           </w:r>
           <w:r>
             <w:rPr>
@@ -28945,15 +28294,7 @@
               <w:rFonts w:eastAsia="Times New Roman"/>
               <w:highlight w:val="green"/>
             </w:rPr>
-            <w:t>quantidade</w:t>
-          </w:r>
-          <w:proofErr w:type="gramEnd"/>
-          <w:r>
-            <w:rPr>
-              <w:rFonts w:eastAsia="Times New Roman"/>
-              <w:highlight w:val="green"/>
-            </w:rPr>
-            <w:t>_op</w:t>
+            <w:t>quantidade_op</w:t>
           </w:r>
           <w:proofErr w:type="spellEnd"/>
           <w:r>
@@ -29599,15 +28940,7 @@
               <w:rFonts w:eastAsia="Times New Roman"/>
               <w:highlight w:val="green"/>
             </w:rPr>
-            <w:t>descricao_op_</w:t>
-          </w:r>
-          <w:proofErr w:type="gramStart"/>
-          <w:r>
-            <w:rPr>
-              <w:rFonts w:eastAsia="Times New Roman"/>
-              <w:highlight w:val="green"/>
-            </w:rPr>
-            <w:t>contrato</w:t>
+            <w:t>descricao_op_contrato</w:t>
           </w:r>
           <w:r>
             <w:rPr>
@@ -29624,7 +28957,6 @@
             <w:t>quantidade</w:t>
           </w:r>
           <w:proofErr w:type="spellEnd"/>
-          <w:proofErr w:type="gramEnd"/>
           <w:r>
             <w:rPr>
               <w:rFonts w:eastAsia="Times New Roman"/>
@@ -29882,21 +29214,12 @@
         </w:rPr>
         <w:t xml:space="preserve">. </w:t>
       </w:r>
-      <w:proofErr w:type="gramStart"/>
-      <w:r>
-        <w:rPr>
-          <w:rFonts w:eastAsia="Times New Roman"/>
-          <w:highlight w:val="yellow"/>
-        </w:rPr>
-        <w:t>[ no</w:t>
-      </w:r>
-      <w:proofErr w:type="gramEnd"/>
-      <w:r>
-        <w:rPr>
-          <w:rFonts w:eastAsia="Times New Roman"/>
-          <w:highlight w:val="yellow"/>
-        </w:rPr>
-        <w:t xml:space="preserve"> caso da operação </w:t>
+      <w:r>
+        <w:rPr>
+          <w:rFonts w:eastAsia="Times New Roman"/>
+          <w:highlight w:val="yellow"/>
+        </w:rPr>
+        <w:t xml:space="preserve">[ no caso da operação </w:t>
       </w:r>
       <w:proofErr w:type="spellStart"/>
       <w:r>
@@ -30214,15 +29537,7 @@
               <w:rFonts w:eastAsia="Times New Roman"/>
               <w:highlight w:val="green"/>
             </w:rPr>
-            <w:t>descricao_op_</w:t>
-          </w:r>
-          <w:proofErr w:type="gramStart"/>
-          <w:r>
-            <w:rPr>
-              <w:rFonts w:eastAsia="Times New Roman"/>
-              <w:highlight w:val="green"/>
-            </w:rPr>
-            <w:t>contrato</w:t>
+            <w:t>descricao_op_contrato</w:t>
           </w:r>
           <w:r>
             <w:rPr>
@@ -30239,7 +29554,6 @@
             <w:t>quantidade</w:t>
           </w:r>
           <w:proofErr w:type="spellEnd"/>
-          <w:proofErr w:type="gramEnd"/>
           <w:r>
             <w:rPr>
               <w:rFonts w:eastAsia="Times New Roman"/>
@@ -30504,21 +29818,12 @@
         </w:rPr>
         <w:t xml:space="preserve">. </w:t>
       </w:r>
-      <w:proofErr w:type="gramStart"/>
-      <w:r>
-        <w:rPr>
-          <w:rFonts w:eastAsia="Times New Roman"/>
-          <w:highlight w:val="yellow"/>
-        </w:rPr>
-        <w:t>[ no</w:t>
-      </w:r>
-      <w:proofErr w:type="gramEnd"/>
-      <w:r>
-        <w:rPr>
-          <w:rFonts w:eastAsia="Times New Roman"/>
-          <w:highlight w:val="yellow"/>
-        </w:rPr>
-        <w:t xml:space="preserve"> caso da operação </w:t>
+      <w:r>
+        <w:rPr>
+          <w:rFonts w:eastAsia="Times New Roman"/>
+          <w:highlight w:val="yellow"/>
+        </w:rPr>
+        <w:t xml:space="preserve">[ no caso da operação </w:t>
       </w:r>
       <w:proofErr w:type="spellStart"/>
       <w:r>
@@ -30714,27 +30019,7 @@
           <w:sz w:val="22"/>
           <w:szCs w:val="22"/>
         </w:rPr>
-        <w:t xml:space="preserve"> </w:t>
-      </w:r>
-      <w:proofErr w:type="gramStart"/>
-      <w:r>
-        <w:rPr>
-          <w:rFonts w:eastAsia="Times New Roman" w:cs="Times New Roman"/>
-          <w:color w:val="002060"/>
-          <w:sz w:val="22"/>
-          <w:szCs w:val="22"/>
-        </w:rPr>
-        <w:t>-  j</w:t>
-      </w:r>
-      <w:proofErr w:type="gramEnd"/>
-      <w:r>
-        <w:rPr>
-          <w:rFonts w:eastAsia="Times New Roman" w:cs="Times New Roman"/>
-          <w:color w:val="002060"/>
-          <w:sz w:val="22"/>
-          <w:szCs w:val="22"/>
-        </w:rPr>
-        <w:t>/p, forense, 2 a   edição, 1967, p. 903.</w:t>
+        <w:t xml:space="preserve"> -  j/p, forense, 2 a   edição, 1967, p. 903.</w:t>
       </w:r>
     </w:p>
     <w:p>
@@ -30820,27 +30105,7 @@
           <w:sz w:val="22"/>
           <w:szCs w:val="22"/>
         </w:rPr>
-        <w:t xml:space="preserve">[...] Referido reclamo, no entanto, fora julgado monocraticamente aplicando ao caso o entendimento mais recente do STJ que </w:t>
-      </w:r>
-      <w:proofErr w:type="gramStart"/>
-      <w:r>
-        <w:rPr>
-          <w:rFonts w:eastAsia="Times New Roman" w:cs="Times New Roman"/>
-          <w:color w:val="002060"/>
-          <w:sz w:val="22"/>
-          <w:szCs w:val="22"/>
-        </w:rPr>
-        <w:t>consolidou-se</w:t>
-      </w:r>
-      <w:proofErr w:type="gramEnd"/>
-      <w:r>
-        <w:rPr>
-          <w:rFonts w:eastAsia="Times New Roman" w:cs="Times New Roman"/>
-          <w:color w:val="002060"/>
-          <w:sz w:val="22"/>
-          <w:szCs w:val="22"/>
-        </w:rPr>
-        <w:t xml:space="preserve"> no sentido da </w:t>
+        <w:t xml:space="preserve">[...] Referido reclamo, no entanto, fora julgado monocraticamente aplicando ao caso o entendimento mais recente do STJ que consolidou-se no sentido da </w:t>
       </w:r>
       <w:r>
         <w:rPr>
@@ -32697,25 +31962,7 @@
           <w:sz w:val="22"/>
           <w:szCs w:val="22"/>
         </w:rPr>
-        <w:t xml:space="preserve">Calculamos as parcelas conforme as condições contratuais pactuadas (taxas de juros, número de </w:t>
-      </w:r>
-      <w:proofErr w:type="gramStart"/>
-      <w:r>
-        <w:rPr>
-          <w:rFonts w:eastAsia="Times New Roman" w:cs="Times New Roman"/>
-          <w:sz w:val="22"/>
-          <w:szCs w:val="22"/>
-        </w:rPr>
-        <w:t>parcelas, etc.</w:t>
-      </w:r>
-      <w:proofErr w:type="gramEnd"/>
-      <w:r>
-        <w:rPr>
-          <w:rFonts w:eastAsia="Times New Roman" w:cs="Times New Roman"/>
-          <w:sz w:val="22"/>
-          <w:szCs w:val="22"/>
-        </w:rPr>
-        <w:t xml:space="preserve">), considerando para isso o valor total da operação (montante): </w:t>
+        <w:t xml:space="preserve">Calculamos as parcelas conforme as condições contratuais pactuadas (taxas de juros, número de parcelas, etc.), considerando para isso o valor total da operação (montante): </w:t>
       </w:r>
       <w:r>
         <w:rPr>
@@ -33199,27 +32446,7 @@
           <w:sz w:val="22"/>
           <w:szCs w:val="22"/>
         </w:rPr>
-        <w:t xml:space="preserve"> </w:t>
-      </w:r>
-      <w:proofErr w:type="gramStart"/>
-      <w:r>
-        <w:rPr>
-          <w:rFonts w:eastAsia="Times New Roman" w:cs="Times New Roman"/>
-          <w:color w:val="002060"/>
-          <w:sz w:val="22"/>
-          <w:szCs w:val="22"/>
-        </w:rPr>
-        <w:t>-  j</w:t>
-      </w:r>
-      <w:proofErr w:type="gramEnd"/>
-      <w:r>
-        <w:rPr>
-          <w:rFonts w:eastAsia="Times New Roman" w:cs="Times New Roman"/>
-          <w:color w:val="002060"/>
-          <w:sz w:val="22"/>
-          <w:szCs w:val="22"/>
-        </w:rPr>
-        <w:t>/p, forense, 2 a   edição, 1967, p. 903.</w:t>
+        <w:t xml:space="preserve"> -  j/p, forense, 2 a   edição, 1967, p. 903.</w:t>
       </w:r>
     </w:p>
     <w:p>
@@ -34349,12 +33576,10 @@
         <w:t xml:space="preserve">TJMG, </w:t>
       </w:r>
       <w:proofErr w:type="spellStart"/>
-      <w:proofErr w:type="gramStart"/>
       <w:r>
         <w:t>Ap.Cív</w:t>
       </w:r>
       <w:proofErr w:type="spellEnd"/>
-      <w:proofErr w:type="gramEnd"/>
       <w:r>
         <w:t xml:space="preserve"> nº 1.0145.05.222381-8/002, Rel. Elpídio Donizetti, j. 13/05/2008.</w:t>
       </w:r>
@@ -34664,25 +33889,7 @@
           <w:sz w:val="22"/>
           <w:szCs w:val="22"/>
         </w:rPr>
-        <w:t xml:space="preserve">Calculamos as parcelas conforme as condições contratuais pactuadas (taxas de juros, número de </w:t>
-      </w:r>
-      <w:proofErr w:type="gramStart"/>
-      <w:r>
-        <w:rPr>
-          <w:rFonts w:eastAsia="Times New Roman" w:cs="Times New Roman"/>
-          <w:sz w:val="22"/>
-          <w:szCs w:val="22"/>
-        </w:rPr>
-        <w:t>parcelas, etc.</w:t>
-      </w:r>
-      <w:proofErr w:type="gramEnd"/>
-      <w:r>
-        <w:rPr>
-          <w:rFonts w:eastAsia="Times New Roman" w:cs="Times New Roman"/>
-          <w:sz w:val="22"/>
-          <w:szCs w:val="22"/>
-        </w:rPr>
-        <w:t xml:space="preserve">), considerando para isso o valor total da operação (montante): </w:t>
+        <w:t xml:space="preserve">Calculamos as parcelas conforme as condições contratuais pactuadas (taxas de juros, número de parcelas, etc.), considerando para isso o valor total da operação (montante): </w:t>
       </w:r>
       <w:r>
         <w:rPr>
@@ -35114,27 +34321,7 @@
           <w:sz w:val="22"/>
           <w:szCs w:val="22"/>
         </w:rPr>
-        <w:t xml:space="preserve"> </w:t>
-      </w:r>
-      <w:proofErr w:type="gramStart"/>
-      <w:r>
-        <w:rPr>
-          <w:rFonts w:eastAsia="Times New Roman" w:cs="Times New Roman"/>
-          <w:color w:val="002060"/>
-          <w:sz w:val="22"/>
-          <w:szCs w:val="22"/>
-        </w:rPr>
-        <w:t>-  j</w:t>
-      </w:r>
-      <w:proofErr w:type="gramEnd"/>
-      <w:r>
-        <w:rPr>
-          <w:rFonts w:eastAsia="Times New Roman" w:cs="Times New Roman"/>
-          <w:color w:val="002060"/>
-          <w:sz w:val="22"/>
-          <w:szCs w:val="22"/>
-        </w:rPr>
-        <w:t>/p, forense, 2 a   edição, 1967, p. 903.</w:t>
+        <w:t xml:space="preserve"> -  j/p, forense, 2 a   edição, 1967, p. 903.</w:t>
       </w:r>
     </w:p>
     <w:p>
@@ -35339,27 +34526,7 @@
           <w:sz w:val="22"/>
           <w:szCs w:val="22"/>
         </w:rPr>
-        <w:t xml:space="preserve">[...] Referido reclamo, no entanto, fora julgado monocraticamente aplicando ao caso o entendimento mais recente do STJ que </w:t>
-      </w:r>
-      <w:proofErr w:type="gramStart"/>
-      <w:r>
-        <w:rPr>
-          <w:rFonts w:eastAsia="Times New Roman" w:cs="Times New Roman"/>
-          <w:color w:val="002060"/>
-          <w:sz w:val="22"/>
-          <w:szCs w:val="22"/>
-        </w:rPr>
-        <w:t>consolidou-se</w:t>
-      </w:r>
-      <w:proofErr w:type="gramEnd"/>
-      <w:r>
-        <w:rPr>
-          <w:rFonts w:eastAsia="Times New Roman" w:cs="Times New Roman"/>
-          <w:color w:val="002060"/>
-          <w:sz w:val="22"/>
-          <w:szCs w:val="22"/>
-        </w:rPr>
-        <w:t xml:space="preserve"> no sentido da </w:t>
+        <w:t xml:space="preserve">[...] Referido reclamo, no entanto, fora julgado monocraticamente aplicando ao caso o entendimento mais recente do STJ que consolidou-se no sentido da </w:t>
       </w:r>
       <w:r>
         <w:rPr>
@@ -37369,18 +36536,9 @@
           <w:rFonts w:eastAsia="Times New Roman"/>
           <w:highlight w:val="green"/>
         </w:rPr>
-        <w:t>produtor_</w:t>
-      </w:r>
-      <w:proofErr w:type="gramStart"/>
-      <w:r>
-        <w:rPr>
-          <w:rFonts w:eastAsia="Times New Roman"/>
-          <w:highlight w:val="green"/>
-        </w:rPr>
-        <w:t>genero.sujeito</w:t>
+        <w:t>produtor_genero.sujeito</w:t>
       </w:r>
       <w:proofErr w:type="spellEnd"/>
-      <w:proofErr w:type="gramEnd"/>
       <w:r>
         <w:rPr>
           <w:rFonts w:eastAsia="Times New Roman"/>
@@ -37580,56 +36738,39 @@
           <w:rFonts w:eastAsia="Times New Roman"/>
           <w:highlight w:val="green"/>
         </w:rPr>
-        <w:t>produtor_</w:t>
-      </w:r>
-      <w:proofErr w:type="gramStart"/>
+        <w:t>produtor_genero.sujeito</w:t>
+      </w:r>
+      <w:proofErr w:type="spellEnd"/>
       <w:r>
         <w:rPr>
           <w:rFonts w:eastAsia="Times New Roman"/>
           <w:highlight w:val="green"/>
         </w:rPr>
-        <w:t>genero.sujeito</w:t>
+        <w:t>}}</w:t>
+      </w:r>
+      <w:r>
+        <w:rPr>
+          <w:rFonts w:eastAsia="Times New Roman"/>
+        </w:rPr>
+        <w:t xml:space="preserve">, </w:t>
+      </w:r>
+      <w:r>
+        <w:t xml:space="preserve">segundo seu relato não foi esse o procedimento adotado pela instituição financeira. Segundo </w:t>
+      </w:r>
+      <w:r>
+        <w:rPr>
+          <w:highlight w:val="green"/>
+        </w:rPr>
+        <w:t>{{</w:t>
+      </w:r>
+      <w:proofErr w:type="spellStart"/>
+      <w:r>
+        <w:rPr>
+          <w:highlight w:val="green"/>
+        </w:rPr>
+        <w:t>produtor_genero.pronome</w:t>
       </w:r>
       <w:proofErr w:type="spellEnd"/>
-      <w:proofErr w:type="gramEnd"/>
-      <w:r>
-        <w:rPr>
-          <w:rFonts w:eastAsia="Times New Roman"/>
-          <w:highlight w:val="green"/>
-        </w:rPr>
-        <w:t>}}</w:t>
-      </w:r>
-      <w:r>
-        <w:rPr>
-          <w:rFonts w:eastAsia="Times New Roman"/>
-        </w:rPr>
-        <w:t xml:space="preserve">, </w:t>
-      </w:r>
-      <w:r>
-        <w:t xml:space="preserve">segundo seu relato não foi esse o procedimento adotado pela instituição financeira. Segundo </w:t>
-      </w:r>
-      <w:r>
-        <w:rPr>
-          <w:highlight w:val="green"/>
-        </w:rPr>
-        <w:t>{{</w:t>
-      </w:r>
-      <w:proofErr w:type="spellStart"/>
-      <w:r>
-        <w:rPr>
-          <w:highlight w:val="green"/>
-        </w:rPr>
-        <w:t>produtor_</w:t>
-      </w:r>
-      <w:proofErr w:type="gramStart"/>
-      <w:r>
-        <w:rPr>
-          <w:highlight w:val="green"/>
-        </w:rPr>
-        <w:t>genero.pronome</w:t>
-      </w:r>
-      <w:proofErr w:type="spellEnd"/>
-      <w:proofErr w:type="gramEnd"/>
       <w:r>
         <w:rPr>
           <w:highlight w:val="green"/>
@@ -37811,68 +36952,46 @@
         <w:rPr>
           <w:highlight w:val="green"/>
         </w:rPr>
-        <w:t>produtor_</w:t>
-      </w:r>
-      <w:proofErr w:type="gramStart"/>
+        <w:t>produtor_genero.</w:t>
+      </w:r>
       <w:r>
         <w:rPr>
           <w:highlight w:val="green"/>
         </w:rPr>
-        <w:t>genero.</w:t>
-      </w:r>
+        <w:t>sujeito</w:t>
+      </w:r>
+      <w:proofErr w:type="spellEnd"/>
       <w:r>
         <w:rPr>
           <w:highlight w:val="green"/>
         </w:rPr>
-        <w:t>sujeito</w:t>
-      </w:r>
-      <w:proofErr w:type="spellEnd"/>
-      <w:proofErr w:type="gramEnd"/>
+        <w:t>}}</w:t>
+      </w:r>
+      <w:r>
+        <w:rPr>
+          <w:rFonts w:eastAsia="Times New Roman"/>
+          <w:highlight w:val="yellow"/>
+        </w:rPr>
+        <w:t xml:space="preserve"> </w:t>
+      </w:r>
       <w:r>
         <w:rPr>
           <w:highlight w:val="green"/>
         </w:rPr>
-        <w:t>}}</w:t>
-      </w:r>
-      <w:r>
-        <w:rPr>
-          <w:rFonts w:eastAsia="Times New Roman"/>
-          <w:highlight w:val="yellow"/>
-        </w:rPr>
-        <w:t xml:space="preserve"> </w:t>
-      </w:r>
+        <w:t>{{</w:t>
+      </w:r>
+      <w:proofErr w:type="spellStart"/>
       <w:r>
         <w:rPr>
           <w:highlight w:val="green"/>
         </w:rPr>
-        <w:t>{{</w:t>
-      </w:r>
-      <w:proofErr w:type="spellStart"/>
+        <w:t>produtor_genero.</w:t>
+      </w:r>
       <w:r>
         <w:rPr>
           <w:highlight w:val="green"/>
         </w:rPr>
-        <w:t>produtor_</w:t>
-      </w:r>
-      <w:proofErr w:type="gramStart"/>
-      <w:r>
-        <w:rPr>
-          <w:highlight w:val="green"/>
-        </w:rPr>
-        <w:t>genero.</w:t>
-      </w:r>
-      <w:r>
-        <w:rPr>
-          <w:highlight w:val="green"/>
-        </w:rPr>
-        <w:t>verbo</w:t>
-      </w:r>
-      <w:proofErr w:type="gramEnd"/>
-      <w:r>
-        <w:rPr>
-          <w:highlight w:val="green"/>
-        </w:rPr>
-        <w:t>_foi</w:t>
+        <w:t>verbo_foi</w:t>
       </w:r>
       <w:proofErr w:type="spellEnd"/>
       <w:r>
@@ -38045,23 +37164,13 @@
         </w:rPr>
         <w:t xml:space="preserve">        I - </w:t>
       </w:r>
-      <w:proofErr w:type="gramStart"/>
       <w:r>
         <w:rPr>
           <w:b/>
           <w:bCs/>
           <w:highlight w:val="green"/>
         </w:rPr>
-        <w:t>condicionar</w:t>
-      </w:r>
-      <w:proofErr w:type="gramEnd"/>
-      <w:r>
-        <w:rPr>
-          <w:b/>
-          <w:bCs/>
-          <w:highlight w:val="green"/>
-        </w:rPr>
-        <w:t xml:space="preserve"> o fornecimento de produto ou de serviço ao fornecimento de outro produto ou serviço, bem como, sem justa causa, a limites quantitativos;</w:t>
+        <w:t>condicionar o fornecimento de produto ou de serviço ao fornecimento de outro produto ou serviço, bem como, sem justa causa, a limites quantitativos;</w:t>
       </w:r>
     </w:p>
     <w:p>
@@ -38076,21 +37185,7 @@
         <w:rPr>
           <w:highlight w:val="green"/>
         </w:rPr>
-        <w:t xml:space="preserve">        II - </w:t>
-      </w:r>
-      <w:proofErr w:type="gramStart"/>
-      <w:r>
-        <w:rPr>
-          <w:highlight w:val="green"/>
-        </w:rPr>
-        <w:t>recusar</w:t>
-      </w:r>
-      <w:proofErr w:type="gramEnd"/>
-      <w:r>
-        <w:rPr>
-          <w:highlight w:val="green"/>
-        </w:rPr>
-        <w:t xml:space="preserve"> atendimento às demandas dos consumidores, na exata medida de suas disponibilidades de estoque, e, ainda, de conformidade com os usos e costumes;</w:t>
+        <w:t>        II - recusar atendimento às demandas dos consumidores, na exata medida de suas disponibilidades de estoque, e, ainda, de conformidade com os usos e costumes;</w:t>
       </w:r>
     </w:p>
     <w:p>
@@ -38121,21 +37216,7 @@
         <w:rPr>
           <w:highlight w:val="green"/>
         </w:rPr>
-        <w:t xml:space="preserve">        IV - </w:t>
-      </w:r>
-      <w:proofErr w:type="gramStart"/>
-      <w:r>
-        <w:rPr>
-          <w:highlight w:val="green"/>
-        </w:rPr>
-        <w:t>prevalecer-se</w:t>
-      </w:r>
-      <w:proofErr w:type="gramEnd"/>
-      <w:r>
-        <w:rPr>
-          <w:highlight w:val="green"/>
-        </w:rPr>
-        <w:t xml:space="preserve"> da fraqueza ou ignorância do consumidor, tendo em vista sua idade, saúde, conhecimento ou condição social, para impingir-lhe seus produtos ou serviços [G.N.];</w:t>
+        <w:t>        IV - prevalecer-se da fraqueza ou ignorância do consumidor, tendo em vista sua idade, saúde, conhecimento ou condição social, para impingir-lhe seus produtos ou serviços [G.N.];</w:t>
       </w:r>
     </w:p>
     <w:p>
@@ -38732,27 +37813,7 @@
           <w:sz w:val="22"/>
           <w:szCs w:val="22"/>
         </w:rPr>
-        <w:t xml:space="preserve">I - </w:t>
-      </w:r>
-      <w:proofErr w:type="gramStart"/>
-      <w:r>
-        <w:rPr>
-          <w:rFonts w:eastAsia="Times New Roman" w:cs="Times New Roman"/>
-          <w:color w:val="002060"/>
-          <w:sz w:val="22"/>
-          <w:szCs w:val="22"/>
-        </w:rPr>
-        <w:t>a</w:t>
-      </w:r>
-      <w:proofErr w:type="gramEnd"/>
-      <w:r>
-        <w:rPr>
-          <w:rFonts w:eastAsia="Times New Roman" w:cs="Times New Roman"/>
-          <w:color w:val="002060"/>
-          <w:sz w:val="22"/>
-          <w:szCs w:val="22"/>
-        </w:rPr>
-        <w:t xml:space="preserve"> cobrança de clientes atendidos pelo correspondente de </w:t>
+        <w:t xml:space="preserve">I - a cobrança de clientes atendidos pelo correspondente de </w:t>
       </w:r>
       <w:r>
         <w:rPr>
@@ -41554,7 +40615,7 @@
           <w:noProof/>
           <w:szCs w:val="23"/>
         </w:rPr>
-        <w:t>24 de junho de 2026</w:t>
+        <w:t>25 de junho de 2026</w:t>
       </w:r>
       <w:r>
         <w:rPr>
@@ -51245,6 +50306,7 @@
     <w:rsid w:val="00042714"/>
     <w:rsid w:val="00055533"/>
     <w:rsid w:val="0005556E"/>
+    <w:rsid w:val="0006046F"/>
     <w:rsid w:val="00064438"/>
     <w:rsid w:val="000756B4"/>
     <w:rsid w:val="00091D1C"/>
@@ -51293,6 +50355,7 @@
     <w:rsid w:val="00322F07"/>
     <w:rsid w:val="00327C86"/>
     <w:rsid w:val="003311E4"/>
+    <w:rsid w:val="00331482"/>
     <w:rsid w:val="00333CE9"/>
     <w:rsid w:val="003437A9"/>
     <w:rsid w:val="0035168B"/>

</xml_diff>

<commit_message>
resvisão no laudo, valores apurados e valor excesso
</commit_message>
<xml_diff>
--- a/laudo/templates/laudo_completo.docx
+++ b/laudo/templates/laudo_completo.docx
@@ -27,6 +27,33 @@
           <w:lang w:eastAsia="pt-BR"/>
         </w:rPr>
         <w:t xml:space="preserve"> </w:t>
+      </w:r>
+      <w:r>
+        <w:rPr>
+          <w:rFonts w:eastAsia="Times New Roman" w:cs="Times New Roman"/>
+          <w:szCs w:val="23"/>
+          <w:highlight w:val="green"/>
+          <w:lang w:eastAsia="pt-BR"/>
+        </w:rPr>
+        <w:t>{{</w:t>
+      </w:r>
+      <w:r>
+        <w:rPr>
+          <w:rFonts w:eastAsia="Times New Roman" w:cs="Times New Roman"/>
+          <w:szCs w:val="23"/>
+          <w:highlight w:val="green"/>
+          <w:lang w:eastAsia="pt-BR"/>
+        </w:rPr>
+        <w:t>auto</w:t>
+      </w:r>
+      <w:r>
+        <w:rPr>
+          <w:rFonts w:eastAsia="Times New Roman" w:cs="Times New Roman"/>
+          <w:szCs w:val="23"/>
+          <w:highlight w:val="green"/>
+          <w:lang w:eastAsia="pt-BR"/>
+        </w:rPr>
+        <w:t>}}</w:t>
       </w:r>
     </w:p>
     <w:p>
@@ -40384,6 +40411,94 @@
       </w:r>
     </w:p>
     <w:p>
+      <w:pPr>
+        <w:ind w:firstLine="0"/>
+        <w:rPr>
+          <w:color w:val="EE0000"/>
+        </w:rPr>
+      </w:pPr>
+      <w:r>
+        <w:rPr>
+          <w:color w:val="EE0000"/>
+        </w:rPr>
+        <w:t>{%</w:t>
+      </w:r>
+      <w:r>
+        <w:rPr>
+          <w:color w:val="EE0000"/>
+        </w:rPr>
+        <w:t>p</w:t>
+      </w:r>
+      <w:r>
+        <w:rPr>
+          <w:color w:val="EE0000"/>
+        </w:rPr>
+        <w:t xml:space="preserve"> </w:t>
+      </w:r>
+      <w:proofErr w:type="spellStart"/>
+      <w:r>
+        <w:rPr>
+          <w:color w:val="EE0000"/>
+        </w:rPr>
+        <w:t>if</w:t>
+      </w:r>
+      <w:proofErr w:type="spellEnd"/>
+      <w:r>
+        <w:rPr>
+          <w:color w:val="EE0000"/>
+        </w:rPr>
+        <w:t xml:space="preserve"> </w:t>
+      </w:r>
+      <w:proofErr w:type="spellStart"/>
+      <w:proofErr w:type="gramStart"/>
+      <w:r>
+        <w:rPr>
+          <w:color w:val="EE0000"/>
+        </w:rPr>
+        <w:t>resumo</w:t>
+      </w:r>
+      <w:r>
+        <w:rPr>
+          <w:color w:val="EE0000"/>
+        </w:rPr>
+        <w:t>.</w:t>
+      </w:r>
+      <w:r>
+        <w:rPr>
+          <w:color w:val="EE0000"/>
+        </w:rPr>
+        <w:t>encadeamento</w:t>
+      </w:r>
+      <w:proofErr w:type="gramEnd"/>
+      <w:r>
+        <w:rPr>
+          <w:color w:val="EE0000"/>
+        </w:rPr>
+        <w:t>_</w:t>
+      </w:r>
+      <w:proofErr w:type="gramStart"/>
+      <w:r>
+        <w:rPr>
+          <w:color w:val="EE0000"/>
+        </w:rPr>
+        <w:t>operacoes</w:t>
+      </w:r>
+      <w:r>
+        <w:rPr>
+          <w:color w:val="EE0000"/>
+        </w:rPr>
+        <w:t>.aplicavel</w:t>
+      </w:r>
+      <w:proofErr w:type="spellEnd"/>
+      <w:proofErr w:type="gramEnd"/>
+      <w:r>
+        <w:rPr>
+          <w:color w:val="EE0000"/>
+        </w:rPr>
+        <w:t xml:space="preserve"> %}</w:t>
+      </w:r>
+    </w:p>
+    <w:p>
       <w:r>
         <w:t xml:space="preserve">Constatou-se o encadeamento entre operações: na movimentação no extrato da conta corrente, acostada aos autos pela requerente, vê-se os créditos da operação </w:t>
       </w:r>
@@ -40405,18 +40520,140 @@
       </w:r>
     </w:p>
     <w:p>
+      <w:pPr>
+        <w:pStyle w:val="List1"/>
+        <w:numPr>
+          <w:ilvl w:val="0"/>
+          <w:numId w:val="0"/>
+        </w:numPr>
+        <w:spacing w:before="100" w:beforeAutospacing="1" w:after="100" w:afterAutospacing="1"/>
+        <w:contextualSpacing/>
+        <w:rPr>
+          <w:color w:val="EE0000"/>
+        </w:rPr>
+      </w:pPr>
+      <w:r>
+        <w:rPr>
+          <w:color w:val="EE0000"/>
+        </w:rPr>
+        <w:t xml:space="preserve">{%p </w:t>
+      </w:r>
+      <w:proofErr w:type="spellStart"/>
+      <w:r>
+        <w:rPr>
+          <w:color w:val="EE0000"/>
+        </w:rPr>
+        <w:t>endif</w:t>
+      </w:r>
+      <w:proofErr w:type="spellEnd"/>
+      <w:r>
+        <w:rPr>
+          <w:color w:val="EE0000"/>
+        </w:rPr>
+        <w:t xml:space="preserve"> %}</w:t>
+      </w:r>
+    </w:p>
+    <w:p>
       <w:r>
         <w:t>---------------------------------------------------------------------------------</w:t>
       </w:r>
     </w:p>
     <w:p>
+      <w:pPr>
+        <w:ind w:firstLine="0"/>
+        <w:rPr>
+          <w:color w:val="EE0000"/>
+        </w:rPr>
+      </w:pPr>
+      <w:r>
+        <w:rPr>
+          <w:color w:val="EE0000"/>
+        </w:rPr>
+        <w:lastRenderedPageBreak/>
+        <w:t>{%</w:t>
+      </w:r>
+      <w:r>
+        <w:rPr>
+          <w:color w:val="EE0000"/>
+        </w:rPr>
+        <w:t>p</w:t>
+      </w:r>
+      <w:r>
+        <w:rPr>
+          <w:color w:val="EE0000"/>
+        </w:rPr>
+        <w:t xml:space="preserve"> </w:t>
+      </w:r>
+      <w:proofErr w:type="spellStart"/>
+      <w:r>
+        <w:rPr>
+          <w:color w:val="EE0000"/>
+        </w:rPr>
+        <w:t>if</w:t>
+      </w:r>
+      <w:proofErr w:type="spellEnd"/>
+      <w:r>
+        <w:rPr>
+          <w:color w:val="EE0000"/>
+        </w:rPr>
+        <w:t xml:space="preserve"> </w:t>
+      </w:r>
+      <w:proofErr w:type="spellStart"/>
+      <w:proofErr w:type="gramStart"/>
+      <w:r>
+        <w:rPr>
+          <w:color w:val="EE0000"/>
+        </w:rPr>
+        <w:t>resumo</w:t>
+      </w:r>
+      <w:r>
+        <w:rPr>
+          <w:color w:val="EE0000"/>
+        </w:rPr>
+        <w:t>.</w:t>
+      </w:r>
+      <w:r>
+        <w:rPr>
+          <w:color w:val="EE0000"/>
+        </w:rPr>
+        <w:t>juros</w:t>
+      </w:r>
+      <w:proofErr w:type="gramEnd"/>
+      <w:r>
+        <w:rPr>
+          <w:color w:val="EE0000"/>
+        </w:rPr>
+        <w:t>_remuneratorios_</w:t>
+      </w:r>
+      <w:proofErr w:type="gramStart"/>
+      <w:r>
+        <w:rPr>
+          <w:color w:val="EE0000"/>
+        </w:rPr>
+        <w:t>irregulares</w:t>
+      </w:r>
+      <w:r>
+        <w:rPr>
+          <w:color w:val="EE0000"/>
+        </w:rPr>
+        <w:t>.aplicavel</w:t>
+      </w:r>
+      <w:proofErr w:type="spellEnd"/>
+      <w:proofErr w:type="gramEnd"/>
+      <w:r>
+        <w:rPr>
+          <w:color w:val="EE0000"/>
+        </w:rPr>
+        <w:t xml:space="preserve"> %}</w:t>
+      </w:r>
+    </w:p>
+    <w:p>
       <w:r>
         <w:t>A taxa de juros praticada foi extremamente superior à taxa limitada de 12,00% a.a. para operações de crédito rural. Diante disso, no recálculo realizado, considerando a finalidade rural do crédito e a legislação aplicável, deve-se limitar os encargos à taxa de 12,00% a.a.</w:t>
       </w:r>
     </w:p>
     <w:p>
       <w:r>
-        <w:lastRenderedPageBreak/>
         <w:t xml:space="preserve">Os juros remuneratórios praticados foram cobrados à taxa muito superior que a média de mercado para o mesmo tipo de operação, onerando excessivamente </w:t>
       </w:r>
       <w:r>
@@ -40438,6 +40675,120 @@
     <w:p>
       <w:r>
         <w:t>Ademais, a taxa de juros praticada foi extremamente superior à taxa limitada de 12,00% a.a. para operações de crédito rural. Diante disso, caso não seja esse o entendimento sobre limitar a taxa de juros à taxa média de mercado, deve-se limitar à taxa de 12,00% a.a.</w:t>
+      </w:r>
+    </w:p>
+    <w:p>
+      <w:pPr>
+        <w:pStyle w:val="List1"/>
+        <w:numPr>
+          <w:ilvl w:val="0"/>
+          <w:numId w:val="0"/>
+        </w:numPr>
+        <w:spacing w:before="100" w:beforeAutospacing="1" w:after="100" w:afterAutospacing="1"/>
+        <w:contextualSpacing/>
+        <w:rPr>
+          <w:color w:val="EE0000"/>
+        </w:rPr>
+      </w:pPr>
+      <w:r>
+        <w:rPr>
+          <w:color w:val="EE0000"/>
+        </w:rPr>
+        <w:t xml:space="preserve">{%p </w:t>
+      </w:r>
+      <w:proofErr w:type="spellStart"/>
+      <w:r>
+        <w:rPr>
+          <w:color w:val="EE0000"/>
+        </w:rPr>
+        <w:t>endif</w:t>
+      </w:r>
+      <w:proofErr w:type="spellEnd"/>
+      <w:r>
+        <w:rPr>
+          <w:color w:val="EE0000"/>
+        </w:rPr>
+        <w:t xml:space="preserve"> %}</w:t>
+      </w:r>
+    </w:p>
+    <w:p>
+      <w:pPr>
+        <w:ind w:firstLine="0"/>
+        <w:rPr>
+          <w:color w:val="EE0000"/>
+        </w:rPr>
+      </w:pPr>
+      <w:r>
+        <w:rPr>
+          <w:color w:val="EE0000"/>
+        </w:rPr>
+        <w:t>{%</w:t>
+      </w:r>
+      <w:r>
+        <w:rPr>
+          <w:color w:val="EE0000"/>
+        </w:rPr>
+        <w:t>p</w:t>
+      </w:r>
+      <w:r>
+        <w:rPr>
+          <w:color w:val="EE0000"/>
+        </w:rPr>
+        <w:t xml:space="preserve"> </w:t>
+      </w:r>
+      <w:proofErr w:type="spellStart"/>
+      <w:r>
+        <w:rPr>
+          <w:color w:val="EE0000"/>
+        </w:rPr>
+        <w:t>if</w:t>
+      </w:r>
+      <w:proofErr w:type="spellEnd"/>
+      <w:r>
+        <w:rPr>
+          <w:color w:val="EE0000"/>
+        </w:rPr>
+        <w:t xml:space="preserve"> </w:t>
+      </w:r>
+      <w:proofErr w:type="spellStart"/>
+      <w:r>
+        <w:rPr>
+          <w:color w:val="EE0000"/>
+        </w:rPr>
+        <w:t>resumo</w:t>
+      </w:r>
+      <w:r>
+        <w:rPr>
+          <w:color w:val="EE0000"/>
+        </w:rPr>
+        <w:t>.</w:t>
+      </w:r>
+      <w:r>
+        <w:rPr>
+          <w:color w:val="EE0000"/>
+        </w:rPr>
+        <w:t>cdi_indevida_com_</w:t>
+      </w:r>
+      <w:proofErr w:type="gramStart"/>
+      <w:r>
+        <w:rPr>
+          <w:color w:val="EE0000"/>
+        </w:rPr>
+        <w:t>encargo</w:t>
+      </w:r>
+      <w:r>
+        <w:rPr>
+          <w:color w:val="EE0000"/>
+        </w:rPr>
+        <w:t>.aplicavel</w:t>
+      </w:r>
+      <w:proofErr w:type="spellEnd"/>
+      <w:proofErr w:type="gramEnd"/>
+      <w:r>
+        <w:rPr>
+          <w:color w:val="EE0000"/>
+        </w:rPr>
+        <w:t xml:space="preserve"> %}</w:t>
       </w:r>
     </w:p>
     <w:p>
@@ -40524,7 +40875,130 @@
       </w:r>
     </w:p>
     <w:p>
-      <w:r>
+      <w:pPr>
+        <w:pStyle w:val="List1"/>
+        <w:numPr>
+          <w:ilvl w:val="0"/>
+          <w:numId w:val="0"/>
+        </w:numPr>
+        <w:spacing w:before="100" w:beforeAutospacing="1" w:after="100" w:afterAutospacing="1"/>
+        <w:contextualSpacing/>
+        <w:rPr>
+          <w:color w:val="EE0000"/>
+        </w:rPr>
+      </w:pPr>
+      <w:r>
+        <w:rPr>
+          <w:color w:val="EE0000"/>
+        </w:rPr>
+        <w:t xml:space="preserve">{%p </w:t>
+      </w:r>
+      <w:proofErr w:type="spellStart"/>
+      <w:r>
+        <w:rPr>
+          <w:color w:val="EE0000"/>
+        </w:rPr>
+        <w:t>endif</w:t>
+      </w:r>
+      <w:proofErr w:type="spellEnd"/>
+      <w:r>
+        <w:rPr>
+          <w:color w:val="EE0000"/>
+        </w:rPr>
+        <w:t xml:space="preserve"> %}</w:t>
+      </w:r>
+    </w:p>
+    <w:p>
+      <w:pPr>
+        <w:ind w:firstLine="0"/>
+        <w:rPr>
+          <w:color w:val="EE0000"/>
+        </w:rPr>
+      </w:pPr>
+      <w:r>
+        <w:rPr>
+          <w:color w:val="EE0000"/>
+        </w:rPr>
+        <w:t>{%</w:t>
+      </w:r>
+      <w:r>
+        <w:rPr>
+          <w:color w:val="EE0000"/>
+        </w:rPr>
+        <w:t>p</w:t>
+      </w:r>
+      <w:r>
+        <w:rPr>
+          <w:color w:val="EE0000"/>
+        </w:rPr>
+        <w:t xml:space="preserve"> </w:t>
+      </w:r>
+      <w:proofErr w:type="spellStart"/>
+      <w:r>
+        <w:rPr>
+          <w:color w:val="EE0000"/>
+        </w:rPr>
+        <w:t>if</w:t>
+      </w:r>
+      <w:proofErr w:type="spellEnd"/>
+      <w:r>
+        <w:rPr>
+          <w:color w:val="EE0000"/>
+        </w:rPr>
+        <w:t xml:space="preserve"> </w:t>
+      </w:r>
+      <w:proofErr w:type="spellStart"/>
+      <w:proofErr w:type="gramStart"/>
+      <w:r>
+        <w:rPr>
+          <w:color w:val="EE0000"/>
+        </w:rPr>
+        <w:t>resumo</w:t>
+      </w:r>
+      <w:r>
+        <w:rPr>
+          <w:color w:val="EE0000"/>
+        </w:rPr>
+        <w:t>.</w:t>
+      </w:r>
+      <w:r>
+        <w:rPr>
+          <w:color w:val="EE0000"/>
+        </w:rPr>
+        <w:t>capitalizacao</w:t>
+      </w:r>
+      <w:proofErr w:type="gramEnd"/>
+      <w:r>
+        <w:rPr>
+          <w:color w:val="EE0000"/>
+        </w:rPr>
+        <w:t>_sem_</w:t>
+      </w:r>
+      <w:proofErr w:type="gramStart"/>
+      <w:r>
+        <w:rPr>
+          <w:color w:val="EE0000"/>
+        </w:rPr>
+        <w:t>pactuacao</w:t>
+      </w:r>
+      <w:r>
+        <w:rPr>
+          <w:color w:val="EE0000"/>
+        </w:rPr>
+        <w:t>.aplicavel</w:t>
+      </w:r>
+      <w:proofErr w:type="spellEnd"/>
+      <w:proofErr w:type="gramEnd"/>
+      <w:r>
+        <w:rPr>
+          <w:color w:val="EE0000"/>
+        </w:rPr>
+        <w:t xml:space="preserve"> %}</w:t>
+      </w:r>
+    </w:p>
+    <w:p>
+      <w:r>
+        <w:lastRenderedPageBreak/>
         <w:t xml:space="preserve">Verificou-se que foi realizada a capitalização mensal dos juros remuneratórios de normalidade. Em todo caso, após a análise das condições para a expressa pactuação da capitalização e sua periodicidade, verificou-se que </w:t>
       </w:r>
       <w:r>
@@ -40567,6 +41041,128 @@
       </w:r>
     </w:p>
     <w:p>
+      <w:pPr>
+        <w:pStyle w:val="List1"/>
+        <w:numPr>
+          <w:ilvl w:val="0"/>
+          <w:numId w:val="0"/>
+        </w:numPr>
+        <w:spacing w:before="100" w:beforeAutospacing="1" w:after="100" w:afterAutospacing="1"/>
+        <w:contextualSpacing/>
+        <w:rPr>
+          <w:color w:val="EE0000"/>
+        </w:rPr>
+      </w:pPr>
+      <w:r>
+        <w:rPr>
+          <w:color w:val="EE0000"/>
+        </w:rPr>
+        <w:t xml:space="preserve">{%p </w:t>
+      </w:r>
+      <w:proofErr w:type="spellStart"/>
+      <w:r>
+        <w:rPr>
+          <w:color w:val="EE0000"/>
+        </w:rPr>
+        <w:t>endif</w:t>
+      </w:r>
+      <w:proofErr w:type="spellEnd"/>
+      <w:r>
+        <w:rPr>
+          <w:color w:val="EE0000"/>
+        </w:rPr>
+        <w:t xml:space="preserve"> %}</w:t>
+      </w:r>
+    </w:p>
+    <w:p>
+      <w:pPr>
+        <w:ind w:firstLine="0"/>
+        <w:rPr>
+          <w:color w:val="EE0000"/>
+        </w:rPr>
+      </w:pPr>
+      <w:r>
+        <w:rPr>
+          <w:color w:val="EE0000"/>
+        </w:rPr>
+        <w:t>{%</w:t>
+      </w:r>
+      <w:r>
+        <w:rPr>
+          <w:color w:val="EE0000"/>
+        </w:rPr>
+        <w:t>p</w:t>
+      </w:r>
+      <w:r>
+        <w:rPr>
+          <w:color w:val="EE0000"/>
+        </w:rPr>
+        <w:t xml:space="preserve"> </w:t>
+      </w:r>
+      <w:proofErr w:type="spellStart"/>
+      <w:r>
+        <w:rPr>
+          <w:color w:val="EE0000"/>
+        </w:rPr>
+        <w:t>if</w:t>
+      </w:r>
+      <w:proofErr w:type="spellEnd"/>
+      <w:r>
+        <w:rPr>
+          <w:color w:val="EE0000"/>
+        </w:rPr>
+        <w:t xml:space="preserve"> </w:t>
+      </w:r>
+      <w:proofErr w:type="spellStart"/>
+      <w:proofErr w:type="gramStart"/>
+      <w:r>
+        <w:rPr>
+          <w:color w:val="EE0000"/>
+        </w:rPr>
+        <w:t>resumo</w:t>
+      </w:r>
+      <w:r>
+        <w:rPr>
+          <w:color w:val="EE0000"/>
+        </w:rPr>
+        <w:t>.</w:t>
+      </w:r>
+      <w:r>
+        <w:rPr>
+          <w:color w:val="EE0000"/>
+        </w:rPr>
+        <w:t>cobranca</w:t>
+      </w:r>
+      <w:proofErr w:type="gramEnd"/>
+      <w:r>
+        <w:rPr>
+          <w:color w:val="EE0000"/>
+        </w:rPr>
+        <w:t>_indevida_seguros_</w:t>
+      </w:r>
+      <w:proofErr w:type="gramStart"/>
+      <w:r>
+        <w:rPr>
+          <w:color w:val="EE0000"/>
+        </w:rPr>
+        <w:t>tarifa</w:t>
+      </w:r>
+      <w:r>
+        <w:rPr>
+          <w:color w:val="EE0000"/>
+        </w:rPr>
+        <w:t>.aplicavel</w:t>
+      </w:r>
+      <w:proofErr w:type="spellEnd"/>
+      <w:proofErr w:type="gramEnd"/>
+      <w:r>
+        <w:rPr>
+          <w:color w:val="EE0000"/>
+        </w:rPr>
+        <w:t xml:space="preserve"> %}</w:t>
+      </w:r>
+    </w:p>
+    <w:p>
       <w:r>
         <w:t>Ainda, foi constatada a cobrança de seguro</w:t>
       </w:r>
@@ -40589,29 +41185,148 @@
         <w:t>custeio</w:t>
       </w:r>
       <w:r>
-        <w:t xml:space="preserve">, </w:t>
-      </w:r>
+        <w:t xml:space="preserve">, é considerada venda casada. Também não há informações claras sobre as condições da contratação. Foi identificada também a cobrança de tarifa de estudos de operações, sobre a qual se entende que se trata de um custo da instituição que não pode ser repassado </w:t>
+      </w:r>
+      <w:r>
+        <w:rPr>
+          <w:highlight w:val="yellow"/>
+        </w:rPr>
+        <w:t>ao produtor.</w:t>
+      </w:r>
+      <w:r>
+        <w:t xml:space="preserve"> Diante de tais irregularidades, as cobranças foram estornadas no recálculo da operação.</w:t>
+      </w:r>
+    </w:p>
+    <w:p>
+      <w:pPr>
+        <w:pStyle w:val="List1"/>
+        <w:numPr>
+          <w:ilvl w:val="0"/>
+          <w:numId w:val="0"/>
+        </w:numPr>
+        <w:spacing w:before="100" w:beforeAutospacing="1" w:after="100" w:afterAutospacing="1"/>
+        <w:contextualSpacing/>
+        <w:rPr>
+          <w:color w:val="EE0000"/>
+        </w:rPr>
+      </w:pPr>
+      <w:r>
+        <w:rPr>
+          <w:color w:val="EE0000"/>
+        </w:rPr>
+        <w:t xml:space="preserve">{%p </w:t>
+      </w:r>
+      <w:proofErr w:type="spellStart"/>
+      <w:r>
+        <w:rPr>
+          <w:color w:val="EE0000"/>
+        </w:rPr>
+        <w:t>endif</w:t>
+      </w:r>
+      <w:proofErr w:type="spellEnd"/>
+      <w:r>
+        <w:rPr>
+          <w:color w:val="EE0000"/>
+        </w:rPr>
+        <w:t xml:space="preserve"> %}</w:t>
+      </w:r>
+    </w:p>
+    <w:p>
+      <w:pPr>
+        <w:ind w:firstLine="0"/>
+        <w:rPr>
+          <w:color w:val="EE0000"/>
+        </w:rPr>
+      </w:pPr>
+      <w:r>
+        <w:rPr>
+          <w:color w:val="EE0000"/>
+        </w:rPr>
+        <w:t>{%</w:t>
+      </w:r>
+      <w:r>
+        <w:rPr>
+          <w:color w:val="EE0000"/>
+        </w:rPr>
+        <w:t>p</w:t>
+      </w:r>
+      <w:r>
+        <w:rPr>
+          <w:color w:val="EE0000"/>
+        </w:rPr>
+        <w:t xml:space="preserve"> </w:t>
+      </w:r>
+      <w:proofErr w:type="spellStart"/>
+      <w:r>
+        <w:rPr>
+          <w:color w:val="EE0000"/>
+        </w:rPr>
+        <w:t>if</w:t>
+      </w:r>
+      <w:proofErr w:type="spellEnd"/>
+      <w:r>
+        <w:rPr>
+          <w:color w:val="EE0000"/>
+        </w:rPr>
+        <w:t xml:space="preserve"> </w:t>
+      </w:r>
+      <w:proofErr w:type="spellStart"/>
+      <w:proofErr w:type="gramStart"/>
+      <w:r>
+        <w:rPr>
+          <w:color w:val="EE0000"/>
+        </w:rPr>
+        <w:t>resumo</w:t>
+      </w:r>
+      <w:r>
+        <w:rPr>
+          <w:color w:val="EE0000"/>
+        </w:rPr>
+        <w:t>.</w:t>
+      </w:r>
+      <w:r>
+        <w:rPr>
+          <w:color w:val="EE0000"/>
+        </w:rPr>
+        <w:t>inadimplemento</w:t>
+      </w:r>
+      <w:proofErr w:type="gramEnd"/>
+      <w:r>
+        <w:rPr>
+          <w:color w:val="EE0000"/>
+        </w:rPr>
+        <w:t>_ilegal_</w:t>
+      </w:r>
+      <w:proofErr w:type="gramStart"/>
+      <w:r>
+        <w:rPr>
+          <w:color w:val="EE0000"/>
+        </w:rPr>
+        <w:t>oneroso</w:t>
+      </w:r>
+      <w:r>
+        <w:rPr>
+          <w:color w:val="EE0000"/>
+        </w:rPr>
+        <w:t>.aplicavel</w:t>
+      </w:r>
+      <w:proofErr w:type="spellEnd"/>
+      <w:proofErr w:type="gramEnd"/>
+      <w:r>
+        <w:rPr>
+          <w:color w:val="EE0000"/>
+        </w:rPr>
+        <w:t xml:space="preserve"> %}</w:t>
+      </w:r>
+    </w:p>
+    <w:p>
+      <w:r>
+        <w:t xml:space="preserve">Para o período de inadimplemento da operação, o banco pactuou a cobrança de comissão de permanência, mas sabendo do desacordo com a legislação para crédito rural, a instituição financeira realizou, na ficha gráfica apresentada, a apuração do inadimplemento com juros remuneratórios de normalidade, juros moratórios de 1,00% a.a. e multa contratual de 2,00%. Enquanto a cobrança de juros moratórios independe de previsão contratual para sua aplicação - diante de imposição legal, a multa contratual se trata de uma cláusula penal para quem atrasa o pagamento, devendo estar expressamente pactuada em contrato, o que não ocorreu no caso em tela, de modo que a cobrança da multa de 2,00% é indevida. </w:t>
+      </w:r>
+    </w:p>
+    <w:p>
       <w:r>
         <w:lastRenderedPageBreak/>
-        <w:t xml:space="preserve">é considerada venda casada. Também não há informações claras sobre as condições da contratação. Foi identificada também a cobrança de tarifa de estudos de operações, sobre a qual se entende que se trata de um custo da instituição que não pode ser repassado </w:t>
-      </w:r>
-      <w:r>
-        <w:rPr>
-          <w:highlight w:val="yellow"/>
-        </w:rPr>
-        <w:t>ao produtor.</w:t>
-      </w:r>
-      <w:r>
-        <w:t xml:space="preserve"> Diante de tais irregularidades, as cobranças foram estornadas no recálculo da operação.</w:t>
-      </w:r>
-    </w:p>
-    <w:p>
-      <w:r>
-        <w:t xml:space="preserve">Para o período de inadimplemento da operação, o banco pactuou a cobrança de comissão de permanência, mas sabendo do desacordo com a legislação para crédito rural, a instituição financeira realizou, na ficha gráfica apresentada, a apuração do inadimplemento com juros remuneratórios de normalidade, juros moratórios de 1,00% a.a. e multa contratual de 2,00%. Enquanto a cobrança de juros moratórios independe de previsão contratual para sua aplicação - diante de imposição legal, a multa contratual se trata de uma cláusula penal para quem atrasa o pagamento, devendo estar expressamente pactuada em contrato, o que não ocorreu no caso em tela, de modo que a cobrança da multa de 2,00% é indevida. </w:t>
-      </w:r>
-    </w:p>
-    <w:p>
-      <w:r>
         <w:t>Destaca-se ainda que os juros remuneratórios cobrados no período de inadimplemento também foram capitalizados mensalmente, mas ressalta-se que eles devem seguir o mesmo fluxo de capitalização do período de normalidade – isto é, a capitalização deve ser afastada.</w:t>
       </w:r>
     </w:p>
@@ -40666,8 +41381,129 @@
       </w:r>
     </w:p>
     <w:p>
-      <w:r>
-        <w:lastRenderedPageBreak/>
+      <w:pPr>
+        <w:pStyle w:val="List1"/>
+        <w:numPr>
+          <w:ilvl w:val="0"/>
+          <w:numId w:val="0"/>
+        </w:numPr>
+        <w:spacing w:before="100" w:beforeAutospacing="1" w:after="100" w:afterAutospacing="1"/>
+        <w:contextualSpacing/>
+        <w:rPr>
+          <w:color w:val="EE0000"/>
+        </w:rPr>
+      </w:pPr>
+      <w:r>
+        <w:rPr>
+          <w:color w:val="EE0000"/>
+        </w:rPr>
+        <w:t xml:space="preserve">{%p </w:t>
+      </w:r>
+      <w:proofErr w:type="spellStart"/>
+      <w:r>
+        <w:rPr>
+          <w:color w:val="EE0000"/>
+        </w:rPr>
+        <w:t>endif</w:t>
+      </w:r>
+      <w:proofErr w:type="spellEnd"/>
+      <w:r>
+        <w:rPr>
+          <w:color w:val="EE0000"/>
+        </w:rPr>
+        <w:t xml:space="preserve"> %}</w:t>
+      </w:r>
+    </w:p>
+    <w:p>
+      <w:pPr>
+        <w:ind w:firstLine="0"/>
+        <w:rPr>
+          <w:color w:val="EE0000"/>
+        </w:rPr>
+      </w:pPr>
+      <w:r>
+        <w:rPr>
+          <w:color w:val="EE0000"/>
+        </w:rPr>
+        <w:t>{%</w:t>
+      </w:r>
+      <w:r>
+        <w:rPr>
+          <w:color w:val="EE0000"/>
+        </w:rPr>
+        <w:t>p</w:t>
+      </w:r>
+      <w:r>
+        <w:rPr>
+          <w:color w:val="EE0000"/>
+        </w:rPr>
+        <w:t xml:space="preserve"> </w:t>
+      </w:r>
+      <w:proofErr w:type="spellStart"/>
+      <w:r>
+        <w:rPr>
+          <w:color w:val="EE0000"/>
+        </w:rPr>
+        <w:t>if</w:t>
+      </w:r>
+      <w:proofErr w:type="spellEnd"/>
+      <w:r>
+        <w:rPr>
+          <w:color w:val="EE0000"/>
+        </w:rPr>
+        <w:t xml:space="preserve"> </w:t>
+      </w:r>
+      <w:proofErr w:type="spellStart"/>
+      <w:proofErr w:type="gramStart"/>
+      <w:r>
+        <w:rPr>
+          <w:color w:val="EE0000"/>
+        </w:rPr>
+        <w:t>resumo</w:t>
+      </w:r>
+      <w:r>
+        <w:rPr>
+          <w:color w:val="EE0000"/>
+        </w:rPr>
+        <w:t>.</w:t>
+      </w:r>
+      <w:r>
+        <w:rPr>
+          <w:color w:val="EE0000"/>
+        </w:rPr>
+        <w:t>encadeamento</w:t>
+      </w:r>
+      <w:proofErr w:type="gramEnd"/>
+      <w:r>
+        <w:rPr>
+          <w:color w:val="EE0000"/>
+        </w:rPr>
+        <w:t>_</w:t>
+      </w:r>
+      <w:proofErr w:type="gramStart"/>
+      <w:r>
+        <w:rPr>
+          <w:color w:val="EE0000"/>
+        </w:rPr>
+        <w:t>operacoes</w:t>
+      </w:r>
+      <w:r>
+        <w:rPr>
+          <w:color w:val="EE0000"/>
+        </w:rPr>
+        <w:t>.aplicavel</w:t>
+      </w:r>
+      <w:proofErr w:type="spellEnd"/>
+      <w:proofErr w:type="gramEnd"/>
+      <w:r>
+        <w:rPr>
+          <w:color w:val="EE0000"/>
+        </w:rPr>
+        <w:t xml:space="preserve"> %}</w:t>
+      </w:r>
+    </w:p>
+    <w:p>
+      <w:r>
         <w:t>----</w:t>
       </w:r>
     </w:p>
@@ -40729,7 +41565,11 @@
         <w:t>cobrança/execução</w:t>
       </w:r>
       <w:r>
-        <w:t xml:space="preserve">. Por sua vez, considerando os termos do Art. 42, parágrafo único, do Código de Defesa do Consumidor, o valor já pago indevidamente a maior (isto é, a diferença apurada até a data da última amortização – R$ </w:t>
+        <w:t xml:space="preserve">. Por sua vez, </w:t>
+      </w:r>
+      <w:r>
+        <w:lastRenderedPageBreak/>
+        <w:t xml:space="preserve">considerando os termos do Art. 42, parágrafo único, do Código de Defesa do Consumidor, o valor já pago indevidamente a maior (isto é, a diferença apurada até a data da última amortização – R$ </w:t>
       </w:r>
       <w:proofErr w:type="spellStart"/>
       <w:r>
@@ -40865,6 +41705,128 @@
     </w:p>
     <w:p>
       <w:pPr>
+        <w:pStyle w:val="List1"/>
+        <w:numPr>
+          <w:ilvl w:val="0"/>
+          <w:numId w:val="0"/>
+        </w:numPr>
+        <w:spacing w:before="100" w:beforeAutospacing="1" w:after="100" w:afterAutospacing="1"/>
+        <w:contextualSpacing/>
+        <w:rPr>
+          <w:color w:val="EE0000"/>
+        </w:rPr>
+      </w:pPr>
+      <w:r>
+        <w:rPr>
+          <w:color w:val="EE0000"/>
+        </w:rPr>
+        <w:t xml:space="preserve">{%p </w:t>
+      </w:r>
+      <w:proofErr w:type="spellStart"/>
+      <w:r>
+        <w:rPr>
+          <w:color w:val="EE0000"/>
+        </w:rPr>
+        <w:t>endif</w:t>
+      </w:r>
+      <w:proofErr w:type="spellEnd"/>
+      <w:r>
+        <w:rPr>
+          <w:color w:val="EE0000"/>
+        </w:rPr>
+        <w:t xml:space="preserve"> %}</w:t>
+      </w:r>
+    </w:p>
+    <w:p>
+      <w:pPr>
+        <w:ind w:firstLine="0"/>
+        <w:rPr>
+          <w:color w:val="EE0000"/>
+        </w:rPr>
+      </w:pPr>
+      <w:r>
+        <w:rPr>
+          <w:color w:val="EE0000"/>
+        </w:rPr>
+        <w:t>{%</w:t>
+      </w:r>
+      <w:r>
+        <w:rPr>
+          <w:color w:val="EE0000"/>
+        </w:rPr>
+        <w:t>p</w:t>
+      </w:r>
+      <w:r>
+        <w:rPr>
+          <w:color w:val="EE0000"/>
+        </w:rPr>
+        <w:t xml:space="preserve"> </w:t>
+      </w:r>
+      <w:proofErr w:type="spellStart"/>
+      <w:r>
+        <w:rPr>
+          <w:color w:val="EE0000"/>
+        </w:rPr>
+        <w:t>if</w:t>
+      </w:r>
+      <w:proofErr w:type="spellEnd"/>
+      <w:r>
+        <w:rPr>
+          <w:color w:val="EE0000"/>
+        </w:rPr>
+        <w:t xml:space="preserve"> </w:t>
+      </w:r>
+      <w:proofErr w:type="spellStart"/>
+      <w:proofErr w:type="gramStart"/>
+      <w:r>
+        <w:rPr>
+          <w:color w:val="EE0000"/>
+        </w:rPr>
+        <w:t>resumo</w:t>
+      </w:r>
+      <w:r>
+        <w:rPr>
+          <w:color w:val="EE0000"/>
+        </w:rPr>
+        <w:t>.</w:t>
+      </w:r>
+      <w:r>
+        <w:rPr>
+          <w:color w:val="EE0000"/>
+        </w:rPr>
+        <w:t>juros</w:t>
+      </w:r>
+      <w:proofErr w:type="gramEnd"/>
+      <w:r>
+        <w:rPr>
+          <w:color w:val="EE0000"/>
+        </w:rPr>
+        <w:t>_remuneratorios_</w:t>
+      </w:r>
+      <w:proofErr w:type="gramStart"/>
+      <w:r>
+        <w:rPr>
+          <w:color w:val="EE0000"/>
+        </w:rPr>
+        <w:t>irregulares</w:t>
+      </w:r>
+      <w:r>
+        <w:rPr>
+          <w:color w:val="EE0000"/>
+        </w:rPr>
+        <w:t>.aplicavel</w:t>
+      </w:r>
+      <w:proofErr w:type="spellEnd"/>
+      <w:proofErr w:type="gramEnd"/>
+      <w:r>
+        <w:rPr>
+          <w:color w:val="EE0000"/>
+        </w:rPr>
+        <w:t xml:space="preserve"> %}</w:t>
+      </w:r>
+    </w:p>
+    <w:p>
+      <w:pPr>
         <w:rPr>
           <w:color w:val="FF0000"/>
         </w:rPr>
@@ -40971,6 +41933,120 @@
     </w:p>
     <w:p>
       <w:pPr>
+        <w:pStyle w:val="List1"/>
+        <w:numPr>
+          <w:ilvl w:val="0"/>
+          <w:numId w:val="0"/>
+        </w:numPr>
+        <w:spacing w:before="100" w:beforeAutospacing="1" w:after="100" w:afterAutospacing="1"/>
+        <w:contextualSpacing/>
+        <w:rPr>
+          <w:color w:val="EE0000"/>
+        </w:rPr>
+      </w:pPr>
+      <w:r>
+        <w:rPr>
+          <w:color w:val="EE0000"/>
+        </w:rPr>
+        <w:t xml:space="preserve">{%p </w:t>
+      </w:r>
+      <w:proofErr w:type="spellStart"/>
+      <w:r>
+        <w:rPr>
+          <w:color w:val="EE0000"/>
+        </w:rPr>
+        <w:t>endif</w:t>
+      </w:r>
+      <w:proofErr w:type="spellEnd"/>
+      <w:r>
+        <w:rPr>
+          <w:color w:val="EE0000"/>
+        </w:rPr>
+        <w:t xml:space="preserve"> %}</w:t>
+      </w:r>
+    </w:p>
+    <w:p>
+      <w:pPr>
+        <w:ind w:firstLine="0"/>
+        <w:rPr>
+          <w:color w:val="EE0000"/>
+        </w:rPr>
+      </w:pPr>
+      <w:r>
+        <w:rPr>
+          <w:color w:val="EE0000"/>
+        </w:rPr>
+        <w:t>{%</w:t>
+      </w:r>
+      <w:r>
+        <w:rPr>
+          <w:color w:val="EE0000"/>
+        </w:rPr>
+        <w:t>p</w:t>
+      </w:r>
+      <w:r>
+        <w:rPr>
+          <w:color w:val="EE0000"/>
+        </w:rPr>
+        <w:t xml:space="preserve"> </w:t>
+      </w:r>
+      <w:proofErr w:type="spellStart"/>
+      <w:r>
+        <w:rPr>
+          <w:color w:val="EE0000"/>
+        </w:rPr>
+        <w:t>if</w:t>
+      </w:r>
+      <w:proofErr w:type="spellEnd"/>
+      <w:r>
+        <w:rPr>
+          <w:color w:val="EE0000"/>
+        </w:rPr>
+        <w:t xml:space="preserve"> </w:t>
+      </w:r>
+      <w:proofErr w:type="spellStart"/>
+      <w:r>
+        <w:rPr>
+          <w:color w:val="EE0000"/>
+        </w:rPr>
+        <w:t>resumo</w:t>
+      </w:r>
+      <w:r>
+        <w:rPr>
+          <w:color w:val="EE0000"/>
+        </w:rPr>
+        <w:t>.</w:t>
+      </w:r>
+      <w:r>
+        <w:rPr>
+          <w:color w:val="EE0000"/>
+        </w:rPr>
+        <w:t>cdi_indevida_com_</w:t>
+      </w:r>
+      <w:proofErr w:type="gramStart"/>
+      <w:r>
+        <w:rPr>
+          <w:color w:val="EE0000"/>
+        </w:rPr>
+        <w:t>encargo</w:t>
+      </w:r>
+      <w:r>
+        <w:rPr>
+          <w:color w:val="EE0000"/>
+        </w:rPr>
+        <w:t>.aplicavel</w:t>
+      </w:r>
+      <w:proofErr w:type="spellEnd"/>
+      <w:proofErr w:type="gramEnd"/>
+      <w:r>
+        <w:rPr>
+          <w:color w:val="EE0000"/>
+        </w:rPr>
+        <w:t xml:space="preserve"> %}</w:t>
+      </w:r>
+    </w:p>
+    <w:p>
+      <w:pPr>
         <w:rPr>
           <w:rFonts w:eastAsia="Times New Roman"/>
           <w:lang w:eastAsia="pt-BR"/>
@@ -40998,24 +42074,17 @@
           <w:rFonts w:eastAsia="Times New Roman"/>
           <w:lang w:eastAsia="pt-BR"/>
         </w:rPr>
-        <w:t xml:space="preserve">há abusividade da </w:t>
-      </w:r>
-      <w:r>
-        <w:rPr>
-          <w:rFonts w:eastAsia="Times New Roman"/>
-          <w:lang w:eastAsia="pt-BR"/>
-        </w:rPr>
+        <w:t>há abusividade da cobrança dos encargos básicos ao utilizar a taxa referente ao CDI. Além disso, sua cobrança onera sobremaneira a contratação do crédito. Diante disso, estornamos os valores referentes ao CDI.</w:t>
+      </w:r>
+    </w:p>
+    <w:p>
+      <w:pPr>
+        <w:rPr>
+          <w:rFonts w:eastAsia="Times New Roman"/>
+        </w:rPr>
+      </w:pPr>
+      <w:r>
         <w:lastRenderedPageBreak/>
-        <w:t>cobrança dos encargos básicos ao utilizar a taxa referente ao CDI. Além disso, sua cobrança onera sobremaneira a contratação do crédito. Diante disso, estornamos os valores referentes ao CDI.</w:t>
-      </w:r>
-    </w:p>
-    <w:p>
-      <w:pPr>
-        <w:rPr>
-          <w:rFonts w:eastAsia="Times New Roman"/>
-        </w:rPr>
-      </w:pPr>
-      <w:r>
         <w:t xml:space="preserve">Ainda, foi possível observar que a taxa da renegociação 280826-4 foi muito superior à taxa das </w:t>
       </w:r>
       <w:r>
@@ -41023,6 +42092,40 @@
           <w:rFonts w:eastAsia="Times New Roman"/>
         </w:rPr>
         <w:t>operações recepcionadas 197947-8 e 258938-5. Assim, caso não se entenda pela aplicação da taxa média de mercado para a operação de renegociação objeto de execução, deve-se limitar a taxa de juros às taxas pactuadas nos contratos originários, de maneira proporcional aos saldos recepcionados, com vistas a manter o equilíbrio da relação contratual.</w:t>
+      </w:r>
+    </w:p>
+    <w:p>
+      <w:pPr>
+        <w:pStyle w:val="List1"/>
+        <w:numPr>
+          <w:ilvl w:val="0"/>
+          <w:numId w:val="0"/>
+        </w:numPr>
+        <w:spacing w:before="100" w:beforeAutospacing="1" w:after="100" w:afterAutospacing="1"/>
+        <w:contextualSpacing/>
+        <w:rPr>
+          <w:color w:val="EE0000"/>
+        </w:rPr>
+      </w:pPr>
+      <w:r>
+        <w:rPr>
+          <w:color w:val="EE0000"/>
+        </w:rPr>
+        <w:t xml:space="preserve">{%p </w:t>
+      </w:r>
+      <w:proofErr w:type="spellStart"/>
+      <w:r>
+        <w:rPr>
+          <w:color w:val="EE0000"/>
+        </w:rPr>
+        <w:t>endif</w:t>
+      </w:r>
+      <w:proofErr w:type="spellEnd"/>
+      <w:r>
+        <w:rPr>
+          <w:color w:val="EE0000"/>
+        </w:rPr>
+        <w:t xml:space="preserve"> %}</w:t>
       </w:r>
     </w:p>
     <w:p>
@@ -41166,17 +42269,20 @@
         <w:t>a Memória de Cálculo referente ao período de inadimplemento do contrato</w:t>
       </w:r>
       <w:r>
-        <w:t xml:space="preserve">. Desse modo, procedeu-se o </w:t>
-      </w:r>
-      <w:r>
+        <w:t xml:space="preserve">. Desse modo, procedeu-se o recálculo do período de normalidade conforme condições contratuais, </w:t>
+      </w:r>
+      <w:r>
+        <w:rPr>
+          <w:highlight w:val="yellow"/>
+        </w:rPr>
+        <w:t xml:space="preserve">inclusive estimando ajuste </w:t>
+      </w:r>
+      <w:r>
+        <w:rPr>
+          <w:highlight w:val="yellow"/>
+        </w:rPr>
         <w:lastRenderedPageBreak/>
-        <w:t xml:space="preserve">recálculo do período de normalidade conforme condições contratuais, </w:t>
-      </w:r>
-      <w:r>
-        <w:rPr>
-          <w:highlight w:val="yellow"/>
-        </w:rPr>
-        <w:t>inclusive estimando ajuste de saldo para mínimas diferenças apuradas em relação ao valor do demonstrativo disponibilizado</w:t>
+        <w:t>de saldo para mínimas diferenças apuradas em relação ao valor do demonstrativo disponibilizado</w:t>
       </w:r>
       <w:r>
         <w:t xml:space="preserve">. Entretanto, </w:t>
@@ -41269,7 +42375,7 @@
         <w:rPr>
           <w:rFonts w:eastAsia="Times New Roman" w:cs="Times New Roman"/>
           <w:b/>
-          <w:color w:val="FF0000"/>
+          <w:color w:val="EE0000"/>
           <w:szCs w:val="23"/>
         </w:rPr>
         <w:t xml:space="preserve"> </w:t>
@@ -41278,24 +42384,47 @@
         <w:rPr>
           <w:rFonts w:eastAsia="Times New Roman" w:cs="Times New Roman"/>
           <w:b/>
-          <w:color w:val="FF0000"/>
+          <w:color w:val="EE0000"/>
           <w:szCs w:val="23"/>
           <w:highlight w:val="green"/>
         </w:rPr>
         <w:t xml:space="preserve">R$ </w:t>
       </w:r>
-      <w:proofErr w:type="spellStart"/>
       <w:r>
         <w:rPr>
           <w:rFonts w:eastAsia="Times New Roman" w:cs="Times New Roman"/>
           <w:b/>
-          <w:color w:val="FF0000"/>
+          <w:color w:val="EE0000"/>
           <w:szCs w:val="23"/>
           <w:highlight w:val="green"/>
-        </w:rPr>
-        <w:t>xxxxx</w:t>
+          <w:lang w:eastAsia="pt-BR"/>
+        </w:rPr>
+        <w:t>{{</w:t>
+      </w:r>
+      <w:proofErr w:type="spellStart"/>
+      <w:r>
+        <w:rPr>
+          <w:rFonts w:eastAsia="Times New Roman" w:cs="Times New Roman"/>
+          <w:b/>
+          <w:color w:val="EE0000"/>
+          <w:szCs w:val="23"/>
+          <w:highlight w:val="green"/>
+          <w:lang w:eastAsia="pt-BR"/>
+        </w:rPr>
+        <w:t>valores_iniciais</w:t>
       </w:r>
       <w:proofErr w:type="spellEnd"/>
+      <w:r>
+        <w:rPr>
+          <w:rFonts w:eastAsia="Times New Roman" w:cs="Times New Roman"/>
+          <w:b/>
+          <w:color w:val="EE0000"/>
+          <w:szCs w:val="23"/>
+          <w:highlight w:val="green"/>
+          <w:lang w:eastAsia="pt-BR"/>
+        </w:rPr>
+        <w:t>}}</w:t>
+      </w:r>
     </w:p>
     <w:p>
       <w:pPr>
@@ -41361,16 +42490,35 @@
         </w:rPr>
         <w:t>R$ </w:t>
       </w:r>
-      <w:proofErr w:type="spellStart"/>
       <w:r>
         <w:rPr>
           <w:rFonts w:eastAsia="Times New Roman" w:cs="Times New Roman"/>
           <w:szCs w:val="23"/>
+          <w:highlight w:val="yellow"/>
           <w:u w:val="single"/>
         </w:rPr>
-        <w:t>xxxx</w:t>
+        <w:t>{{</w:t>
+      </w:r>
+      <w:proofErr w:type="spellStart"/>
+      <w:r>
+        <w:rPr>
+          <w:rFonts w:eastAsia="Times New Roman" w:cs="Times New Roman"/>
+          <w:szCs w:val="23"/>
+          <w:highlight w:val="yellow"/>
+          <w:u w:val="single"/>
+        </w:rPr>
+        <w:t>valores_recalculado</w:t>
       </w:r>
       <w:proofErr w:type="spellEnd"/>
+      <w:r>
+        <w:rPr>
+          <w:rFonts w:eastAsia="Times New Roman" w:cs="Times New Roman"/>
+          <w:szCs w:val="23"/>
+          <w:highlight w:val="yellow"/>
+          <w:u w:val="single"/>
+        </w:rPr>
+        <w:t>}}</w:t>
+      </w:r>
     </w:p>
     <w:p>
       <w:pPr>
@@ -41443,19 +42591,41 @@
         </w:rPr>
         <w:t xml:space="preserve">R$ </w:t>
       </w:r>
-      <w:proofErr w:type="spellStart"/>
       <w:r>
         <w:rPr>
           <w:rFonts w:eastAsia="Times New Roman" w:cs="Times New Roman"/>
           <w:b/>
           <w:bCs/>
           <w:szCs w:val="23"/>
-          <w:highlight w:val="green"/>
+          <w:highlight w:val="yellow"/>
           <w:u w:val="single"/>
         </w:rPr>
-        <w:t>xxxxxx</w:t>
+        <w:t>{{</w:t>
+      </w:r>
+      <w:proofErr w:type="spellStart"/>
+      <w:r>
+        <w:rPr>
+          <w:rFonts w:eastAsia="Times New Roman" w:cs="Times New Roman"/>
+          <w:b/>
+          <w:bCs/>
+          <w:szCs w:val="23"/>
+          <w:highlight w:val="yellow"/>
+          <w:u w:val="single"/>
+        </w:rPr>
+        <w:t>valor_excesso</w:t>
       </w:r>
       <w:proofErr w:type="spellEnd"/>
+      <w:r>
+        <w:rPr>
+          <w:rFonts w:eastAsia="Times New Roman" w:cs="Times New Roman"/>
+          <w:b/>
+          <w:bCs/>
+          <w:szCs w:val="23"/>
+          <w:highlight w:val="yellow"/>
+          <w:u w:val="single"/>
+        </w:rPr>
+        <w:t>}}</w:t>
+      </w:r>
     </w:p>
     <w:p>
       <w:pPr>
@@ -41636,7 +42806,7 @@
           <w:noProof/>
           <w:szCs w:val="23"/>
         </w:rPr>
-        <w:t>1 de julho de 2026</w:t>
+        <w:t>13 de julho de 2026</w:t>
       </w:r>
       <w:r>
         <w:rPr>
@@ -42381,7 +43551,6 @@
           <w:color w:val="EE0000"/>
           <w:szCs w:val="23"/>
         </w:rPr>
-        <w:lastRenderedPageBreak/>
         <w:t>FORAM FEITAS AS CAPAS D</w:t>
       </w:r>
       <w:r>
@@ -49251,7 +50420,6 @@
   <w:style w:type="character" w:default="1" w:styleId="Fontepargpadro">
     <w:name w:val="Default Paragraph Font"/>
     <w:uiPriority w:val="1"/>
-    <w:semiHidden/>
     <w:unhideWhenUsed/>
   </w:style>
   <w:style w:type="table" w:default="1" w:styleId="Tabelanormal">
@@ -51390,6 +52558,7 @@
     <w:rsid w:val="003A13C3"/>
     <w:rsid w:val="003A3998"/>
     <w:rsid w:val="003B005A"/>
+    <w:rsid w:val="003C09B8"/>
     <w:rsid w:val="003F413A"/>
     <w:rsid w:val="00402088"/>
     <w:rsid w:val="00433808"/>
@@ -51539,6 +52708,7 @@
     <w:rsid w:val="00C11BEA"/>
     <w:rsid w:val="00C14CEB"/>
     <w:rsid w:val="00C15988"/>
+    <w:rsid w:val="00C17842"/>
     <w:rsid w:val="00C375CC"/>
     <w:rsid w:val="00C45714"/>
     <w:rsid w:val="00C55585"/>

</xml_diff>

<commit_message>
ajuste os saldos final no laudo.docx
</commit_message>
<xml_diff>
--- a/laudo/templates/laudo_completo.docx
+++ b/laudo/templates/laudo_completo.docx
@@ -42388,40 +42388,54 @@
           <w:szCs w:val="23"/>
           <w:highlight w:val="green"/>
         </w:rPr>
-        <w:t xml:space="preserve">R$ </w:t>
+        <w:t>R$</w:t>
       </w:r>
       <w:r>
         <w:rPr>
           <w:rFonts w:eastAsia="Times New Roman" w:cs="Times New Roman"/>
           <w:b/>
+          <w:bCs/>
           <w:color w:val="EE0000"/>
           <w:szCs w:val="23"/>
           <w:highlight w:val="green"/>
-          <w:lang w:eastAsia="pt-BR"/>
-        </w:rPr>
-        <w:t>{{</w:t>
-      </w:r>
-      <w:proofErr w:type="spellStart"/>
+        </w:rPr>
+        <w:t xml:space="preserve"> </w:t>
+      </w:r>
       <w:r>
         <w:rPr>
           <w:rFonts w:eastAsia="Times New Roman" w:cs="Times New Roman"/>
           <w:b/>
+          <w:bCs/>
           <w:color w:val="EE0000"/>
           <w:szCs w:val="23"/>
-          <w:highlight w:val="green"/>
-          <w:lang w:eastAsia="pt-BR"/>
-        </w:rPr>
-        <w:t>valores_iniciais</w:t>
-      </w:r>
-      <w:proofErr w:type="spellEnd"/>
+          <w:highlight w:val="yellow"/>
+          <w:u w:val="single"/>
+        </w:rPr>
+        <w:t>{{</w:t>
+      </w:r>
+      <w:proofErr w:type="spellStart"/>
       <w:r>
         <w:rPr>
           <w:rFonts w:eastAsia="Times New Roman" w:cs="Times New Roman"/>
           <w:b/>
+          <w:bCs/>
           <w:color w:val="EE0000"/>
           <w:szCs w:val="23"/>
-          <w:highlight w:val="green"/>
-          <w:lang w:eastAsia="pt-BR"/>
+          <w:highlight w:val="yellow"/>
+          <w:u w:val="single"/>
+        </w:rPr>
+        <w:t>valores_recalculado</w:t>
+      </w:r>
+      <w:proofErr w:type="spellEnd"/>
+      <w:r>
+        <w:rPr>
+          <w:rFonts w:eastAsia="Times New Roman" w:cs="Times New Roman"/>
+          <w:b/>
+          <w:bCs/>
+          <w:color w:val="EE0000"/>
+          <w:szCs w:val="23"/>
+          <w:highlight w:val="yellow"/>
+          <w:u w:val="single"/>
         </w:rPr>
         <w:t>}}</w:t>
       </w:r>
@@ -42494,8 +42508,8 @@
         <w:rPr>
           <w:rFonts w:eastAsia="Times New Roman" w:cs="Times New Roman"/>
           <w:szCs w:val="23"/>
-          <w:highlight w:val="yellow"/>
-          <w:u w:val="single"/>
+          <w:highlight w:val="green"/>
+          <w:lang w:eastAsia="pt-BR"/>
         </w:rPr>
         <w:t>{{</w:t>
       </w:r>
@@ -42504,18 +42518,18 @@
         <w:rPr>
           <w:rFonts w:eastAsia="Times New Roman" w:cs="Times New Roman"/>
           <w:szCs w:val="23"/>
-          <w:highlight w:val="yellow"/>
-          <w:u w:val="single"/>
-        </w:rPr>
-        <w:t>valores_recalculado</w:t>
+          <w:highlight w:val="green"/>
+          <w:lang w:eastAsia="pt-BR"/>
+        </w:rPr>
+        <w:t>valores_iniciais</w:t>
       </w:r>
       <w:proofErr w:type="spellEnd"/>
       <w:r>
         <w:rPr>
           <w:rFonts w:eastAsia="Times New Roman" w:cs="Times New Roman"/>
           <w:szCs w:val="23"/>
-          <w:highlight w:val="yellow"/>
-          <w:u w:val="single"/>
+          <w:highlight w:val="green"/>
+          <w:lang w:eastAsia="pt-BR"/>
         </w:rPr>
         <w:t>}}</w:t>
       </w:r>
@@ -42797,7 +42811,7 @@
           <w:noProof/>
           <w:szCs w:val="23"/>
         </w:rPr>
-        <w:t>15 de julho de 2026</w:t>
+        <w:t>20 de julho de 2026</w:t>
       </w:r>
       <w:r>
         <w:rPr>
@@ -52648,6 +52662,7 @@
     <w:rsid w:val="005C66A7"/>
     <w:rsid w:val="005D6E63"/>
     <w:rsid w:val="005D7123"/>
+    <w:rsid w:val="005E050B"/>
     <w:rsid w:val="005E2FEF"/>
     <w:rsid w:val="005F2F38"/>
     <w:rsid w:val="0062037F"/>
@@ -52818,6 +52833,7 @@
     <w:rsid w:val="00EF134C"/>
     <w:rsid w:val="00EF1701"/>
     <w:rsid w:val="00EF3C19"/>
+    <w:rsid w:val="00F0116A"/>
     <w:rsid w:val="00F048F4"/>
     <w:rsid w:val="00F115C5"/>
     <w:rsid w:val="00F15E56"/>

</xml_diff>